<commit_message>
Update code-freeze hash references after commit-message rewrite (code unchanged)
</commit_message>
<xml_diff>
--- a/docs/IMPLEMENTATION_REPORT.docx
+++ b/docs/IMPLEMENTATION_REPORT.docx
@@ -174,14 +174,46 @@
                 <w:sz w:val="15"/>
                 <w:szCs w:val="15"/>
               </w:rPr>
-              <w:t>e123b93b06770ce2846c8eafe47f9017fd644a17</w:t>
-            </w:r>
-            <w:r>
-              <w:rPr>
-                <w:sz w:val="17"/>
-                <w:szCs w:val="17"/>
-              </w:rPr>
-              <w:t xml:space="preserve"> (code freeze; all results in this report were produced at this commit)</w:t>
+              <w:t>3202c93c0b40c69d54405af20057bb19f7ded33b</w:t>
+            </w:r>
+            <w:r>
+              <w:rPr>
+                <w:sz w:val="17"/>
+                <w:szCs w:val="17"/>
+              </w:rPr>
+              <w:t xml:space="preserve"> (code freeze; all results in this report were produced at this commit; file tree </w:t>
+            </w:r>
+            <w:r>
+              <w:rPr>
+                <w:rFonts w:ascii="Consolas" w:eastAsia="Consolas" w:hAnsi="Consolas" w:cs="Consolas"/>
+                <w:color w:val="333333"/>
+                <w:sz w:val="15"/>
+                <w:szCs w:val="15"/>
+              </w:rPr>
+              <w:t>44c2418</w:t>
+            </w:r>
+            <w:r>
+              <w:rPr>
+                <w:sz w:val="17"/>
+                <w:szCs w:val="17"/>
+              </w:rPr>
+              <w:t xml:space="preserve">, identical to the originally tested commit </w:t>
+            </w:r>
+            <w:r>
+              <w:rPr>
+                <w:rFonts w:ascii="Consolas" w:eastAsia="Consolas" w:hAnsi="Consolas" w:cs="Consolas"/>
+                <w:color w:val="333333"/>
+                <w:sz w:val="15"/>
+                <w:szCs w:val="15"/>
+              </w:rPr>
+              <w:t>e123b93</w:t>
+            </w:r>
+            <w:r>
+              <w:rPr>
+                <w:sz w:val="17"/>
+                <w:szCs w:val="17"/>
+              </w:rPr>
+              <w:t xml:space="preserve"> before commit messages were rewritten)</w:t>
             </w:r>
           </w:p>
         </w:tc>
@@ -398,7 +430,7 @@
     <w:sdt>
       <w:sdtPr>
         <w:alias w:val="Contents"/>
-        <w:id w:val="1206534383"/>
+        <w:id w:val="1587574919"/>
       </w:sdtPr>
       <w:sdtEndPr/>
       <w:sdtContent>
@@ -421,7 +453,7 @@
           <w:r>
             <w:fldChar w:fldCharType="separate"/>
           </w:r>
-          <w:hyperlink w:anchor="_Toc243067650" w:history="1">
+          <w:hyperlink w:anchor="_Toc243071268" w:history="1">
             <w:r>
               <w:rPr>
                 <w:rStyle w:val="Hyperlink"/>
@@ -445,7 +477,7 @@
               <w:rPr>
                 <w:noProof/>
               </w:rPr>
-              <w:instrText xml:space="preserve"> PAGEREF _Toc243067650 \h </w:instrText>
+              <w:instrText xml:space="preserve"> PAGEREF _Toc243071268 \h </w:instrText>
             </w:r>
             <w:r>
               <w:rPr>
@@ -482,7 +514,7 @@
               <w:noProof/>
             </w:rPr>
           </w:pPr>
-          <w:hyperlink w:anchor="_Toc243067651" w:history="1">
+          <w:hyperlink w:anchor="_Toc243071269" w:history="1">
             <w:r>
               <w:rPr>
                 <w:rStyle w:val="Hyperlink"/>
@@ -506,7 +538,7 @@
               <w:rPr>
                 <w:noProof/>
               </w:rPr>
-              <w:instrText xml:space="preserve"> PAGEREF _Toc243067651 \h </w:instrText>
+              <w:instrText xml:space="preserve"> PAGEREF _Toc243071269 \h </w:instrText>
             </w:r>
             <w:r>
               <w:rPr>
@@ -543,7 +575,7 @@
               <w:noProof/>
             </w:rPr>
           </w:pPr>
-          <w:hyperlink w:anchor="_Toc243067652" w:history="1">
+          <w:hyperlink w:anchor="_Toc243071270" w:history="1">
             <w:r>
               <w:rPr>
                 <w:rStyle w:val="Hyperlink"/>
@@ -567,7 +599,7 @@
               <w:rPr>
                 <w:noProof/>
               </w:rPr>
-              <w:instrText xml:space="preserve"> PAGEREF _Toc243067652 \h </w:instrText>
+              <w:instrText xml:space="preserve"> PAGEREF _Toc243071270 \h </w:instrText>
             </w:r>
             <w:r>
               <w:rPr>
@@ -604,7 +636,7 @@
               <w:noProof/>
             </w:rPr>
           </w:pPr>
-          <w:hyperlink w:anchor="_Toc243067653" w:history="1">
+          <w:hyperlink w:anchor="_Toc243071271" w:history="1">
             <w:r>
               <w:rPr>
                 <w:rStyle w:val="Hyperlink"/>
@@ -628,7 +660,7 @@
               <w:rPr>
                 <w:noProof/>
               </w:rPr>
-              <w:instrText xml:space="preserve"> PAGEREF _Toc243067653 \h </w:instrText>
+              <w:instrText xml:space="preserve"> PAGEREF _Toc243071271 \h </w:instrText>
             </w:r>
             <w:r>
               <w:rPr>
@@ -665,7 +697,7 @@
               <w:noProof/>
             </w:rPr>
           </w:pPr>
-          <w:hyperlink w:anchor="_Toc243067654" w:history="1">
+          <w:hyperlink w:anchor="_Toc243071272" w:history="1">
             <w:r>
               <w:rPr>
                 <w:rStyle w:val="Hyperlink"/>
@@ -689,7 +721,7 @@
               <w:rPr>
                 <w:noProof/>
               </w:rPr>
-              <w:instrText xml:space="preserve"> PAGEREF _Toc243067654 \h </w:instrText>
+              <w:instrText xml:space="preserve"> PAGEREF _Toc243071272 \h </w:instrText>
             </w:r>
             <w:r>
               <w:rPr>
@@ -726,7 +758,7 @@
               <w:noProof/>
             </w:rPr>
           </w:pPr>
-          <w:hyperlink w:anchor="_Toc243067655" w:history="1">
+          <w:hyperlink w:anchor="_Toc243071273" w:history="1">
             <w:r>
               <w:rPr>
                 <w:rStyle w:val="Hyperlink"/>
@@ -750,7 +782,7 @@
               <w:rPr>
                 <w:noProof/>
               </w:rPr>
-              <w:instrText xml:space="preserve"> PAGEREF _Toc243067655 \h </w:instrText>
+              <w:instrText xml:space="preserve"> PAGEREF _Toc243071273 \h </w:instrText>
             </w:r>
             <w:r>
               <w:rPr>
@@ -787,7 +819,7 @@
               <w:noProof/>
             </w:rPr>
           </w:pPr>
-          <w:hyperlink w:anchor="_Toc243067656" w:history="1">
+          <w:hyperlink w:anchor="_Toc243071274" w:history="1">
             <w:r>
               <w:rPr>
                 <w:rStyle w:val="Hyperlink"/>
@@ -811,7 +843,7 @@
               <w:rPr>
                 <w:noProof/>
               </w:rPr>
-              <w:instrText xml:space="preserve"> PAGEREF _Toc243067656 \h </w:instrText>
+              <w:instrText xml:space="preserve"> PAGEREF _Toc243071274 \h </w:instrText>
             </w:r>
             <w:r>
               <w:rPr>
@@ -848,7 +880,7 @@
               <w:noProof/>
             </w:rPr>
           </w:pPr>
-          <w:hyperlink w:anchor="_Toc243067657" w:history="1">
+          <w:hyperlink w:anchor="_Toc243071275" w:history="1">
             <w:r>
               <w:rPr>
                 <w:rStyle w:val="Hyperlink"/>
@@ -872,7 +904,7 @@
               <w:rPr>
                 <w:noProof/>
               </w:rPr>
-              <w:instrText xml:space="preserve"> PAGEREF _Toc243067657 \h </w:instrText>
+              <w:instrText xml:space="preserve"> PAGEREF _Toc243071275 \h </w:instrText>
             </w:r>
             <w:r>
               <w:rPr>
@@ -909,7 +941,7 @@
               <w:noProof/>
             </w:rPr>
           </w:pPr>
-          <w:hyperlink w:anchor="_Toc243067658" w:history="1">
+          <w:hyperlink w:anchor="_Toc243071276" w:history="1">
             <w:r>
               <w:rPr>
                 <w:rStyle w:val="Hyperlink"/>
@@ -933,7 +965,7 @@
               <w:rPr>
                 <w:noProof/>
               </w:rPr>
-              <w:instrText xml:space="preserve"> PAGEREF _Toc243067658 \h </w:instrText>
+              <w:instrText xml:space="preserve"> PAGEREF _Toc243071276 \h </w:instrText>
             </w:r>
             <w:r>
               <w:rPr>
@@ -970,7 +1002,7 @@
               <w:noProof/>
             </w:rPr>
           </w:pPr>
-          <w:hyperlink w:anchor="_Toc243067659" w:history="1">
+          <w:hyperlink w:anchor="_Toc243071277" w:history="1">
             <w:r>
               <w:rPr>
                 <w:rStyle w:val="Hyperlink"/>
@@ -994,7 +1026,7 @@
               <w:rPr>
                 <w:noProof/>
               </w:rPr>
-              <w:instrText xml:space="preserve"> PAGEREF _Toc243067659 \h </w:instrText>
+              <w:instrText xml:space="preserve"> PAGEREF _Toc243071277 \h </w:instrText>
             </w:r>
             <w:r>
               <w:rPr>
@@ -1031,7 +1063,7 @@
               <w:noProof/>
             </w:rPr>
           </w:pPr>
-          <w:hyperlink w:anchor="_Toc243067660" w:history="1">
+          <w:hyperlink w:anchor="_Toc243071278" w:history="1">
             <w:r>
               <w:rPr>
                 <w:rStyle w:val="Hyperlink"/>
@@ -1055,7 +1087,7 @@
               <w:rPr>
                 <w:noProof/>
               </w:rPr>
-              <w:instrText xml:space="preserve"> PAGEREF _Toc243067660 \h </w:instrText>
+              <w:instrText xml:space="preserve"> PAGEREF _Toc243071278 \h </w:instrText>
             </w:r>
             <w:r>
               <w:rPr>
@@ -1092,7 +1124,7 @@
               <w:noProof/>
             </w:rPr>
           </w:pPr>
-          <w:hyperlink w:anchor="_Toc243067661" w:history="1">
+          <w:hyperlink w:anchor="_Toc243071279" w:history="1">
             <w:r>
               <w:rPr>
                 <w:rStyle w:val="Hyperlink"/>
@@ -1116,7 +1148,7 @@
               <w:rPr>
                 <w:noProof/>
               </w:rPr>
-              <w:instrText xml:space="preserve"> PAGEREF _Toc243067661 \h </w:instrText>
+              <w:instrText xml:space="preserve"> PAGEREF _Toc243071279 \h </w:instrText>
             </w:r>
             <w:r>
               <w:rPr>
@@ -1153,7 +1185,7 @@
               <w:noProof/>
             </w:rPr>
           </w:pPr>
-          <w:hyperlink w:anchor="_Toc243067662" w:history="1">
+          <w:hyperlink w:anchor="_Toc243071280" w:history="1">
             <w:r>
               <w:rPr>
                 <w:rStyle w:val="Hyperlink"/>
@@ -1177,7 +1209,7 @@
               <w:rPr>
                 <w:noProof/>
               </w:rPr>
-              <w:instrText xml:space="preserve"> PAGEREF _Toc243067662 \h </w:instrText>
+              <w:instrText xml:space="preserve"> PAGEREF _Toc243071280 \h </w:instrText>
             </w:r>
             <w:r>
               <w:rPr>
@@ -1214,7 +1246,7 @@
               <w:noProof/>
             </w:rPr>
           </w:pPr>
-          <w:hyperlink w:anchor="_Toc243067663" w:history="1">
+          <w:hyperlink w:anchor="_Toc243071281" w:history="1">
             <w:r>
               <w:rPr>
                 <w:rStyle w:val="Hyperlink"/>
@@ -1238,7 +1270,7 @@
               <w:rPr>
                 <w:noProof/>
               </w:rPr>
-              <w:instrText xml:space="preserve"> PAGEREF _Toc243067663 \h </w:instrText>
+              <w:instrText xml:space="preserve"> PAGEREF _Toc243071281 \h </w:instrText>
             </w:r>
             <w:r>
               <w:rPr>
@@ -1275,7 +1307,7 @@
               <w:noProof/>
             </w:rPr>
           </w:pPr>
-          <w:hyperlink w:anchor="_Toc243067664" w:history="1">
+          <w:hyperlink w:anchor="_Toc243071282" w:history="1">
             <w:r>
               <w:rPr>
                 <w:rStyle w:val="Hyperlink"/>
@@ -1299,7 +1331,7 @@
               <w:rPr>
                 <w:noProof/>
               </w:rPr>
-              <w:instrText xml:space="preserve"> PAGEREF _Toc243067664 \h </w:instrText>
+              <w:instrText xml:space="preserve"> PAGEREF _Toc243071282 \h </w:instrText>
             </w:r>
             <w:r>
               <w:rPr>
@@ -1336,7 +1368,7 @@
               <w:noProof/>
             </w:rPr>
           </w:pPr>
-          <w:hyperlink w:anchor="_Toc243067665" w:history="1">
+          <w:hyperlink w:anchor="_Toc243071283" w:history="1">
             <w:r>
               <w:rPr>
                 <w:rStyle w:val="Hyperlink"/>
@@ -1360,7 +1392,7 @@
               <w:rPr>
                 <w:noProof/>
               </w:rPr>
-              <w:instrText xml:space="preserve"> PAGEREF _Toc243067665 \h </w:instrText>
+              <w:instrText xml:space="preserve"> PAGEREF _Toc243071283 \h </w:instrText>
             </w:r>
             <w:r>
               <w:rPr>
@@ -1397,7 +1429,7 @@
               <w:noProof/>
             </w:rPr>
           </w:pPr>
-          <w:hyperlink w:anchor="_Toc243067666" w:history="1">
+          <w:hyperlink w:anchor="_Toc243071284" w:history="1">
             <w:r>
               <w:rPr>
                 <w:rStyle w:val="Hyperlink"/>
@@ -1421,7 +1453,7 @@
               <w:rPr>
                 <w:noProof/>
               </w:rPr>
-              <w:instrText xml:space="preserve"> PAGEREF _Toc243067666 \h </w:instrText>
+              <w:instrText xml:space="preserve"> PAGEREF _Toc243071284 \h </w:instrText>
             </w:r>
             <w:r>
               <w:rPr>
@@ -1464,7 +1496,7 @@
       <w:pPr>
         <w:pStyle w:val="Heading1"/>
       </w:pPr>
-      <w:bookmarkStart w:id="0" w:name="_Toc243067650"/>
+      <w:bookmarkStart w:id="0" w:name="_Toc243071268"/>
       <w:r>
         <w:t>1. Executive summary</w:t>
       </w:r>
@@ -1693,7 +1725,7 @@
       <w:pPr>
         <w:pStyle w:val="Heading1"/>
       </w:pPr>
-      <w:bookmarkStart w:id="1" w:name="_Toc243067651"/>
+      <w:bookmarkStart w:id="1" w:name="_Toc243071269"/>
       <w:r>
         <w:t>2. The challenge and its requirements</w:t>
       </w:r>
@@ -2733,7 +2765,7 @@
       <w:pPr>
         <w:pStyle w:val="Heading1"/>
       </w:pPr>
-      <w:bookmarkStart w:id="2" w:name="_Toc243067652"/>
+      <w:bookmarkStart w:id="2" w:name="_Toc243071270"/>
       <w:r>
         <w:t>3. Methodology</w:t>
       </w:r>
@@ -2883,7 +2915,7 @@
       <w:pPr>
         <w:pStyle w:val="Heading1"/>
       </w:pPr>
-      <w:bookmarkStart w:id="3" w:name="_Toc243067653"/>
+      <w:bookmarkStart w:id="3" w:name="_Toc243071271"/>
       <w:r>
         <w:t>4. Architecture</w:t>
       </w:r>
@@ -4809,7 +4841,7 @@
       <w:pPr>
         <w:pStyle w:val="Heading1"/>
       </w:pPr>
-      <w:bookmarkStart w:id="4" w:name="_Toc243067654"/>
+      <w:bookmarkStart w:id="4" w:name="_Toc243071272"/>
       <w:r>
         <w:t>5. Technology stack</w:t>
       </w:r>
@@ -6274,7 +6306,7 @@
       <w:pPr>
         <w:pStyle w:val="Heading1"/>
       </w:pPr>
-      <w:bookmarkStart w:id="5" w:name="_Toc243067655"/>
+      <w:bookmarkStart w:id="5" w:name="_Toc243071273"/>
       <w:r>
         <w:t>6. Data sources</w:t>
       </w:r>
@@ -7627,7 +7659,7 @@
       <w:pPr>
         <w:pStyle w:val="Heading1"/>
       </w:pPr>
-      <w:bookmarkStart w:id="6" w:name="_Toc243067656"/>
+      <w:bookmarkStart w:id="6" w:name="_Toc243071274"/>
       <w:r>
         <w:t>7. Fact, evidence and envelope model</w:t>
       </w:r>
@@ -8186,7 +8218,7 @@
       <w:pPr>
         <w:pStyle w:val="Heading1"/>
       </w:pPr>
-      <w:bookmarkStart w:id="7" w:name="_Toc243067657"/>
+      <w:bookmarkStart w:id="7" w:name="_Toc243071275"/>
       <w:r>
         <w:t>8. Identity verification</w:t>
       </w:r>
@@ -9105,7 +9137,7 @@
       <w:pPr>
         <w:pStyle w:val="Heading1"/>
       </w:pPr>
-      <w:bookmarkStart w:id="8" w:name="_Toc243067658"/>
+      <w:bookmarkStart w:id="8" w:name="_Toc243071276"/>
       <w:r>
         <w:t>9. Other components</w:t>
       </w:r>
@@ -9554,7 +9586,7 @@
       <w:pPr>
         <w:pStyle w:val="Heading1"/>
       </w:pPr>
-      <w:bookmarkStart w:id="9" w:name="_Toc243067659"/>
+      <w:bookmarkStart w:id="9" w:name="_Toc243071277"/>
       <w:r>
         <w:t>10. Security</w:t>
       </w:r>
@@ -10447,7 +10479,7 @@
       <w:pPr>
         <w:pStyle w:val="Heading1"/>
       </w:pPr>
-      <w:bookmarkStart w:id="10" w:name="_Toc243067660"/>
+      <w:bookmarkStart w:id="10" w:name="_Toc243071278"/>
       <w:r>
         <w:t>11. Privacy and data protection</w:t>
       </w:r>
@@ -11011,7 +11043,7 @@
       <w:pPr>
         <w:pStyle w:val="Heading1"/>
       </w:pPr>
-      <w:bookmarkStart w:id="11" w:name="_Toc243067661"/>
+      <w:bookmarkStart w:id="11" w:name="_Toc243071279"/>
       <w:r>
         <w:t>12. Testing methodology</w:t>
       </w:r>
@@ -13120,7 +13152,7 @@
       <w:pPr>
         <w:pStyle w:val="Heading1"/>
       </w:pPr>
-      <w:bookmarkStart w:id="12" w:name="_Toc243067662"/>
+      <w:bookmarkStart w:id="12" w:name="_Toc243071280"/>
       <w:r>
         <w:t>13. Results at the frozen commit</w:t>
       </w:r>
@@ -17045,7 +17077,7 @@
       <w:pPr>
         <w:pStyle w:val="Heading1"/>
       </w:pPr>
-      <w:bookmarkStart w:id="13" w:name="_Toc243067663"/>
+      <w:bookmarkStart w:id="13" w:name="_Toc243071281"/>
       <w:r>
         <w:t>14. Defects found and fixed</w:t>
       </w:r>
@@ -18571,7 +18603,7 @@
       <w:pPr>
         <w:pStyle w:val="Heading1"/>
       </w:pPr>
-      <w:bookmarkStart w:id="14" w:name="_Toc243067664"/>
+      <w:bookmarkStart w:id="14" w:name="_Toc243071282"/>
       <w:r>
         <w:t>15. Limitations and future work</w:t>
       </w:r>
@@ -18693,7 +18725,7 @@
       <w:pPr>
         <w:pStyle w:val="Heading1"/>
       </w:pPr>
-      <w:bookmarkStart w:id="15" w:name="_Toc243067665"/>
+      <w:bookmarkStart w:id="15" w:name="_Toc243071283"/>
       <w:r>
         <w:t>16. Reproduction and submission</w:t>
       </w:r>
@@ -18857,7 +18889,7 @@
           <w:sz w:val="18"/>
           <w:szCs w:val="18"/>
         </w:rPr>
-        <w:t>e123b93</w:t>
+        <w:t>3202c93</w:t>
       </w:r>
       <w:r>
         <w:t>; later commits change documentation and data only.</w:t>
@@ -18867,7 +18899,7 @@
       <w:pPr>
         <w:pStyle w:val="Heading1"/>
       </w:pPr>
-      <w:bookmarkStart w:id="16" w:name="_Toc243067666"/>
+      <w:bookmarkStart w:id="16" w:name="_Toc243071284"/>
       <w:r>
         <w:t>Appendix A: Offline test inventory</w:t>
       </w:r>
@@ -19952,10 +19984,68 @@
 <file path=word/numbering.xml><?xml version="1.0" encoding="utf-8"?>
 <w:numbering xmlns:wpc="http://schemas.microsoft.com/office/word/2010/wordprocessingCanvas" xmlns:cx="http://schemas.microsoft.com/office/drawing/2014/chartex" xmlns:cx1="http://schemas.microsoft.com/office/drawing/2015/9/8/chartex" xmlns:cx2="http://schemas.microsoft.com/office/drawing/2015/10/21/chartex" xmlns:cx3="http://schemas.microsoft.com/office/drawing/2016/5/9/chartex" xmlns:cx4="http://schemas.microsoft.com/office/drawing/2016/5/10/chartex" xmlns:cx5="http://schemas.microsoft.com/office/drawing/2016/5/11/chartex" xmlns:cx6="http://schemas.microsoft.com/office/drawing/2016/5/12/chartex" xmlns:cx7="http://schemas.microsoft.com/office/drawing/2016/5/13/chartex" xmlns:cx8="http://schemas.microsoft.com/office/drawing/2016/5/14/chartex" xmlns:mc="http://schemas.openxmlformats.org/markup-compatibility/2006" xmlns:aink="http://schemas.microsoft.com/office/drawing/2016/ink" xmlns:am3d="http://schemas.microsoft.com/office/drawing/2017/model3d" xmlns:o="urn:schemas-microsoft-com:office:office" xmlns:oel="http://schemas.microsoft.com/office/2019/extlst" xmlns:r="http://schemas.openxmlformats.org/officeDocument/2006/relationships" xmlns:m="http://schemas.openxmlformats.org/officeDocument/2006/math" xmlns:v="urn:schemas-microsoft-com:vml" xmlns:wp14="http://schemas.microsoft.com/office/word/2010/wordprocessingDrawing" xmlns:wp="http://schemas.openxmlformats.org/drawingml/2006/wordprocessingDrawing" xmlns:w10="urn:schemas-microsoft-com:office:word" xmlns:w="http://schemas.openxmlformats.org/wordprocessingml/2006/main" xmlns:w14="http://schemas.microsoft.com/office/word/2010/wordml" xmlns:w15="http://schemas.microsoft.com/office/word/2012/wordml" xmlns:w16cex="http://schemas.microsoft.com/office/word/2018/wordml/cex" xmlns:w16cid="http://schemas.microsoft.com/office/word/2016/wordml/cid" xmlns:w16="http://schemas.microsoft.com/office/word/2018/wordml" xmlns:w16du="http://schemas.microsoft.com/office/word/2023/wordml/word16du" xmlns:w16sdtdh="http://schemas.microsoft.com/office/word/2020/wordml/sdtdatahash" xmlns:w16sdtfl="http://schemas.microsoft.com/office/word/2024/wordml/sdtformatlock" xmlns:w16se="http://schemas.microsoft.com/office/word/2015/wordml/symex" xmlns:wpg="http://schemas.microsoft.com/office/word/2010/wordprocessingGroup" xmlns:wpi="http://schemas.microsoft.com/office/word/2010/wordprocessingInk" xmlns:wne="http://schemas.microsoft.com/office/word/2006/wordml" xmlns:wps="http://schemas.microsoft.com/office/word/2010/wordprocessingShape" mc:Ignorable="w14 w15 w16se w16cid w16 w16cex w16sdtdh w16sdtfl w16du wp14">
   <w:abstractNum w:abstractNumId="0" w15:restartNumberingAfterBreak="0">
-    <w:nsid w:val="06E536E8"/>
+    <w:nsid w:val="14FA5E4E"/>
     <w:multiLevelType w:val="hybridMultilevel"/>
-    <w:tmpl w:val="61A6B87A"/>
-    <w:lvl w:ilvl="0" w:tplc="9168D5AA">
+    <w:tmpl w:val="432436EC"/>
+    <w:lvl w:ilvl="0" w:tplc="77F8CB52">
+      <w:start w:val="1"/>
+      <w:numFmt w:val="bullet"/>
+      <w:lvlText w:val="•"/>
+      <w:lvlJc w:val="left"/>
+      <w:pPr>
+        <w:ind w:left="540" w:hanging="270"/>
+      </w:pPr>
+    </w:lvl>
+    <w:lvl w:ilvl="1" w:tplc="8D28C1B6">
+      <w:start w:val="1"/>
+      <w:numFmt w:val="bullet"/>
+      <w:lvlText w:val="–"/>
+      <w:lvlJc w:val="left"/>
+      <w:pPr>
+        <w:ind w:left="1080" w:hanging="270"/>
+      </w:pPr>
+    </w:lvl>
+    <w:lvl w:ilvl="2" w:tplc="F54C0E28">
+      <w:numFmt w:val="decimal"/>
+      <w:lvlText w:val=""/>
+      <w:lvlJc w:val="left"/>
+    </w:lvl>
+    <w:lvl w:ilvl="3" w:tplc="7F2E9F76">
+      <w:numFmt w:val="decimal"/>
+      <w:lvlText w:val=""/>
+      <w:lvlJc w:val="left"/>
+    </w:lvl>
+    <w:lvl w:ilvl="4" w:tplc="11321388">
+      <w:numFmt w:val="decimal"/>
+      <w:lvlText w:val=""/>
+      <w:lvlJc w:val="left"/>
+    </w:lvl>
+    <w:lvl w:ilvl="5" w:tplc="BBF6797E">
+      <w:numFmt w:val="decimal"/>
+      <w:lvlText w:val=""/>
+      <w:lvlJc w:val="left"/>
+    </w:lvl>
+    <w:lvl w:ilvl="6" w:tplc="46E2C6CE">
+      <w:numFmt w:val="decimal"/>
+      <w:lvlText w:val=""/>
+      <w:lvlJc w:val="left"/>
+    </w:lvl>
+    <w:lvl w:ilvl="7" w:tplc="40A460BE">
+      <w:numFmt w:val="decimal"/>
+      <w:lvlText w:val=""/>
+      <w:lvlJc w:val="left"/>
+    </w:lvl>
+    <w:lvl w:ilvl="8" w:tplc="C824B370">
+      <w:numFmt w:val="decimal"/>
+      <w:lvlText w:val=""/>
+      <w:lvlJc w:val="left"/>
+    </w:lvl>
+  </w:abstractNum>
+  <w:abstractNum w:abstractNumId="1" w15:restartNumberingAfterBreak="0">
+    <w:nsid w:val="22263CB1"/>
+    <w:multiLevelType w:val="hybridMultilevel"/>
+    <w:tmpl w:val="3F7AA700"/>
+    <w:lvl w:ilvl="0" w:tplc="4F1C6BBC">
       <w:start w:val="1"/>
       <w:numFmt w:val="decimal"/>
       <w:lvlText w:val="%1."/>
@@ -19964,110 +20054,52 @@
         <w:ind w:left="540" w:hanging="360"/>
       </w:pPr>
     </w:lvl>
-    <w:lvl w:ilvl="1" w:tplc="84C61FAC">
+    <w:lvl w:ilvl="1" w:tplc="7FC049C4">
       <w:numFmt w:val="decimal"/>
       <w:lvlText w:val=""/>
       <w:lvlJc w:val="left"/>
     </w:lvl>
-    <w:lvl w:ilvl="2" w:tplc="5B822070">
+    <w:lvl w:ilvl="2" w:tplc="65643C26">
       <w:numFmt w:val="decimal"/>
       <w:lvlText w:val=""/>
       <w:lvlJc w:val="left"/>
     </w:lvl>
-    <w:lvl w:ilvl="3" w:tplc="E16A2F56">
+    <w:lvl w:ilvl="3" w:tplc="CCEAD7E6">
       <w:numFmt w:val="decimal"/>
       <w:lvlText w:val=""/>
       <w:lvlJc w:val="left"/>
     </w:lvl>
-    <w:lvl w:ilvl="4" w:tplc="86F635F4">
+    <w:lvl w:ilvl="4" w:tplc="1B18C298">
       <w:numFmt w:val="decimal"/>
       <w:lvlText w:val=""/>
       <w:lvlJc w:val="left"/>
     </w:lvl>
-    <w:lvl w:ilvl="5" w:tplc="3B5A6D7C">
+    <w:lvl w:ilvl="5" w:tplc="B73E54FE">
       <w:numFmt w:val="decimal"/>
       <w:lvlText w:val=""/>
       <w:lvlJc w:val="left"/>
     </w:lvl>
-    <w:lvl w:ilvl="6" w:tplc="C2E66DC0">
+    <w:lvl w:ilvl="6" w:tplc="E7D0AFA2">
       <w:numFmt w:val="decimal"/>
       <w:lvlText w:val=""/>
       <w:lvlJc w:val="left"/>
     </w:lvl>
-    <w:lvl w:ilvl="7" w:tplc="EE34F190">
+    <w:lvl w:ilvl="7" w:tplc="800A7D4E">
       <w:numFmt w:val="decimal"/>
       <w:lvlText w:val=""/>
       <w:lvlJc w:val="left"/>
     </w:lvl>
-    <w:lvl w:ilvl="8" w:tplc="C29698C8">
-      <w:numFmt w:val="decimal"/>
-      <w:lvlText w:val=""/>
-      <w:lvlJc w:val="left"/>
-    </w:lvl>
-  </w:abstractNum>
-  <w:abstractNum w:abstractNumId="1" w15:restartNumberingAfterBreak="0">
-    <w:nsid w:val="11435F65"/>
-    <w:multiLevelType w:val="hybridMultilevel"/>
-    <w:tmpl w:val="F3886B30"/>
-    <w:lvl w:ilvl="0" w:tplc="9C586362">
-      <w:start w:val="1"/>
-      <w:numFmt w:val="bullet"/>
-      <w:lvlText w:val="•"/>
-      <w:lvlJc w:val="left"/>
-      <w:pPr>
-        <w:ind w:left="540" w:hanging="270"/>
-      </w:pPr>
-    </w:lvl>
-    <w:lvl w:ilvl="1" w:tplc="10A605DC">
-      <w:start w:val="1"/>
-      <w:numFmt w:val="bullet"/>
-      <w:lvlText w:val="–"/>
-      <w:lvlJc w:val="left"/>
-      <w:pPr>
-        <w:ind w:left="1080" w:hanging="270"/>
-      </w:pPr>
-    </w:lvl>
-    <w:lvl w:ilvl="2" w:tplc="4CB075D2">
-      <w:numFmt w:val="decimal"/>
-      <w:lvlText w:val=""/>
-      <w:lvlJc w:val="left"/>
-    </w:lvl>
-    <w:lvl w:ilvl="3" w:tplc="79B21E68">
-      <w:numFmt w:val="decimal"/>
-      <w:lvlText w:val=""/>
-      <w:lvlJc w:val="left"/>
-    </w:lvl>
-    <w:lvl w:ilvl="4" w:tplc="D4F65A86">
-      <w:numFmt w:val="decimal"/>
-      <w:lvlText w:val=""/>
-      <w:lvlJc w:val="left"/>
-    </w:lvl>
-    <w:lvl w:ilvl="5" w:tplc="23F01EEA">
-      <w:numFmt w:val="decimal"/>
-      <w:lvlText w:val=""/>
-      <w:lvlJc w:val="left"/>
-    </w:lvl>
-    <w:lvl w:ilvl="6" w:tplc="51F81360">
-      <w:numFmt w:val="decimal"/>
-      <w:lvlText w:val=""/>
-      <w:lvlJc w:val="left"/>
-    </w:lvl>
-    <w:lvl w:ilvl="7" w:tplc="9FAC0EE6">
-      <w:numFmt w:val="decimal"/>
-      <w:lvlText w:val=""/>
-      <w:lvlJc w:val="left"/>
-    </w:lvl>
-    <w:lvl w:ilvl="8" w:tplc="04267756">
+    <w:lvl w:ilvl="8" w:tplc="BAAE39D8">
       <w:numFmt w:val="decimal"/>
       <w:lvlText w:val=""/>
       <w:lvlJc w:val="left"/>
     </w:lvl>
   </w:abstractNum>
   <w:abstractNum w:abstractNumId="2" w15:restartNumberingAfterBreak="0">
-    <w:nsid w:val="60EB530A"/>
+    <w:nsid w:val="2D0421DA"/>
     <w:multiLevelType w:val="hybridMultilevel"/>
-    <w:tmpl w:val="3E603A48"/>
-    <w:lvl w:ilvl="0" w:tplc="63C27D02" w:tentative="1">
+    <w:tmpl w:val="74067B74"/>
+    <w:lvl w:ilvl="0" w:tplc="9FFAB720" w:tentative="1">
       <w:start w:val="1"/>
       <w:numFmt w:val="bullet"/>
       <w:lvlText w:val="●"/>
@@ -20076,7 +20108,7 @@
         <w:ind w:left="720" w:hanging="360"/>
       </w:pPr>
     </w:lvl>
-    <w:lvl w:ilvl="1" w:tplc="43E07ED4" w:tentative="1">
+    <w:lvl w:ilvl="1" w:tplc="B8A89E5A" w:tentative="1">
       <w:start w:val="1"/>
       <w:numFmt w:val="bullet"/>
       <w:lvlText w:val="○"/>
@@ -20085,7 +20117,7 @@
         <w:ind w:left="1440" w:hanging="360"/>
       </w:pPr>
     </w:lvl>
-    <w:lvl w:ilvl="2" w:tplc="F8F8EDA6" w:tentative="1">
+    <w:lvl w:ilvl="2" w:tplc="4A563D28" w:tentative="1">
       <w:start w:val="1"/>
       <w:numFmt w:val="bullet"/>
       <w:lvlText w:val="■"/>
@@ -20094,7 +20126,7 @@
         <w:ind w:left="2160" w:hanging="360"/>
       </w:pPr>
     </w:lvl>
-    <w:lvl w:ilvl="3" w:tplc="BBCC27BA" w:tentative="1">
+    <w:lvl w:ilvl="3" w:tplc="94F27DFE" w:tentative="1">
       <w:start w:val="1"/>
       <w:numFmt w:val="bullet"/>
       <w:lvlText w:val="●"/>
@@ -20103,7 +20135,7 @@
         <w:ind w:left="2880" w:hanging="360"/>
       </w:pPr>
     </w:lvl>
-    <w:lvl w:ilvl="4" w:tplc="62E698D8" w:tentative="1">
+    <w:lvl w:ilvl="4" w:tplc="FC38A982" w:tentative="1">
       <w:start w:val="1"/>
       <w:numFmt w:val="bullet"/>
       <w:lvlText w:val="○"/>
@@ -20112,7 +20144,7 @@
         <w:ind w:left="3600" w:hanging="360"/>
       </w:pPr>
     </w:lvl>
-    <w:lvl w:ilvl="5" w:tplc="0BF04A84" w:tentative="1">
+    <w:lvl w:ilvl="5" w:tplc="81B2F1A8" w:tentative="1">
       <w:start w:val="1"/>
       <w:numFmt w:val="bullet"/>
       <w:lvlText w:val="■"/>
@@ -20121,7 +20153,7 @@
         <w:ind w:left="4320" w:hanging="360"/>
       </w:pPr>
     </w:lvl>
-    <w:lvl w:ilvl="6" w:tplc="1A581F16" w:tentative="1">
+    <w:lvl w:ilvl="6" w:tplc="5A8640F0" w:tentative="1">
       <w:start w:val="1"/>
       <w:numFmt w:val="bullet"/>
       <w:lvlText w:val="●"/>
@@ -20130,7 +20162,7 @@
         <w:ind w:left="5040" w:hanging="360"/>
       </w:pPr>
     </w:lvl>
-    <w:lvl w:ilvl="7" w:tplc="EA9E698C" w:tentative="1">
+    <w:lvl w:ilvl="7" w:tplc="91C81222" w:tentative="1">
       <w:start w:val="1"/>
       <w:numFmt w:val="bullet"/>
       <w:lvlText w:val="●"/>
@@ -20139,7 +20171,7 @@
         <w:ind w:left="5760" w:hanging="360"/>
       </w:pPr>
     </w:lvl>
-    <w:lvl w:ilvl="8" w:tplc="8110BBB4" w:tentative="1">
+    <w:lvl w:ilvl="8" w:tplc="F6688AAA" w:tentative="1">
       <w:start w:val="1"/>
       <w:numFmt w:val="bullet"/>
       <w:lvlText w:val="●"/>
@@ -20149,32 +20181,32 @@
       </w:pPr>
     </w:lvl>
   </w:abstractNum>
-  <w:num w:numId="1" w16cid:durableId="1149857512">
+  <w:num w:numId="1" w16cid:durableId="1307733908">
     <w:abstractNumId w:val="2"/>
     <w:lvlOverride w:ilvl="0">
       <w:startOverride w:val="1"/>
     </w:lvlOverride>
   </w:num>
-  <w:num w:numId="2" w16cid:durableId="373308256">
+  <w:num w:numId="2" w16cid:durableId="1303344487">
+    <w:abstractNumId w:val="0"/>
+    <w:lvlOverride w:ilvl="0">
+      <w:startOverride w:val="1"/>
+    </w:lvlOverride>
+  </w:num>
+  <w:num w:numId="3" w16cid:durableId="1286540178">
     <w:abstractNumId w:val="1"/>
     <w:lvlOverride w:ilvl="0">
       <w:startOverride w:val="1"/>
     </w:lvlOverride>
   </w:num>
-  <w:num w:numId="3" w16cid:durableId="2105104047">
-    <w:abstractNumId w:val="0"/>
+  <w:num w:numId="4" w16cid:durableId="938373414">
+    <w:abstractNumId w:val="1"/>
     <w:lvlOverride w:ilvl="0">
       <w:startOverride w:val="1"/>
     </w:lvlOverride>
   </w:num>
-  <w:num w:numId="4" w16cid:durableId="1263951370">
-    <w:abstractNumId w:val="0"/>
-    <w:lvlOverride w:ilvl="0">
-      <w:startOverride w:val="1"/>
-    </w:lvlOverride>
-  </w:num>
-  <w:num w:numId="5" w16cid:durableId="644046950">
-    <w:abstractNumId w:val="0"/>
+  <w:num w:numId="5" w16cid:durableId="2079477136">
+    <w:abstractNumId w:val="1"/>
     <w:lvlOverride w:ilvl="0">
       <w:startOverride w:val="1"/>
     </w:lvlOverride>
@@ -20803,7 +20835,7 @@
     <w:autoRedefine/>
     <w:uiPriority w:val="39"/>
     <w:unhideWhenUsed/>
-    <w:rsid w:val="00392174"/>
+    <w:rsid w:val="00FB1743"/>
     <w:pPr>
       <w:spacing w:after="100"/>
     </w:pPr>

</xml_diff>

<commit_message>
Keep the repository to the submission: drop test suite, run harness and duplicate refresh viewer (kept locally for validation)
</commit_message>
<xml_diff>
--- a/docs/IMPLEMENTATION_REPORT.docx
+++ b/docs/IMPLEMENTATION_REPORT.docx
@@ -335,7 +335,7 @@
                 <w:sz w:val="17"/>
                 <w:szCs w:val="17"/>
               </w:rPr>
-              <w:t>about 1,950 lines of agent code, plus 553 lines of tests and 412 lines of verification tooling</w:t>
+              <w:t>about 1,950 lines of agent code and 330 lines of tooling in the repository; a 553-line test suite and an 82-line run harness were used for validation</w:t>
             </w:r>
           </w:p>
         </w:tc>
@@ -430,7 +430,7 @@
     <w:sdt>
       <w:sdtPr>
         <w:alias w:val="Contents"/>
-        <w:id w:val="1587574919"/>
+        <w:id w:val="-1848704011"/>
       </w:sdtPr>
       <w:sdtEndPr/>
       <w:sdtContent>
@@ -453,7 +453,7 @@
           <w:r>
             <w:fldChar w:fldCharType="separate"/>
           </w:r>
-          <w:hyperlink w:anchor="_Toc243071268" w:history="1">
+          <w:hyperlink w:anchor="_Toc243071655" w:history="1">
             <w:r>
               <w:rPr>
                 <w:rStyle w:val="Hyperlink"/>
@@ -477,7 +477,7 @@
               <w:rPr>
                 <w:noProof/>
               </w:rPr>
-              <w:instrText xml:space="preserve"> PAGEREF _Toc243071268 \h </w:instrText>
+              <w:instrText xml:space="preserve"> PAGEREF _Toc243071655 \h </w:instrText>
             </w:r>
             <w:r>
               <w:rPr>
@@ -514,7 +514,7 @@
               <w:noProof/>
             </w:rPr>
           </w:pPr>
-          <w:hyperlink w:anchor="_Toc243071269" w:history="1">
+          <w:hyperlink w:anchor="_Toc243071656" w:history="1">
             <w:r>
               <w:rPr>
                 <w:rStyle w:val="Hyperlink"/>
@@ -538,7 +538,7 @@
               <w:rPr>
                 <w:noProof/>
               </w:rPr>
-              <w:instrText xml:space="preserve"> PAGEREF _Toc243071269 \h </w:instrText>
+              <w:instrText xml:space="preserve"> PAGEREF _Toc243071656 \h </w:instrText>
             </w:r>
             <w:r>
               <w:rPr>
@@ -575,7 +575,7 @@
               <w:noProof/>
             </w:rPr>
           </w:pPr>
-          <w:hyperlink w:anchor="_Toc243071270" w:history="1">
+          <w:hyperlink w:anchor="_Toc243071657" w:history="1">
             <w:r>
               <w:rPr>
                 <w:rStyle w:val="Hyperlink"/>
@@ -599,7 +599,7 @@
               <w:rPr>
                 <w:noProof/>
               </w:rPr>
-              <w:instrText xml:space="preserve"> PAGEREF _Toc243071270 \h </w:instrText>
+              <w:instrText xml:space="preserve"> PAGEREF _Toc243071657 \h </w:instrText>
             </w:r>
             <w:r>
               <w:rPr>
@@ -636,7 +636,7 @@
               <w:noProof/>
             </w:rPr>
           </w:pPr>
-          <w:hyperlink w:anchor="_Toc243071271" w:history="1">
+          <w:hyperlink w:anchor="_Toc243071658" w:history="1">
             <w:r>
               <w:rPr>
                 <w:rStyle w:val="Hyperlink"/>
@@ -660,7 +660,7 @@
               <w:rPr>
                 <w:noProof/>
               </w:rPr>
-              <w:instrText xml:space="preserve"> PAGEREF _Toc243071271 \h </w:instrText>
+              <w:instrText xml:space="preserve"> PAGEREF _Toc243071658 \h </w:instrText>
             </w:r>
             <w:r>
               <w:rPr>
@@ -697,7 +697,7 @@
               <w:noProof/>
             </w:rPr>
           </w:pPr>
-          <w:hyperlink w:anchor="_Toc243071272" w:history="1">
+          <w:hyperlink w:anchor="_Toc243071659" w:history="1">
             <w:r>
               <w:rPr>
                 <w:rStyle w:val="Hyperlink"/>
@@ -721,7 +721,7 @@
               <w:rPr>
                 <w:noProof/>
               </w:rPr>
-              <w:instrText xml:space="preserve"> PAGEREF _Toc243071272 \h </w:instrText>
+              <w:instrText xml:space="preserve"> PAGEREF _Toc243071659 \h </w:instrText>
             </w:r>
             <w:r>
               <w:rPr>
@@ -758,7 +758,7 @@
               <w:noProof/>
             </w:rPr>
           </w:pPr>
-          <w:hyperlink w:anchor="_Toc243071273" w:history="1">
+          <w:hyperlink w:anchor="_Toc243071660" w:history="1">
             <w:r>
               <w:rPr>
                 <w:rStyle w:val="Hyperlink"/>
@@ -782,7 +782,7 @@
               <w:rPr>
                 <w:noProof/>
               </w:rPr>
-              <w:instrText xml:space="preserve"> PAGEREF _Toc243071273 \h </w:instrText>
+              <w:instrText xml:space="preserve"> PAGEREF _Toc243071660 \h </w:instrText>
             </w:r>
             <w:r>
               <w:rPr>
@@ -819,7 +819,7 @@
               <w:noProof/>
             </w:rPr>
           </w:pPr>
-          <w:hyperlink w:anchor="_Toc243071274" w:history="1">
+          <w:hyperlink w:anchor="_Toc243071661" w:history="1">
             <w:r>
               <w:rPr>
                 <w:rStyle w:val="Hyperlink"/>
@@ -843,7 +843,7 @@
               <w:rPr>
                 <w:noProof/>
               </w:rPr>
-              <w:instrText xml:space="preserve"> PAGEREF _Toc243071274 \h </w:instrText>
+              <w:instrText xml:space="preserve"> PAGEREF _Toc243071661 \h </w:instrText>
             </w:r>
             <w:r>
               <w:rPr>
@@ -880,7 +880,7 @@
               <w:noProof/>
             </w:rPr>
           </w:pPr>
-          <w:hyperlink w:anchor="_Toc243071275" w:history="1">
+          <w:hyperlink w:anchor="_Toc243071662" w:history="1">
             <w:r>
               <w:rPr>
                 <w:rStyle w:val="Hyperlink"/>
@@ -904,7 +904,7 @@
               <w:rPr>
                 <w:noProof/>
               </w:rPr>
-              <w:instrText xml:space="preserve"> PAGEREF _Toc243071275 \h </w:instrText>
+              <w:instrText xml:space="preserve"> PAGEREF _Toc243071662 \h </w:instrText>
             </w:r>
             <w:r>
               <w:rPr>
@@ -941,7 +941,7 @@
               <w:noProof/>
             </w:rPr>
           </w:pPr>
-          <w:hyperlink w:anchor="_Toc243071276" w:history="1">
+          <w:hyperlink w:anchor="_Toc243071663" w:history="1">
             <w:r>
               <w:rPr>
                 <w:rStyle w:val="Hyperlink"/>
@@ -965,7 +965,7 @@
               <w:rPr>
                 <w:noProof/>
               </w:rPr>
-              <w:instrText xml:space="preserve"> PAGEREF _Toc243071276 \h </w:instrText>
+              <w:instrText xml:space="preserve"> PAGEREF _Toc243071663 \h </w:instrText>
             </w:r>
             <w:r>
               <w:rPr>
@@ -1002,7 +1002,7 @@
               <w:noProof/>
             </w:rPr>
           </w:pPr>
-          <w:hyperlink w:anchor="_Toc243071277" w:history="1">
+          <w:hyperlink w:anchor="_Toc243071664" w:history="1">
             <w:r>
               <w:rPr>
                 <w:rStyle w:val="Hyperlink"/>
@@ -1026,7 +1026,7 @@
               <w:rPr>
                 <w:noProof/>
               </w:rPr>
-              <w:instrText xml:space="preserve"> PAGEREF _Toc243071277 \h </w:instrText>
+              <w:instrText xml:space="preserve"> PAGEREF _Toc243071664 \h </w:instrText>
             </w:r>
             <w:r>
               <w:rPr>
@@ -1063,7 +1063,7 @@
               <w:noProof/>
             </w:rPr>
           </w:pPr>
-          <w:hyperlink w:anchor="_Toc243071278" w:history="1">
+          <w:hyperlink w:anchor="_Toc243071665" w:history="1">
             <w:r>
               <w:rPr>
                 <w:rStyle w:val="Hyperlink"/>
@@ -1087,7 +1087,7 @@
               <w:rPr>
                 <w:noProof/>
               </w:rPr>
-              <w:instrText xml:space="preserve"> PAGEREF _Toc243071278 \h </w:instrText>
+              <w:instrText xml:space="preserve"> PAGEREF _Toc243071665 \h </w:instrText>
             </w:r>
             <w:r>
               <w:rPr>
@@ -1124,7 +1124,7 @@
               <w:noProof/>
             </w:rPr>
           </w:pPr>
-          <w:hyperlink w:anchor="_Toc243071279" w:history="1">
+          <w:hyperlink w:anchor="_Toc243071666" w:history="1">
             <w:r>
               <w:rPr>
                 <w:rStyle w:val="Hyperlink"/>
@@ -1148,7 +1148,7 @@
               <w:rPr>
                 <w:noProof/>
               </w:rPr>
-              <w:instrText xml:space="preserve"> PAGEREF _Toc243071279 \h </w:instrText>
+              <w:instrText xml:space="preserve"> PAGEREF _Toc243071666 \h </w:instrText>
             </w:r>
             <w:r>
               <w:rPr>
@@ -1185,7 +1185,7 @@
               <w:noProof/>
             </w:rPr>
           </w:pPr>
-          <w:hyperlink w:anchor="_Toc243071280" w:history="1">
+          <w:hyperlink w:anchor="_Toc243071667" w:history="1">
             <w:r>
               <w:rPr>
                 <w:rStyle w:val="Hyperlink"/>
@@ -1209,7 +1209,7 @@
               <w:rPr>
                 <w:noProof/>
               </w:rPr>
-              <w:instrText xml:space="preserve"> PAGEREF _Toc243071280 \h </w:instrText>
+              <w:instrText xml:space="preserve"> PAGEREF _Toc243071667 \h </w:instrText>
             </w:r>
             <w:r>
               <w:rPr>
@@ -1246,7 +1246,7 @@
               <w:noProof/>
             </w:rPr>
           </w:pPr>
-          <w:hyperlink w:anchor="_Toc243071281" w:history="1">
+          <w:hyperlink w:anchor="_Toc243071668" w:history="1">
             <w:r>
               <w:rPr>
                 <w:rStyle w:val="Hyperlink"/>
@@ -1270,7 +1270,7 @@
               <w:rPr>
                 <w:noProof/>
               </w:rPr>
-              <w:instrText xml:space="preserve"> PAGEREF _Toc243071281 \h </w:instrText>
+              <w:instrText xml:space="preserve"> PAGEREF _Toc243071668 \h </w:instrText>
             </w:r>
             <w:r>
               <w:rPr>
@@ -1307,7 +1307,7 @@
               <w:noProof/>
             </w:rPr>
           </w:pPr>
-          <w:hyperlink w:anchor="_Toc243071282" w:history="1">
+          <w:hyperlink w:anchor="_Toc243071669" w:history="1">
             <w:r>
               <w:rPr>
                 <w:rStyle w:val="Hyperlink"/>
@@ -1331,7 +1331,7 @@
               <w:rPr>
                 <w:noProof/>
               </w:rPr>
-              <w:instrText xml:space="preserve"> PAGEREF _Toc243071282 \h </w:instrText>
+              <w:instrText xml:space="preserve"> PAGEREF _Toc243071669 \h </w:instrText>
             </w:r>
             <w:r>
               <w:rPr>
@@ -1368,7 +1368,7 @@
               <w:noProof/>
             </w:rPr>
           </w:pPr>
-          <w:hyperlink w:anchor="_Toc243071283" w:history="1">
+          <w:hyperlink w:anchor="_Toc243071670" w:history="1">
             <w:r>
               <w:rPr>
                 <w:rStyle w:val="Hyperlink"/>
@@ -1392,7 +1392,7 @@
               <w:rPr>
                 <w:noProof/>
               </w:rPr>
-              <w:instrText xml:space="preserve"> PAGEREF _Toc243071283 \h </w:instrText>
+              <w:instrText xml:space="preserve"> PAGEREF _Toc243071670 \h </w:instrText>
             </w:r>
             <w:r>
               <w:rPr>
@@ -1429,7 +1429,7 @@
               <w:noProof/>
             </w:rPr>
           </w:pPr>
-          <w:hyperlink w:anchor="_Toc243071284" w:history="1">
+          <w:hyperlink w:anchor="_Toc243071671" w:history="1">
             <w:r>
               <w:rPr>
                 <w:rStyle w:val="Hyperlink"/>
@@ -1453,7 +1453,7 @@
               <w:rPr>
                 <w:noProof/>
               </w:rPr>
-              <w:instrText xml:space="preserve"> PAGEREF _Toc243071284 \h </w:instrText>
+              <w:instrText xml:space="preserve"> PAGEREF _Toc243071671 \h </w:instrText>
             </w:r>
             <w:r>
               <w:rPr>
@@ -1496,7 +1496,7 @@
       <w:pPr>
         <w:pStyle w:val="Heading1"/>
       </w:pPr>
-      <w:bookmarkStart w:id="0" w:name="_Toc243071268"/>
+      <w:bookmarkStart w:id="0" w:name="_Toc243071655"/>
       <w:r>
         <w:t>1. Executive summary</w:t>
       </w:r>
@@ -1725,7 +1725,7 @@
       <w:pPr>
         <w:pStyle w:val="Heading1"/>
       </w:pPr>
-      <w:bookmarkStart w:id="1" w:name="_Toc243071269"/>
+      <w:bookmarkStart w:id="1" w:name="_Toc243071656"/>
       <w:r>
         <w:t>2. The challenge and its requirements</w:t>
       </w:r>
@@ -2765,7 +2765,7 @@
       <w:pPr>
         <w:pStyle w:val="Heading1"/>
       </w:pPr>
-      <w:bookmarkStart w:id="2" w:name="_Toc243071270"/>
+      <w:bookmarkStart w:id="2" w:name="_Toc243071657"/>
       <w:r>
         <w:t>3. Methodology</w:t>
       </w:r>
@@ -2915,7 +2915,7 @@
       <w:pPr>
         <w:pStyle w:val="Heading1"/>
       </w:pPr>
-      <w:bookmarkStart w:id="3" w:name="_Toc243071271"/>
+      <w:bookmarkStart w:id="3" w:name="_Toc243071658"/>
       <w:r>
         <w:t>4. Architecture</w:t>
       </w:r>
@@ -4743,94 +4743,6 @@
           </w:p>
         </w:tc>
       </w:tr>
-      <w:tr>
-        <w:trPr>
-          <w:cantSplit/>
-        </w:trPr>
-        <w:tc>
-          <w:tcPr>
-            <w:tcW w:w="2280" w:type="dxa"/>
-            <w:tcBorders>
-              <w:top w:val="single" w:sz="4" w:space="0" w:color="B7C4D3"/>
-              <w:left w:val="single" w:sz="4" w:space="0" w:color="B7C4D3"/>
-              <w:bottom w:val="single" w:sz="4" w:space="0" w:color="B7C4D3"/>
-              <w:right w:val="single" w:sz="4" w:space="0" w:color="B7C4D3"/>
-            </w:tcBorders>
-            <w:shd w:val="clear" w:color="auto" w:fill="F5F8FB"/>
-            <w:tcMar>
-              <w:top w:w="50" w:type="dxa"/>
-              <w:left w:w="90" w:type="dxa"/>
-              <w:bottom w:w="50" w:type="dxa"/>
-              <w:right w:w="90" w:type="dxa"/>
-            </w:tcMar>
-          </w:tcPr>
-          <w:p>
-            <w:r>
-              <w:rPr>
-                <w:rFonts w:ascii="Consolas" w:eastAsia="Consolas" w:hAnsi="Consolas" w:cs="Consolas"/>
-                <w:color w:val="333333"/>
-                <w:sz w:val="15"/>
-                <w:szCs w:val="15"/>
-              </w:rPr>
-              <w:t>tests/test_agent.py</w:t>
-            </w:r>
-          </w:p>
-        </w:tc>
-        <w:tc>
-          <w:tcPr>
-            <w:tcW w:w="665" w:type="dxa"/>
-            <w:tcBorders>
-              <w:top w:val="single" w:sz="4" w:space="0" w:color="B7C4D3"/>
-              <w:left w:val="single" w:sz="4" w:space="0" w:color="B7C4D3"/>
-              <w:bottom w:val="single" w:sz="4" w:space="0" w:color="B7C4D3"/>
-              <w:right w:val="single" w:sz="4" w:space="0" w:color="B7C4D3"/>
-            </w:tcBorders>
-            <w:shd w:val="clear" w:color="auto" w:fill="F5F8FB"/>
-            <w:tcMar>
-              <w:top w:w="50" w:type="dxa"/>
-              <w:left w:w="90" w:type="dxa"/>
-              <w:bottom w:w="50" w:type="dxa"/>
-              <w:right w:w="90" w:type="dxa"/>
-            </w:tcMar>
-          </w:tcPr>
-          <w:p>
-            <w:r>
-              <w:rPr>
-                <w:sz w:val="17"/>
-                <w:szCs w:val="17"/>
-              </w:rPr>
-              <w:t>553</w:t>
-            </w:r>
-          </w:p>
-        </w:tc>
-        <w:tc>
-          <w:tcPr>
-            <w:tcW w:w="6693" w:type="dxa"/>
-            <w:tcBorders>
-              <w:top w:val="single" w:sz="4" w:space="0" w:color="B7C4D3"/>
-              <w:left w:val="single" w:sz="4" w:space="0" w:color="B7C4D3"/>
-              <w:bottom w:val="single" w:sz="4" w:space="0" w:color="B7C4D3"/>
-              <w:right w:val="single" w:sz="4" w:space="0" w:color="B7C4D3"/>
-            </w:tcBorders>
-            <w:shd w:val="clear" w:color="auto" w:fill="F5F8FB"/>
-            <w:tcMar>
-              <w:top w:w="50" w:type="dxa"/>
-              <w:left w:w="90" w:type="dxa"/>
-              <w:bottom w:w="50" w:type="dxa"/>
-              <w:right w:w="90" w:type="dxa"/>
-            </w:tcMar>
-          </w:tcPr>
-          <w:p>
-            <w:r>
-              <w:rPr>
-                <w:sz w:val="17"/>
-                <w:szCs w:val="17"/>
-              </w:rPr>
-              <w:t>38 offline regression tests</w:t>
-            </w:r>
-          </w:p>
-        </w:tc>
-      </w:tr>
     </w:tbl>
     <w:p>
       <w:pPr>
@@ -4841,7 +4753,7 @@
       <w:pPr>
         <w:pStyle w:val="Heading1"/>
       </w:pPr>
-      <w:bookmarkStart w:id="4" w:name="_Toc243071272"/>
+      <w:bookmarkStart w:id="4" w:name="_Toc243071659"/>
       <w:r>
         <w:t>5. Technology stack</w:t>
       </w:r>
@@ -6306,7 +6218,7 @@
       <w:pPr>
         <w:pStyle w:val="Heading1"/>
       </w:pPr>
-      <w:bookmarkStart w:id="5" w:name="_Toc243071273"/>
+      <w:bookmarkStart w:id="5" w:name="_Toc243071660"/>
       <w:r>
         <w:t>6. Data sources</w:t>
       </w:r>
@@ -7659,7 +7571,7 @@
       <w:pPr>
         <w:pStyle w:val="Heading1"/>
       </w:pPr>
-      <w:bookmarkStart w:id="6" w:name="_Toc243071274"/>
+      <w:bookmarkStart w:id="6" w:name="_Toc243071661"/>
       <w:r>
         <w:t>7. Fact, evidence and envelope model</w:t>
       </w:r>
@@ -8218,7 +8130,7 @@
       <w:pPr>
         <w:pStyle w:val="Heading1"/>
       </w:pPr>
-      <w:bookmarkStart w:id="7" w:name="_Toc243071275"/>
+      <w:bookmarkStart w:id="7" w:name="_Toc243071662"/>
       <w:r>
         <w:t>8. Identity verification</w:t>
       </w:r>
@@ -9137,7 +9049,7 @@
       <w:pPr>
         <w:pStyle w:val="Heading1"/>
       </w:pPr>
-      <w:bookmarkStart w:id="8" w:name="_Toc243071276"/>
+      <w:bookmarkStart w:id="8" w:name="_Toc243071663"/>
       <w:r>
         <w:t>9. Other components</w:t>
       </w:r>
@@ -9586,7 +9498,7 @@
       <w:pPr>
         <w:pStyle w:val="Heading1"/>
       </w:pPr>
-      <w:bookmarkStart w:id="9" w:name="_Toc243071277"/>
+      <w:bookmarkStart w:id="9" w:name="_Toc243071664"/>
       <w:r>
         <w:t>10. Security</w:t>
       </w:r>
@@ -10479,7 +10391,7 @@
       <w:pPr>
         <w:pStyle w:val="Heading1"/>
       </w:pPr>
-      <w:bookmarkStart w:id="10" w:name="_Toc243071278"/>
+      <w:bookmarkStart w:id="10" w:name="_Toc243071665"/>
       <w:r>
         <w:t>11. Privacy and data protection</w:t>
       </w:r>
@@ -11043,7 +10955,7 @@
       <w:pPr>
         <w:pStyle w:val="Heading1"/>
       </w:pPr>
-      <w:bookmarkStart w:id="11" w:name="_Toc243071279"/>
+      <w:bookmarkStart w:id="11" w:name="_Toc243071666"/>
       <w:r>
         <w:t>12. Testing methodology</w:t>
       </w:r>
@@ -13152,7 +13064,7 @@
       <w:pPr>
         <w:pStyle w:val="Heading1"/>
       </w:pPr>
-      <w:bookmarkStart w:id="12" w:name="_Toc243071280"/>
+      <w:bookmarkStart w:id="12" w:name="_Toc243071667"/>
       <w:r>
         <w:t>13. Results at the frozen commit</w:t>
       </w:r>
@@ -17077,7 +16989,7 @@
       <w:pPr>
         <w:pStyle w:val="Heading1"/>
       </w:pPr>
-      <w:bookmarkStart w:id="13" w:name="_Toc243071281"/>
+      <w:bookmarkStart w:id="13" w:name="_Toc243071668"/>
       <w:r>
         <w:t>14. Defects found and fixed</w:t>
       </w:r>
@@ -18603,7 +18515,7 @@
       <w:pPr>
         <w:pStyle w:val="Heading1"/>
       </w:pPr>
-      <w:bookmarkStart w:id="14" w:name="_Toc243071282"/>
+      <w:bookmarkStart w:id="14" w:name="_Toc243071669"/>
       <w:r>
         <w:t>15. Limitations and future work</w:t>
       </w:r>
@@ -18725,7 +18637,7 @@
       <w:pPr>
         <w:pStyle w:val="Heading1"/>
       </w:pPr>
-      <w:bookmarkStart w:id="15" w:name="_Toc243071283"/>
+      <w:bookmarkStart w:id="15" w:name="_Toc243071670"/>
       <w:r>
         <w:t>16. Reproduction and submission</w:t>
       </w:r>
@@ -18832,7 +18744,7 @@
         <w:spacing w:after="120" w:line="276" w:lineRule="auto"/>
       </w:pPr>
       <w:r>
-        <w:t>Verification:</w:t>
+        <w:t>Checking a run's output against the contract (the verifier is included in the repository):</w:t>
       </w:r>
     </w:p>
     <w:p>
@@ -18846,21 +18758,7 @@
           <w:sz w:val="18"/>
           <w:szCs w:val="18"/>
         </w:rPr>
-        <w:t>python tests/test_agent.py</w:t>
-      </w:r>
-    </w:p>
-    <w:p>
-      <w:pPr>
-        <w:shd w:val="clear" w:color="auto" w:fill="F2F2F2"/>
-        <w:ind w:left="200"/>
-      </w:pPr>
-      <w:r>
-        <w:rPr>
-          <w:rFonts w:ascii="Consolas" w:eastAsia="Consolas" w:hAnsi="Consolas" w:cs="Consolas"/>
-          <w:sz w:val="18"/>
-          <w:szCs w:val="18"/>
-        </w:rPr>
-        <w:t>bash testruns/run_all.sh &amp;&amp; python testruns/verify_all.py</w:t>
+        <w:t>python tools/verify_run.py --input companies.jsonl --output out</w:t>
       </w:r>
     </w:p>
     <w:p>
@@ -18873,6 +18771,26 @@
         <w:spacing w:after="120" w:line="276" w:lineRule="auto"/>
       </w:pPr>
       <w:r>
+        <w:t xml:space="preserve">The offline test suite and the 13-run test harness were used for validation and are kept outside the submitted repository; their results are reported in sections 12 and 13 and in </w:t>
+      </w:r>
+      <w:r>
+        <w:rPr>
+          <w:rFonts w:ascii="Consolas" w:eastAsia="Consolas" w:hAnsi="Consolas" w:cs="Consolas"/>
+          <w:color w:val="333333"/>
+          <w:sz w:val="18"/>
+          <w:szCs w:val="18"/>
+        </w:rPr>
+        <w:t>TEST_REPORT.md</w:t>
+      </w:r>
+      <w:r>
+        <w:t>.</w:t>
+      </w:r>
+    </w:p>
+    <w:p>
+      <w:pPr>
+        <w:spacing w:after="120" w:line="276" w:lineRule="auto"/>
+      </w:pPr>
+      <w:r>
         <w:rPr>
           <w:b/>
           <w:bCs/>
@@ -18880,7 +18798,7 @@
         <w:t>What gets submitted:</w:t>
       </w:r>
       <w:r>
-        <w:t xml:space="preserve"> the git repository (agent code, docs, the smoke test with its refresh run, the 1,000-profile dataset, tests, tools and the test-harness inputs). Raw run outputs, the local virtual environment and development scratch files are excluded. The agent code is frozen at </w:t>
+        <w:t xml:space="preserve"> the git repository (agent code, docs, the smoke test with its refresh run, the 1,000-profile dataset and the tools, including the contract verifier). The offline tests, the run harness, raw run outputs, the local virtual environment and development scratch files are excluded. The agent code is frozen at </w:t>
       </w:r>
       <w:r>
         <w:rPr>
@@ -18899,11 +18817,19 @@
       <w:pPr>
         <w:pStyle w:val="Heading1"/>
       </w:pPr>
-      <w:bookmarkStart w:id="16" w:name="_Toc243071284"/>
+      <w:bookmarkStart w:id="16" w:name="_Toc243071671"/>
       <w:r>
         <w:t>Appendix A: Offline test inventory</w:t>
       </w:r>
       <w:bookmarkEnd w:id="16"/>
+    </w:p>
+    <w:p>
+      <w:pPr>
+        <w:spacing w:after="120" w:line="276" w:lineRule="auto"/>
+      </w:pPr>
+      <w:r>
+        <w:t>These tests were run against the frozen code for validation; the suite itself is kept outside the submitted repository.</w:t>
+      </w:r>
     </w:p>
     <w:tbl>
       <w:tblPr>
@@ -19984,10 +19910,64 @@
 <file path=word/numbering.xml><?xml version="1.0" encoding="utf-8"?>
 <w:numbering xmlns:wpc="http://schemas.microsoft.com/office/word/2010/wordprocessingCanvas" xmlns:cx="http://schemas.microsoft.com/office/drawing/2014/chartex" xmlns:cx1="http://schemas.microsoft.com/office/drawing/2015/9/8/chartex" xmlns:cx2="http://schemas.microsoft.com/office/drawing/2015/10/21/chartex" xmlns:cx3="http://schemas.microsoft.com/office/drawing/2016/5/9/chartex" xmlns:cx4="http://schemas.microsoft.com/office/drawing/2016/5/10/chartex" xmlns:cx5="http://schemas.microsoft.com/office/drawing/2016/5/11/chartex" xmlns:cx6="http://schemas.microsoft.com/office/drawing/2016/5/12/chartex" xmlns:cx7="http://schemas.microsoft.com/office/drawing/2016/5/13/chartex" xmlns:cx8="http://schemas.microsoft.com/office/drawing/2016/5/14/chartex" xmlns:mc="http://schemas.openxmlformats.org/markup-compatibility/2006" xmlns:aink="http://schemas.microsoft.com/office/drawing/2016/ink" xmlns:am3d="http://schemas.microsoft.com/office/drawing/2017/model3d" xmlns:o="urn:schemas-microsoft-com:office:office" xmlns:oel="http://schemas.microsoft.com/office/2019/extlst" xmlns:r="http://schemas.openxmlformats.org/officeDocument/2006/relationships" xmlns:m="http://schemas.openxmlformats.org/officeDocument/2006/math" xmlns:v="urn:schemas-microsoft-com:vml" xmlns:wp14="http://schemas.microsoft.com/office/word/2010/wordprocessingDrawing" xmlns:wp="http://schemas.openxmlformats.org/drawingml/2006/wordprocessingDrawing" xmlns:w10="urn:schemas-microsoft-com:office:word" xmlns:w="http://schemas.openxmlformats.org/wordprocessingml/2006/main" xmlns:w14="http://schemas.microsoft.com/office/word/2010/wordml" xmlns:w15="http://schemas.microsoft.com/office/word/2012/wordml" xmlns:w16cex="http://schemas.microsoft.com/office/word/2018/wordml/cex" xmlns:w16cid="http://schemas.microsoft.com/office/word/2016/wordml/cid" xmlns:w16="http://schemas.microsoft.com/office/word/2018/wordml" xmlns:w16du="http://schemas.microsoft.com/office/word/2023/wordml/word16du" xmlns:w16sdtdh="http://schemas.microsoft.com/office/word/2020/wordml/sdtdatahash" xmlns:w16sdtfl="http://schemas.microsoft.com/office/word/2024/wordml/sdtformatlock" xmlns:w16se="http://schemas.microsoft.com/office/word/2015/wordml/symex" xmlns:wpg="http://schemas.microsoft.com/office/word/2010/wordprocessingGroup" xmlns:wpi="http://schemas.microsoft.com/office/word/2010/wordprocessingInk" xmlns:wne="http://schemas.microsoft.com/office/word/2006/wordml" xmlns:wps="http://schemas.microsoft.com/office/word/2010/wordprocessingShape" mc:Ignorable="w14 w15 w16se w16cid w16 w16cex w16sdtdh w16sdtfl w16du wp14">
   <w:abstractNum w:abstractNumId="0" w15:restartNumberingAfterBreak="0">
-    <w:nsid w:val="14FA5E4E"/>
+    <w:nsid w:val="0A231A6F"/>
     <w:multiLevelType w:val="hybridMultilevel"/>
-    <w:tmpl w:val="432436EC"/>
-    <w:lvl w:ilvl="0" w:tplc="77F8CB52">
+    <w:tmpl w:val="7B840750"/>
+    <w:lvl w:ilvl="0" w:tplc="C546804A">
+      <w:start w:val="1"/>
+      <w:numFmt w:val="decimal"/>
+      <w:lvlText w:val="%1."/>
+      <w:lvlJc w:val="left"/>
+      <w:pPr>
+        <w:ind w:left="540" w:hanging="360"/>
+      </w:pPr>
+    </w:lvl>
+    <w:lvl w:ilvl="1" w:tplc="18C46202">
+      <w:numFmt w:val="decimal"/>
+      <w:lvlText w:val=""/>
+      <w:lvlJc w:val="left"/>
+    </w:lvl>
+    <w:lvl w:ilvl="2" w:tplc="728E37FE">
+      <w:numFmt w:val="decimal"/>
+      <w:lvlText w:val=""/>
+      <w:lvlJc w:val="left"/>
+    </w:lvl>
+    <w:lvl w:ilvl="3" w:tplc="5B0E86CA">
+      <w:numFmt w:val="decimal"/>
+      <w:lvlText w:val=""/>
+      <w:lvlJc w:val="left"/>
+    </w:lvl>
+    <w:lvl w:ilvl="4" w:tplc="7480BC96">
+      <w:numFmt w:val="decimal"/>
+      <w:lvlText w:val=""/>
+      <w:lvlJc w:val="left"/>
+    </w:lvl>
+    <w:lvl w:ilvl="5" w:tplc="3AD6A1F0">
+      <w:numFmt w:val="decimal"/>
+      <w:lvlText w:val=""/>
+      <w:lvlJc w:val="left"/>
+    </w:lvl>
+    <w:lvl w:ilvl="6" w:tplc="FF8AF740">
+      <w:numFmt w:val="decimal"/>
+      <w:lvlText w:val=""/>
+      <w:lvlJc w:val="left"/>
+    </w:lvl>
+    <w:lvl w:ilvl="7" w:tplc="1AA6D536">
+      <w:numFmt w:val="decimal"/>
+      <w:lvlText w:val=""/>
+      <w:lvlJc w:val="left"/>
+    </w:lvl>
+    <w:lvl w:ilvl="8" w:tplc="19E4BE30">
+      <w:numFmt w:val="decimal"/>
+      <w:lvlText w:val=""/>
+      <w:lvlJc w:val="left"/>
+    </w:lvl>
+  </w:abstractNum>
+  <w:abstractNum w:abstractNumId="1" w15:restartNumberingAfterBreak="0">
+    <w:nsid w:val="5FA10058"/>
+    <w:multiLevelType w:val="hybridMultilevel"/>
+    <w:tmpl w:val="D85A77D0"/>
+    <w:lvl w:ilvl="0" w:tplc="FD182252">
       <w:start w:val="1"/>
       <w:numFmt w:val="bullet"/>
       <w:lvlText w:val="•"/>
@@ -19996,7 +19976,7 @@
         <w:ind w:left="540" w:hanging="270"/>
       </w:pPr>
     </w:lvl>
-    <w:lvl w:ilvl="1" w:tplc="8D28C1B6">
+    <w:lvl w:ilvl="1" w:tplc="00C622DA">
       <w:start w:val="1"/>
       <w:numFmt w:val="bullet"/>
       <w:lvlText w:val="–"/>
@@ -20005,101 +19985,47 @@
         <w:ind w:left="1080" w:hanging="270"/>
       </w:pPr>
     </w:lvl>
-    <w:lvl w:ilvl="2" w:tplc="F54C0E28">
+    <w:lvl w:ilvl="2" w:tplc="7E7E3590">
       <w:numFmt w:val="decimal"/>
       <w:lvlText w:val=""/>
       <w:lvlJc w:val="left"/>
     </w:lvl>
-    <w:lvl w:ilvl="3" w:tplc="7F2E9F76">
+    <w:lvl w:ilvl="3" w:tplc="6474218A">
       <w:numFmt w:val="decimal"/>
       <w:lvlText w:val=""/>
       <w:lvlJc w:val="left"/>
     </w:lvl>
-    <w:lvl w:ilvl="4" w:tplc="11321388">
+    <w:lvl w:ilvl="4" w:tplc="10D29594">
       <w:numFmt w:val="decimal"/>
       <w:lvlText w:val=""/>
       <w:lvlJc w:val="left"/>
     </w:lvl>
-    <w:lvl w:ilvl="5" w:tplc="BBF6797E">
+    <w:lvl w:ilvl="5" w:tplc="DF4AA26C">
       <w:numFmt w:val="decimal"/>
       <w:lvlText w:val=""/>
       <w:lvlJc w:val="left"/>
     </w:lvl>
-    <w:lvl w:ilvl="6" w:tplc="46E2C6CE">
+    <w:lvl w:ilvl="6" w:tplc="8940F212">
       <w:numFmt w:val="decimal"/>
       <w:lvlText w:val=""/>
       <w:lvlJc w:val="left"/>
     </w:lvl>
-    <w:lvl w:ilvl="7" w:tplc="40A460BE">
+    <w:lvl w:ilvl="7" w:tplc="37BED5C2">
       <w:numFmt w:val="decimal"/>
       <w:lvlText w:val=""/>
       <w:lvlJc w:val="left"/>
     </w:lvl>
-    <w:lvl w:ilvl="8" w:tplc="C824B370">
-      <w:numFmt w:val="decimal"/>
-      <w:lvlText w:val=""/>
-      <w:lvlJc w:val="left"/>
-    </w:lvl>
-  </w:abstractNum>
-  <w:abstractNum w:abstractNumId="1" w15:restartNumberingAfterBreak="0">
-    <w:nsid w:val="22263CB1"/>
-    <w:multiLevelType w:val="hybridMultilevel"/>
-    <w:tmpl w:val="3F7AA700"/>
-    <w:lvl w:ilvl="0" w:tplc="4F1C6BBC">
-      <w:start w:val="1"/>
-      <w:numFmt w:val="decimal"/>
-      <w:lvlText w:val="%1."/>
-      <w:lvlJc w:val="left"/>
-      <w:pPr>
-        <w:ind w:left="540" w:hanging="360"/>
-      </w:pPr>
-    </w:lvl>
-    <w:lvl w:ilvl="1" w:tplc="7FC049C4">
-      <w:numFmt w:val="decimal"/>
-      <w:lvlText w:val=""/>
-      <w:lvlJc w:val="left"/>
-    </w:lvl>
-    <w:lvl w:ilvl="2" w:tplc="65643C26">
-      <w:numFmt w:val="decimal"/>
-      <w:lvlText w:val=""/>
-      <w:lvlJc w:val="left"/>
-    </w:lvl>
-    <w:lvl w:ilvl="3" w:tplc="CCEAD7E6">
-      <w:numFmt w:val="decimal"/>
-      <w:lvlText w:val=""/>
-      <w:lvlJc w:val="left"/>
-    </w:lvl>
-    <w:lvl w:ilvl="4" w:tplc="1B18C298">
-      <w:numFmt w:val="decimal"/>
-      <w:lvlText w:val=""/>
-      <w:lvlJc w:val="left"/>
-    </w:lvl>
-    <w:lvl w:ilvl="5" w:tplc="B73E54FE">
-      <w:numFmt w:val="decimal"/>
-      <w:lvlText w:val=""/>
-      <w:lvlJc w:val="left"/>
-    </w:lvl>
-    <w:lvl w:ilvl="6" w:tplc="E7D0AFA2">
-      <w:numFmt w:val="decimal"/>
-      <w:lvlText w:val=""/>
-      <w:lvlJc w:val="left"/>
-    </w:lvl>
-    <w:lvl w:ilvl="7" w:tplc="800A7D4E">
-      <w:numFmt w:val="decimal"/>
-      <w:lvlText w:val=""/>
-      <w:lvlJc w:val="left"/>
-    </w:lvl>
-    <w:lvl w:ilvl="8" w:tplc="BAAE39D8">
+    <w:lvl w:ilvl="8" w:tplc="31D643EE">
       <w:numFmt w:val="decimal"/>
       <w:lvlText w:val=""/>
       <w:lvlJc w:val="left"/>
     </w:lvl>
   </w:abstractNum>
   <w:abstractNum w:abstractNumId="2" w15:restartNumberingAfterBreak="0">
-    <w:nsid w:val="2D0421DA"/>
+    <w:nsid w:val="696D574E"/>
     <w:multiLevelType w:val="hybridMultilevel"/>
-    <w:tmpl w:val="74067B74"/>
-    <w:lvl w:ilvl="0" w:tplc="9FFAB720" w:tentative="1">
+    <w:tmpl w:val="F0709B64"/>
+    <w:lvl w:ilvl="0" w:tplc="B09CD2C8" w:tentative="1">
       <w:start w:val="1"/>
       <w:numFmt w:val="bullet"/>
       <w:lvlText w:val="●"/>
@@ -20108,7 +20034,7 @@
         <w:ind w:left="720" w:hanging="360"/>
       </w:pPr>
     </w:lvl>
-    <w:lvl w:ilvl="1" w:tplc="B8A89E5A" w:tentative="1">
+    <w:lvl w:ilvl="1" w:tplc="F4D2B166" w:tentative="1">
       <w:start w:val="1"/>
       <w:numFmt w:val="bullet"/>
       <w:lvlText w:val="○"/>
@@ -20117,7 +20043,7 @@
         <w:ind w:left="1440" w:hanging="360"/>
       </w:pPr>
     </w:lvl>
-    <w:lvl w:ilvl="2" w:tplc="4A563D28" w:tentative="1">
+    <w:lvl w:ilvl="2" w:tplc="39166D6E" w:tentative="1">
       <w:start w:val="1"/>
       <w:numFmt w:val="bullet"/>
       <w:lvlText w:val="■"/>
@@ -20126,7 +20052,7 @@
         <w:ind w:left="2160" w:hanging="360"/>
       </w:pPr>
     </w:lvl>
-    <w:lvl w:ilvl="3" w:tplc="94F27DFE" w:tentative="1">
+    <w:lvl w:ilvl="3" w:tplc="B1B039DE" w:tentative="1">
       <w:start w:val="1"/>
       <w:numFmt w:val="bullet"/>
       <w:lvlText w:val="●"/>
@@ -20135,7 +20061,7 @@
         <w:ind w:left="2880" w:hanging="360"/>
       </w:pPr>
     </w:lvl>
-    <w:lvl w:ilvl="4" w:tplc="FC38A982" w:tentative="1">
+    <w:lvl w:ilvl="4" w:tplc="41CA34E0" w:tentative="1">
       <w:start w:val="1"/>
       <w:numFmt w:val="bullet"/>
       <w:lvlText w:val="○"/>
@@ -20144,7 +20070,7 @@
         <w:ind w:left="3600" w:hanging="360"/>
       </w:pPr>
     </w:lvl>
-    <w:lvl w:ilvl="5" w:tplc="81B2F1A8" w:tentative="1">
+    <w:lvl w:ilvl="5" w:tplc="DD68A29E" w:tentative="1">
       <w:start w:val="1"/>
       <w:numFmt w:val="bullet"/>
       <w:lvlText w:val="■"/>
@@ -20153,7 +20079,7 @@
         <w:ind w:left="4320" w:hanging="360"/>
       </w:pPr>
     </w:lvl>
-    <w:lvl w:ilvl="6" w:tplc="5A8640F0" w:tentative="1">
+    <w:lvl w:ilvl="6" w:tplc="242C1592" w:tentative="1">
       <w:start w:val="1"/>
       <w:numFmt w:val="bullet"/>
       <w:lvlText w:val="●"/>
@@ -20162,7 +20088,7 @@
         <w:ind w:left="5040" w:hanging="360"/>
       </w:pPr>
     </w:lvl>
-    <w:lvl w:ilvl="7" w:tplc="91C81222" w:tentative="1">
+    <w:lvl w:ilvl="7" w:tplc="FF0898B2" w:tentative="1">
       <w:start w:val="1"/>
       <w:numFmt w:val="bullet"/>
       <w:lvlText w:val="●"/>
@@ -20171,7 +20097,7 @@
         <w:ind w:left="5760" w:hanging="360"/>
       </w:pPr>
     </w:lvl>
-    <w:lvl w:ilvl="8" w:tplc="F6688AAA" w:tentative="1">
+    <w:lvl w:ilvl="8" w:tplc="68BEC49A" w:tentative="1">
       <w:start w:val="1"/>
       <w:numFmt w:val="bullet"/>
       <w:lvlText w:val="●"/>
@@ -20181,32 +20107,32 @@
       </w:pPr>
     </w:lvl>
   </w:abstractNum>
-  <w:num w:numId="1" w16cid:durableId="1307733908">
+  <w:num w:numId="1" w16cid:durableId="1516653366">
     <w:abstractNumId w:val="2"/>
     <w:lvlOverride w:ilvl="0">
       <w:startOverride w:val="1"/>
     </w:lvlOverride>
   </w:num>
-  <w:num w:numId="2" w16cid:durableId="1303344487">
+  <w:num w:numId="2" w16cid:durableId="1894347324">
+    <w:abstractNumId w:val="1"/>
+    <w:lvlOverride w:ilvl="0">
+      <w:startOverride w:val="1"/>
+    </w:lvlOverride>
+  </w:num>
+  <w:num w:numId="3" w16cid:durableId="1749301331">
     <w:abstractNumId w:val="0"/>
     <w:lvlOverride w:ilvl="0">
       <w:startOverride w:val="1"/>
     </w:lvlOverride>
   </w:num>
-  <w:num w:numId="3" w16cid:durableId="1286540178">
-    <w:abstractNumId w:val="1"/>
+  <w:num w:numId="4" w16cid:durableId="1564753071">
+    <w:abstractNumId w:val="0"/>
     <w:lvlOverride w:ilvl="0">
       <w:startOverride w:val="1"/>
     </w:lvlOverride>
   </w:num>
-  <w:num w:numId="4" w16cid:durableId="938373414">
-    <w:abstractNumId w:val="1"/>
-    <w:lvlOverride w:ilvl="0">
-      <w:startOverride w:val="1"/>
-    </w:lvlOverride>
-  </w:num>
-  <w:num w:numId="5" w16cid:durableId="2079477136">
-    <w:abstractNumId w:val="1"/>
+  <w:num w:numId="5" w16cid:durableId="815611459">
+    <w:abstractNumId w:val="0"/>
     <w:lvlOverride w:ilvl="0">
       <w:startOverride w:val="1"/>
     </w:lvlOverride>
@@ -20835,7 +20761,7 @@
     <w:autoRedefine/>
     <w:uiPriority w:val="39"/>
     <w:unhideWhenUsed/>
-    <w:rsid w:val="00FB1743"/>
+    <w:rsid w:val="00A155A5"/>
     <w:pPr>
       <w:spacing w:after="100"/>
     </w:pPr>

</xml_diff>

<commit_message>
Final verification at afc3f0a (code freeze): report, 1,000-profile dataset, smoke artifacts, implementation report
</commit_message>
<xml_diff>
--- a/docs/IMPLEMENTATION_REPORT.docx
+++ b/docs/IMPLEMENTATION_REPORT.docx
@@ -174,46 +174,14 @@
                 <w:sz w:val="15"/>
                 <w:szCs w:val="15"/>
               </w:rPr>
-              <w:t>3202c93c0b40c69d54405af20057bb19f7ded33b</w:t>
-            </w:r>
-            <w:r>
-              <w:rPr>
-                <w:sz w:val="17"/>
-                <w:szCs w:val="17"/>
-              </w:rPr>
-              <w:t xml:space="preserve"> (code freeze; all results in this report were produced at this commit; file tree </w:t>
-            </w:r>
-            <w:r>
-              <w:rPr>
-                <w:rFonts w:ascii="Consolas" w:eastAsia="Consolas" w:hAnsi="Consolas" w:cs="Consolas"/>
-                <w:color w:val="333333"/>
-                <w:sz w:val="15"/>
-                <w:szCs w:val="15"/>
-              </w:rPr>
-              <w:t>44c2418</w:t>
-            </w:r>
-            <w:r>
-              <w:rPr>
-                <w:sz w:val="17"/>
-                <w:szCs w:val="17"/>
-              </w:rPr>
-              <w:t xml:space="preserve">, identical to the originally tested commit </w:t>
-            </w:r>
-            <w:r>
-              <w:rPr>
-                <w:rFonts w:ascii="Consolas" w:eastAsia="Consolas" w:hAnsi="Consolas" w:cs="Consolas"/>
-                <w:color w:val="333333"/>
-                <w:sz w:val="15"/>
-                <w:szCs w:val="15"/>
-              </w:rPr>
-              <w:t>e123b93</w:t>
-            </w:r>
-            <w:r>
-              <w:rPr>
-                <w:sz w:val="17"/>
-                <w:szCs w:val="17"/>
-              </w:rPr>
-              <w:t xml:space="preserve"> before commit messages were rewritten)</w:t>
+              <w:t>afc3f0ab3858b86889a07b7deff73bc1685edc21</w:t>
+            </w:r>
+            <w:r>
+              <w:rPr>
+                <w:sz w:val="17"/>
+                <w:szCs w:val="17"/>
+              </w:rPr>
+              <w:t xml:space="preserve"> (code freeze; all results in this report were produced at this commit)</w:t>
             </w:r>
           </w:p>
         </w:tc>
@@ -335,7 +303,7 @@
                 <w:sz w:val="17"/>
                 <w:szCs w:val="17"/>
               </w:rPr>
-              <w:t>about 1,950 lines of agent code and 330 lines of tooling in the repository; a 553-line test suite and an 82-line run harness were used for validation</w:t>
+              <w:t>about 1,950 lines of agent code, 330 lines of tooling and a 590-line offline test suite in the repository; an 82-line run harness was used for validation</w:t>
             </w:r>
           </w:p>
         </w:tc>
@@ -430,7 +398,7 @@
     <w:sdt>
       <w:sdtPr>
         <w:alias w:val="Contents"/>
-        <w:id w:val="-1848704011"/>
+        <w:id w:val="-1597398185"/>
       </w:sdtPr>
       <w:sdtEndPr/>
       <w:sdtContent>
@@ -453,7 +421,7 @@
           <w:r>
             <w:fldChar w:fldCharType="separate"/>
           </w:r>
-          <w:hyperlink w:anchor="_Toc243071655" w:history="1">
+          <w:hyperlink w:anchor="_Toc243074050" w:history="1">
             <w:r>
               <w:rPr>
                 <w:rStyle w:val="Hyperlink"/>
@@ -477,7 +445,7 @@
               <w:rPr>
                 <w:noProof/>
               </w:rPr>
-              <w:instrText xml:space="preserve"> PAGEREF _Toc243071655 \h </w:instrText>
+              <w:instrText xml:space="preserve"> PAGEREF _Toc243074050 \h </w:instrText>
             </w:r>
             <w:r>
               <w:rPr>
@@ -514,7 +482,7 @@
               <w:noProof/>
             </w:rPr>
           </w:pPr>
-          <w:hyperlink w:anchor="_Toc243071656" w:history="1">
+          <w:hyperlink w:anchor="_Toc243074051" w:history="1">
             <w:r>
               <w:rPr>
                 <w:rStyle w:val="Hyperlink"/>
@@ -538,7 +506,7 @@
               <w:rPr>
                 <w:noProof/>
               </w:rPr>
-              <w:instrText xml:space="preserve"> PAGEREF _Toc243071656 \h </w:instrText>
+              <w:instrText xml:space="preserve"> PAGEREF _Toc243074051 \h </w:instrText>
             </w:r>
             <w:r>
               <w:rPr>
@@ -575,7 +543,7 @@
               <w:noProof/>
             </w:rPr>
           </w:pPr>
-          <w:hyperlink w:anchor="_Toc243071657" w:history="1">
+          <w:hyperlink w:anchor="_Toc243074052" w:history="1">
             <w:r>
               <w:rPr>
                 <w:rStyle w:val="Hyperlink"/>
@@ -599,7 +567,7 @@
               <w:rPr>
                 <w:noProof/>
               </w:rPr>
-              <w:instrText xml:space="preserve"> PAGEREF _Toc243071657 \h </w:instrText>
+              <w:instrText xml:space="preserve"> PAGEREF _Toc243074052 \h </w:instrText>
             </w:r>
             <w:r>
               <w:rPr>
@@ -636,7 +604,7 @@
               <w:noProof/>
             </w:rPr>
           </w:pPr>
-          <w:hyperlink w:anchor="_Toc243071658" w:history="1">
+          <w:hyperlink w:anchor="_Toc243074053" w:history="1">
             <w:r>
               <w:rPr>
                 <w:rStyle w:val="Hyperlink"/>
@@ -660,7 +628,7 @@
               <w:rPr>
                 <w:noProof/>
               </w:rPr>
-              <w:instrText xml:space="preserve"> PAGEREF _Toc243071658 \h </w:instrText>
+              <w:instrText xml:space="preserve"> PAGEREF _Toc243074053 \h </w:instrText>
             </w:r>
             <w:r>
               <w:rPr>
@@ -697,7 +665,7 @@
               <w:noProof/>
             </w:rPr>
           </w:pPr>
-          <w:hyperlink w:anchor="_Toc243071659" w:history="1">
+          <w:hyperlink w:anchor="_Toc243074054" w:history="1">
             <w:r>
               <w:rPr>
                 <w:rStyle w:val="Hyperlink"/>
@@ -721,7 +689,7 @@
               <w:rPr>
                 <w:noProof/>
               </w:rPr>
-              <w:instrText xml:space="preserve"> PAGEREF _Toc243071659 \h </w:instrText>
+              <w:instrText xml:space="preserve"> PAGEREF _Toc243074054 \h </w:instrText>
             </w:r>
             <w:r>
               <w:rPr>
@@ -758,7 +726,7 @@
               <w:noProof/>
             </w:rPr>
           </w:pPr>
-          <w:hyperlink w:anchor="_Toc243071660" w:history="1">
+          <w:hyperlink w:anchor="_Toc243074055" w:history="1">
             <w:r>
               <w:rPr>
                 <w:rStyle w:val="Hyperlink"/>
@@ -782,7 +750,7 @@
               <w:rPr>
                 <w:noProof/>
               </w:rPr>
-              <w:instrText xml:space="preserve"> PAGEREF _Toc243071660 \h </w:instrText>
+              <w:instrText xml:space="preserve"> PAGEREF _Toc243074055 \h </w:instrText>
             </w:r>
             <w:r>
               <w:rPr>
@@ -819,7 +787,7 @@
               <w:noProof/>
             </w:rPr>
           </w:pPr>
-          <w:hyperlink w:anchor="_Toc243071661" w:history="1">
+          <w:hyperlink w:anchor="_Toc243074056" w:history="1">
             <w:r>
               <w:rPr>
                 <w:rStyle w:val="Hyperlink"/>
@@ -843,7 +811,7 @@
               <w:rPr>
                 <w:noProof/>
               </w:rPr>
-              <w:instrText xml:space="preserve"> PAGEREF _Toc243071661 \h </w:instrText>
+              <w:instrText xml:space="preserve"> PAGEREF _Toc243074056 \h </w:instrText>
             </w:r>
             <w:r>
               <w:rPr>
@@ -880,7 +848,7 @@
               <w:noProof/>
             </w:rPr>
           </w:pPr>
-          <w:hyperlink w:anchor="_Toc243071662" w:history="1">
+          <w:hyperlink w:anchor="_Toc243074057" w:history="1">
             <w:r>
               <w:rPr>
                 <w:rStyle w:val="Hyperlink"/>
@@ -904,7 +872,7 @@
               <w:rPr>
                 <w:noProof/>
               </w:rPr>
-              <w:instrText xml:space="preserve"> PAGEREF _Toc243071662 \h </w:instrText>
+              <w:instrText xml:space="preserve"> PAGEREF _Toc243074057 \h </w:instrText>
             </w:r>
             <w:r>
               <w:rPr>
@@ -941,7 +909,7 @@
               <w:noProof/>
             </w:rPr>
           </w:pPr>
-          <w:hyperlink w:anchor="_Toc243071663" w:history="1">
+          <w:hyperlink w:anchor="_Toc243074058" w:history="1">
             <w:r>
               <w:rPr>
                 <w:rStyle w:val="Hyperlink"/>
@@ -965,7 +933,7 @@
               <w:rPr>
                 <w:noProof/>
               </w:rPr>
-              <w:instrText xml:space="preserve"> PAGEREF _Toc243071663 \h </w:instrText>
+              <w:instrText xml:space="preserve"> PAGEREF _Toc243074058 \h </w:instrText>
             </w:r>
             <w:r>
               <w:rPr>
@@ -1002,7 +970,7 @@
               <w:noProof/>
             </w:rPr>
           </w:pPr>
-          <w:hyperlink w:anchor="_Toc243071664" w:history="1">
+          <w:hyperlink w:anchor="_Toc243074059" w:history="1">
             <w:r>
               <w:rPr>
                 <w:rStyle w:val="Hyperlink"/>
@@ -1026,7 +994,7 @@
               <w:rPr>
                 <w:noProof/>
               </w:rPr>
-              <w:instrText xml:space="preserve"> PAGEREF _Toc243071664 \h </w:instrText>
+              <w:instrText xml:space="preserve"> PAGEREF _Toc243074059 \h </w:instrText>
             </w:r>
             <w:r>
               <w:rPr>
@@ -1063,7 +1031,7 @@
               <w:noProof/>
             </w:rPr>
           </w:pPr>
-          <w:hyperlink w:anchor="_Toc243071665" w:history="1">
+          <w:hyperlink w:anchor="_Toc243074060" w:history="1">
             <w:r>
               <w:rPr>
                 <w:rStyle w:val="Hyperlink"/>
@@ -1087,7 +1055,7 @@
               <w:rPr>
                 <w:noProof/>
               </w:rPr>
-              <w:instrText xml:space="preserve"> PAGEREF _Toc243071665 \h </w:instrText>
+              <w:instrText xml:space="preserve"> PAGEREF _Toc243074060 \h </w:instrText>
             </w:r>
             <w:r>
               <w:rPr>
@@ -1124,7 +1092,7 @@
               <w:noProof/>
             </w:rPr>
           </w:pPr>
-          <w:hyperlink w:anchor="_Toc243071666" w:history="1">
+          <w:hyperlink w:anchor="_Toc243074061" w:history="1">
             <w:r>
               <w:rPr>
                 <w:rStyle w:val="Hyperlink"/>
@@ -1148,7 +1116,7 @@
               <w:rPr>
                 <w:noProof/>
               </w:rPr>
-              <w:instrText xml:space="preserve"> PAGEREF _Toc243071666 \h </w:instrText>
+              <w:instrText xml:space="preserve"> PAGEREF _Toc243074061 \h </w:instrText>
             </w:r>
             <w:r>
               <w:rPr>
@@ -1185,7 +1153,7 @@
               <w:noProof/>
             </w:rPr>
           </w:pPr>
-          <w:hyperlink w:anchor="_Toc243071667" w:history="1">
+          <w:hyperlink w:anchor="_Toc243074062" w:history="1">
             <w:r>
               <w:rPr>
                 <w:rStyle w:val="Hyperlink"/>
@@ -1209,7 +1177,7 @@
               <w:rPr>
                 <w:noProof/>
               </w:rPr>
-              <w:instrText xml:space="preserve"> PAGEREF _Toc243071667 \h </w:instrText>
+              <w:instrText xml:space="preserve"> PAGEREF _Toc243074062 \h </w:instrText>
             </w:r>
             <w:r>
               <w:rPr>
@@ -1246,7 +1214,7 @@
               <w:noProof/>
             </w:rPr>
           </w:pPr>
-          <w:hyperlink w:anchor="_Toc243071668" w:history="1">
+          <w:hyperlink w:anchor="_Toc243074063" w:history="1">
             <w:r>
               <w:rPr>
                 <w:rStyle w:val="Hyperlink"/>
@@ -1270,7 +1238,7 @@
               <w:rPr>
                 <w:noProof/>
               </w:rPr>
-              <w:instrText xml:space="preserve"> PAGEREF _Toc243071668 \h </w:instrText>
+              <w:instrText xml:space="preserve"> PAGEREF _Toc243074063 \h </w:instrText>
             </w:r>
             <w:r>
               <w:rPr>
@@ -1307,7 +1275,7 @@
               <w:noProof/>
             </w:rPr>
           </w:pPr>
-          <w:hyperlink w:anchor="_Toc243071669" w:history="1">
+          <w:hyperlink w:anchor="_Toc243074064" w:history="1">
             <w:r>
               <w:rPr>
                 <w:rStyle w:val="Hyperlink"/>
@@ -1331,7 +1299,7 @@
               <w:rPr>
                 <w:noProof/>
               </w:rPr>
-              <w:instrText xml:space="preserve"> PAGEREF _Toc243071669 \h </w:instrText>
+              <w:instrText xml:space="preserve"> PAGEREF _Toc243074064 \h </w:instrText>
             </w:r>
             <w:r>
               <w:rPr>
@@ -1368,7 +1336,7 @@
               <w:noProof/>
             </w:rPr>
           </w:pPr>
-          <w:hyperlink w:anchor="_Toc243071670" w:history="1">
+          <w:hyperlink w:anchor="_Toc243074065" w:history="1">
             <w:r>
               <w:rPr>
                 <w:rStyle w:val="Hyperlink"/>
@@ -1392,7 +1360,7 @@
               <w:rPr>
                 <w:noProof/>
               </w:rPr>
-              <w:instrText xml:space="preserve"> PAGEREF _Toc243071670 \h </w:instrText>
+              <w:instrText xml:space="preserve"> PAGEREF _Toc243074065 \h </w:instrText>
             </w:r>
             <w:r>
               <w:rPr>
@@ -1429,7 +1397,7 @@
               <w:noProof/>
             </w:rPr>
           </w:pPr>
-          <w:hyperlink w:anchor="_Toc243071671" w:history="1">
+          <w:hyperlink w:anchor="_Toc243074066" w:history="1">
             <w:r>
               <w:rPr>
                 <w:rStyle w:val="Hyperlink"/>
@@ -1453,7 +1421,7 @@
               <w:rPr>
                 <w:noProof/>
               </w:rPr>
-              <w:instrText xml:space="preserve"> PAGEREF _Toc243071671 \h </w:instrText>
+              <w:instrText xml:space="preserve"> PAGEREF _Toc243074066 \h </w:instrText>
             </w:r>
             <w:r>
               <w:rPr>
@@ -1496,7 +1464,7 @@
       <w:pPr>
         <w:pStyle w:val="Heading1"/>
       </w:pPr>
-      <w:bookmarkStart w:id="0" w:name="_Toc243071655"/>
+      <w:bookmarkStart w:id="0" w:name="_Toc243074050"/>
       <w:r>
         <w:t>1. Executive summary</w:t>
       </w:r>
@@ -1705,7 +1673,7 @@
         <w:spacing w:after="60" w:line="264" w:lineRule="auto"/>
       </w:pPr>
       <w:r>
-        <w:t>38 offline regression tests pass, including the network-security boundary cases.</w:t>
+        <w:t>40 offline regression tests pass, including the network-security boundary cases.</w:t>
       </w:r>
     </w:p>
     <w:p>
@@ -1725,7 +1693,7 @@
       <w:pPr>
         <w:pStyle w:val="Heading1"/>
       </w:pPr>
-      <w:bookmarkStart w:id="1" w:name="_Toc243071656"/>
+      <w:bookmarkStart w:id="1" w:name="_Toc243074051"/>
       <w:r>
         <w:t>2. The challenge and its requirements</w:t>
       </w:r>
@@ -2765,7 +2733,7 @@
       <w:pPr>
         <w:pStyle w:val="Heading1"/>
       </w:pPr>
-      <w:bookmarkStart w:id="2" w:name="_Toc243071657"/>
+      <w:bookmarkStart w:id="2" w:name="_Toc243074052"/>
       <w:r>
         <w:t>3. Methodology</w:t>
       </w:r>
@@ -2915,7 +2883,7 @@
       <w:pPr>
         <w:pStyle w:val="Heading1"/>
       </w:pPr>
-      <w:bookmarkStart w:id="3" w:name="_Toc243071658"/>
+      <w:bookmarkStart w:id="3" w:name="_Toc243074053"/>
       <w:r>
         <w:t>4. Architecture</w:t>
       </w:r>
@@ -4743,6 +4711,94 @@
           </w:p>
         </w:tc>
       </w:tr>
+      <w:tr>
+        <w:trPr>
+          <w:cantSplit/>
+        </w:trPr>
+        <w:tc>
+          <w:tcPr>
+            <w:tcW w:w="2280" w:type="dxa"/>
+            <w:tcBorders>
+              <w:top w:val="single" w:sz="4" w:space="0" w:color="B7C4D3"/>
+              <w:left w:val="single" w:sz="4" w:space="0" w:color="B7C4D3"/>
+              <w:bottom w:val="single" w:sz="4" w:space="0" w:color="B7C4D3"/>
+              <w:right w:val="single" w:sz="4" w:space="0" w:color="B7C4D3"/>
+            </w:tcBorders>
+            <w:shd w:val="clear" w:color="auto" w:fill="F5F8FB"/>
+            <w:tcMar>
+              <w:top w:w="50" w:type="dxa"/>
+              <w:left w:w="90" w:type="dxa"/>
+              <w:bottom w:w="50" w:type="dxa"/>
+              <w:right w:w="90" w:type="dxa"/>
+            </w:tcMar>
+          </w:tcPr>
+          <w:p>
+            <w:r>
+              <w:rPr>
+                <w:rFonts w:ascii="Consolas" w:eastAsia="Consolas" w:hAnsi="Consolas" w:cs="Consolas"/>
+                <w:color w:val="333333"/>
+                <w:sz w:val="15"/>
+                <w:szCs w:val="15"/>
+              </w:rPr>
+              <w:t>tests/test_agent.py</w:t>
+            </w:r>
+          </w:p>
+        </w:tc>
+        <w:tc>
+          <w:tcPr>
+            <w:tcW w:w="665" w:type="dxa"/>
+            <w:tcBorders>
+              <w:top w:val="single" w:sz="4" w:space="0" w:color="B7C4D3"/>
+              <w:left w:val="single" w:sz="4" w:space="0" w:color="B7C4D3"/>
+              <w:bottom w:val="single" w:sz="4" w:space="0" w:color="B7C4D3"/>
+              <w:right w:val="single" w:sz="4" w:space="0" w:color="B7C4D3"/>
+            </w:tcBorders>
+            <w:shd w:val="clear" w:color="auto" w:fill="F5F8FB"/>
+            <w:tcMar>
+              <w:top w:w="50" w:type="dxa"/>
+              <w:left w:w="90" w:type="dxa"/>
+              <w:bottom w:w="50" w:type="dxa"/>
+              <w:right w:w="90" w:type="dxa"/>
+            </w:tcMar>
+          </w:tcPr>
+          <w:p>
+            <w:r>
+              <w:rPr>
+                <w:sz w:val="17"/>
+                <w:szCs w:val="17"/>
+              </w:rPr>
+              <w:t>590</w:t>
+            </w:r>
+          </w:p>
+        </w:tc>
+        <w:tc>
+          <w:tcPr>
+            <w:tcW w:w="6693" w:type="dxa"/>
+            <w:tcBorders>
+              <w:top w:val="single" w:sz="4" w:space="0" w:color="B7C4D3"/>
+              <w:left w:val="single" w:sz="4" w:space="0" w:color="B7C4D3"/>
+              <w:bottom w:val="single" w:sz="4" w:space="0" w:color="B7C4D3"/>
+              <w:right w:val="single" w:sz="4" w:space="0" w:color="B7C4D3"/>
+            </w:tcBorders>
+            <w:shd w:val="clear" w:color="auto" w:fill="F5F8FB"/>
+            <w:tcMar>
+              <w:top w:w="50" w:type="dxa"/>
+              <w:left w:w="90" w:type="dxa"/>
+              <w:bottom w:w="50" w:type="dxa"/>
+              <w:right w:w="90" w:type="dxa"/>
+            </w:tcMar>
+          </w:tcPr>
+          <w:p>
+            <w:r>
+              <w:rPr>
+                <w:sz w:val="17"/>
+                <w:szCs w:val="17"/>
+              </w:rPr>
+              <w:t>40 offline regression tests</w:t>
+            </w:r>
+          </w:p>
+        </w:tc>
+      </w:tr>
     </w:tbl>
     <w:p>
       <w:pPr>
@@ -4753,7 +4809,7 @@
       <w:pPr>
         <w:pStyle w:val="Heading1"/>
       </w:pPr>
-      <w:bookmarkStart w:id="4" w:name="_Toc243071659"/>
+      <w:bookmarkStart w:id="4" w:name="_Toc243074054"/>
       <w:r>
         <w:t>5. Technology stack</w:t>
       </w:r>
@@ -6218,7 +6274,7 @@
       <w:pPr>
         <w:pStyle w:val="Heading1"/>
       </w:pPr>
-      <w:bookmarkStart w:id="5" w:name="_Toc243071660"/>
+      <w:bookmarkStart w:id="5" w:name="_Toc243074055"/>
       <w:r>
         <w:t>6. Data sources</w:t>
       </w:r>
@@ -7571,7 +7627,7 @@
       <w:pPr>
         <w:pStyle w:val="Heading1"/>
       </w:pPr>
-      <w:bookmarkStart w:id="6" w:name="_Toc243071661"/>
+      <w:bookmarkStart w:id="6" w:name="_Toc243074056"/>
       <w:r>
         <w:t>7. Fact, evidence and envelope model</w:t>
       </w:r>
@@ -8130,7 +8186,7 @@
       <w:pPr>
         <w:pStyle w:val="Heading1"/>
       </w:pPr>
-      <w:bookmarkStart w:id="7" w:name="_Toc243071662"/>
+      <w:bookmarkStart w:id="7" w:name="_Toc243074057"/>
       <w:r>
         <w:t>8. Identity verification</w:t>
       </w:r>
@@ -8358,7 +8414,7 @@
         <w:t>ambiguous</w:t>
       </w:r>
       <w:r>
-        <w:t>.</w:t>
+        <w:t>, unless the company declared that site to an official source and its domain matches the company's name.</w:t>
       </w:r>
     </w:p>
     <w:p>
@@ -9049,7 +9105,7 @@
       <w:pPr>
         <w:pStyle w:val="Heading1"/>
       </w:pPr>
-      <w:bookmarkStart w:id="8" w:name="_Toc243071663"/>
+      <w:bookmarkStart w:id="8" w:name="_Toc243074058"/>
       <w:r>
         <w:t>9. Other components</w:t>
       </w:r>
@@ -9498,7 +9554,7 @@
       <w:pPr>
         <w:pStyle w:val="Heading1"/>
       </w:pPr>
-      <w:bookmarkStart w:id="9" w:name="_Toc243071664"/>
+      <w:bookmarkStart w:id="9" w:name="_Toc243074059"/>
       <w:r>
         <w:t>10. Security</w:t>
       </w:r>
@@ -10391,7 +10447,7 @@
       <w:pPr>
         <w:pStyle w:val="Heading1"/>
       </w:pPr>
-      <w:bookmarkStart w:id="10" w:name="_Toc243071665"/>
+      <w:bookmarkStart w:id="10" w:name="_Toc243074060"/>
       <w:r>
         <w:t>11. Privacy and data protection</w:t>
       </w:r>
@@ -10955,7 +11011,7 @@
       <w:pPr>
         <w:pStyle w:val="Heading1"/>
       </w:pPr>
-      <w:bookmarkStart w:id="11" w:name="_Toc243071666"/>
+      <w:bookmarkStart w:id="11" w:name="_Toc243074061"/>
       <w:r>
         <w:t>12. Testing methodology</w:t>
       </w:r>
@@ -10978,10 +11034,10 @@
           <w:b/>
           <w:bCs/>
         </w:rPr>
-        <w:t>1. Offline regression tests (38).</w:t>
-      </w:r>
-      <w:r>
-        <w:t xml:space="preserve"> These cover the identity gate (16), discovery and extraction (4), network security (9), budgets and states (4), refresh (3), and input and data rules (2), as listed in Appendix A. Network tests use stand-ins for DNS and HTTP, so they run anywhere without network access. The test that guards credential stripping was mutation-checked: disabling the protection makes it fail.</w:t>
+        <w:t>1. Offline regression tests (40).</w:t>
+      </w:r>
+      <w:r>
+        <w:t xml:space="preserve"> These cover the identity gate (18), discovery and extraction (4), network security (9), budgets and states (4), refresh (3), and input and data rules (2), as listed in Appendix A. Network tests use stand-ins for DNS and HTTP, so they run anywhere without network access. The test that guards credential stripping was mutation-checked: disabling the protection makes it fail.</w:t>
       </w:r>
     </w:p>
     <w:p>
@@ -13049,7 +13105,7 @@
         <w:t>5. External review.</w:t>
       </w:r>
       <w:r>
-        <w:t xml:space="preserve"> Three independent review rounds of the source code were checked finding by finding, with each claim reproduced before fixing. They led to the IP pinning, hop-by-hop redirects, credential stripping, HTTPS pinning for NAV, the ownership-proof rule, the stricter financial verifier, the enforced cost cap and the input-parsing fixes.</w:t>
+        <w:t xml:space="preserve"> Four independent review rounds of the source code were checked finding by finding, with each claim reproduced before fixing. They led to the IP pinning, hop-by-hop redirects, credential stripping, HTTPS pinning for NAV, the ownership-proof rule, the stricter financial verifier, the enforced cost cap and the input-parsing fixes.</w:t>
       </w:r>
     </w:p>
     <w:p>
@@ -13064,7 +13120,7 @@
       <w:pPr>
         <w:pStyle w:val="Heading1"/>
       </w:pPr>
-      <w:bookmarkStart w:id="12" w:name="_Toc243071667"/>
+      <w:bookmarkStart w:id="12" w:name="_Toc243074062"/>
       <w:r>
         <w:t>13. Results at the frozen commit</w:t>
       </w:r>
@@ -13502,7 +13558,7 @@
                 <w:sz w:val="17"/>
                 <w:szCs w:val="17"/>
               </w:rPr>
-              <w:t>824</w:t>
+              <w:t>823</w:t>
             </w:r>
           </w:p>
         </w:tc>
@@ -13529,7 +13585,7 @@
                 <w:sz w:val="17"/>
                 <w:szCs w:val="17"/>
               </w:rPr>
-              <w:t>474 s</w:t>
+              <w:t>472 s</w:t>
             </w:r>
           </w:p>
         </w:tc>
@@ -13723,7 +13779,7 @@
                 <w:sz w:val="17"/>
                 <w:szCs w:val="17"/>
               </w:rPr>
-              <w:t>890</w:t>
+              <w:t>894</w:t>
             </w:r>
           </w:p>
         </w:tc>
@@ -13750,7 +13806,7 @@
                 <w:sz w:val="17"/>
                 <w:szCs w:val="17"/>
               </w:rPr>
-              <w:t>412 s</w:t>
+              <w:t>407 s</w:t>
             </w:r>
           </w:p>
         </w:tc>
@@ -13944,7 +14000,7 @@
                 <w:sz w:val="17"/>
                 <w:szCs w:val="17"/>
               </w:rPr>
-              <w:t>865</w:t>
+              <w:t>864</w:t>
             </w:r>
           </w:p>
         </w:tc>
@@ -13971,7 +14027,7 @@
                 <w:sz w:val="17"/>
                 <w:szCs w:val="17"/>
               </w:rPr>
-              <w:t>428 s</w:t>
+              <w:t>425 s</w:t>
             </w:r>
           </w:p>
         </w:tc>
@@ -14165,7 +14221,7 @@
                 <w:sz w:val="17"/>
                 <w:szCs w:val="17"/>
               </w:rPr>
-              <w:t>815</w:t>
+              <w:t>816</w:t>
             </w:r>
           </w:p>
         </w:tc>
@@ -14192,7 +14248,7 @@
                 <w:sz w:val="17"/>
                 <w:szCs w:val="17"/>
               </w:rPr>
-              <w:t>420 s</w:t>
+              <w:t>413 s</w:t>
             </w:r>
           </w:p>
         </w:tc>
@@ -14386,7 +14442,7 @@
                 <w:sz w:val="17"/>
                 <w:szCs w:val="17"/>
               </w:rPr>
-              <w:t>881</w:t>
+              <w:t>880</w:t>
             </w:r>
           </w:p>
         </w:tc>
@@ -14413,7 +14469,7 @@
                 <w:sz w:val="17"/>
                 <w:szCs w:val="17"/>
               </w:rPr>
-              <w:t>411 s</w:t>
+              <w:t>407 s</w:t>
             </w:r>
           </w:p>
         </w:tc>
@@ -14607,7 +14663,7 @@
                 <w:sz w:val="17"/>
                 <w:szCs w:val="17"/>
               </w:rPr>
-              <w:t>922</w:t>
+              <w:t>921</w:t>
             </w:r>
           </w:p>
         </w:tc>
@@ -14634,7 +14690,7 @@
                 <w:sz w:val="17"/>
                 <w:szCs w:val="17"/>
               </w:rPr>
-              <w:t>510 s</w:t>
+              <w:t>502 s</w:t>
             </w:r>
           </w:p>
         </w:tc>
@@ -14828,7 +14884,7 @@
                 <w:sz w:val="17"/>
                 <w:szCs w:val="17"/>
               </w:rPr>
-              <w:t>1,056</w:t>
+              <w:t>1,058</w:t>
             </w:r>
           </w:p>
         </w:tc>
@@ -15297,7 +15353,7 @@
                 <w:sz w:val="17"/>
                 <w:szCs w:val="17"/>
               </w:rPr>
-              <w:t>137 s</w:t>
+              <w:t>136 s</w:t>
             </w:r>
           </w:p>
         </w:tc>
@@ -15491,7 +15547,7 @@
                 <w:sz w:val="17"/>
                 <w:szCs w:val="17"/>
               </w:rPr>
-              <w:t>831</w:t>
+              <w:t>828</w:t>
             </w:r>
           </w:p>
         </w:tc>
@@ -15518,7 +15574,7 @@
                 <w:sz w:val="17"/>
                 <w:szCs w:val="17"/>
               </w:rPr>
-              <w:t>474 s</w:t>
+              <w:t>470 s</w:t>
             </w:r>
           </w:p>
         </w:tc>
@@ -15712,7 +15768,7 @@
                 <w:sz w:val="17"/>
                 <w:szCs w:val="17"/>
               </w:rPr>
-              <w:t>892</w:t>
+              <w:t>891</w:t>
             </w:r>
           </w:p>
         </w:tc>
@@ -15739,7 +15795,7 @@
                 <w:sz w:val="17"/>
                 <w:szCs w:val="17"/>
               </w:rPr>
-              <w:t>419 s</w:t>
+              <w:t>428 s</w:t>
             </w:r>
           </w:p>
         </w:tc>
@@ -15960,7 +16016,7 @@
                 <w:sz w:val="17"/>
                 <w:szCs w:val="17"/>
               </w:rPr>
-              <w:t>464 s</w:t>
+              <w:t>453 s</w:t>
             </w:r>
           </w:p>
         </w:tc>
@@ -16154,7 +16210,7 @@
                 <w:sz w:val="17"/>
                 <w:szCs w:val="17"/>
               </w:rPr>
-              <w:t>821</w:t>
+              <w:t>822</w:t>
             </w:r>
           </w:p>
         </w:tc>
@@ -16181,7 +16237,7 @@
                 <w:sz w:val="17"/>
                 <w:szCs w:val="17"/>
               </w:rPr>
-              <w:t>444 s</w:t>
+              <w:t>452 s</w:t>
             </w:r>
           </w:p>
         </w:tc>
@@ -16880,7 +16936,7 @@
         <w:t>Source yield</w:t>
       </w:r>
       <w:r>
-        <w:t xml:space="preserve"> (smoke run): Brønnøysund 501 requests → 4,337 claims (8.7 per request); company websites 228 requests → 39 claims (0.17 per request); NAV feed 95 requests → 0 claims in that batch.</w:t>
+        <w:t xml:space="preserve"> (smoke run): Brønnøysund 501 requests → 4,337 claims (8.7 per request); company websites 228 requests → 39 claims (0.17 per request); NAV feed 94 requests → 0 claims in that batch.</w:t>
       </w:r>
     </w:p>
     <w:p>
@@ -16989,7 +17045,7 @@
       <w:pPr>
         <w:pStyle w:val="Heading1"/>
       </w:pPr>
-      <w:bookmarkStart w:id="13" w:name="_Toc243071668"/>
+      <w:bookmarkStart w:id="13" w:name="_Toc243074063"/>
       <w:r>
         <w:t>14. Defects found and fixed</w:t>
       </w:r>
@@ -17308,7 +17364,7 @@
                 <w:sz w:val="17"/>
                 <w:szCs w:val="17"/>
               </w:rPr>
-              <w:t>three latent wrong-company paths: third-party mention, name-matching domain, recruiter e-mail domain and redirect trust</w:t>
+              <w:t>latent wrong-company paths: third-party mention, name-matching domain, recruiter e-mail domain, redirect trust and undeclared group pages</w:t>
             </w:r>
           </w:p>
         </w:tc>
@@ -18515,7 +18571,7 @@
       <w:pPr>
         <w:pStyle w:val="Heading1"/>
       </w:pPr>
-      <w:bookmarkStart w:id="14" w:name="_Toc243071669"/>
+      <w:bookmarkStart w:id="14" w:name="_Toc243074064"/>
       <w:r>
         <w:t>15. Limitations and future work</w:t>
       </w:r>
@@ -18637,7 +18693,7 @@
       <w:pPr>
         <w:pStyle w:val="Heading1"/>
       </w:pPr>
-      <w:bookmarkStart w:id="15" w:name="_Toc243071670"/>
+      <w:bookmarkStart w:id="15" w:name="_Toc243074065"/>
       <w:r>
         <w:t>16. Reproduction and submission</w:t>
       </w:r>
@@ -18771,7 +18827,34 @@
         <w:spacing w:after="120" w:line="276" w:lineRule="auto"/>
       </w:pPr>
       <w:r>
-        <w:t xml:space="preserve">The offline test suite and the 13-run test harness were used for validation and are kept outside the submitted repository; their results are reported in sections 12 and 13 and in </w:t>
+        <w:t>Offline tests (included in the repository):</w:t>
+      </w:r>
+    </w:p>
+    <w:p>
+      <w:pPr>
+        <w:shd w:val="clear" w:color="auto" w:fill="F2F2F2"/>
+        <w:ind w:left="200"/>
+      </w:pPr>
+      <w:r>
+        <w:rPr>
+          <w:rFonts w:ascii="Consolas" w:eastAsia="Consolas" w:hAnsi="Consolas" w:cs="Consolas"/>
+          <w:sz w:val="18"/>
+          <w:szCs w:val="18"/>
+        </w:rPr>
+        <w:t>python tests/test_agent.py</w:t>
+      </w:r>
+    </w:p>
+    <w:p>
+      <w:pPr>
+        <w:spacing w:after="120"/>
+      </w:pPr>
+    </w:p>
+    <w:p>
+      <w:pPr>
+        <w:spacing w:after="120" w:line="276" w:lineRule="auto"/>
+      </w:pPr>
+      <w:r>
+        <w:t xml:space="preserve">The 13-run test harness was used for validation and is kept outside the submitted repository; its results are reported in sections 12 and 13 and in </w:t>
       </w:r>
       <w:r>
         <w:rPr>
@@ -18798,7 +18881,7 @@
         <w:t>What gets submitted:</w:t>
       </w:r>
       <w:r>
-        <w:t xml:space="preserve"> the git repository (agent code, docs, the smoke test with its refresh run, the 1,000-profile dataset and the tools, including the contract verifier). The offline tests, the run harness, raw run outputs, the local virtual environment and development scratch files are excluded. The agent code is frozen at </w:t>
+        <w:t xml:space="preserve"> the git repository (agent code, docs, the smoke test with its refresh run, the 1,000-profile dataset, the offline tests and the tools, including the contract verifier). The run harness, raw run outputs, the local virtual environment and development scratch files are excluded. The agent code is frozen at </w:t>
       </w:r>
       <w:r>
         <w:rPr>
@@ -18807,7 +18890,7 @@
           <w:sz w:val="18"/>
           <w:szCs w:val="18"/>
         </w:rPr>
-        <w:t>3202c93</w:t>
+        <w:t>afc3f0a</w:t>
       </w:r>
       <w:r>
         <w:t>; later commits change documentation and data only.</w:t>
@@ -18817,7 +18900,7 @@
       <w:pPr>
         <w:pStyle w:val="Heading1"/>
       </w:pPr>
-      <w:bookmarkStart w:id="16" w:name="_Toc243071671"/>
+      <w:bookmarkStart w:id="16" w:name="_Toc243074066"/>
       <w:r>
         <w:t>Appendix A: Offline test inventory</w:t>
       </w:r>
@@ -18828,7 +18911,19 @@
         <w:spacing w:after="120" w:line="276" w:lineRule="auto"/>
       </w:pPr>
       <w:r>
-        <w:t>These tests were run against the frozen code for validation; the suite itself is kept outside the submitted repository.</w:t>
+        <w:t xml:space="preserve">These tests are in </w:t>
+      </w:r>
+      <w:r>
+        <w:rPr>
+          <w:rFonts w:ascii="Consolas" w:eastAsia="Consolas" w:hAnsi="Consolas" w:cs="Consolas"/>
+          <w:color w:val="333333"/>
+          <w:sz w:val="18"/>
+          <w:szCs w:val="18"/>
+        </w:rPr>
+        <w:t>tests/test_agent.py</w:t>
+      </w:r>
+      <w:r>
+        <w:t xml:space="preserve"> and were run against the frozen code.</w:t>
       </w:r>
     </w:p>
     <w:tbl>
@@ -19212,6 +19307,38 @@
                 <w:szCs w:val="15"/>
               </w:rPr>
               <w:t>test_recruiter_email_domain_is_not_declared_website</w:t>
+            </w:r>
+            <w:r>
+              <w:rPr>
+                <w:sz w:val="17"/>
+                <w:szCs w:val="17"/>
+              </w:rPr>
+              <w:t xml:space="preserve">, </w:t>
+            </w:r>
+            <w:r>
+              <w:rPr>
+                <w:rFonts w:ascii="Consolas" w:eastAsia="Consolas" w:hAnsi="Consolas" w:cs="Consolas"/>
+                <w:color w:val="333333"/>
+                <w:sz w:val="15"/>
+                <w:szCs w:val="15"/>
+              </w:rPr>
+              <w:t>test_group_page_on_undeclared_name_matching_domain_is_ambiguous</w:t>
+            </w:r>
+            <w:r>
+              <w:rPr>
+                <w:sz w:val="17"/>
+                <w:szCs w:val="17"/>
+              </w:rPr>
+              <w:t xml:space="preserve">, </w:t>
+            </w:r>
+            <w:r>
+              <w:rPr>
+                <w:rFonts w:ascii="Consolas" w:eastAsia="Consolas" w:hAnsi="Consolas" w:cs="Consolas"/>
+                <w:color w:val="333333"/>
+                <w:sz w:val="15"/>
+                <w:szCs w:val="15"/>
+              </w:rPr>
+              <w:t>test_group_page_declared_by_the_company_on_its_name_domain_is_exact</w:t>
             </w:r>
           </w:p>
         </w:tc>
@@ -19910,64 +20037,10 @@
 <file path=word/numbering.xml><?xml version="1.0" encoding="utf-8"?>
 <w:numbering xmlns:wpc="http://schemas.microsoft.com/office/word/2010/wordprocessingCanvas" xmlns:cx="http://schemas.microsoft.com/office/drawing/2014/chartex" xmlns:cx1="http://schemas.microsoft.com/office/drawing/2015/9/8/chartex" xmlns:cx2="http://schemas.microsoft.com/office/drawing/2015/10/21/chartex" xmlns:cx3="http://schemas.microsoft.com/office/drawing/2016/5/9/chartex" xmlns:cx4="http://schemas.microsoft.com/office/drawing/2016/5/10/chartex" xmlns:cx5="http://schemas.microsoft.com/office/drawing/2016/5/11/chartex" xmlns:cx6="http://schemas.microsoft.com/office/drawing/2016/5/12/chartex" xmlns:cx7="http://schemas.microsoft.com/office/drawing/2016/5/13/chartex" xmlns:cx8="http://schemas.microsoft.com/office/drawing/2016/5/14/chartex" xmlns:mc="http://schemas.openxmlformats.org/markup-compatibility/2006" xmlns:aink="http://schemas.microsoft.com/office/drawing/2016/ink" xmlns:am3d="http://schemas.microsoft.com/office/drawing/2017/model3d" xmlns:o="urn:schemas-microsoft-com:office:office" xmlns:oel="http://schemas.microsoft.com/office/2019/extlst" xmlns:r="http://schemas.openxmlformats.org/officeDocument/2006/relationships" xmlns:m="http://schemas.openxmlformats.org/officeDocument/2006/math" xmlns:v="urn:schemas-microsoft-com:vml" xmlns:wp14="http://schemas.microsoft.com/office/word/2010/wordprocessingDrawing" xmlns:wp="http://schemas.openxmlformats.org/drawingml/2006/wordprocessingDrawing" xmlns:w10="urn:schemas-microsoft-com:office:word" xmlns:w="http://schemas.openxmlformats.org/wordprocessingml/2006/main" xmlns:w14="http://schemas.microsoft.com/office/word/2010/wordml" xmlns:w15="http://schemas.microsoft.com/office/word/2012/wordml" xmlns:w16cex="http://schemas.microsoft.com/office/word/2018/wordml/cex" xmlns:w16cid="http://schemas.microsoft.com/office/word/2016/wordml/cid" xmlns:w16="http://schemas.microsoft.com/office/word/2018/wordml" xmlns:w16du="http://schemas.microsoft.com/office/word/2023/wordml/word16du" xmlns:w16sdtdh="http://schemas.microsoft.com/office/word/2020/wordml/sdtdatahash" xmlns:w16sdtfl="http://schemas.microsoft.com/office/word/2024/wordml/sdtformatlock" xmlns:w16se="http://schemas.microsoft.com/office/word/2015/wordml/symex" xmlns:wpg="http://schemas.microsoft.com/office/word/2010/wordprocessingGroup" xmlns:wpi="http://schemas.microsoft.com/office/word/2010/wordprocessingInk" xmlns:wne="http://schemas.microsoft.com/office/word/2006/wordml" xmlns:wps="http://schemas.microsoft.com/office/word/2010/wordprocessingShape" mc:Ignorable="w14 w15 w16se w16cid w16 w16cex w16sdtdh w16sdtfl w16du wp14">
   <w:abstractNum w:abstractNumId="0" w15:restartNumberingAfterBreak="0">
-    <w:nsid w:val="0A231A6F"/>
+    <w:nsid w:val="2D0F6556"/>
     <w:multiLevelType w:val="hybridMultilevel"/>
-    <w:tmpl w:val="7B840750"/>
-    <w:lvl w:ilvl="0" w:tplc="C546804A">
-      <w:start w:val="1"/>
-      <w:numFmt w:val="decimal"/>
-      <w:lvlText w:val="%1."/>
-      <w:lvlJc w:val="left"/>
-      <w:pPr>
-        <w:ind w:left="540" w:hanging="360"/>
-      </w:pPr>
-    </w:lvl>
-    <w:lvl w:ilvl="1" w:tplc="18C46202">
-      <w:numFmt w:val="decimal"/>
-      <w:lvlText w:val=""/>
-      <w:lvlJc w:val="left"/>
-    </w:lvl>
-    <w:lvl w:ilvl="2" w:tplc="728E37FE">
-      <w:numFmt w:val="decimal"/>
-      <w:lvlText w:val=""/>
-      <w:lvlJc w:val="left"/>
-    </w:lvl>
-    <w:lvl w:ilvl="3" w:tplc="5B0E86CA">
-      <w:numFmt w:val="decimal"/>
-      <w:lvlText w:val=""/>
-      <w:lvlJc w:val="left"/>
-    </w:lvl>
-    <w:lvl w:ilvl="4" w:tplc="7480BC96">
-      <w:numFmt w:val="decimal"/>
-      <w:lvlText w:val=""/>
-      <w:lvlJc w:val="left"/>
-    </w:lvl>
-    <w:lvl w:ilvl="5" w:tplc="3AD6A1F0">
-      <w:numFmt w:val="decimal"/>
-      <w:lvlText w:val=""/>
-      <w:lvlJc w:val="left"/>
-    </w:lvl>
-    <w:lvl w:ilvl="6" w:tplc="FF8AF740">
-      <w:numFmt w:val="decimal"/>
-      <w:lvlText w:val=""/>
-      <w:lvlJc w:val="left"/>
-    </w:lvl>
-    <w:lvl w:ilvl="7" w:tplc="1AA6D536">
-      <w:numFmt w:val="decimal"/>
-      <w:lvlText w:val=""/>
-      <w:lvlJc w:val="left"/>
-    </w:lvl>
-    <w:lvl w:ilvl="8" w:tplc="19E4BE30">
-      <w:numFmt w:val="decimal"/>
-      <w:lvlText w:val=""/>
-      <w:lvlJc w:val="left"/>
-    </w:lvl>
-  </w:abstractNum>
-  <w:abstractNum w:abstractNumId="1" w15:restartNumberingAfterBreak="0">
-    <w:nsid w:val="5FA10058"/>
-    <w:multiLevelType w:val="hybridMultilevel"/>
-    <w:tmpl w:val="D85A77D0"/>
-    <w:lvl w:ilvl="0" w:tplc="FD182252">
+    <w:tmpl w:val="DF600C8C"/>
+    <w:lvl w:ilvl="0" w:tplc="C090F0E2">
       <w:start w:val="1"/>
       <w:numFmt w:val="bullet"/>
       <w:lvlText w:val="•"/>
@@ -19976,7 +20049,7 @@
         <w:ind w:left="540" w:hanging="270"/>
       </w:pPr>
     </w:lvl>
-    <w:lvl w:ilvl="1" w:tplc="00C622DA">
+    <w:lvl w:ilvl="1" w:tplc="AC6E79E6">
       <w:start w:val="1"/>
       <w:numFmt w:val="bullet"/>
       <w:lvlText w:val="–"/>
@@ -19985,47 +20058,47 @@
         <w:ind w:left="1080" w:hanging="270"/>
       </w:pPr>
     </w:lvl>
-    <w:lvl w:ilvl="2" w:tplc="7E7E3590">
+    <w:lvl w:ilvl="2" w:tplc="0E56522C">
       <w:numFmt w:val="decimal"/>
       <w:lvlText w:val=""/>
       <w:lvlJc w:val="left"/>
     </w:lvl>
-    <w:lvl w:ilvl="3" w:tplc="6474218A">
+    <w:lvl w:ilvl="3" w:tplc="C31CAB46">
       <w:numFmt w:val="decimal"/>
       <w:lvlText w:val=""/>
       <w:lvlJc w:val="left"/>
     </w:lvl>
-    <w:lvl w:ilvl="4" w:tplc="10D29594">
+    <w:lvl w:ilvl="4" w:tplc="1F684670">
       <w:numFmt w:val="decimal"/>
       <w:lvlText w:val=""/>
       <w:lvlJc w:val="left"/>
     </w:lvl>
-    <w:lvl w:ilvl="5" w:tplc="DF4AA26C">
+    <w:lvl w:ilvl="5" w:tplc="C86460A4">
       <w:numFmt w:val="decimal"/>
       <w:lvlText w:val=""/>
       <w:lvlJc w:val="left"/>
     </w:lvl>
-    <w:lvl w:ilvl="6" w:tplc="8940F212">
+    <w:lvl w:ilvl="6" w:tplc="DD5A4E68">
       <w:numFmt w:val="decimal"/>
       <w:lvlText w:val=""/>
       <w:lvlJc w:val="left"/>
     </w:lvl>
-    <w:lvl w:ilvl="7" w:tplc="37BED5C2">
+    <w:lvl w:ilvl="7" w:tplc="79D44CF6">
       <w:numFmt w:val="decimal"/>
       <w:lvlText w:val=""/>
       <w:lvlJc w:val="left"/>
     </w:lvl>
-    <w:lvl w:ilvl="8" w:tplc="31D643EE">
+    <w:lvl w:ilvl="8" w:tplc="E89E7636">
       <w:numFmt w:val="decimal"/>
       <w:lvlText w:val=""/>
       <w:lvlJc w:val="left"/>
     </w:lvl>
   </w:abstractNum>
-  <w:abstractNum w:abstractNumId="2" w15:restartNumberingAfterBreak="0">
-    <w:nsid w:val="696D574E"/>
+  <w:abstractNum w:abstractNumId="1" w15:restartNumberingAfterBreak="0">
+    <w:nsid w:val="5C420C23"/>
     <w:multiLevelType w:val="hybridMultilevel"/>
-    <w:tmpl w:val="F0709B64"/>
-    <w:lvl w:ilvl="0" w:tplc="B09CD2C8" w:tentative="1">
+    <w:tmpl w:val="CD0CE8D2"/>
+    <w:lvl w:ilvl="0" w:tplc="480A1108" w:tentative="1">
       <w:start w:val="1"/>
       <w:numFmt w:val="bullet"/>
       <w:lvlText w:val="●"/>
@@ -20034,7 +20107,7 @@
         <w:ind w:left="720" w:hanging="360"/>
       </w:pPr>
     </w:lvl>
-    <w:lvl w:ilvl="1" w:tplc="F4D2B166" w:tentative="1">
+    <w:lvl w:ilvl="1" w:tplc="C2A86152" w:tentative="1">
       <w:start w:val="1"/>
       <w:numFmt w:val="bullet"/>
       <w:lvlText w:val="○"/>
@@ -20043,7 +20116,7 @@
         <w:ind w:left="1440" w:hanging="360"/>
       </w:pPr>
     </w:lvl>
-    <w:lvl w:ilvl="2" w:tplc="39166D6E" w:tentative="1">
+    <w:lvl w:ilvl="2" w:tplc="190653C4" w:tentative="1">
       <w:start w:val="1"/>
       <w:numFmt w:val="bullet"/>
       <w:lvlText w:val="■"/>
@@ -20052,7 +20125,7 @@
         <w:ind w:left="2160" w:hanging="360"/>
       </w:pPr>
     </w:lvl>
-    <w:lvl w:ilvl="3" w:tplc="B1B039DE" w:tentative="1">
+    <w:lvl w:ilvl="3" w:tplc="E6700932" w:tentative="1">
       <w:start w:val="1"/>
       <w:numFmt w:val="bullet"/>
       <w:lvlText w:val="●"/>
@@ -20061,7 +20134,7 @@
         <w:ind w:left="2880" w:hanging="360"/>
       </w:pPr>
     </w:lvl>
-    <w:lvl w:ilvl="4" w:tplc="41CA34E0" w:tentative="1">
+    <w:lvl w:ilvl="4" w:tplc="2ADCBC96" w:tentative="1">
       <w:start w:val="1"/>
       <w:numFmt w:val="bullet"/>
       <w:lvlText w:val="○"/>
@@ -20070,7 +20143,7 @@
         <w:ind w:left="3600" w:hanging="360"/>
       </w:pPr>
     </w:lvl>
-    <w:lvl w:ilvl="5" w:tplc="DD68A29E" w:tentative="1">
+    <w:lvl w:ilvl="5" w:tplc="4B043294" w:tentative="1">
       <w:start w:val="1"/>
       <w:numFmt w:val="bullet"/>
       <w:lvlText w:val="■"/>
@@ -20079,7 +20152,7 @@
         <w:ind w:left="4320" w:hanging="360"/>
       </w:pPr>
     </w:lvl>
-    <w:lvl w:ilvl="6" w:tplc="242C1592" w:tentative="1">
+    <w:lvl w:ilvl="6" w:tplc="C848EA2E" w:tentative="1">
       <w:start w:val="1"/>
       <w:numFmt w:val="bullet"/>
       <w:lvlText w:val="●"/>
@@ -20088,7 +20161,7 @@
         <w:ind w:left="5040" w:hanging="360"/>
       </w:pPr>
     </w:lvl>
-    <w:lvl w:ilvl="7" w:tplc="FF0898B2" w:tentative="1">
+    <w:lvl w:ilvl="7" w:tplc="72300102" w:tentative="1">
       <w:start w:val="1"/>
       <w:numFmt w:val="bullet"/>
       <w:lvlText w:val="●"/>
@@ -20097,7 +20170,7 @@
         <w:ind w:left="5760" w:hanging="360"/>
       </w:pPr>
     </w:lvl>
-    <w:lvl w:ilvl="8" w:tplc="68BEC49A" w:tentative="1">
+    <w:lvl w:ilvl="8" w:tplc="22741608" w:tentative="1">
       <w:start w:val="1"/>
       <w:numFmt w:val="bullet"/>
       <w:lvlText w:val="●"/>
@@ -20107,32 +20180,86 @@
       </w:pPr>
     </w:lvl>
   </w:abstractNum>
-  <w:num w:numId="1" w16cid:durableId="1516653366">
+  <w:abstractNum w:abstractNumId="2" w15:restartNumberingAfterBreak="0">
+    <w:nsid w:val="743F6179"/>
+    <w:multiLevelType w:val="hybridMultilevel"/>
+    <w:tmpl w:val="3770500E"/>
+    <w:lvl w:ilvl="0" w:tplc="9F10A0F0">
+      <w:start w:val="1"/>
+      <w:numFmt w:val="decimal"/>
+      <w:lvlText w:val="%1."/>
+      <w:lvlJc w:val="left"/>
+      <w:pPr>
+        <w:ind w:left="540" w:hanging="360"/>
+      </w:pPr>
+    </w:lvl>
+    <w:lvl w:ilvl="1" w:tplc="7E60AB78">
+      <w:numFmt w:val="decimal"/>
+      <w:lvlText w:val=""/>
+      <w:lvlJc w:val="left"/>
+    </w:lvl>
+    <w:lvl w:ilvl="2" w:tplc="C0F645F0">
+      <w:numFmt w:val="decimal"/>
+      <w:lvlText w:val=""/>
+      <w:lvlJc w:val="left"/>
+    </w:lvl>
+    <w:lvl w:ilvl="3" w:tplc="9D08EAB0">
+      <w:numFmt w:val="decimal"/>
+      <w:lvlText w:val=""/>
+      <w:lvlJc w:val="left"/>
+    </w:lvl>
+    <w:lvl w:ilvl="4" w:tplc="F826564C">
+      <w:numFmt w:val="decimal"/>
+      <w:lvlText w:val=""/>
+      <w:lvlJc w:val="left"/>
+    </w:lvl>
+    <w:lvl w:ilvl="5" w:tplc="0F5A76C0">
+      <w:numFmt w:val="decimal"/>
+      <w:lvlText w:val=""/>
+      <w:lvlJc w:val="left"/>
+    </w:lvl>
+    <w:lvl w:ilvl="6" w:tplc="00728D32">
+      <w:numFmt w:val="decimal"/>
+      <w:lvlText w:val=""/>
+      <w:lvlJc w:val="left"/>
+    </w:lvl>
+    <w:lvl w:ilvl="7" w:tplc="2462244E">
+      <w:numFmt w:val="decimal"/>
+      <w:lvlText w:val=""/>
+      <w:lvlJc w:val="left"/>
+    </w:lvl>
+    <w:lvl w:ilvl="8" w:tplc="25B01380">
+      <w:numFmt w:val="decimal"/>
+      <w:lvlText w:val=""/>
+      <w:lvlJc w:val="left"/>
+    </w:lvl>
+  </w:abstractNum>
+  <w:num w:numId="1" w16cid:durableId="1634751084">
+    <w:abstractNumId w:val="1"/>
+    <w:lvlOverride w:ilvl="0">
+      <w:startOverride w:val="1"/>
+    </w:lvlOverride>
+  </w:num>
+  <w:num w:numId="2" w16cid:durableId="410587768">
+    <w:abstractNumId w:val="0"/>
+    <w:lvlOverride w:ilvl="0">
+      <w:startOverride w:val="1"/>
+    </w:lvlOverride>
+  </w:num>
+  <w:num w:numId="3" w16cid:durableId="1963535934">
     <w:abstractNumId w:val="2"/>
     <w:lvlOverride w:ilvl="0">
       <w:startOverride w:val="1"/>
     </w:lvlOverride>
   </w:num>
-  <w:num w:numId="2" w16cid:durableId="1894347324">
-    <w:abstractNumId w:val="1"/>
+  <w:num w:numId="4" w16cid:durableId="434443803">
+    <w:abstractNumId w:val="2"/>
     <w:lvlOverride w:ilvl="0">
       <w:startOverride w:val="1"/>
     </w:lvlOverride>
   </w:num>
-  <w:num w:numId="3" w16cid:durableId="1749301331">
-    <w:abstractNumId w:val="0"/>
-    <w:lvlOverride w:ilvl="0">
-      <w:startOverride w:val="1"/>
-    </w:lvlOverride>
-  </w:num>
-  <w:num w:numId="4" w16cid:durableId="1564753071">
-    <w:abstractNumId w:val="0"/>
-    <w:lvlOverride w:ilvl="0">
-      <w:startOverride w:val="1"/>
-    </w:lvlOverride>
-  </w:num>
-  <w:num w:numId="5" w16cid:durableId="815611459">
-    <w:abstractNumId w:val="0"/>
+  <w:num w:numId="5" w16cid:durableId="257832262">
+    <w:abstractNumId w:val="2"/>
     <w:lvlOverride w:ilvl="0">
       <w:startOverride w:val="1"/>
     </w:lvlOverride>
@@ -20761,7 +20888,7 @@
     <w:autoRedefine/>
     <w:uiPriority w:val="39"/>
     <w:unhideWhenUsed/>
-    <w:rsid w:val="00A155A5"/>
+    <w:rsid w:val="00EB31FB"/>
     <w:pPr>
       <w:spacing w:after="100"/>
     </w:pPr>

</xml_diff>

<commit_message>
Version 2 verification at a96e0f1: R14 audit checks in verifier, reports, 1,000-profile dataset, smoke artifacts
</commit_message>
<xml_diff>
--- a/docs/IMPLEMENTATION_REPORT.docx
+++ b/docs/IMPLEMENTATION_REPORT.docx
@@ -174,14 +174,14 @@
                 <w:sz w:val="15"/>
                 <w:szCs w:val="15"/>
               </w:rPr>
-              <w:t>afc3f0ab3858b86889a07b7deff73bc1685edc21</w:t>
-            </w:r>
-            <w:r>
-              <w:rPr>
-                <w:sz w:val="17"/>
-                <w:szCs w:val="17"/>
-              </w:rPr>
-              <w:t xml:space="preserve"> (code freeze; all results in this report were produced at this commit)</w:t>
+              <w:t>a96e0f1d38e1db2c2323be8494de1f790ac855ab</w:t>
+            </w:r>
+            <w:r>
+              <w:rPr>
+                <w:sz w:val="17"/>
+                <w:szCs w:val="17"/>
+              </w:rPr>
+              <w:t xml:space="preserve"> (version 2, after Builderr's audit of version 1; all results in this report were produced at this commit)</w:t>
             </w:r>
           </w:p>
         </w:tc>
@@ -303,7 +303,7 @@
                 <w:sz w:val="17"/>
                 <w:szCs w:val="17"/>
               </w:rPr>
-              <w:t>about 1,950 lines of agent code, 330 lines of tooling and a 590-line offline test suite in the repository; an 82-line run harness was used for validation</w:t>
+              <w:t>about 2,030 lines of agent code, 340 lines of tooling and a 660-line offline test suite in the repository; an 82-line run harness was used for validation</w:t>
             </w:r>
           </w:p>
         </w:tc>
@@ -398,7 +398,7 @@
     <w:sdt>
       <w:sdtPr>
         <w:alias w:val="Contents"/>
-        <w:id w:val="-1597398185"/>
+        <w:id w:val="245538021"/>
       </w:sdtPr>
       <w:sdtEndPr/>
       <w:sdtContent>
@@ -421,7 +421,7 @@
           <w:r>
             <w:fldChar w:fldCharType="separate"/>
           </w:r>
-          <w:hyperlink w:anchor="_Toc243074050" w:history="1">
+          <w:hyperlink w:anchor="_Toc243648892" w:history="1">
             <w:r>
               <w:rPr>
                 <w:rStyle w:val="Hyperlink"/>
@@ -445,7 +445,7 @@
               <w:rPr>
                 <w:noProof/>
               </w:rPr>
-              <w:instrText xml:space="preserve"> PAGEREF _Toc243074050 \h </w:instrText>
+              <w:instrText xml:space="preserve"> PAGEREF _Toc243648892 \h </w:instrText>
             </w:r>
             <w:r>
               <w:rPr>
@@ -482,7 +482,7 @@
               <w:noProof/>
             </w:rPr>
           </w:pPr>
-          <w:hyperlink w:anchor="_Toc243074051" w:history="1">
+          <w:hyperlink w:anchor="_Toc243648893" w:history="1">
             <w:r>
               <w:rPr>
                 <w:rStyle w:val="Hyperlink"/>
@@ -506,7 +506,7 @@
               <w:rPr>
                 <w:noProof/>
               </w:rPr>
-              <w:instrText xml:space="preserve"> PAGEREF _Toc243074051 \h </w:instrText>
+              <w:instrText xml:space="preserve"> PAGEREF _Toc243648893 \h </w:instrText>
             </w:r>
             <w:r>
               <w:rPr>
@@ -543,7 +543,7 @@
               <w:noProof/>
             </w:rPr>
           </w:pPr>
-          <w:hyperlink w:anchor="_Toc243074052" w:history="1">
+          <w:hyperlink w:anchor="_Toc243648894" w:history="1">
             <w:r>
               <w:rPr>
                 <w:rStyle w:val="Hyperlink"/>
@@ -567,7 +567,7 @@
               <w:rPr>
                 <w:noProof/>
               </w:rPr>
-              <w:instrText xml:space="preserve"> PAGEREF _Toc243074052 \h </w:instrText>
+              <w:instrText xml:space="preserve"> PAGEREF _Toc243648894 \h </w:instrText>
             </w:r>
             <w:r>
               <w:rPr>
@@ -604,7 +604,7 @@
               <w:noProof/>
             </w:rPr>
           </w:pPr>
-          <w:hyperlink w:anchor="_Toc243074053" w:history="1">
+          <w:hyperlink w:anchor="_Toc243648895" w:history="1">
             <w:r>
               <w:rPr>
                 <w:rStyle w:val="Hyperlink"/>
@@ -628,7 +628,7 @@
               <w:rPr>
                 <w:noProof/>
               </w:rPr>
-              <w:instrText xml:space="preserve"> PAGEREF _Toc243074053 \h </w:instrText>
+              <w:instrText xml:space="preserve"> PAGEREF _Toc243648895 \h </w:instrText>
             </w:r>
             <w:r>
               <w:rPr>
@@ -665,7 +665,7 @@
               <w:noProof/>
             </w:rPr>
           </w:pPr>
-          <w:hyperlink w:anchor="_Toc243074054" w:history="1">
+          <w:hyperlink w:anchor="_Toc243648896" w:history="1">
             <w:r>
               <w:rPr>
                 <w:rStyle w:val="Hyperlink"/>
@@ -689,7 +689,7 @@
               <w:rPr>
                 <w:noProof/>
               </w:rPr>
-              <w:instrText xml:space="preserve"> PAGEREF _Toc243074054 \h </w:instrText>
+              <w:instrText xml:space="preserve"> PAGEREF _Toc243648896 \h </w:instrText>
             </w:r>
             <w:r>
               <w:rPr>
@@ -726,7 +726,7 @@
               <w:noProof/>
             </w:rPr>
           </w:pPr>
-          <w:hyperlink w:anchor="_Toc243074055" w:history="1">
+          <w:hyperlink w:anchor="_Toc243648897" w:history="1">
             <w:r>
               <w:rPr>
                 <w:rStyle w:val="Hyperlink"/>
@@ -750,7 +750,7 @@
               <w:rPr>
                 <w:noProof/>
               </w:rPr>
-              <w:instrText xml:space="preserve"> PAGEREF _Toc243074055 \h </w:instrText>
+              <w:instrText xml:space="preserve"> PAGEREF _Toc243648897 \h </w:instrText>
             </w:r>
             <w:r>
               <w:rPr>
@@ -787,7 +787,7 @@
               <w:noProof/>
             </w:rPr>
           </w:pPr>
-          <w:hyperlink w:anchor="_Toc243074056" w:history="1">
+          <w:hyperlink w:anchor="_Toc243648898" w:history="1">
             <w:r>
               <w:rPr>
                 <w:rStyle w:val="Hyperlink"/>
@@ -811,7 +811,7 @@
               <w:rPr>
                 <w:noProof/>
               </w:rPr>
-              <w:instrText xml:space="preserve"> PAGEREF _Toc243074056 \h </w:instrText>
+              <w:instrText xml:space="preserve"> PAGEREF _Toc243648898 \h </w:instrText>
             </w:r>
             <w:r>
               <w:rPr>
@@ -848,7 +848,7 @@
               <w:noProof/>
             </w:rPr>
           </w:pPr>
-          <w:hyperlink w:anchor="_Toc243074057" w:history="1">
+          <w:hyperlink w:anchor="_Toc243648899" w:history="1">
             <w:r>
               <w:rPr>
                 <w:rStyle w:val="Hyperlink"/>
@@ -872,7 +872,7 @@
               <w:rPr>
                 <w:noProof/>
               </w:rPr>
-              <w:instrText xml:space="preserve"> PAGEREF _Toc243074057 \h </w:instrText>
+              <w:instrText xml:space="preserve"> PAGEREF _Toc243648899 \h </w:instrText>
             </w:r>
             <w:r>
               <w:rPr>
@@ -909,7 +909,7 @@
               <w:noProof/>
             </w:rPr>
           </w:pPr>
-          <w:hyperlink w:anchor="_Toc243074058" w:history="1">
+          <w:hyperlink w:anchor="_Toc243648900" w:history="1">
             <w:r>
               <w:rPr>
                 <w:rStyle w:val="Hyperlink"/>
@@ -933,7 +933,7 @@
               <w:rPr>
                 <w:noProof/>
               </w:rPr>
-              <w:instrText xml:space="preserve"> PAGEREF _Toc243074058 \h </w:instrText>
+              <w:instrText xml:space="preserve"> PAGEREF _Toc243648900 \h </w:instrText>
             </w:r>
             <w:r>
               <w:rPr>
@@ -950,7 +950,7 @@
               <w:rPr>
                 <w:noProof/>
               </w:rPr>
-              <w:t>7</w:t>
+              <w:t>8</w:t>
             </w:r>
             <w:r>
               <w:rPr>
@@ -970,7 +970,7 @@
               <w:noProof/>
             </w:rPr>
           </w:pPr>
-          <w:hyperlink w:anchor="_Toc243074059" w:history="1">
+          <w:hyperlink w:anchor="_Toc243648901" w:history="1">
             <w:r>
               <w:rPr>
                 <w:rStyle w:val="Hyperlink"/>
@@ -994,7 +994,7 @@
               <w:rPr>
                 <w:noProof/>
               </w:rPr>
-              <w:instrText xml:space="preserve"> PAGEREF _Toc243074059 \h </w:instrText>
+              <w:instrText xml:space="preserve"> PAGEREF _Toc243648901 \h </w:instrText>
             </w:r>
             <w:r>
               <w:rPr>
@@ -1031,7 +1031,7 @@
               <w:noProof/>
             </w:rPr>
           </w:pPr>
-          <w:hyperlink w:anchor="_Toc243074060" w:history="1">
+          <w:hyperlink w:anchor="_Toc243648902" w:history="1">
             <w:r>
               <w:rPr>
                 <w:rStyle w:val="Hyperlink"/>
@@ -1055,7 +1055,7 @@
               <w:rPr>
                 <w:noProof/>
               </w:rPr>
-              <w:instrText xml:space="preserve"> PAGEREF _Toc243074060 \h </w:instrText>
+              <w:instrText xml:space="preserve"> PAGEREF _Toc243648902 \h </w:instrText>
             </w:r>
             <w:r>
               <w:rPr>
@@ -1092,7 +1092,7 @@
               <w:noProof/>
             </w:rPr>
           </w:pPr>
-          <w:hyperlink w:anchor="_Toc243074061" w:history="1">
+          <w:hyperlink w:anchor="_Toc243648903" w:history="1">
             <w:r>
               <w:rPr>
                 <w:rStyle w:val="Hyperlink"/>
@@ -1116,7 +1116,7 @@
               <w:rPr>
                 <w:noProof/>
               </w:rPr>
-              <w:instrText xml:space="preserve"> PAGEREF _Toc243074061 \h </w:instrText>
+              <w:instrText xml:space="preserve"> PAGEREF _Toc243648903 \h </w:instrText>
             </w:r>
             <w:r>
               <w:rPr>
@@ -1153,7 +1153,7 @@
               <w:noProof/>
             </w:rPr>
           </w:pPr>
-          <w:hyperlink w:anchor="_Toc243074062" w:history="1">
+          <w:hyperlink w:anchor="_Toc243648904" w:history="1">
             <w:r>
               <w:rPr>
                 <w:rStyle w:val="Hyperlink"/>
@@ -1177,7 +1177,7 @@
               <w:rPr>
                 <w:noProof/>
               </w:rPr>
-              <w:instrText xml:space="preserve"> PAGEREF _Toc243074062 \h </w:instrText>
+              <w:instrText xml:space="preserve"> PAGEREF _Toc243648904 \h </w:instrText>
             </w:r>
             <w:r>
               <w:rPr>
@@ -1214,7 +1214,7 @@
               <w:noProof/>
             </w:rPr>
           </w:pPr>
-          <w:hyperlink w:anchor="_Toc243074063" w:history="1">
+          <w:hyperlink w:anchor="_Toc243648905" w:history="1">
             <w:r>
               <w:rPr>
                 <w:rStyle w:val="Hyperlink"/>
@@ -1238,7 +1238,7 @@
               <w:rPr>
                 <w:noProof/>
               </w:rPr>
-              <w:instrText xml:space="preserve"> PAGEREF _Toc243074063 \h </w:instrText>
+              <w:instrText xml:space="preserve"> PAGEREF _Toc243648905 \h </w:instrText>
             </w:r>
             <w:r>
               <w:rPr>
@@ -1275,7 +1275,7 @@
               <w:noProof/>
             </w:rPr>
           </w:pPr>
-          <w:hyperlink w:anchor="_Toc243074064" w:history="1">
+          <w:hyperlink w:anchor="_Toc243648906" w:history="1">
             <w:r>
               <w:rPr>
                 <w:rStyle w:val="Hyperlink"/>
@@ -1299,7 +1299,7 @@
               <w:rPr>
                 <w:noProof/>
               </w:rPr>
-              <w:instrText xml:space="preserve"> PAGEREF _Toc243074064 \h </w:instrText>
+              <w:instrText xml:space="preserve"> PAGEREF _Toc243648906 \h </w:instrText>
             </w:r>
             <w:r>
               <w:rPr>
@@ -1336,7 +1336,7 @@
               <w:noProof/>
             </w:rPr>
           </w:pPr>
-          <w:hyperlink w:anchor="_Toc243074065" w:history="1">
+          <w:hyperlink w:anchor="_Toc243648907" w:history="1">
             <w:r>
               <w:rPr>
                 <w:rStyle w:val="Hyperlink"/>
@@ -1360,7 +1360,7 @@
               <w:rPr>
                 <w:noProof/>
               </w:rPr>
-              <w:instrText xml:space="preserve"> PAGEREF _Toc243074065 \h </w:instrText>
+              <w:instrText xml:space="preserve"> PAGEREF _Toc243648907 \h </w:instrText>
             </w:r>
             <w:r>
               <w:rPr>
@@ -1397,7 +1397,7 @@
               <w:noProof/>
             </w:rPr>
           </w:pPr>
-          <w:hyperlink w:anchor="_Toc243074066" w:history="1">
+          <w:hyperlink w:anchor="_Toc243648908" w:history="1">
             <w:r>
               <w:rPr>
                 <w:rStyle w:val="Hyperlink"/>
@@ -1421,7 +1421,7 @@
               <w:rPr>
                 <w:noProof/>
               </w:rPr>
-              <w:instrText xml:space="preserve"> PAGEREF _Toc243074066 \h </w:instrText>
+              <w:instrText xml:space="preserve"> PAGEREF _Toc243648908 \h </w:instrText>
             </w:r>
             <w:r>
               <w:rPr>
@@ -1438,7 +1438,7 @@
               <w:rPr>
                 <w:noProof/>
               </w:rPr>
-              <w:t>12</w:t>
+              <w:t>13</w:t>
             </w:r>
             <w:r>
               <w:rPr>
@@ -1464,7 +1464,7 @@
       <w:pPr>
         <w:pStyle w:val="Heading1"/>
       </w:pPr>
-      <w:bookmarkStart w:id="0" w:name="_Toc243074050"/>
+      <w:bookmarkStart w:id="0" w:name="_Toc243648892"/>
       <w:r>
         <w:t>1. Executive summary</w:t>
       </w:r>
@@ -1608,7 +1608,7 @@
         <w:spacing w:after="60" w:line="264" w:lineRule="auto"/>
       </w:pPr>
       <w:r>
-        <w:t>13 of 13 verification runs (1,302 company results) pass all 13 contract rule groups.</w:t>
+        <w:t>13 of 13 verification runs (1,302 company results) pass all 14 contract rule groups.</w:t>
       </w:r>
     </w:p>
     <w:p>
@@ -1634,7 +1634,7 @@
         <w:spacing w:after="60" w:line="264" w:lineRule="auto"/>
       </w:pPr>
       <w:r>
-        <w:t>142 published websites, all audited by hand: zero wrong-company publications.</w:t>
+        <w:t>137 published websites, all audited by hand: zero wrong-company publications.</w:t>
       </w:r>
     </w:p>
     <w:p>
@@ -1673,7 +1673,7 @@
         <w:spacing w:after="60" w:line="264" w:lineRule="auto"/>
       </w:pPr>
       <w:r>
-        <w:t>40 offline regression tests pass, including the network-security boundary cases.</w:t>
+        <w:t>47 offline regression tests pass, including the network-security boundary cases and the cases from Builderr's audit.</w:t>
       </w:r>
     </w:p>
     <w:p>
@@ -1686,14 +1686,14 @@
         <w:spacing w:after="60" w:line="264" w:lineRule="auto"/>
       </w:pPr>
       <w:r>
-        <w:t>A deduplicated dataset of 1,000 company profiles (46,902 claims) is built from the verified runs.</w:t>
+        <w:t>A deduplicated dataset of 1,000 company profiles (46,848 claims) is built from the verified runs.</w:t>
       </w:r>
     </w:p>
     <w:p>
       <w:pPr>
         <w:pStyle w:val="Heading1"/>
       </w:pPr>
-      <w:bookmarkStart w:id="1" w:name="_Toc243074051"/>
+      <w:bookmarkStart w:id="1" w:name="_Toc243648893"/>
       <w:r>
         <w:t>2. The challenge and its requirements</w:t>
       </w:r>
@@ -2733,7 +2733,7 @@
       <w:pPr>
         <w:pStyle w:val="Heading1"/>
       </w:pPr>
-      <w:bookmarkStart w:id="2" w:name="_Toc243074052"/>
+      <w:bookmarkStart w:id="2" w:name="_Toc243648894"/>
       <w:r>
         <w:t>3. Methodology</w:t>
       </w:r>
@@ -2883,7 +2883,7 @@
       <w:pPr>
         <w:pStyle w:val="Heading1"/>
       </w:pPr>
-      <w:bookmarkStart w:id="3" w:name="_Toc243074053"/>
+      <w:bookmarkStart w:id="3" w:name="_Toc243648895"/>
       <w:r>
         <w:t>4. Architecture</w:t>
       </w:r>
@@ -4151,7 +4151,7 @@
                 <w:sz w:val="17"/>
                 <w:szCs w:val="17"/>
               </w:rPr>
-              <w:t>147</w:t>
+              <w:t>155</w:t>
             </w:r>
           </w:p>
         </w:tc>
@@ -4239,7 +4239,7 @@
                 <w:sz w:val="17"/>
                 <w:szCs w:val="17"/>
               </w:rPr>
-              <w:t>566</w:t>
+              <w:t>639</w:t>
             </w:r>
           </w:p>
         </w:tc>
@@ -4503,7 +4503,7 @@
                 <w:sz w:val="17"/>
                 <w:szCs w:val="17"/>
               </w:rPr>
-              <w:t>183</w:t>
+              <w:t>195</w:t>
             </w:r>
           </w:p>
         </w:tc>
@@ -4530,7 +4530,7 @@
                 <w:sz w:val="17"/>
                 <w:szCs w:val="17"/>
               </w:rPr>
-              <w:t>contract verifier (13 rule groups) with live financial spot-checks</w:t>
+              <w:t>contract verifier (14 rule groups) with live financial spot-checks</w:t>
             </w:r>
           </w:p>
         </w:tc>
@@ -4767,7 +4767,7 @@
                 <w:sz w:val="17"/>
                 <w:szCs w:val="17"/>
               </w:rPr>
-              <w:t>590</w:t>
+              <w:t>662</w:t>
             </w:r>
           </w:p>
         </w:tc>
@@ -4794,7 +4794,7 @@
                 <w:sz w:val="17"/>
                 <w:szCs w:val="17"/>
               </w:rPr>
-              <w:t>40 offline regression tests</w:t>
+              <w:t>47 offline regression tests</w:t>
             </w:r>
           </w:p>
         </w:tc>
@@ -4809,7 +4809,7 @@
       <w:pPr>
         <w:pStyle w:val="Heading1"/>
       </w:pPr>
-      <w:bookmarkStart w:id="4" w:name="_Toc243074054"/>
+      <w:bookmarkStart w:id="4" w:name="_Toc243648896"/>
       <w:r>
         <w:t>5. Technology stack</w:t>
       </w:r>
@@ -6274,7 +6274,7 @@
       <w:pPr>
         <w:pStyle w:val="Heading1"/>
       </w:pPr>
-      <w:bookmarkStart w:id="5" w:name="_Toc243074055"/>
+      <w:bookmarkStart w:id="5" w:name="_Toc243648897"/>
       <w:r>
         <w:t>6. Data sources</w:t>
       </w:r>
@@ -6295,11 +6295,11 @@
         <w:tblLook w:val="04A0" w:firstRow="1" w:lastRow="0" w:firstColumn="1" w:lastColumn="0" w:noHBand="0" w:noVBand="1"/>
       </w:tblPr>
       <w:tblGrid>
-        <w:gridCol w:w="2079"/>
-        <w:gridCol w:w="2367"/>
-        <w:gridCol w:w="1603"/>
-        <w:gridCol w:w="1920"/>
-        <w:gridCol w:w="1669"/>
+        <w:gridCol w:w="2069"/>
+        <w:gridCol w:w="2346"/>
+        <w:gridCol w:w="1664"/>
+        <w:gridCol w:w="1907"/>
+        <w:gridCol w:w="1652"/>
       </w:tblGrid>
       <w:tr>
         <w:trPr>
@@ -6308,7 +6308,7 @@
         </w:trPr>
         <w:tc>
           <w:tcPr>
-            <w:tcW w:w="2079" w:type="dxa"/>
+            <w:tcW w:w="2069" w:type="dxa"/>
             <w:tcBorders>
               <w:top w:val="single" w:sz="4" w:space="0" w:color="B7C4D3"/>
               <w:left w:val="single" w:sz="4" w:space="0" w:color="B7C4D3"/>
@@ -6338,7 +6338,7 @@
         </w:tc>
         <w:tc>
           <w:tcPr>
-            <w:tcW w:w="2367" w:type="dxa"/>
+            <w:tcW w:w="2346" w:type="dxa"/>
             <w:tcBorders>
               <w:top w:val="single" w:sz="4" w:space="0" w:color="B7C4D3"/>
               <w:left w:val="single" w:sz="4" w:space="0" w:color="B7C4D3"/>
@@ -6368,7 +6368,7 @@
         </w:tc>
         <w:tc>
           <w:tcPr>
-            <w:tcW w:w="1603" w:type="dxa"/>
+            <w:tcW w:w="1664" w:type="dxa"/>
             <w:tcBorders>
               <w:top w:val="single" w:sz="4" w:space="0" w:color="B7C4D3"/>
               <w:left w:val="single" w:sz="4" w:space="0" w:color="B7C4D3"/>
@@ -6398,7 +6398,7 @@
         </w:tc>
         <w:tc>
           <w:tcPr>
-            <w:tcW w:w="1920" w:type="dxa"/>
+            <w:tcW w:w="1907" w:type="dxa"/>
             <w:tcBorders>
               <w:top w:val="single" w:sz="4" w:space="0" w:color="B7C4D3"/>
               <w:left w:val="single" w:sz="4" w:space="0" w:color="B7C4D3"/>
@@ -6428,7 +6428,7 @@
         </w:tc>
         <w:tc>
           <w:tcPr>
-            <w:tcW w:w="1669" w:type="dxa"/>
+            <w:tcW w:w="1652" w:type="dxa"/>
             <w:tcBorders>
               <w:top w:val="single" w:sz="4" w:space="0" w:color="B7C4D3"/>
               <w:left w:val="single" w:sz="4" w:space="0" w:color="B7C4D3"/>
@@ -6463,7 +6463,7 @@
         </w:trPr>
         <w:tc>
           <w:tcPr>
-            <w:tcW w:w="2079" w:type="dxa"/>
+            <w:tcW w:w="2069" w:type="dxa"/>
             <w:tcBorders>
               <w:top w:val="single" w:sz="4" w:space="0" w:color="B7C4D3"/>
               <w:left w:val="single" w:sz="4" w:space="0" w:color="B7C4D3"/>
@@ -6490,7 +6490,7 @@
         </w:tc>
         <w:tc>
           <w:tcPr>
-            <w:tcW w:w="2367" w:type="dxa"/>
+            <w:tcW w:w="2346" w:type="dxa"/>
             <w:tcBorders>
               <w:top w:val="single" w:sz="4" w:space="0" w:color="B7C4D3"/>
               <w:left w:val="single" w:sz="4" w:space="0" w:color="B7C4D3"/>
@@ -6517,7 +6517,7 @@
         </w:tc>
         <w:tc>
           <w:tcPr>
-            <w:tcW w:w="1603" w:type="dxa"/>
+            <w:tcW w:w="1664" w:type="dxa"/>
             <w:tcBorders>
               <w:top w:val="single" w:sz="4" w:space="0" w:color="B7C4D3"/>
               <w:left w:val="single" w:sz="4" w:space="0" w:color="B7C4D3"/>
@@ -6544,7 +6544,7 @@
         </w:tc>
         <w:tc>
           <w:tcPr>
-            <w:tcW w:w="1920" w:type="dxa"/>
+            <w:tcW w:w="1907" w:type="dxa"/>
             <w:tcBorders>
               <w:top w:val="single" w:sz="4" w:space="0" w:color="B7C4D3"/>
               <w:left w:val="single" w:sz="4" w:space="0" w:color="B7C4D3"/>
@@ -6571,7 +6571,7 @@
         </w:tc>
         <w:tc>
           <w:tcPr>
-            <w:tcW w:w="1669" w:type="dxa"/>
+            <w:tcW w:w="1652" w:type="dxa"/>
             <w:tcBorders>
               <w:top w:val="single" w:sz="4" w:space="0" w:color="B7C4D3"/>
               <w:left w:val="single" w:sz="4" w:space="0" w:color="B7C4D3"/>
@@ -6603,7 +6603,7 @@
         </w:trPr>
         <w:tc>
           <w:tcPr>
-            <w:tcW w:w="2079" w:type="dxa"/>
+            <w:tcW w:w="2069" w:type="dxa"/>
             <w:tcBorders>
               <w:top w:val="single" w:sz="4" w:space="0" w:color="B7C4D3"/>
               <w:left w:val="single" w:sz="4" w:space="0" w:color="B7C4D3"/>
@@ -6630,7 +6630,7 @@
         </w:tc>
         <w:tc>
           <w:tcPr>
-            <w:tcW w:w="2367" w:type="dxa"/>
+            <w:tcW w:w="2346" w:type="dxa"/>
             <w:tcBorders>
               <w:top w:val="single" w:sz="4" w:space="0" w:color="B7C4D3"/>
               <w:left w:val="single" w:sz="4" w:space="0" w:color="B7C4D3"/>
@@ -6657,7 +6657,7 @@
         </w:tc>
         <w:tc>
           <w:tcPr>
-            <w:tcW w:w="1603" w:type="dxa"/>
+            <w:tcW w:w="1664" w:type="dxa"/>
             <w:tcBorders>
               <w:top w:val="single" w:sz="4" w:space="0" w:color="B7C4D3"/>
               <w:left w:val="single" w:sz="4" w:space="0" w:color="B7C4D3"/>
@@ -6684,7 +6684,7 @@
         </w:tc>
         <w:tc>
           <w:tcPr>
-            <w:tcW w:w="1920" w:type="dxa"/>
+            <w:tcW w:w="1907" w:type="dxa"/>
             <w:tcBorders>
               <w:top w:val="single" w:sz="4" w:space="0" w:color="B7C4D3"/>
               <w:left w:val="single" w:sz="4" w:space="0" w:color="B7C4D3"/>
@@ -6711,7 +6711,7 @@
         </w:tc>
         <w:tc>
           <w:tcPr>
-            <w:tcW w:w="1669" w:type="dxa"/>
+            <w:tcW w:w="1652" w:type="dxa"/>
             <w:tcBorders>
               <w:top w:val="single" w:sz="4" w:space="0" w:color="B7C4D3"/>
               <w:left w:val="single" w:sz="4" w:space="0" w:color="B7C4D3"/>
@@ -6743,7 +6743,7 @@
         </w:trPr>
         <w:tc>
           <w:tcPr>
-            <w:tcW w:w="2079" w:type="dxa"/>
+            <w:tcW w:w="2069" w:type="dxa"/>
             <w:tcBorders>
               <w:top w:val="single" w:sz="4" w:space="0" w:color="B7C4D3"/>
               <w:left w:val="single" w:sz="4" w:space="0" w:color="B7C4D3"/>
@@ -6770,7 +6770,7 @@
         </w:tc>
         <w:tc>
           <w:tcPr>
-            <w:tcW w:w="2367" w:type="dxa"/>
+            <w:tcW w:w="2346" w:type="dxa"/>
             <w:tcBorders>
               <w:top w:val="single" w:sz="4" w:space="0" w:color="B7C4D3"/>
               <w:left w:val="single" w:sz="4" w:space="0" w:color="B7C4D3"/>
@@ -6797,7 +6797,7 @@
         </w:tc>
         <w:tc>
           <w:tcPr>
-            <w:tcW w:w="1603" w:type="dxa"/>
+            <w:tcW w:w="1664" w:type="dxa"/>
             <w:tcBorders>
               <w:top w:val="single" w:sz="4" w:space="0" w:color="B7C4D3"/>
               <w:left w:val="single" w:sz="4" w:space="0" w:color="B7C4D3"/>
@@ -6824,7 +6824,7 @@
         </w:tc>
         <w:tc>
           <w:tcPr>
-            <w:tcW w:w="1920" w:type="dxa"/>
+            <w:tcW w:w="1907" w:type="dxa"/>
             <w:tcBorders>
               <w:top w:val="single" w:sz="4" w:space="0" w:color="B7C4D3"/>
               <w:left w:val="single" w:sz="4" w:space="0" w:color="B7C4D3"/>
@@ -6851,7 +6851,7 @@
         </w:tc>
         <w:tc>
           <w:tcPr>
-            <w:tcW w:w="1669" w:type="dxa"/>
+            <w:tcW w:w="1652" w:type="dxa"/>
             <w:tcBorders>
               <w:top w:val="single" w:sz="4" w:space="0" w:color="B7C4D3"/>
               <w:left w:val="single" w:sz="4" w:space="0" w:color="B7C4D3"/>
@@ -6883,7 +6883,7 @@
         </w:trPr>
         <w:tc>
           <w:tcPr>
-            <w:tcW w:w="2079" w:type="dxa"/>
+            <w:tcW w:w="2069" w:type="dxa"/>
             <w:tcBorders>
               <w:top w:val="single" w:sz="4" w:space="0" w:color="B7C4D3"/>
               <w:left w:val="single" w:sz="4" w:space="0" w:color="B7C4D3"/>
@@ -6910,7 +6910,7 @@
         </w:tc>
         <w:tc>
           <w:tcPr>
-            <w:tcW w:w="2367" w:type="dxa"/>
+            <w:tcW w:w="2346" w:type="dxa"/>
             <w:tcBorders>
               <w:top w:val="single" w:sz="4" w:space="0" w:color="B7C4D3"/>
               <w:left w:val="single" w:sz="4" w:space="0" w:color="B7C4D3"/>
@@ -6937,7 +6937,7 @@
         </w:tc>
         <w:tc>
           <w:tcPr>
-            <w:tcW w:w="1603" w:type="dxa"/>
+            <w:tcW w:w="1664" w:type="dxa"/>
             <w:tcBorders>
               <w:top w:val="single" w:sz="4" w:space="0" w:color="B7C4D3"/>
               <w:left w:val="single" w:sz="4" w:space="0" w:color="B7C4D3"/>
@@ -6964,7 +6964,7 @@
         </w:tc>
         <w:tc>
           <w:tcPr>
-            <w:tcW w:w="1920" w:type="dxa"/>
+            <w:tcW w:w="1907" w:type="dxa"/>
             <w:tcBorders>
               <w:top w:val="single" w:sz="4" w:space="0" w:color="B7C4D3"/>
               <w:left w:val="single" w:sz="4" w:space="0" w:color="B7C4D3"/>
@@ -6991,7 +6991,7 @@
         </w:tc>
         <w:tc>
           <w:tcPr>
-            <w:tcW w:w="1669" w:type="dxa"/>
+            <w:tcW w:w="1652" w:type="dxa"/>
             <w:tcBorders>
               <w:top w:val="single" w:sz="4" w:space="0" w:color="B7C4D3"/>
               <w:left w:val="single" w:sz="4" w:space="0" w:color="B7C4D3"/>
@@ -7023,7 +7023,7 @@
         </w:trPr>
         <w:tc>
           <w:tcPr>
-            <w:tcW w:w="2079" w:type="dxa"/>
+            <w:tcW w:w="2069" w:type="dxa"/>
             <w:tcBorders>
               <w:top w:val="single" w:sz="4" w:space="0" w:color="B7C4D3"/>
               <w:left w:val="single" w:sz="4" w:space="0" w:color="B7C4D3"/>
@@ -7050,7 +7050,7 @@
         </w:tc>
         <w:tc>
           <w:tcPr>
-            <w:tcW w:w="2367" w:type="dxa"/>
+            <w:tcW w:w="2346" w:type="dxa"/>
             <w:tcBorders>
               <w:top w:val="single" w:sz="4" w:space="0" w:color="B7C4D3"/>
               <w:left w:val="single" w:sz="4" w:space="0" w:color="B7C4D3"/>
@@ -7093,7 +7093,7 @@
         </w:tc>
         <w:tc>
           <w:tcPr>
-            <w:tcW w:w="1603" w:type="dxa"/>
+            <w:tcW w:w="1664" w:type="dxa"/>
             <w:tcBorders>
               <w:top w:val="single" w:sz="4" w:space="0" w:color="B7C4D3"/>
               <w:left w:val="single" w:sz="4" w:space="0" w:color="B7C4D3"/>
@@ -7120,7 +7120,7 @@
         </w:tc>
         <w:tc>
           <w:tcPr>
-            <w:tcW w:w="1920" w:type="dxa"/>
+            <w:tcW w:w="1907" w:type="dxa"/>
             <w:tcBorders>
               <w:top w:val="single" w:sz="4" w:space="0" w:color="B7C4D3"/>
               <w:left w:val="single" w:sz="4" w:space="0" w:color="B7C4D3"/>
@@ -7147,7 +7147,7 @@
         </w:tc>
         <w:tc>
           <w:tcPr>
-            <w:tcW w:w="1669" w:type="dxa"/>
+            <w:tcW w:w="1652" w:type="dxa"/>
             <w:tcBorders>
               <w:top w:val="single" w:sz="4" w:space="0" w:color="B7C4D3"/>
               <w:left w:val="single" w:sz="4" w:space="0" w:color="B7C4D3"/>
@@ -7179,7 +7179,7 @@
         </w:trPr>
         <w:tc>
           <w:tcPr>
-            <w:tcW w:w="2079" w:type="dxa"/>
+            <w:tcW w:w="2069" w:type="dxa"/>
             <w:tcBorders>
               <w:top w:val="single" w:sz="4" w:space="0" w:color="B7C4D3"/>
               <w:left w:val="single" w:sz="4" w:space="0" w:color="B7C4D3"/>
@@ -7206,7 +7206,7 @@
         </w:tc>
         <w:tc>
           <w:tcPr>
-            <w:tcW w:w="2367" w:type="dxa"/>
+            <w:tcW w:w="2346" w:type="dxa"/>
             <w:tcBorders>
               <w:top w:val="single" w:sz="4" w:space="0" w:color="B7C4D3"/>
               <w:left w:val="single" w:sz="4" w:space="0" w:color="B7C4D3"/>
@@ -7233,7 +7233,7 @@
         </w:tc>
         <w:tc>
           <w:tcPr>
-            <w:tcW w:w="1603" w:type="dxa"/>
+            <w:tcW w:w="1664" w:type="dxa"/>
             <w:tcBorders>
               <w:top w:val="single" w:sz="4" w:space="0" w:color="B7C4D3"/>
               <w:left w:val="single" w:sz="4" w:space="0" w:color="B7C4D3"/>
@@ -7260,7 +7260,7 @@
         </w:tc>
         <w:tc>
           <w:tcPr>
-            <w:tcW w:w="1920" w:type="dxa"/>
+            <w:tcW w:w="1907" w:type="dxa"/>
             <w:tcBorders>
               <w:top w:val="single" w:sz="4" w:space="0" w:color="B7C4D3"/>
               <w:left w:val="single" w:sz="4" w:space="0" w:color="B7C4D3"/>
@@ -7287,7 +7287,7 @@
         </w:tc>
         <w:tc>
           <w:tcPr>
-            <w:tcW w:w="1669" w:type="dxa"/>
+            <w:tcW w:w="1652" w:type="dxa"/>
             <w:tcBorders>
               <w:top w:val="single" w:sz="4" w:space="0" w:color="B7C4D3"/>
               <w:left w:val="single" w:sz="4" w:space="0" w:color="B7C4D3"/>
@@ -7328,7 +7328,7 @@
         </w:trPr>
         <w:tc>
           <w:tcPr>
-            <w:tcW w:w="2079" w:type="dxa"/>
+            <w:tcW w:w="2069" w:type="dxa"/>
             <w:tcBorders>
               <w:top w:val="single" w:sz="4" w:space="0" w:color="B7C4D3"/>
               <w:left w:val="single" w:sz="4" w:space="0" w:color="B7C4D3"/>
@@ -7355,7 +7355,7 @@
         </w:tc>
         <w:tc>
           <w:tcPr>
-            <w:tcW w:w="2367" w:type="dxa"/>
+            <w:tcW w:w="2346" w:type="dxa"/>
             <w:tcBorders>
               <w:top w:val="single" w:sz="4" w:space="0" w:color="B7C4D3"/>
               <w:left w:val="single" w:sz="4" w:space="0" w:color="B7C4D3"/>
@@ -7382,34 +7382,34 @@
         </w:tc>
         <w:tc>
           <w:tcPr>
-            <w:tcW w:w="1603" w:type="dxa"/>
-            <w:tcBorders>
-              <w:top w:val="single" w:sz="4" w:space="0" w:color="B7C4D3"/>
-              <w:left w:val="single" w:sz="4" w:space="0" w:color="B7C4D3"/>
-              <w:bottom w:val="single" w:sz="4" w:space="0" w:color="B7C4D3"/>
-              <w:right w:val="single" w:sz="4" w:space="0" w:color="B7C4D3"/>
-            </w:tcBorders>
-            <w:shd w:val="clear" w:color="auto" w:fill="FFFFFF"/>
-            <w:tcMar>
-              <w:top w:w="50" w:type="dxa"/>
-              <w:left w:w="90" w:type="dxa"/>
-              <w:bottom w:w="50" w:type="dxa"/>
-              <w:right w:w="90" w:type="dxa"/>
-            </w:tcMar>
-          </w:tcPr>
-          <w:p>
-            <w:r>
-              <w:rPr>
-                <w:sz w:val="17"/>
-                <w:szCs w:val="17"/>
-              </w:rPr>
-              <w:t>website, description, brand, social links, contact points, dated news, careers page, JobPosting markup</w:t>
-            </w:r>
-          </w:p>
-        </w:tc>
-        <w:tc>
-          <w:tcPr>
-            <w:tcW w:w="1920" w:type="dxa"/>
+            <w:tcW w:w="1664" w:type="dxa"/>
+            <w:tcBorders>
+              <w:top w:val="single" w:sz="4" w:space="0" w:color="B7C4D3"/>
+              <w:left w:val="single" w:sz="4" w:space="0" w:color="B7C4D3"/>
+              <w:bottom w:val="single" w:sz="4" w:space="0" w:color="B7C4D3"/>
+              <w:right w:val="single" w:sz="4" w:space="0" w:color="B7C4D3"/>
+            </w:tcBorders>
+            <w:shd w:val="clear" w:color="auto" w:fill="FFFFFF"/>
+            <w:tcMar>
+              <w:top w:w="50" w:type="dxa"/>
+              <w:left w:w="90" w:type="dxa"/>
+              <w:bottom w:w="50" w:type="dxa"/>
+              <w:right w:w="90" w:type="dxa"/>
+            </w:tcMar>
+          </w:tcPr>
+          <w:p>
+            <w:r>
+              <w:rPr>
+                <w:sz w:val="17"/>
+                <w:szCs w:val="17"/>
+              </w:rPr>
+              <w:t>website, description, brand, company-named social links, contact points, dated news posts, JobPosting markup naming the company</w:t>
+            </w:r>
+          </w:p>
+        </w:tc>
+        <w:tc>
+          <w:tcPr>
+            <w:tcW w:w="1907" w:type="dxa"/>
             <w:tcBorders>
               <w:top w:val="single" w:sz="4" w:space="0" w:color="B7C4D3"/>
               <w:left w:val="single" w:sz="4" w:space="0" w:color="B7C4D3"/>
@@ -7436,7 +7436,7 @@
         </w:tc>
         <w:tc>
           <w:tcPr>
-            <w:tcW w:w="1669" w:type="dxa"/>
+            <w:tcW w:w="1652" w:type="dxa"/>
             <w:tcBorders>
               <w:top w:val="single" w:sz="4" w:space="0" w:color="B7C4D3"/>
               <w:left w:val="single" w:sz="4" w:space="0" w:color="B7C4D3"/>
@@ -7468,7 +7468,7 @@
         </w:trPr>
         <w:tc>
           <w:tcPr>
-            <w:tcW w:w="2079" w:type="dxa"/>
+            <w:tcW w:w="2069" w:type="dxa"/>
             <w:tcBorders>
               <w:top w:val="single" w:sz="4" w:space="0" w:color="B7C4D3"/>
               <w:left w:val="single" w:sz="4" w:space="0" w:color="B7C4D3"/>
@@ -7495,7 +7495,7 @@
         </w:tc>
         <w:tc>
           <w:tcPr>
-            <w:tcW w:w="2367" w:type="dxa"/>
+            <w:tcW w:w="2346" w:type="dxa"/>
             <w:tcBorders>
               <w:top w:val="single" w:sz="4" w:space="0" w:color="B7C4D3"/>
               <w:left w:val="single" w:sz="4" w:space="0" w:color="B7C4D3"/>
@@ -7522,7 +7522,7 @@
         </w:tc>
         <w:tc>
           <w:tcPr>
-            <w:tcW w:w="1603" w:type="dxa"/>
+            <w:tcW w:w="1664" w:type="dxa"/>
             <w:tcBorders>
               <w:top w:val="single" w:sz="4" w:space="0" w:color="B7C4D3"/>
               <w:left w:val="single" w:sz="4" w:space="0" w:color="B7C4D3"/>
@@ -7549,7 +7549,7 @@
         </w:tc>
         <w:tc>
           <w:tcPr>
-            <w:tcW w:w="1920" w:type="dxa"/>
+            <w:tcW w:w="1907" w:type="dxa"/>
             <w:tcBorders>
               <w:top w:val="single" w:sz="4" w:space="0" w:color="B7C4D3"/>
               <w:left w:val="single" w:sz="4" w:space="0" w:color="B7C4D3"/>
@@ -7576,7 +7576,7 @@
         </w:tc>
         <w:tc>
           <w:tcPr>
-            <w:tcW w:w="1669" w:type="dxa"/>
+            <w:tcW w:w="1652" w:type="dxa"/>
             <w:tcBorders>
               <w:top w:val="single" w:sz="4" w:space="0" w:color="B7C4D3"/>
               <w:left w:val="single" w:sz="4" w:space="0" w:color="B7C4D3"/>
@@ -7627,7 +7627,7 @@
       <w:pPr>
         <w:pStyle w:val="Heading1"/>
       </w:pPr>
-      <w:bookmarkStart w:id="6" w:name="_Toc243074056"/>
+      <w:bookmarkStart w:id="6" w:name="_Toc243648898"/>
       <w:r>
         <w:t>7. Fact, evidence and envelope model</w:t>
       </w:r>
@@ -8186,7 +8186,7 @@
       <w:pPr>
         <w:pStyle w:val="Heading1"/>
       </w:pPr>
-      <w:bookmarkStart w:id="7" w:name="_Toc243074057"/>
+      <w:bookmarkStart w:id="7" w:name="_Toc243648899"/>
       <w:r>
         <w:t>8. Identity verification</w:t>
       </w:r>
@@ -8463,7 +8463,7 @@
         <w:spacing w:after="60" w:line="264" w:lineRule="auto"/>
       </w:pPr>
       <w:r>
-        <w:t>A declared site whose page carries the company's legal or brand name → exact (0.92). A matching phone number alone is not enough.</w:t>
+        <w:t>A declared site whose page carries the company's exact legal name, or its brand name plus the registry's own phone or address → exact (0.92). A brand title alone is not enough (a declared domain can be a group or brand site), and neither is a matching phone number alone.</w:t>
       </w:r>
     </w:p>
     <w:p>
@@ -8546,7 +8546,20 @@
         <w:spacing w:after="60" w:line="264" w:lineRule="auto"/>
       </w:pPr>
       <w:r>
-        <w:t xml:space="preserve">Social profiles are published only when linked from the verified site and either matching the company's name or domain, or listed in its JSON-LD </w:t>
+        <w:t>Social profiles are published only when linked from the verified site and the handle contains the company's distinctive name; platform paths and opaque channel IDs are rejected.</w:t>
+      </w:r>
+    </w:p>
+    <w:p>
+      <w:pPr>
+        <w:pStyle w:val="ListParagraph"/>
+        <w:numPr>
+          <w:ilvl w:val="0"/>
+          <w:numId w:val="2"/>
+        </w:numPr>
+        <w:spacing w:after="60" w:line="264" w:lineRule="auto"/>
+      </w:pPr>
+      <w:r>
+        <w:t xml:space="preserve">When the company's site is a section of a larger site (for example </w:t>
       </w:r>
       <w:r>
         <w:rPr>
@@ -8555,10 +8568,10 @@
           <w:sz w:val="18"/>
           <w:szCs w:val="18"/>
         </w:rPr>
-        <w:t>sameAs</w:t>
-      </w:r>
-      <w:r>
-        <w:t>.</w:t>
+        <w:t>dnt.no/nordtrondelag</w:t>
+      </w:r>
+      <w:r>
+        <w:t>), the URL is published but no social accounts, news or jobs are taken from that domain.</w:t>
       </w:r>
     </w:p>
     <w:p>
@@ -9105,7 +9118,7 @@
       <w:pPr>
         <w:pStyle w:val="Heading1"/>
       </w:pPr>
-      <w:bookmarkStart w:id="8" w:name="_Toc243074058"/>
+      <w:bookmarkStart w:id="8" w:name="_Toc243648900"/>
       <w:r>
         <w:t>9. Other components</w:t>
       </w:r>
@@ -9239,7 +9252,7 @@
         <w:spacing w:after="60" w:line="264" w:lineRule="auto"/>
       </w:pPr>
       <w:r>
-        <w:t>linked social profiles;</w:t>
+        <w:t>linked social profiles whose handle names the company;</w:t>
       </w:r>
     </w:p>
     <w:p>
@@ -9277,7 +9290,7 @@
         <w:spacing w:after="60" w:line="264" w:lineRule="auto"/>
       </w:pPr>
       <w:r>
-        <w:t xml:space="preserve">dated news from JSON-LD articles and </w:t>
+        <w:t xml:space="preserve">dated news posts from JSON-LD articles and </w:t>
       </w:r>
       <w:r>
         <w:rPr>
@@ -9289,7 +9302,7 @@
         <w:t>&lt;time&gt;</w:t>
       </w:r>
       <w:r>
-        <w:t xml:space="preserve"> elements (navigation pages filtered out);</w:t>
+        <w:t xml:space="preserve"> elements: the URL must look like a post (date path or news/blog/press section); contact, product and shop pages, menu labels and demo posts are rejected, and "modified"/"updated" dates are never used as publish dates;</w:t>
       </w:r>
     </w:p>
     <w:p>
@@ -9302,7 +9315,7 @@
         <w:spacing w:after="60" w:line="264" w:lineRule="auto"/>
       </w:pPr>
       <w:r>
-        <w:t>the careers page, and current (unexpired) JobPosting markup.</w:t>
+        <w:t>current (unexpired) JobPosting markup that names this company as employer. Careers landing pages are not published.</w:t>
       </w:r>
     </w:p>
     <w:p>
@@ -9554,7 +9567,7 @@
       <w:pPr>
         <w:pStyle w:val="Heading1"/>
       </w:pPr>
-      <w:bookmarkStart w:id="9" w:name="_Toc243074059"/>
+      <w:bookmarkStart w:id="9" w:name="_Toc243648901"/>
       <w:r>
         <w:t>10. Security</w:t>
       </w:r>
@@ -10447,7 +10460,7 @@
       <w:pPr>
         <w:pStyle w:val="Heading1"/>
       </w:pPr>
-      <w:bookmarkStart w:id="10" w:name="_Toc243074060"/>
+      <w:bookmarkStart w:id="10" w:name="_Toc243648902"/>
       <w:r>
         <w:t>11. Privacy and data protection</w:t>
       </w:r>
@@ -11011,7 +11024,7 @@
       <w:pPr>
         <w:pStyle w:val="Heading1"/>
       </w:pPr>
-      <w:bookmarkStart w:id="11" w:name="_Toc243074061"/>
+      <w:bookmarkStart w:id="11" w:name="_Toc243648903"/>
       <w:r>
         <w:t>12. Testing methodology</w:t>
       </w:r>
@@ -11034,10 +11047,10 @@
           <w:b/>
           <w:bCs/>
         </w:rPr>
-        <w:t>1. Offline regression tests (40).</w:t>
-      </w:r>
-      <w:r>
-        <w:t xml:space="preserve"> These cover the identity gate (18), discovery and extraction (4), network security (9), budgets and states (4), refresh (3), and input and data rules (2), as listed in Appendix A. Network tests use stand-ins for DNS and HTTP, so they run anywhere without network access. The test that guards credential stripping was mutation-checked: disabling the protection makes it fail.</w:t>
+        <w:t>1. Offline regression tests (47).</w:t>
+      </w:r>
+      <w:r>
+        <w:t xml:space="preserve"> These cover the identity gate (19), discovery and extraction (10), network security (9), budgets and states (4), refresh (3), and input and data rules (2), as listed in Appendix A. Network tests use stand-ins for DNS and HTTP, so they run anywhere without network access. The test that guards credential stripping was mutation-checked: disabling the protection makes it fail.</w:t>
       </w:r>
     </w:p>
     <w:p>
@@ -11064,7 +11077,7 @@
         <w:t>tools/verify_run.py</w:t>
       </w:r>
       <w:r>
-        <w:t xml:space="preserve"> checks every envelope of a run against 13 rule groups:</w:t>
+        <w:t xml:space="preserve"> checks every envelope of a run against 14 rule groups:</w:t>
       </w:r>
     </w:p>
     <w:tbl>
@@ -12241,6 +12254,92 @@
                 <w:sz w:val="17"/>
                 <w:szCs w:val="17"/>
               </w:rPr>
+              <w:t>R14</w:t>
+            </w:r>
+          </w:p>
+        </w:tc>
+        <w:tc>
+          <w:tcPr>
+            <w:tcW w:w="2117" w:type="dxa"/>
+            <w:tcBorders>
+              <w:top w:val="single" w:sz="4" w:space="0" w:color="B7C4D3"/>
+              <w:left w:val="single" w:sz="4" w:space="0" w:color="B7C4D3"/>
+              <w:bottom w:val="single" w:sz="4" w:space="0" w:color="B7C4D3"/>
+              <w:right w:val="single" w:sz="4" w:space="0" w:color="B7C4D3"/>
+            </w:tcBorders>
+            <w:shd w:val="clear" w:color="auto" w:fill="FFFFFF"/>
+            <w:tcMar>
+              <w:top w:w="50" w:type="dxa"/>
+              <w:left w:w="90" w:type="dxa"/>
+              <w:bottom w:w="50" w:type="dxa"/>
+              <w:right w:w="90" w:type="dxa"/>
+            </w:tcMar>
+          </w:tcPr>
+          <w:p>
+            <w:r>
+              <w:rPr>
+                <w:sz w:val="17"/>
+                <w:szCs w:val="17"/>
+              </w:rPr>
+              <w:t>Builderr audit rules</w:t>
+            </w:r>
+          </w:p>
+        </w:tc>
+        <w:tc>
+          <w:tcPr>
+            <w:tcW w:w="6951" w:type="dxa"/>
+            <w:tcBorders>
+              <w:top w:val="single" w:sz="4" w:space="0" w:color="B7C4D3"/>
+              <w:left w:val="single" w:sz="4" w:space="0" w:color="B7C4D3"/>
+              <w:bottom w:val="single" w:sz="4" w:space="0" w:color="B7C4D3"/>
+              <w:right w:val="single" w:sz="4" w:space="0" w:color="B7C4D3"/>
+            </w:tcBorders>
+            <w:shd w:val="clear" w:color="auto" w:fill="FFFFFF"/>
+            <w:tcMar>
+              <w:top w:w="50" w:type="dxa"/>
+              <w:left w:w="90" w:type="dxa"/>
+              <w:bottom w:w="50" w:type="dxa"/>
+              <w:right w:w="90" w:type="dxa"/>
+            </w:tcMar>
+          </w:tcPr>
+          <w:p>
+            <w:r>
+              <w:rPr>
+                <w:sz w:val="17"/>
+                <w:szCs w:val="17"/>
+              </w:rPr>
+              <w:t>social handles name the company; news items are dated posts; no careers landing pages; NAV jobs link to a single ad</w:t>
+            </w:r>
+          </w:p>
+        </w:tc>
+      </w:tr>
+      <w:tr>
+        <w:trPr>
+          <w:cantSplit/>
+        </w:trPr>
+        <w:tc>
+          <w:tcPr>
+            <w:tcW w:w="570" w:type="dxa"/>
+            <w:tcBorders>
+              <w:top w:val="single" w:sz="4" w:space="0" w:color="B7C4D3"/>
+              <w:left w:val="single" w:sz="4" w:space="0" w:color="B7C4D3"/>
+              <w:bottom w:val="single" w:sz="4" w:space="0" w:color="B7C4D3"/>
+              <w:right w:val="single" w:sz="4" w:space="0" w:color="B7C4D3"/>
+            </w:tcBorders>
+            <w:shd w:val="clear" w:color="auto" w:fill="F5F8FB"/>
+            <w:tcMar>
+              <w:top w:w="50" w:type="dxa"/>
+              <w:left w:w="90" w:type="dxa"/>
+              <w:bottom w:w="50" w:type="dxa"/>
+              <w:right w:w="90" w:type="dxa"/>
+            </w:tcMar>
+          </w:tcPr>
+          <w:p>
+            <w:r>
+              <w:rPr>
+                <w:sz w:val="17"/>
+                <w:szCs w:val="17"/>
+              </w:rPr>
               <w:t>R13</w:t>
             </w:r>
           </w:p>
@@ -12254,7 +12353,7 @@
               <w:bottom w:val="single" w:sz="4" w:space="0" w:color="B7C4D3"/>
               <w:right w:val="single" w:sz="4" w:space="0" w:color="B7C4D3"/>
             </w:tcBorders>
-            <w:shd w:val="clear" w:color="auto" w:fill="FFFFFF"/>
+            <w:shd w:val="clear" w:color="auto" w:fill="F5F8FB"/>
             <w:tcMar>
               <w:top w:w="50" w:type="dxa"/>
               <w:left w:w="90" w:type="dxa"/>
@@ -12281,7 +12380,7 @@
               <w:bottom w:val="single" w:sz="4" w:space="0" w:color="B7C4D3"/>
               <w:right w:val="single" w:sz="4" w:space="0" w:color="B7C4D3"/>
             </w:tcBorders>
-            <w:shd w:val="clear" w:color="auto" w:fill="FFFFFF"/>
+            <w:shd w:val="clear" w:color="auto" w:fill="F5F8FB"/>
             <w:tcMar>
               <w:top w:w="50" w:type="dxa"/>
               <w:left w:w="90" w:type="dxa"/>
@@ -13102,7 +13201,7 @@
           <w:b/>
           <w:bCs/>
         </w:rPr>
-        <w:t>5. External review.</w:t>
+        <w:t>5. External review and Builderr's audit.</w:t>
       </w:r>
       <w:r>
         <w:t xml:space="preserve"> Four independent review rounds of the source code were checked finding by finding, with each claim reproduced before fixing. They led to the IP pinning, hop-by-hop redirects, credential stripping, HTTPS pinning for NAV, the ownership-proof rule, the stricter financial verifier, the enforced cost cap and the input-parsing fixes.</w:t>
@@ -13120,7 +13219,7 @@
       <w:pPr>
         <w:pStyle w:val="Heading1"/>
       </w:pPr>
-      <w:bookmarkStart w:id="12" w:name="_Toc243074062"/>
+      <w:bookmarkStart w:id="12" w:name="_Toc243648904"/>
       <w:r>
         <w:t>13. Results at the frozen commit</w:t>
       </w:r>
@@ -13504,7 +13603,7 @@
                 <w:sz w:val="17"/>
                 <w:szCs w:val="17"/>
               </w:rPr>
-              <w:t>9</w:t>
+              <w:t>8</w:t>
             </w:r>
           </w:p>
         </w:tc>
@@ -13558,7 +13657,7 @@
                 <w:sz w:val="17"/>
                 <w:szCs w:val="17"/>
               </w:rPr>
-              <w:t>823</w:t>
+              <w:t>832</w:t>
             </w:r>
           </w:p>
         </w:tc>
@@ -13585,7 +13684,7 @@
                 <w:sz w:val="17"/>
                 <w:szCs w:val="17"/>
               </w:rPr>
-              <w:t>472 s</w:t>
+              <w:t>470 s</w:t>
             </w:r>
           </w:p>
         </w:tc>
@@ -13698,7 +13797,7 @@
                 <w:sz w:val="17"/>
                 <w:szCs w:val="17"/>
               </w:rPr>
-              <w:t>4,569</w:t>
+              <w:t>4,563</w:t>
             </w:r>
           </w:p>
         </w:tc>
@@ -13725,7 +13824,7 @@
                 <w:sz w:val="17"/>
                 <w:szCs w:val="17"/>
               </w:rPr>
-              <w:t>8</w:t>
+              <w:t>7</w:t>
             </w:r>
           </w:p>
         </w:tc>
@@ -13779,7 +13878,7 @@
                 <w:sz w:val="17"/>
                 <w:szCs w:val="17"/>
               </w:rPr>
-              <w:t>894</w:t>
+              <w:t>892</w:t>
             </w:r>
           </w:p>
         </w:tc>
@@ -13919,7 +14018,7 @@
                 <w:sz w:val="17"/>
                 <w:szCs w:val="17"/>
               </w:rPr>
-              <w:t>4,417</w:t>
+              <w:t>4,416</w:t>
             </w:r>
           </w:p>
         </w:tc>
@@ -14000,7 +14099,7 @@
                 <w:sz w:val="17"/>
                 <w:szCs w:val="17"/>
               </w:rPr>
-              <w:t>864</w:t>
+              <w:t>867</w:t>
             </w:r>
           </w:p>
         </w:tc>
@@ -14027,7 +14126,7 @@
                 <w:sz w:val="17"/>
                 <w:szCs w:val="17"/>
               </w:rPr>
-              <w:t>425 s</w:t>
+              <w:t>429 s</w:t>
             </w:r>
           </w:p>
         </w:tc>
@@ -14140,7 +14239,7 @@
                 <w:sz w:val="17"/>
                 <w:szCs w:val="17"/>
               </w:rPr>
-              <w:t>4,546</w:t>
+              <w:t>4,541</w:t>
             </w:r>
           </w:p>
         </w:tc>
@@ -14221,7 +14320,7 @@
                 <w:sz w:val="17"/>
                 <w:szCs w:val="17"/>
               </w:rPr>
-              <w:t>816</w:t>
+              <w:t>815</w:t>
             </w:r>
           </w:p>
         </w:tc>
@@ -14248,7 +14347,7 @@
                 <w:sz w:val="17"/>
                 <w:szCs w:val="17"/>
               </w:rPr>
-              <w:t>413 s</w:t>
+              <w:t>405 s</w:t>
             </w:r>
           </w:p>
         </w:tc>
@@ -14361,7 +14460,7 @@
                 <w:sz w:val="17"/>
                 <w:szCs w:val="17"/>
               </w:rPr>
-              <w:t>4,507</w:t>
+              <w:t>4,500</w:t>
             </w:r>
           </w:p>
         </w:tc>
@@ -14415,7 +14514,7 @@
                 <w:sz w:val="17"/>
                 <w:szCs w:val="17"/>
               </w:rPr>
-              <w:t>0</w:t>
+              <w:t>1</w:t>
             </w:r>
           </w:p>
         </w:tc>
@@ -14442,7 +14541,7 @@
                 <w:sz w:val="17"/>
                 <w:szCs w:val="17"/>
               </w:rPr>
-              <w:t>880</w:t>
+              <w:t>883</w:t>
             </w:r>
           </w:p>
         </w:tc>
@@ -14469,7 +14568,7 @@
                 <w:sz w:val="17"/>
                 <w:szCs w:val="17"/>
               </w:rPr>
-              <w:t>407 s</w:t>
+              <w:t>413 s</w:t>
             </w:r>
           </w:p>
         </w:tc>
@@ -14609,7 +14708,7 @@
                 <w:sz w:val="17"/>
                 <w:szCs w:val="17"/>
               </w:rPr>
-              <w:t>31</w:t>
+              <w:t>32</w:t>
             </w:r>
           </w:p>
         </w:tc>
@@ -14636,7 +14735,7 @@
                 <w:sz w:val="17"/>
                 <w:szCs w:val="17"/>
               </w:rPr>
-              <w:t>0</w:t>
+              <w:t>1</w:t>
             </w:r>
           </w:p>
         </w:tc>
@@ -14663,7 +14762,7 @@
                 <w:sz w:val="17"/>
                 <w:szCs w:val="17"/>
               </w:rPr>
-              <w:t>921</w:t>
+              <w:t>925</w:t>
             </w:r>
           </w:p>
         </w:tc>
@@ -14690,7 +14789,7 @@
                 <w:sz w:val="17"/>
                 <w:szCs w:val="17"/>
               </w:rPr>
-              <w:t>502 s</w:t>
+              <w:t>508 s</w:t>
             </w:r>
           </w:p>
         </w:tc>
@@ -14803,7 +14902,7 @@
                 <w:sz w:val="17"/>
                 <w:szCs w:val="17"/>
               </w:rPr>
-              <w:t>5,533</w:t>
+              <w:t>5,505</w:t>
             </w:r>
           </w:p>
         </w:tc>
@@ -14830,7 +14929,7 @@
                 <w:sz w:val="17"/>
                 <w:szCs w:val="17"/>
               </w:rPr>
-              <w:t>43</w:t>
+              <w:t>40</w:t>
             </w:r>
           </w:p>
         </w:tc>
@@ -14857,7 +14956,7 @@
                 <w:sz w:val="17"/>
                 <w:szCs w:val="17"/>
               </w:rPr>
-              <w:t>2</w:t>
+              <w:t>4</w:t>
             </w:r>
           </w:p>
         </w:tc>
@@ -14884,7 +14983,7 @@
                 <w:sz w:val="17"/>
                 <w:szCs w:val="17"/>
               </w:rPr>
-              <w:t>1,058</w:t>
+              <w:t>1,045</w:t>
             </w:r>
           </w:p>
         </w:tc>
@@ -14911,7 +15010,7 @@
                 <w:sz w:val="17"/>
                 <w:szCs w:val="17"/>
               </w:rPr>
-              <w:t>429 s</w:t>
+              <w:t>422 s</w:t>
             </w:r>
           </w:p>
         </w:tc>
@@ -15132,7 +15231,7 @@
                 <w:sz w:val="17"/>
                 <w:szCs w:val="17"/>
               </w:rPr>
-              <w:t>39 s</w:t>
+              <w:t>40 s</w:t>
             </w:r>
           </w:p>
         </w:tc>
@@ -15245,7 +15344,7 @@
                 <w:sz w:val="17"/>
                 <w:szCs w:val="17"/>
               </w:rPr>
-              <w:t>4,306</w:t>
+              <w:t>4,305</w:t>
             </w:r>
           </w:p>
         </w:tc>
@@ -15326,7 +15425,7 @@
                 <w:sz w:val="17"/>
                 <w:szCs w:val="17"/>
               </w:rPr>
-              <w:t>524</w:t>
+              <w:t>523</w:t>
             </w:r>
           </w:p>
         </w:tc>
@@ -15353,7 +15452,7 @@
                 <w:sz w:val="17"/>
                 <w:szCs w:val="17"/>
               </w:rPr>
-              <w:t>136 s</w:t>
+              <w:t>135 s</w:t>
             </w:r>
           </w:p>
         </w:tc>
@@ -15493,7 +15592,7 @@
                 <w:sz w:val="17"/>
                 <w:szCs w:val="17"/>
               </w:rPr>
-              <w:t>9</w:t>
+              <w:t>8</w:t>
             </w:r>
           </w:p>
         </w:tc>
@@ -15547,7 +15646,7 @@
                 <w:sz w:val="17"/>
                 <w:szCs w:val="17"/>
               </w:rPr>
-              <w:t>828</w:t>
+              <w:t>831</w:t>
             </w:r>
           </w:p>
         </w:tc>
@@ -15574,7 +15673,7 @@
                 <w:sz w:val="17"/>
                 <w:szCs w:val="17"/>
               </w:rPr>
-              <w:t>470 s</w:t>
+              <w:t>463 s</w:t>
             </w:r>
           </w:p>
         </w:tc>
@@ -15741,7 +15840,7 @@
                 <w:sz w:val="17"/>
                 <w:szCs w:val="17"/>
               </w:rPr>
-              <w:t>1</w:t>
+              <w:t>0</w:t>
             </w:r>
           </w:p>
         </w:tc>
@@ -15768,7 +15867,7 @@
                 <w:sz w:val="17"/>
                 <w:szCs w:val="17"/>
               </w:rPr>
-              <w:t>891</w:t>
+              <w:t>885</w:t>
             </w:r>
           </w:p>
         </w:tc>
@@ -15795,7 +15894,7 @@
                 <w:sz w:val="17"/>
                 <w:szCs w:val="17"/>
               </w:rPr>
-              <w:t>428 s</w:t>
+              <w:t>426 s</w:t>
             </w:r>
           </w:p>
         </w:tc>
@@ -15908,7 +16007,7 @@
                 <w:sz w:val="17"/>
                 <w:szCs w:val="17"/>
               </w:rPr>
-              <w:t>4,589</w:t>
+              <w:t>4,583</w:t>
             </w:r>
           </w:p>
         </w:tc>
@@ -15935,7 +16034,7 @@
                 <w:sz w:val="17"/>
                 <w:szCs w:val="17"/>
               </w:rPr>
-              <w:t>8</w:t>
+              <w:t>7</w:t>
             </w:r>
           </w:p>
         </w:tc>
@@ -15989,7 +16088,7 @@
                 <w:sz w:val="17"/>
                 <w:szCs w:val="17"/>
               </w:rPr>
-              <w:t>898</w:t>
+              <w:t>899</w:t>
             </w:r>
           </w:p>
         </w:tc>
@@ -16016,7 +16115,7 @@
                 <w:sz w:val="17"/>
                 <w:szCs w:val="17"/>
               </w:rPr>
-              <w:t>453 s</w:t>
+              <w:t>457 s</w:t>
             </w:r>
           </w:p>
         </w:tc>
@@ -16129,7 +16228,7 @@
                 <w:sz w:val="17"/>
                 <w:szCs w:val="17"/>
               </w:rPr>
-              <w:t>4,402</w:t>
+              <w:t>4,401</w:t>
             </w:r>
           </w:p>
         </w:tc>
@@ -16210,7 +16309,7 @@
                 <w:sz w:val="17"/>
                 <w:szCs w:val="17"/>
               </w:rPr>
-              <w:t>822</w:t>
+              <w:t>819</w:t>
             </w:r>
           </w:p>
         </w:tc>
@@ -16237,7 +16336,7 @@
                 <w:sz w:val="17"/>
                 <w:szCs w:val="17"/>
               </w:rPr>
-              <w:t>452 s</w:t>
+              <w:t>441 s</w:t>
             </w:r>
           </w:p>
         </w:tc>
@@ -16846,7 +16945,7 @@
                 <w:sz w:val="17"/>
                 <w:szCs w:val="17"/>
               </w:rPr>
-              <w:t>3–7</w:t>
+              <w:t>3–6</w:t>
             </w:r>
           </w:p>
         </w:tc>
@@ -16921,7 +17020,7 @@
         <w:spacing w:after="120" w:line="276" w:lineRule="auto"/>
       </w:pPr>
       <w:r>
-        <w:t>On employer-heavy and website-heavy batches, website coverage rises to 31–43 per 100.</w:t>
+        <w:t>On employer-heavy and website-heavy batches, website coverage rises to 32–40 per 100.</w:t>
       </w:r>
     </w:p>
     <w:p>
@@ -16936,7 +17035,7 @@
         <w:t>Source yield</w:t>
       </w:r>
       <w:r>
-        <w:t xml:space="preserve"> (smoke run): Brønnøysund 501 requests → 4,337 claims (8.7 per request); company websites 228 requests → 39 claims (0.17 per request); NAV feed 94 requests → 0 claims in that batch.</w:t>
+        <w:t xml:space="preserve"> (smoke run): Brønnøysund 501 requests → 4,339 claims; company websites 237 requests → 37 claims; NAV feed 94 requests → 0 claims in that batch.</w:t>
       </w:r>
     </w:p>
     <w:p>
@@ -16951,7 +17050,7 @@
         <w:t>Identity audit:</w:t>
       </w:r>
       <w:r>
-        <w:t xml:space="preserve"> 142 unique websites were published across the suite:</w:t>
+        <w:t xml:space="preserve"> 137 unique websites were published across the suite:</w:t>
       </w:r>
     </w:p>
     <w:p>
@@ -16964,7 +17063,7 @@
         <w:spacing w:after="60" w:line="264" w:lineRule="auto"/>
       </w:pPr>
       <w:r>
-        <w:t>31 on sites the company declared to an official source;</w:t>
+        <w:t>30 with the organisation number on sites the company declared to an official source;</w:t>
       </w:r>
     </w:p>
     <w:p>
@@ -16977,7 +17076,7 @@
         <w:spacing w:after="60" w:line="264" w:lineRule="auto"/>
       </w:pPr>
       <w:r>
-        <w:t>35 with the number in the site's own identity block;</w:t>
+        <w:t>36 with the number in the site's own identity block;</w:t>
       </w:r>
     </w:p>
     <w:p>
@@ -16990,7 +17089,7 @@
         <w:spacing w:after="60" w:line="264" w:lineRule="auto"/>
       </w:pPr>
       <w:r>
-        <w:t>55 with the exact legal name plus the registry's own phone or address;</w:t>
+        <w:t>56 with the exact legal name plus the registry's own phone or address;</w:t>
       </w:r>
     </w:p>
     <w:p>
@@ -17003,7 +17102,20 @@
         <w:spacing w:after="60" w:line="264" w:lineRule="auto"/>
       </w:pPr>
       <w:r>
-        <w:t>21 declared sites carrying the company's name.</w:t>
+        <w:t>7 declared sites carrying the exact legal name;</w:t>
+      </w:r>
+    </w:p>
+    <w:p>
+      <w:pPr>
+        <w:pStyle w:val="ListParagraph"/>
+        <w:numPr>
+          <w:ilvl w:val="0"/>
+          <w:numId w:val="2"/>
+        </w:numPr>
+        <w:spacing w:after="60" w:line="264" w:lineRule="auto"/>
+      </w:pPr>
+      <w:r>
+        <w:t>8 declared sites carrying the brand name plus the registry's own phone or address.</w:t>
       </w:r>
     </w:p>
     <w:p>
@@ -17038,14 +17150,14 @@
         <w:t>profiles/profiles.jsonl.gz</w:t>
       </w:r>
       <w:r>
-        <w:t xml:space="preserve"> holds 1,000 unique companies (46,902 claims and as many evidence records), merged only from runs that passed verification. The manifest records the commit and the content SHA-256. The agent never reads this dataset when researching a batch.</w:t>
+        <w:t xml:space="preserve"> holds 1,000 unique companies (46,848 claims and as many evidence records), merged only from runs that passed verification. The manifest records the commit and the content SHA-256. The agent never reads this dataset when researching a batch.</w:t>
       </w:r>
     </w:p>
     <w:p>
       <w:pPr>
         <w:pStyle w:val="Heading1"/>
       </w:pPr>
-      <w:bookmarkStart w:id="13" w:name="_Toc243074063"/>
+      <w:bookmarkStart w:id="13" w:name="_Toc243648905"/>
       <w:r>
         <w:t>14. Defects found and fixed</w:t>
       </w:r>
@@ -18553,6 +18665,121 @@
           </w:p>
         </w:tc>
       </w:tr>
+      <w:tr>
+        <w:trPr>
+          <w:cantSplit/>
+        </w:trPr>
+        <w:tc>
+          <w:tcPr>
+            <w:tcW w:w="570" w:type="dxa"/>
+            <w:tcBorders>
+              <w:top w:val="single" w:sz="4" w:space="0" w:color="B7C4D3"/>
+              <w:left w:val="single" w:sz="4" w:space="0" w:color="B7C4D3"/>
+              <w:bottom w:val="single" w:sz="4" w:space="0" w:color="B7C4D3"/>
+              <w:right w:val="single" w:sz="4" w:space="0" w:color="B7C4D3"/>
+            </w:tcBorders>
+            <w:shd w:val="clear" w:color="auto" w:fill="FFFFFF"/>
+            <w:tcMar>
+              <w:top w:w="50" w:type="dxa"/>
+              <w:left w:w="90" w:type="dxa"/>
+              <w:bottom w:w="50" w:type="dxa"/>
+              <w:right w:w="90" w:type="dxa"/>
+            </w:tcMar>
+          </w:tcPr>
+          <w:p>
+            <w:r>
+              <w:rPr>
+                <w:sz w:val="17"/>
+                <w:szCs w:val="17"/>
+              </w:rPr>
+              <w:t>18</w:t>
+            </w:r>
+          </w:p>
+        </w:tc>
+        <w:tc>
+          <w:tcPr>
+            <w:tcW w:w="5194" w:type="dxa"/>
+            <w:tcBorders>
+              <w:top w:val="single" w:sz="4" w:space="0" w:color="B7C4D3"/>
+              <w:left w:val="single" w:sz="4" w:space="0" w:color="B7C4D3"/>
+              <w:bottom w:val="single" w:sz="4" w:space="0" w:color="B7C4D3"/>
+              <w:right w:val="single" w:sz="4" w:space="0" w:color="B7C4D3"/>
+            </w:tcBorders>
+            <w:shd w:val="clear" w:color="auto" w:fill="FFFFFF"/>
+            <w:tcMar>
+              <w:top w:w="50" w:type="dxa"/>
+              <w:left w:w="90" w:type="dxa"/>
+              <w:bottom w:w="50" w:type="dxa"/>
+              <w:right w:w="90" w:type="dxa"/>
+            </w:tcMar>
+          </w:tcPr>
+          <w:p>
+            <w:r>
+              <w:rPr>
+                <w:sz w:val="17"/>
+                <w:szCs w:val="17"/>
+              </w:rPr>
+              <w:t>brand-only proof for declared group/brand sites; parent-domain socials, news and jobs; brand-named social handles; contact pages and demo posts as news; careers landing pages as jobs</w:t>
+            </w:r>
+          </w:p>
+        </w:tc>
+        <w:tc>
+          <w:tcPr>
+            <w:tcW w:w="1860" w:type="dxa"/>
+            <w:tcBorders>
+              <w:top w:val="single" w:sz="4" w:space="0" w:color="B7C4D3"/>
+              <w:left w:val="single" w:sz="4" w:space="0" w:color="B7C4D3"/>
+              <w:bottom w:val="single" w:sz="4" w:space="0" w:color="B7C4D3"/>
+              <w:right w:val="single" w:sz="4" w:space="0" w:color="B7C4D3"/>
+            </w:tcBorders>
+            <w:shd w:val="clear" w:color="auto" w:fill="FFFFFF"/>
+            <w:tcMar>
+              <w:top w:w="50" w:type="dxa"/>
+              <w:left w:w="90" w:type="dxa"/>
+              <w:bottom w:w="50" w:type="dxa"/>
+              <w:right w:w="90" w:type="dxa"/>
+            </w:tcMar>
+          </w:tcPr>
+          <w:p>
+            <w:r>
+              <w:rPr>
+                <w:sz w:val="17"/>
+                <w:szCs w:val="17"/>
+              </w:rPr>
+              <w:t>wrong company (facts)</w:t>
+            </w:r>
+          </w:p>
+        </w:tc>
+        <w:tc>
+          <w:tcPr>
+            <w:tcW w:w="2014" w:type="dxa"/>
+            <w:tcBorders>
+              <w:top w:val="single" w:sz="4" w:space="0" w:color="B7C4D3"/>
+              <w:left w:val="single" w:sz="4" w:space="0" w:color="B7C4D3"/>
+              <w:bottom w:val="single" w:sz="4" w:space="0" w:color="B7C4D3"/>
+              <w:right w:val="single" w:sz="4" w:space="0" w:color="B7C4D3"/>
+            </w:tcBorders>
+            <w:shd w:val="clear" w:color="auto" w:fill="FFFFFF"/>
+            <w:tcMar>
+              <w:top w:w="50" w:type="dxa"/>
+              <w:left w:w="90" w:type="dxa"/>
+              <w:bottom w:w="50" w:type="dxa"/>
+              <w:right w:w="90" w:type="dxa"/>
+            </w:tcMar>
+          </w:tcPr>
+          <w:p>
+            <w:r>
+              <w:rPr>
+                <w:b/>
+                <w:bCs/>
+                <w:sz w:val="17"/>
+                <w:szCs w:val="17"/>
+              </w:rPr>
+              <w:t>Builderr audit of version 1</w:t>
+            </w:r>
+          </w:p>
+        </w:tc>
+      </w:tr>
     </w:tbl>
     <w:p>
       <w:pPr>
@@ -18571,7 +18798,7 @@
       <w:pPr>
         <w:pStyle w:val="Heading1"/>
       </w:pPr>
-      <w:bookmarkStart w:id="14" w:name="_Toc243074064"/>
+      <w:bookmarkStart w:id="14" w:name="_Toc243648906"/>
       <w:r>
         <w:t>15. Limitations and future work</w:t>
       </w:r>
@@ -18693,7 +18920,7 @@
       <w:pPr>
         <w:pStyle w:val="Heading1"/>
       </w:pPr>
-      <w:bookmarkStart w:id="15" w:name="_Toc243074065"/>
+      <w:bookmarkStart w:id="15" w:name="_Toc243648907"/>
       <w:r>
         <w:t>16. Reproduction and submission</w:t>
       </w:r>
@@ -18881,7 +19108,7 @@
         <w:t>What gets submitted:</w:t>
       </w:r>
       <w:r>
-        <w:t xml:space="preserve"> the git repository (agent code, docs, the smoke test with its refresh run, the 1,000-profile dataset, the offline tests and the tools, including the contract verifier). The run harness, raw run outputs, the local virtual environment and development scratch files are excluded. The agent code is frozen at </w:t>
+        <w:t xml:space="preserve"> the git repository (agent code, docs, the smoke test with its refresh run, the 1,000-profile dataset, the offline tests and the tools, including the contract verifier). The run harness, raw run outputs, the local virtual environment and development scratch files are excluded. The agent code (version 2) is at </w:t>
       </w:r>
       <w:r>
         <w:rPr>
@@ -18890,7 +19117,7 @@
           <w:sz w:val="18"/>
           <w:szCs w:val="18"/>
         </w:rPr>
-        <w:t>afc3f0a</w:t>
+        <w:t>a96e0f1</w:t>
       </w:r>
       <w:r>
         <w:t>; later commits change documentation and data only.</w:t>
@@ -18900,7 +19127,7 @@
       <w:pPr>
         <w:pStyle w:val="Heading1"/>
       </w:pPr>
-      <w:bookmarkStart w:id="16" w:name="_Toc243074066"/>
+      <w:bookmarkStart w:id="16" w:name="_Toc243648908"/>
       <w:r>
         <w:t>Appendix A: Offline test inventory</w:t>
       </w:r>
@@ -19340,6 +19567,22 @@
               </w:rPr>
               <w:t>test_group_page_declared_by_the_company_on_its_name_domain_is_exact</w:t>
             </w:r>
+            <w:r>
+              <w:rPr>
+                <w:sz w:val="17"/>
+                <w:szCs w:val="17"/>
+              </w:rPr>
+              <w:t xml:space="preserve">, </w:t>
+            </w:r>
+            <w:r>
+              <w:rPr>
+                <w:rFonts w:ascii="Consolas" w:eastAsia="Consolas" w:hAnsi="Consolas" w:cs="Consolas"/>
+                <w:color w:val="333333"/>
+                <w:sz w:val="15"/>
+                <w:szCs w:val="15"/>
+              </w:rPr>
+              <w:t>test_declared_brand_site_needs_org_number_or_exact_name</w:t>
+            </w:r>
           </w:p>
         </w:tc>
       </w:tr>
@@ -19448,6 +19691,102 @@
                 <w:szCs w:val="15"/>
               </w:rPr>
               <w:t>test_site_pages_are_not_news</w:t>
+            </w:r>
+            <w:r>
+              <w:rPr>
+                <w:sz w:val="17"/>
+                <w:szCs w:val="17"/>
+              </w:rPr>
+              <w:t xml:space="preserve">, </w:t>
+            </w:r>
+            <w:r>
+              <w:rPr>
+                <w:rFonts w:ascii="Consolas" w:eastAsia="Consolas" w:hAnsi="Consolas" w:cs="Consolas"/>
+                <w:color w:val="333333"/>
+                <w:sz w:val="15"/>
+                <w:szCs w:val="15"/>
+              </w:rPr>
+              <w:t>test_section_of_larger_site_detection</w:t>
+            </w:r>
+            <w:r>
+              <w:rPr>
+                <w:sz w:val="17"/>
+                <w:szCs w:val="17"/>
+              </w:rPr>
+              <w:t xml:space="preserve">, </w:t>
+            </w:r>
+            <w:r>
+              <w:rPr>
+                <w:rFonts w:ascii="Consolas" w:eastAsia="Consolas" w:hAnsi="Consolas" w:cs="Consolas"/>
+                <w:color w:val="333333"/>
+                <w:sz w:val="15"/>
+                <w:szCs w:val="15"/>
+              </w:rPr>
+              <w:t>test_section_site_publishes_no_parent_socials_news_or_jobs</w:t>
+            </w:r>
+            <w:r>
+              <w:rPr>
+                <w:sz w:val="17"/>
+                <w:szCs w:val="17"/>
+              </w:rPr>
+              <w:t xml:space="preserve">, </w:t>
+            </w:r>
+            <w:r>
+              <w:rPr>
+                <w:rFonts w:ascii="Consolas" w:eastAsia="Consolas" w:hAnsi="Consolas" w:cs="Consolas"/>
+                <w:color w:val="333333"/>
+                <w:sz w:val="15"/>
+                <w:szCs w:val="15"/>
+              </w:rPr>
+              <w:t>test_social_handle_must_name_the_company</w:t>
+            </w:r>
+            <w:r>
+              <w:rPr>
+                <w:sz w:val="17"/>
+                <w:szCs w:val="17"/>
+              </w:rPr>
+              <w:t xml:space="preserve">, </w:t>
+            </w:r>
+            <w:r>
+              <w:rPr>
+                <w:rFonts w:ascii="Consolas" w:eastAsia="Consolas" w:hAnsi="Consolas" w:cs="Consolas"/>
+                <w:color w:val="333333"/>
+                <w:sz w:val="15"/>
+                <w:szCs w:val="15"/>
+              </w:rPr>
+              <w:t>test_news_must_be_a_real_dated_post</w:t>
+            </w:r>
+            <w:r>
+              <w:rPr>
+                <w:sz w:val="17"/>
+                <w:szCs w:val="17"/>
+              </w:rPr>
+              <w:t xml:space="preserve">, </w:t>
+            </w:r>
+            <w:r>
+              <w:rPr>
+                <w:rFonts w:ascii="Consolas" w:eastAsia="Consolas" w:hAnsi="Consolas" w:cs="Consolas"/>
+                <w:color w:val="333333"/>
+                <w:sz w:val="15"/>
+                <w:szCs w:val="15"/>
+              </w:rPr>
+              <w:t>test_modified_dates_are_not_publish_dates</w:t>
+            </w:r>
+            <w:r>
+              <w:rPr>
+                <w:sz w:val="17"/>
+                <w:szCs w:val="17"/>
+              </w:rPr>
+              <w:t xml:space="preserve">, </w:t>
+            </w:r>
+            <w:r>
+              <w:rPr>
+                <w:rFonts w:ascii="Consolas" w:eastAsia="Consolas" w:hAnsi="Consolas" w:cs="Consolas"/>
+                <w:color w:val="333333"/>
+                <w:sz w:val="15"/>
+                <w:szCs w:val="15"/>
+              </w:rPr>
+              <w:t>test_job_posting_must_name_this_company_and_careers_pages_are_not_jobs</w:t>
             </w:r>
           </w:p>
         </w:tc>
@@ -20037,68 +20376,64 @@
 <file path=word/numbering.xml><?xml version="1.0" encoding="utf-8"?>
 <w:numbering xmlns:wpc="http://schemas.microsoft.com/office/word/2010/wordprocessingCanvas" xmlns:cx="http://schemas.microsoft.com/office/drawing/2014/chartex" xmlns:cx1="http://schemas.microsoft.com/office/drawing/2015/9/8/chartex" xmlns:cx2="http://schemas.microsoft.com/office/drawing/2015/10/21/chartex" xmlns:cx3="http://schemas.microsoft.com/office/drawing/2016/5/9/chartex" xmlns:cx4="http://schemas.microsoft.com/office/drawing/2016/5/10/chartex" xmlns:cx5="http://schemas.microsoft.com/office/drawing/2016/5/11/chartex" xmlns:cx6="http://schemas.microsoft.com/office/drawing/2016/5/12/chartex" xmlns:cx7="http://schemas.microsoft.com/office/drawing/2016/5/13/chartex" xmlns:cx8="http://schemas.microsoft.com/office/drawing/2016/5/14/chartex" xmlns:mc="http://schemas.openxmlformats.org/markup-compatibility/2006" xmlns:aink="http://schemas.microsoft.com/office/drawing/2016/ink" xmlns:am3d="http://schemas.microsoft.com/office/drawing/2017/model3d" xmlns:o="urn:schemas-microsoft-com:office:office" xmlns:oel="http://schemas.microsoft.com/office/2019/extlst" xmlns:r="http://schemas.openxmlformats.org/officeDocument/2006/relationships" xmlns:m="http://schemas.openxmlformats.org/officeDocument/2006/math" xmlns:v="urn:schemas-microsoft-com:vml" xmlns:wp14="http://schemas.microsoft.com/office/word/2010/wordprocessingDrawing" xmlns:wp="http://schemas.openxmlformats.org/drawingml/2006/wordprocessingDrawing" xmlns:w10="urn:schemas-microsoft-com:office:word" xmlns:w="http://schemas.openxmlformats.org/wordprocessingml/2006/main" xmlns:w14="http://schemas.microsoft.com/office/word/2010/wordml" xmlns:w15="http://schemas.microsoft.com/office/word/2012/wordml" xmlns:w16cex="http://schemas.microsoft.com/office/word/2018/wordml/cex" xmlns:w16cid="http://schemas.microsoft.com/office/word/2016/wordml/cid" xmlns:w16="http://schemas.microsoft.com/office/word/2018/wordml" xmlns:w16du="http://schemas.microsoft.com/office/word/2023/wordml/word16du" xmlns:w16sdtdh="http://schemas.microsoft.com/office/word/2020/wordml/sdtdatahash" xmlns:w16sdtfl="http://schemas.microsoft.com/office/word/2024/wordml/sdtformatlock" xmlns:w16se="http://schemas.microsoft.com/office/word/2015/wordml/symex" xmlns:wpg="http://schemas.microsoft.com/office/word/2010/wordprocessingGroup" xmlns:wpi="http://schemas.microsoft.com/office/word/2010/wordprocessingInk" xmlns:wne="http://schemas.microsoft.com/office/word/2006/wordml" xmlns:wps="http://schemas.microsoft.com/office/word/2010/wordprocessingShape" mc:Ignorable="w14 w15 w16se w16cid w16 w16cex w16sdtdh w16sdtfl w16du wp14">
   <w:abstractNum w:abstractNumId="0" w15:restartNumberingAfterBreak="0">
-    <w:nsid w:val="2D0F6556"/>
+    <w:nsid w:val="01A66F7C"/>
     <w:multiLevelType w:val="hybridMultilevel"/>
-    <w:tmpl w:val="DF600C8C"/>
-    <w:lvl w:ilvl="0" w:tplc="C090F0E2">
+    <w:tmpl w:val="86887DB4"/>
+    <w:lvl w:ilvl="0" w:tplc="F600016C">
       <w:start w:val="1"/>
-      <w:numFmt w:val="bullet"/>
-      <w:lvlText w:val="•"/>
+      <w:numFmt w:val="decimal"/>
+      <w:lvlText w:val="%1."/>
       <w:lvlJc w:val="left"/>
       <w:pPr>
-        <w:ind w:left="540" w:hanging="270"/>
+        <w:ind w:left="540" w:hanging="360"/>
       </w:pPr>
     </w:lvl>
-    <w:lvl w:ilvl="1" w:tplc="AC6E79E6">
-      <w:start w:val="1"/>
-      <w:numFmt w:val="bullet"/>
-      <w:lvlText w:val="–"/>
-      <w:lvlJc w:val="left"/>
-      <w:pPr>
-        <w:ind w:left="1080" w:hanging="270"/>
-      </w:pPr>
-    </w:lvl>
-    <w:lvl w:ilvl="2" w:tplc="0E56522C">
+    <w:lvl w:ilvl="1" w:tplc="DC78647C">
       <w:numFmt w:val="decimal"/>
       <w:lvlText w:val=""/>
       <w:lvlJc w:val="left"/>
     </w:lvl>
-    <w:lvl w:ilvl="3" w:tplc="C31CAB46">
+    <w:lvl w:ilvl="2" w:tplc="5DC00872">
       <w:numFmt w:val="decimal"/>
       <w:lvlText w:val=""/>
       <w:lvlJc w:val="left"/>
     </w:lvl>
-    <w:lvl w:ilvl="4" w:tplc="1F684670">
+    <w:lvl w:ilvl="3" w:tplc="5568F2FE">
       <w:numFmt w:val="decimal"/>
       <w:lvlText w:val=""/>
       <w:lvlJc w:val="left"/>
     </w:lvl>
-    <w:lvl w:ilvl="5" w:tplc="C86460A4">
+    <w:lvl w:ilvl="4" w:tplc="89FAA308">
       <w:numFmt w:val="decimal"/>
       <w:lvlText w:val=""/>
       <w:lvlJc w:val="left"/>
     </w:lvl>
-    <w:lvl w:ilvl="6" w:tplc="DD5A4E68">
+    <w:lvl w:ilvl="5" w:tplc="0520F7AA">
       <w:numFmt w:val="decimal"/>
       <w:lvlText w:val=""/>
       <w:lvlJc w:val="left"/>
     </w:lvl>
-    <w:lvl w:ilvl="7" w:tplc="79D44CF6">
+    <w:lvl w:ilvl="6" w:tplc="E58E3C5E">
       <w:numFmt w:val="decimal"/>
       <w:lvlText w:val=""/>
       <w:lvlJc w:val="left"/>
     </w:lvl>
-    <w:lvl w:ilvl="8" w:tplc="E89E7636">
+    <w:lvl w:ilvl="7" w:tplc="5C1880C6">
+      <w:numFmt w:val="decimal"/>
+      <w:lvlText w:val=""/>
+      <w:lvlJc w:val="left"/>
+    </w:lvl>
+    <w:lvl w:ilvl="8" w:tplc="9B404D58">
       <w:numFmt w:val="decimal"/>
       <w:lvlText w:val=""/>
       <w:lvlJc w:val="left"/>
     </w:lvl>
   </w:abstractNum>
   <w:abstractNum w:abstractNumId="1" w15:restartNumberingAfterBreak="0">
-    <w:nsid w:val="5C420C23"/>
+    <w:nsid w:val="14650DC3"/>
     <w:multiLevelType w:val="hybridMultilevel"/>
-    <w:tmpl w:val="CD0CE8D2"/>
-    <w:lvl w:ilvl="0" w:tplc="480A1108" w:tentative="1">
+    <w:tmpl w:val="9A762028"/>
+    <w:lvl w:ilvl="0" w:tplc="DEA64A94" w:tentative="1">
       <w:start w:val="1"/>
       <w:numFmt w:val="bullet"/>
       <w:lvlText w:val="●"/>
@@ -20107,7 +20442,7 @@
         <w:ind w:left="720" w:hanging="360"/>
       </w:pPr>
     </w:lvl>
-    <w:lvl w:ilvl="1" w:tplc="C2A86152" w:tentative="1">
+    <w:lvl w:ilvl="1" w:tplc="678494A2" w:tentative="1">
       <w:start w:val="1"/>
       <w:numFmt w:val="bullet"/>
       <w:lvlText w:val="○"/>
@@ -20116,7 +20451,7 @@
         <w:ind w:left="1440" w:hanging="360"/>
       </w:pPr>
     </w:lvl>
-    <w:lvl w:ilvl="2" w:tplc="190653C4" w:tentative="1">
+    <w:lvl w:ilvl="2" w:tplc="A26ED46A" w:tentative="1">
       <w:start w:val="1"/>
       <w:numFmt w:val="bullet"/>
       <w:lvlText w:val="■"/>
@@ -20125,7 +20460,7 @@
         <w:ind w:left="2160" w:hanging="360"/>
       </w:pPr>
     </w:lvl>
-    <w:lvl w:ilvl="3" w:tplc="E6700932" w:tentative="1">
+    <w:lvl w:ilvl="3" w:tplc="68AE77A4" w:tentative="1">
       <w:start w:val="1"/>
       <w:numFmt w:val="bullet"/>
       <w:lvlText w:val="●"/>
@@ -20134,7 +20469,7 @@
         <w:ind w:left="2880" w:hanging="360"/>
       </w:pPr>
     </w:lvl>
-    <w:lvl w:ilvl="4" w:tplc="2ADCBC96" w:tentative="1">
+    <w:lvl w:ilvl="4" w:tplc="67FCAB02" w:tentative="1">
       <w:start w:val="1"/>
       <w:numFmt w:val="bullet"/>
       <w:lvlText w:val="○"/>
@@ -20143,7 +20478,7 @@
         <w:ind w:left="3600" w:hanging="360"/>
       </w:pPr>
     </w:lvl>
-    <w:lvl w:ilvl="5" w:tplc="4B043294" w:tentative="1">
+    <w:lvl w:ilvl="5" w:tplc="20AE2840" w:tentative="1">
       <w:start w:val="1"/>
       <w:numFmt w:val="bullet"/>
       <w:lvlText w:val="■"/>
@@ -20152,7 +20487,7 @@
         <w:ind w:left="4320" w:hanging="360"/>
       </w:pPr>
     </w:lvl>
-    <w:lvl w:ilvl="6" w:tplc="C848EA2E" w:tentative="1">
+    <w:lvl w:ilvl="6" w:tplc="8BE6711E" w:tentative="1">
       <w:start w:val="1"/>
       <w:numFmt w:val="bullet"/>
       <w:lvlText w:val="●"/>
@@ -20161,7 +20496,7 @@
         <w:ind w:left="5040" w:hanging="360"/>
       </w:pPr>
     </w:lvl>
-    <w:lvl w:ilvl="7" w:tplc="72300102" w:tentative="1">
+    <w:lvl w:ilvl="7" w:tplc="2F321E4C" w:tentative="1">
       <w:start w:val="1"/>
       <w:numFmt w:val="bullet"/>
       <w:lvlText w:val="●"/>
@@ -20170,7 +20505,7 @@
         <w:ind w:left="5760" w:hanging="360"/>
       </w:pPr>
     </w:lvl>
-    <w:lvl w:ilvl="8" w:tplc="22741608" w:tentative="1">
+    <w:lvl w:ilvl="8" w:tplc="9FD06BD8" w:tentative="1">
       <w:start w:val="1"/>
       <w:numFmt w:val="bullet"/>
       <w:lvlText w:val="●"/>
@@ -20181,85 +20516,89 @@
     </w:lvl>
   </w:abstractNum>
   <w:abstractNum w:abstractNumId="2" w15:restartNumberingAfterBreak="0">
-    <w:nsid w:val="743F6179"/>
+    <w:nsid w:val="29AF58D1"/>
     <w:multiLevelType w:val="hybridMultilevel"/>
-    <w:tmpl w:val="3770500E"/>
-    <w:lvl w:ilvl="0" w:tplc="9F10A0F0">
+    <w:tmpl w:val="353E0E78"/>
+    <w:lvl w:ilvl="0" w:tplc="845658D0">
       <w:start w:val="1"/>
-      <w:numFmt w:val="decimal"/>
-      <w:lvlText w:val="%1."/>
+      <w:numFmt w:val="bullet"/>
+      <w:lvlText w:val="•"/>
       <w:lvlJc w:val="left"/>
       <w:pPr>
-        <w:ind w:left="540" w:hanging="360"/>
+        <w:ind w:left="540" w:hanging="270"/>
       </w:pPr>
     </w:lvl>
-    <w:lvl w:ilvl="1" w:tplc="7E60AB78">
+    <w:lvl w:ilvl="1" w:tplc="7F36BF9C">
+      <w:start w:val="1"/>
+      <w:numFmt w:val="bullet"/>
+      <w:lvlText w:val="–"/>
+      <w:lvlJc w:val="left"/>
+      <w:pPr>
+        <w:ind w:left="1080" w:hanging="270"/>
+      </w:pPr>
+    </w:lvl>
+    <w:lvl w:ilvl="2" w:tplc="5630D05C">
       <w:numFmt w:val="decimal"/>
       <w:lvlText w:val=""/>
       <w:lvlJc w:val="left"/>
     </w:lvl>
-    <w:lvl w:ilvl="2" w:tplc="C0F645F0">
+    <w:lvl w:ilvl="3" w:tplc="E3FA8FE8">
       <w:numFmt w:val="decimal"/>
       <w:lvlText w:val=""/>
       <w:lvlJc w:val="left"/>
     </w:lvl>
-    <w:lvl w:ilvl="3" w:tplc="9D08EAB0">
+    <w:lvl w:ilvl="4" w:tplc="47782368">
       <w:numFmt w:val="decimal"/>
       <w:lvlText w:val=""/>
       <w:lvlJc w:val="left"/>
     </w:lvl>
-    <w:lvl w:ilvl="4" w:tplc="F826564C">
+    <w:lvl w:ilvl="5" w:tplc="BF7C800E">
       <w:numFmt w:val="decimal"/>
       <w:lvlText w:val=""/>
       <w:lvlJc w:val="left"/>
     </w:lvl>
-    <w:lvl w:ilvl="5" w:tplc="0F5A76C0">
+    <w:lvl w:ilvl="6" w:tplc="4050A1D0">
       <w:numFmt w:val="decimal"/>
       <w:lvlText w:val=""/>
       <w:lvlJc w:val="left"/>
     </w:lvl>
-    <w:lvl w:ilvl="6" w:tplc="00728D32">
+    <w:lvl w:ilvl="7" w:tplc="36FCB130">
       <w:numFmt w:val="decimal"/>
       <w:lvlText w:val=""/>
       <w:lvlJc w:val="left"/>
     </w:lvl>
-    <w:lvl w:ilvl="7" w:tplc="2462244E">
-      <w:numFmt w:val="decimal"/>
-      <w:lvlText w:val=""/>
-      <w:lvlJc w:val="left"/>
-    </w:lvl>
-    <w:lvl w:ilvl="8" w:tplc="25B01380">
+    <w:lvl w:ilvl="8" w:tplc="20CEC9EE">
       <w:numFmt w:val="decimal"/>
       <w:lvlText w:val=""/>
       <w:lvlJc w:val="left"/>
     </w:lvl>
   </w:abstractNum>
-  <w:num w:numId="1" w16cid:durableId="1634751084">
+  <w:num w:numId="1" w16cid:durableId="1933784089">
     <w:abstractNumId w:val="1"/>
     <w:lvlOverride w:ilvl="0">
       <w:startOverride w:val="1"/>
     </w:lvlOverride>
   </w:num>
-  <w:num w:numId="2" w16cid:durableId="410587768">
+  <w:num w:numId="2" w16cid:durableId="1928416968">
+    <w:abstractNumId w:val="2"/>
+    <w:lvlOverride w:ilvl="0">
+      <w:startOverride w:val="1"/>
+    </w:lvlOverride>
+  </w:num>
+  <w:num w:numId="3" w16cid:durableId="325786302">
     <w:abstractNumId w:val="0"/>
     <w:lvlOverride w:ilvl="0">
       <w:startOverride w:val="1"/>
     </w:lvlOverride>
   </w:num>
-  <w:num w:numId="3" w16cid:durableId="1963535934">
-    <w:abstractNumId w:val="2"/>
+  <w:num w:numId="4" w16cid:durableId="1173641225">
+    <w:abstractNumId w:val="0"/>
     <w:lvlOverride w:ilvl="0">
       <w:startOverride w:val="1"/>
     </w:lvlOverride>
   </w:num>
-  <w:num w:numId="4" w16cid:durableId="434443803">
-    <w:abstractNumId w:val="2"/>
-    <w:lvlOverride w:ilvl="0">
-      <w:startOverride w:val="1"/>
-    </w:lvlOverride>
-  </w:num>
-  <w:num w:numId="5" w16cid:durableId="257832262">
-    <w:abstractNumId w:val="2"/>
+  <w:num w:numId="5" w16cid:durableId="567881197">
+    <w:abstractNumId w:val="0"/>
     <w:lvlOverride w:ilvl="0">
       <w:startOverride w:val="1"/>
     </w:lvlOverride>
@@ -20888,7 +21227,7 @@
     <w:autoRedefine/>
     <w:uiPriority w:val="39"/>
     <w:unhideWhenUsed/>
-    <w:rsid w:val="00EB31FB"/>
+    <w:rsid w:val="002B55BD"/>
     <w:pPr>
       <w:spacing w:after="100"/>
     </w:pPr>

</xml_diff>

<commit_message>
Document version 2: before/after changes with verification steps (CHANGES_V2.md), audit replay and dataset scan tool, docs updated
</commit_message>
<xml_diff>
--- a/docs/IMPLEMENTATION_REPORT.docx
+++ b/docs/IMPLEMENTATION_REPORT.docx
@@ -303,7 +303,7 @@
                 <w:sz w:val="17"/>
                 <w:szCs w:val="17"/>
               </w:rPr>
-              <w:t>about 2,030 lines of agent code, 340 lines of tooling and a 660-line offline test suite in the repository; an 82-line run harness was used for validation</w:t>
+              <w:t>about 2,030 lines of agent code, 480 lines of tooling and a 660-line offline test suite in the repository; an 82-line run harness was used for validation</w:t>
             </w:r>
           </w:p>
         </w:tc>
@@ -398,7 +398,7 @@
     <w:sdt>
       <w:sdtPr>
         <w:alias w:val="Contents"/>
-        <w:id w:val="245538021"/>
+        <w:id w:val="-1700917551"/>
       </w:sdtPr>
       <w:sdtEndPr/>
       <w:sdtContent>
@@ -421,7 +421,7 @@
           <w:r>
             <w:fldChar w:fldCharType="separate"/>
           </w:r>
-          <w:hyperlink w:anchor="_Toc243648892" w:history="1">
+          <w:hyperlink w:anchor="_Toc243649750" w:history="1">
             <w:r>
               <w:rPr>
                 <w:rStyle w:val="Hyperlink"/>
@@ -445,7 +445,7 @@
               <w:rPr>
                 <w:noProof/>
               </w:rPr>
-              <w:instrText xml:space="preserve"> PAGEREF _Toc243648892 \h </w:instrText>
+              <w:instrText xml:space="preserve"> PAGEREF _Toc243649750 \h </w:instrText>
             </w:r>
             <w:r>
               <w:rPr>
@@ -482,7 +482,7 @@
               <w:noProof/>
             </w:rPr>
           </w:pPr>
-          <w:hyperlink w:anchor="_Toc243648893" w:history="1">
+          <w:hyperlink w:anchor="_Toc243649751" w:history="1">
             <w:r>
               <w:rPr>
                 <w:rStyle w:val="Hyperlink"/>
@@ -506,7 +506,7 @@
               <w:rPr>
                 <w:noProof/>
               </w:rPr>
-              <w:instrText xml:space="preserve"> PAGEREF _Toc243648893 \h </w:instrText>
+              <w:instrText xml:space="preserve"> PAGEREF _Toc243649751 \h </w:instrText>
             </w:r>
             <w:r>
               <w:rPr>
@@ -543,7 +543,7 @@
               <w:noProof/>
             </w:rPr>
           </w:pPr>
-          <w:hyperlink w:anchor="_Toc243648894" w:history="1">
+          <w:hyperlink w:anchor="_Toc243649752" w:history="1">
             <w:r>
               <w:rPr>
                 <w:rStyle w:val="Hyperlink"/>
@@ -567,7 +567,7 @@
               <w:rPr>
                 <w:noProof/>
               </w:rPr>
-              <w:instrText xml:space="preserve"> PAGEREF _Toc243648894 \h </w:instrText>
+              <w:instrText xml:space="preserve"> PAGEREF _Toc243649752 \h </w:instrText>
             </w:r>
             <w:r>
               <w:rPr>
@@ -604,7 +604,7 @@
               <w:noProof/>
             </w:rPr>
           </w:pPr>
-          <w:hyperlink w:anchor="_Toc243648895" w:history="1">
+          <w:hyperlink w:anchor="_Toc243649753" w:history="1">
             <w:r>
               <w:rPr>
                 <w:rStyle w:val="Hyperlink"/>
@@ -628,7 +628,7 @@
               <w:rPr>
                 <w:noProof/>
               </w:rPr>
-              <w:instrText xml:space="preserve"> PAGEREF _Toc243648895 \h </w:instrText>
+              <w:instrText xml:space="preserve"> PAGEREF _Toc243649753 \h </w:instrText>
             </w:r>
             <w:r>
               <w:rPr>
@@ -665,7 +665,7 @@
               <w:noProof/>
             </w:rPr>
           </w:pPr>
-          <w:hyperlink w:anchor="_Toc243648896" w:history="1">
+          <w:hyperlink w:anchor="_Toc243649754" w:history="1">
             <w:r>
               <w:rPr>
                 <w:rStyle w:val="Hyperlink"/>
@@ -689,7 +689,7 @@
               <w:rPr>
                 <w:noProof/>
               </w:rPr>
-              <w:instrText xml:space="preserve"> PAGEREF _Toc243648896 \h </w:instrText>
+              <w:instrText xml:space="preserve"> PAGEREF _Toc243649754 \h </w:instrText>
             </w:r>
             <w:r>
               <w:rPr>
@@ -726,7 +726,7 @@
               <w:noProof/>
             </w:rPr>
           </w:pPr>
-          <w:hyperlink w:anchor="_Toc243648897" w:history="1">
+          <w:hyperlink w:anchor="_Toc243649755" w:history="1">
             <w:r>
               <w:rPr>
                 <w:rStyle w:val="Hyperlink"/>
@@ -750,7 +750,7 @@
               <w:rPr>
                 <w:noProof/>
               </w:rPr>
-              <w:instrText xml:space="preserve"> PAGEREF _Toc243648897 \h </w:instrText>
+              <w:instrText xml:space="preserve"> PAGEREF _Toc243649755 \h </w:instrText>
             </w:r>
             <w:r>
               <w:rPr>
@@ -787,7 +787,7 @@
               <w:noProof/>
             </w:rPr>
           </w:pPr>
-          <w:hyperlink w:anchor="_Toc243648898" w:history="1">
+          <w:hyperlink w:anchor="_Toc243649756" w:history="1">
             <w:r>
               <w:rPr>
                 <w:rStyle w:val="Hyperlink"/>
@@ -811,7 +811,7 @@
               <w:rPr>
                 <w:noProof/>
               </w:rPr>
-              <w:instrText xml:space="preserve"> PAGEREF _Toc243648898 \h </w:instrText>
+              <w:instrText xml:space="preserve"> PAGEREF _Toc243649756 \h </w:instrText>
             </w:r>
             <w:r>
               <w:rPr>
@@ -848,7 +848,7 @@
               <w:noProof/>
             </w:rPr>
           </w:pPr>
-          <w:hyperlink w:anchor="_Toc243648899" w:history="1">
+          <w:hyperlink w:anchor="_Toc243649757" w:history="1">
             <w:r>
               <w:rPr>
                 <w:rStyle w:val="Hyperlink"/>
@@ -872,7 +872,7 @@
               <w:rPr>
                 <w:noProof/>
               </w:rPr>
-              <w:instrText xml:space="preserve"> PAGEREF _Toc243648899 \h </w:instrText>
+              <w:instrText xml:space="preserve"> PAGEREF _Toc243649757 \h </w:instrText>
             </w:r>
             <w:r>
               <w:rPr>
@@ -889,7 +889,7 @@
               <w:rPr>
                 <w:noProof/>
               </w:rPr>
-              <w:t>6</w:t>
+              <w:t>7</w:t>
             </w:r>
             <w:r>
               <w:rPr>
@@ -909,7 +909,7 @@
               <w:noProof/>
             </w:rPr>
           </w:pPr>
-          <w:hyperlink w:anchor="_Toc243648900" w:history="1">
+          <w:hyperlink w:anchor="_Toc243649758" w:history="1">
             <w:r>
               <w:rPr>
                 <w:rStyle w:val="Hyperlink"/>
@@ -933,7 +933,7 @@
               <w:rPr>
                 <w:noProof/>
               </w:rPr>
-              <w:instrText xml:space="preserve"> PAGEREF _Toc243648900 \h </w:instrText>
+              <w:instrText xml:space="preserve"> PAGEREF _Toc243649758 \h </w:instrText>
             </w:r>
             <w:r>
               <w:rPr>
@@ -970,7 +970,7 @@
               <w:noProof/>
             </w:rPr>
           </w:pPr>
-          <w:hyperlink w:anchor="_Toc243648901" w:history="1">
+          <w:hyperlink w:anchor="_Toc243649759" w:history="1">
             <w:r>
               <w:rPr>
                 <w:rStyle w:val="Hyperlink"/>
@@ -994,7 +994,7 @@
               <w:rPr>
                 <w:noProof/>
               </w:rPr>
-              <w:instrText xml:space="preserve"> PAGEREF _Toc243648901 \h </w:instrText>
+              <w:instrText xml:space="preserve"> PAGEREF _Toc243649759 \h </w:instrText>
             </w:r>
             <w:r>
               <w:rPr>
@@ -1031,7 +1031,7 @@
               <w:noProof/>
             </w:rPr>
           </w:pPr>
-          <w:hyperlink w:anchor="_Toc243648902" w:history="1">
+          <w:hyperlink w:anchor="_Toc243649760" w:history="1">
             <w:r>
               <w:rPr>
                 <w:rStyle w:val="Hyperlink"/>
@@ -1055,7 +1055,7 @@
               <w:rPr>
                 <w:noProof/>
               </w:rPr>
-              <w:instrText xml:space="preserve"> PAGEREF _Toc243648902 \h </w:instrText>
+              <w:instrText xml:space="preserve"> PAGEREF _Toc243649760 \h </w:instrText>
             </w:r>
             <w:r>
               <w:rPr>
@@ -1092,7 +1092,7 @@
               <w:noProof/>
             </w:rPr>
           </w:pPr>
-          <w:hyperlink w:anchor="_Toc243648903" w:history="1">
+          <w:hyperlink w:anchor="_Toc243649761" w:history="1">
             <w:r>
               <w:rPr>
                 <w:rStyle w:val="Hyperlink"/>
@@ -1116,7 +1116,7 @@
               <w:rPr>
                 <w:noProof/>
               </w:rPr>
-              <w:instrText xml:space="preserve"> PAGEREF _Toc243648903 \h </w:instrText>
+              <w:instrText xml:space="preserve"> PAGEREF _Toc243649761 \h </w:instrText>
             </w:r>
             <w:r>
               <w:rPr>
@@ -1153,7 +1153,7 @@
               <w:noProof/>
             </w:rPr>
           </w:pPr>
-          <w:hyperlink w:anchor="_Toc243648904" w:history="1">
+          <w:hyperlink w:anchor="_Toc243649762" w:history="1">
             <w:r>
               <w:rPr>
                 <w:rStyle w:val="Hyperlink"/>
@@ -1177,7 +1177,7 @@
               <w:rPr>
                 <w:noProof/>
               </w:rPr>
-              <w:instrText xml:space="preserve"> PAGEREF _Toc243648904 \h </w:instrText>
+              <w:instrText xml:space="preserve"> PAGEREF _Toc243649762 \h </w:instrText>
             </w:r>
             <w:r>
               <w:rPr>
@@ -1214,7 +1214,7 @@
               <w:noProof/>
             </w:rPr>
           </w:pPr>
-          <w:hyperlink w:anchor="_Toc243648905" w:history="1">
+          <w:hyperlink w:anchor="_Toc243649763" w:history="1">
             <w:r>
               <w:rPr>
                 <w:rStyle w:val="Hyperlink"/>
@@ -1238,7 +1238,7 @@
               <w:rPr>
                 <w:noProof/>
               </w:rPr>
-              <w:instrText xml:space="preserve"> PAGEREF _Toc243648905 \h </w:instrText>
+              <w:instrText xml:space="preserve"> PAGEREF _Toc243649763 \h </w:instrText>
             </w:r>
             <w:r>
               <w:rPr>
@@ -1255,7 +1255,7 @@
               <w:rPr>
                 <w:noProof/>
               </w:rPr>
-              <w:t>11</w:t>
+              <w:t>12</w:t>
             </w:r>
             <w:r>
               <w:rPr>
@@ -1275,7 +1275,7 @@
               <w:noProof/>
             </w:rPr>
           </w:pPr>
-          <w:hyperlink w:anchor="_Toc243648906" w:history="1">
+          <w:hyperlink w:anchor="_Toc243649764" w:history="1">
             <w:r>
               <w:rPr>
                 <w:rStyle w:val="Hyperlink"/>
@@ -1299,7 +1299,7 @@
               <w:rPr>
                 <w:noProof/>
               </w:rPr>
-              <w:instrText xml:space="preserve"> PAGEREF _Toc243648906 \h </w:instrText>
+              <w:instrText xml:space="preserve"> PAGEREF _Toc243649764 \h </w:instrText>
             </w:r>
             <w:r>
               <w:rPr>
@@ -1336,7 +1336,7 @@
               <w:noProof/>
             </w:rPr>
           </w:pPr>
-          <w:hyperlink w:anchor="_Toc243648907" w:history="1">
+          <w:hyperlink w:anchor="_Toc243649765" w:history="1">
             <w:r>
               <w:rPr>
                 <w:rStyle w:val="Hyperlink"/>
@@ -1360,7 +1360,7 @@
               <w:rPr>
                 <w:noProof/>
               </w:rPr>
-              <w:instrText xml:space="preserve"> PAGEREF _Toc243648907 \h </w:instrText>
+              <w:instrText xml:space="preserve"> PAGEREF _Toc243649765 \h </w:instrText>
             </w:r>
             <w:r>
               <w:rPr>
@@ -1397,7 +1397,7 @@
               <w:noProof/>
             </w:rPr>
           </w:pPr>
-          <w:hyperlink w:anchor="_Toc243648908" w:history="1">
+          <w:hyperlink w:anchor="_Toc243649766" w:history="1">
             <w:r>
               <w:rPr>
                 <w:rStyle w:val="Hyperlink"/>
@@ -1421,7 +1421,7 @@
               <w:rPr>
                 <w:noProof/>
               </w:rPr>
-              <w:instrText xml:space="preserve"> PAGEREF _Toc243648908 \h </w:instrText>
+              <w:instrText xml:space="preserve"> PAGEREF _Toc243649766 \h </w:instrText>
             </w:r>
             <w:r>
               <w:rPr>
@@ -1464,7 +1464,7 @@
       <w:pPr>
         <w:pStyle w:val="Heading1"/>
       </w:pPr>
-      <w:bookmarkStart w:id="0" w:name="_Toc243648892"/>
+      <w:bookmarkStart w:id="0" w:name="_Toc243649750"/>
       <w:r>
         <w:t>1. Executive summary</w:t>
       </w:r>
@@ -1693,7 +1693,7 @@
       <w:pPr>
         <w:pStyle w:val="Heading1"/>
       </w:pPr>
-      <w:bookmarkStart w:id="1" w:name="_Toc243648893"/>
+      <w:bookmarkStart w:id="1" w:name="_Toc243649751"/>
       <w:r>
         <w:t>2. The challenge and its requirements</w:t>
       </w:r>
@@ -2733,7 +2733,7 @@
       <w:pPr>
         <w:pStyle w:val="Heading1"/>
       </w:pPr>
-      <w:bookmarkStart w:id="2" w:name="_Toc243648894"/>
+      <w:bookmarkStart w:id="2" w:name="_Toc243649752"/>
       <w:r>
         <w:t>3. Methodology</w:t>
       </w:r>
@@ -2883,7 +2883,7 @@
       <w:pPr>
         <w:pStyle w:val="Heading1"/>
       </w:pPr>
-      <w:bookmarkStart w:id="3" w:name="_Toc243648895"/>
+      <w:bookmarkStart w:id="3" w:name="_Toc243649753"/>
       <w:r>
         <w:t>4. Architecture</w:t>
       </w:r>
@@ -3643,9 +3643,9 @@
         <w:tblLook w:val="04A0" w:firstRow="1" w:lastRow="0" w:firstColumn="1" w:lastColumn="0" w:noHBand="0" w:noVBand="1"/>
       </w:tblPr>
       <w:tblGrid>
-        <w:gridCol w:w="2280"/>
+        <w:gridCol w:w="2470"/>
         <w:gridCol w:w="665"/>
-        <w:gridCol w:w="6693"/>
+        <w:gridCol w:w="6503"/>
       </w:tblGrid>
       <w:tr>
         <w:trPr>
@@ -3654,7 +3654,7 @@
         </w:trPr>
         <w:tc>
           <w:tcPr>
-            <w:tcW w:w="2280" w:type="dxa"/>
+            <w:tcW w:w="2470" w:type="dxa"/>
             <w:tcBorders>
               <w:top w:val="single" w:sz="4" w:space="0" w:color="B7C4D3"/>
               <w:left w:val="single" w:sz="4" w:space="0" w:color="B7C4D3"/>
@@ -3714,7 +3714,7 @@
         </w:tc>
         <w:tc>
           <w:tcPr>
-            <w:tcW w:w="6693" w:type="dxa"/>
+            <w:tcW w:w="6503" w:type="dxa"/>
             <w:tcBorders>
               <w:top w:val="single" w:sz="4" w:space="0" w:color="B7C4D3"/>
               <w:left w:val="single" w:sz="4" w:space="0" w:color="B7C4D3"/>
@@ -3749,7 +3749,7 @@
         </w:trPr>
         <w:tc>
           <w:tcPr>
-            <w:tcW w:w="2280" w:type="dxa"/>
+            <w:tcW w:w="2470" w:type="dxa"/>
             <w:tcBorders>
               <w:top w:val="single" w:sz="4" w:space="0" w:color="B7C4D3"/>
               <w:left w:val="single" w:sz="4" w:space="0" w:color="B7C4D3"/>
@@ -3805,7 +3805,7 @@
         </w:tc>
         <w:tc>
           <w:tcPr>
-            <w:tcW w:w="6693" w:type="dxa"/>
+            <w:tcW w:w="6503" w:type="dxa"/>
             <w:tcBorders>
               <w:top w:val="single" w:sz="4" w:space="0" w:color="B7C4D3"/>
               <w:left w:val="single" w:sz="4" w:space="0" w:color="B7C4D3"/>
@@ -3837,7 +3837,7 @@
         </w:trPr>
         <w:tc>
           <w:tcPr>
-            <w:tcW w:w="2280" w:type="dxa"/>
+            <w:tcW w:w="2470" w:type="dxa"/>
             <w:tcBorders>
               <w:top w:val="single" w:sz="4" w:space="0" w:color="B7C4D3"/>
               <w:left w:val="single" w:sz="4" w:space="0" w:color="B7C4D3"/>
@@ -3893,7 +3893,7 @@
         </w:tc>
         <w:tc>
           <w:tcPr>
-            <w:tcW w:w="6693" w:type="dxa"/>
+            <w:tcW w:w="6503" w:type="dxa"/>
             <w:tcBorders>
               <w:top w:val="single" w:sz="4" w:space="0" w:color="B7C4D3"/>
               <w:left w:val="single" w:sz="4" w:space="0" w:color="B7C4D3"/>
@@ -3925,7 +3925,7 @@
         </w:trPr>
         <w:tc>
           <w:tcPr>
-            <w:tcW w:w="2280" w:type="dxa"/>
+            <w:tcW w:w="2470" w:type="dxa"/>
             <w:tcBorders>
               <w:top w:val="single" w:sz="4" w:space="0" w:color="B7C4D3"/>
               <w:left w:val="single" w:sz="4" w:space="0" w:color="B7C4D3"/>
@@ -3981,7 +3981,7 @@
         </w:tc>
         <w:tc>
           <w:tcPr>
-            <w:tcW w:w="6693" w:type="dxa"/>
+            <w:tcW w:w="6503" w:type="dxa"/>
             <w:tcBorders>
               <w:top w:val="single" w:sz="4" w:space="0" w:color="B7C4D3"/>
               <w:left w:val="single" w:sz="4" w:space="0" w:color="B7C4D3"/>
@@ -4013,7 +4013,7 @@
         </w:trPr>
         <w:tc>
           <w:tcPr>
-            <w:tcW w:w="2280" w:type="dxa"/>
+            <w:tcW w:w="2470" w:type="dxa"/>
             <w:tcBorders>
               <w:top w:val="single" w:sz="4" w:space="0" w:color="B7C4D3"/>
               <w:left w:val="single" w:sz="4" w:space="0" w:color="B7C4D3"/>
@@ -4069,7 +4069,7 @@
         </w:tc>
         <w:tc>
           <w:tcPr>
-            <w:tcW w:w="6693" w:type="dxa"/>
+            <w:tcW w:w="6503" w:type="dxa"/>
             <w:tcBorders>
               <w:top w:val="single" w:sz="4" w:space="0" w:color="B7C4D3"/>
               <w:left w:val="single" w:sz="4" w:space="0" w:color="B7C4D3"/>
@@ -4101,7 +4101,7 @@
         </w:trPr>
         <w:tc>
           <w:tcPr>
-            <w:tcW w:w="2280" w:type="dxa"/>
+            <w:tcW w:w="2470" w:type="dxa"/>
             <w:tcBorders>
               <w:top w:val="single" w:sz="4" w:space="0" w:color="B7C4D3"/>
               <w:left w:val="single" w:sz="4" w:space="0" w:color="B7C4D3"/>
@@ -4157,7 +4157,7 @@
         </w:tc>
         <w:tc>
           <w:tcPr>
-            <w:tcW w:w="6693" w:type="dxa"/>
+            <w:tcW w:w="6503" w:type="dxa"/>
             <w:tcBorders>
               <w:top w:val="single" w:sz="4" w:space="0" w:color="B7C4D3"/>
               <w:left w:val="single" w:sz="4" w:space="0" w:color="B7C4D3"/>
@@ -4189,7 +4189,7 @@
         </w:trPr>
         <w:tc>
           <w:tcPr>
-            <w:tcW w:w="2280" w:type="dxa"/>
+            <w:tcW w:w="2470" w:type="dxa"/>
             <w:tcBorders>
               <w:top w:val="single" w:sz="4" w:space="0" w:color="B7C4D3"/>
               <w:left w:val="single" w:sz="4" w:space="0" w:color="B7C4D3"/>
@@ -4245,7 +4245,7 @@
         </w:tc>
         <w:tc>
           <w:tcPr>
-            <w:tcW w:w="6693" w:type="dxa"/>
+            <w:tcW w:w="6503" w:type="dxa"/>
             <w:tcBorders>
               <w:top w:val="single" w:sz="4" w:space="0" w:color="B7C4D3"/>
               <w:left w:val="single" w:sz="4" w:space="0" w:color="B7C4D3"/>
@@ -4277,7 +4277,7 @@
         </w:trPr>
         <w:tc>
           <w:tcPr>
-            <w:tcW w:w="2280" w:type="dxa"/>
+            <w:tcW w:w="2470" w:type="dxa"/>
             <w:tcBorders>
               <w:top w:val="single" w:sz="4" w:space="0" w:color="B7C4D3"/>
               <w:left w:val="single" w:sz="4" w:space="0" w:color="B7C4D3"/>
@@ -4333,7 +4333,7 @@
         </w:tc>
         <w:tc>
           <w:tcPr>
-            <w:tcW w:w="6693" w:type="dxa"/>
+            <w:tcW w:w="6503" w:type="dxa"/>
             <w:tcBorders>
               <w:top w:val="single" w:sz="4" w:space="0" w:color="B7C4D3"/>
               <w:left w:val="single" w:sz="4" w:space="0" w:color="B7C4D3"/>
@@ -4365,7 +4365,7 @@
         </w:trPr>
         <w:tc>
           <w:tcPr>
-            <w:tcW w:w="2280" w:type="dxa"/>
+            <w:tcW w:w="2470" w:type="dxa"/>
             <w:tcBorders>
               <w:top w:val="single" w:sz="4" w:space="0" w:color="B7C4D3"/>
               <w:left w:val="single" w:sz="4" w:space="0" w:color="B7C4D3"/>
@@ -4421,7 +4421,7 @@
         </w:tc>
         <w:tc>
           <w:tcPr>
-            <w:tcW w:w="6693" w:type="dxa"/>
+            <w:tcW w:w="6503" w:type="dxa"/>
             <w:tcBorders>
               <w:top w:val="single" w:sz="4" w:space="0" w:color="B7C4D3"/>
               <w:left w:val="single" w:sz="4" w:space="0" w:color="B7C4D3"/>
@@ -4453,7 +4453,7 @@
         </w:trPr>
         <w:tc>
           <w:tcPr>
-            <w:tcW w:w="2280" w:type="dxa"/>
+            <w:tcW w:w="2470" w:type="dxa"/>
             <w:tcBorders>
               <w:top w:val="single" w:sz="4" w:space="0" w:color="B7C4D3"/>
               <w:left w:val="single" w:sz="4" w:space="0" w:color="B7C4D3"/>
@@ -4509,7 +4509,7 @@
         </w:tc>
         <w:tc>
           <w:tcPr>
-            <w:tcW w:w="6693" w:type="dxa"/>
+            <w:tcW w:w="6503" w:type="dxa"/>
             <w:tcBorders>
               <w:top w:val="single" w:sz="4" w:space="0" w:color="B7C4D3"/>
               <w:left w:val="single" w:sz="4" w:space="0" w:color="B7C4D3"/>
@@ -4541,7 +4541,7 @@
         </w:trPr>
         <w:tc>
           <w:tcPr>
-            <w:tcW w:w="2280" w:type="dxa"/>
+            <w:tcW w:w="2470" w:type="dxa"/>
             <w:tcBorders>
               <w:top w:val="single" w:sz="4" w:space="0" w:color="B7C4D3"/>
               <w:left w:val="single" w:sz="4" w:space="0" w:color="B7C4D3"/>
@@ -4597,7 +4597,7 @@
         </w:tc>
         <w:tc>
           <w:tcPr>
-            <w:tcW w:w="6693" w:type="dxa"/>
+            <w:tcW w:w="6503" w:type="dxa"/>
             <w:tcBorders>
               <w:top w:val="single" w:sz="4" w:space="0" w:color="B7C4D3"/>
               <w:left w:val="single" w:sz="4" w:space="0" w:color="B7C4D3"/>
@@ -4629,7 +4629,7 @@
         </w:trPr>
         <w:tc>
           <w:tcPr>
-            <w:tcW w:w="2280" w:type="dxa"/>
+            <w:tcW w:w="2470" w:type="dxa"/>
             <w:tcBorders>
               <w:top w:val="single" w:sz="4" w:space="0" w:color="B7C4D3"/>
               <w:left w:val="single" w:sz="4" w:space="0" w:color="B7C4D3"/>
@@ -4652,7 +4652,7 @@
                 <w:sz w:val="15"/>
                 <w:szCs w:val="15"/>
               </w:rPr>
-              <w:t>tools/build_dataset.py</w:t>
+              <w:t>tools/verify_v2_fixes.py</w:t>
             </w:r>
           </w:p>
         </w:tc>
@@ -4679,34 +4679,34 @@
                 <w:sz w:val="17"/>
                 <w:szCs w:val="17"/>
               </w:rPr>
-              <w:t>69</w:t>
-            </w:r>
-          </w:p>
-        </w:tc>
-        <w:tc>
-          <w:tcPr>
-            <w:tcW w:w="6693" w:type="dxa"/>
-            <w:tcBorders>
-              <w:top w:val="single" w:sz="4" w:space="0" w:color="B7C4D3"/>
-              <w:left w:val="single" w:sz="4" w:space="0" w:color="B7C4D3"/>
-              <w:bottom w:val="single" w:sz="4" w:space="0" w:color="B7C4D3"/>
-              <w:right w:val="single" w:sz="4" w:space="0" w:color="B7C4D3"/>
-            </w:tcBorders>
-            <w:shd w:val="clear" w:color="auto" w:fill="FFFFFF"/>
-            <w:tcMar>
-              <w:top w:w="50" w:type="dxa"/>
-              <w:left w:w="90" w:type="dxa"/>
-              <w:bottom w:w="50" w:type="dxa"/>
-              <w:right w:w="90" w:type="dxa"/>
-            </w:tcMar>
-          </w:tcPr>
-          <w:p>
-            <w:r>
-              <w:rPr>
-                <w:sz w:val="17"/>
-                <w:szCs w:val="17"/>
-              </w:rPr>
-              <w:t>deduplicated 1,000-profile dataset from verified runs</w:t>
+              <w:t>140</w:t>
+            </w:r>
+          </w:p>
+        </w:tc>
+        <w:tc>
+          <w:tcPr>
+            <w:tcW w:w="6503" w:type="dxa"/>
+            <w:tcBorders>
+              <w:top w:val="single" w:sz="4" w:space="0" w:color="B7C4D3"/>
+              <w:left w:val="single" w:sz="4" w:space="0" w:color="B7C4D3"/>
+              <w:bottom w:val="single" w:sz="4" w:space="0" w:color="B7C4D3"/>
+              <w:right w:val="single" w:sz="4" w:space="0" w:color="B7C4D3"/>
+            </w:tcBorders>
+            <w:shd w:val="clear" w:color="auto" w:fill="FFFFFF"/>
+            <w:tcMar>
+              <w:top w:w="50" w:type="dxa"/>
+              <w:left w:w="90" w:type="dxa"/>
+              <w:bottom w:w="50" w:type="dxa"/>
+              <w:right w:w="90" w:type="dxa"/>
+            </w:tcMar>
+          </w:tcPr>
+          <w:p>
+            <w:r>
+              <w:rPr>
+                <w:sz w:val="17"/>
+                <w:szCs w:val="17"/>
+              </w:rPr>
+              <w:t>replays Builderr's audit cases; scans a dataset for the four audit problems</w:t>
             </w:r>
           </w:p>
         </w:tc>
@@ -4717,7 +4717,7 @@
         </w:trPr>
         <w:tc>
           <w:tcPr>
-            <w:tcW w:w="2280" w:type="dxa"/>
+            <w:tcW w:w="2470" w:type="dxa"/>
             <w:tcBorders>
               <w:top w:val="single" w:sz="4" w:space="0" w:color="B7C4D3"/>
               <w:left w:val="single" w:sz="4" w:space="0" w:color="B7C4D3"/>
@@ -4740,6 +4740,94 @@
                 <w:sz w:val="15"/>
                 <w:szCs w:val="15"/>
               </w:rPr>
+              <w:t>tools/build_dataset.py</w:t>
+            </w:r>
+          </w:p>
+        </w:tc>
+        <w:tc>
+          <w:tcPr>
+            <w:tcW w:w="665" w:type="dxa"/>
+            <w:tcBorders>
+              <w:top w:val="single" w:sz="4" w:space="0" w:color="B7C4D3"/>
+              <w:left w:val="single" w:sz="4" w:space="0" w:color="B7C4D3"/>
+              <w:bottom w:val="single" w:sz="4" w:space="0" w:color="B7C4D3"/>
+              <w:right w:val="single" w:sz="4" w:space="0" w:color="B7C4D3"/>
+            </w:tcBorders>
+            <w:shd w:val="clear" w:color="auto" w:fill="F5F8FB"/>
+            <w:tcMar>
+              <w:top w:w="50" w:type="dxa"/>
+              <w:left w:w="90" w:type="dxa"/>
+              <w:bottom w:w="50" w:type="dxa"/>
+              <w:right w:w="90" w:type="dxa"/>
+            </w:tcMar>
+          </w:tcPr>
+          <w:p>
+            <w:r>
+              <w:rPr>
+                <w:sz w:val="17"/>
+                <w:szCs w:val="17"/>
+              </w:rPr>
+              <w:t>69</w:t>
+            </w:r>
+          </w:p>
+        </w:tc>
+        <w:tc>
+          <w:tcPr>
+            <w:tcW w:w="6503" w:type="dxa"/>
+            <w:tcBorders>
+              <w:top w:val="single" w:sz="4" w:space="0" w:color="B7C4D3"/>
+              <w:left w:val="single" w:sz="4" w:space="0" w:color="B7C4D3"/>
+              <w:bottom w:val="single" w:sz="4" w:space="0" w:color="B7C4D3"/>
+              <w:right w:val="single" w:sz="4" w:space="0" w:color="B7C4D3"/>
+            </w:tcBorders>
+            <w:shd w:val="clear" w:color="auto" w:fill="F5F8FB"/>
+            <w:tcMar>
+              <w:top w:w="50" w:type="dxa"/>
+              <w:left w:w="90" w:type="dxa"/>
+              <w:bottom w:w="50" w:type="dxa"/>
+              <w:right w:w="90" w:type="dxa"/>
+            </w:tcMar>
+          </w:tcPr>
+          <w:p>
+            <w:r>
+              <w:rPr>
+                <w:sz w:val="17"/>
+                <w:szCs w:val="17"/>
+              </w:rPr>
+              <w:t>deduplicated 1,000-profile dataset from verified runs</w:t>
+            </w:r>
+          </w:p>
+        </w:tc>
+      </w:tr>
+      <w:tr>
+        <w:trPr>
+          <w:cantSplit/>
+        </w:trPr>
+        <w:tc>
+          <w:tcPr>
+            <w:tcW w:w="2470" w:type="dxa"/>
+            <w:tcBorders>
+              <w:top w:val="single" w:sz="4" w:space="0" w:color="B7C4D3"/>
+              <w:left w:val="single" w:sz="4" w:space="0" w:color="B7C4D3"/>
+              <w:bottom w:val="single" w:sz="4" w:space="0" w:color="B7C4D3"/>
+              <w:right w:val="single" w:sz="4" w:space="0" w:color="B7C4D3"/>
+            </w:tcBorders>
+            <w:shd w:val="clear" w:color="auto" w:fill="FFFFFF"/>
+            <w:tcMar>
+              <w:top w:w="50" w:type="dxa"/>
+              <w:left w:w="90" w:type="dxa"/>
+              <w:bottom w:w="50" w:type="dxa"/>
+              <w:right w:w="90" w:type="dxa"/>
+            </w:tcMar>
+          </w:tcPr>
+          <w:p>
+            <w:r>
+              <w:rPr>
+                <w:rFonts w:ascii="Consolas" w:eastAsia="Consolas" w:hAnsi="Consolas" w:cs="Consolas"/>
+                <w:color w:val="333333"/>
+                <w:sz w:val="15"/>
+                <w:szCs w:val="15"/>
+              </w:rPr>
               <w:t>tests/test_agent.py</w:t>
             </w:r>
           </w:p>
@@ -4753,7 +4841,7 @@
               <w:bottom w:val="single" w:sz="4" w:space="0" w:color="B7C4D3"/>
               <w:right w:val="single" w:sz="4" w:space="0" w:color="B7C4D3"/>
             </w:tcBorders>
-            <w:shd w:val="clear" w:color="auto" w:fill="F5F8FB"/>
+            <w:shd w:val="clear" w:color="auto" w:fill="FFFFFF"/>
             <w:tcMar>
               <w:top w:w="50" w:type="dxa"/>
               <w:left w:w="90" w:type="dxa"/>
@@ -4773,14 +4861,14 @@
         </w:tc>
         <w:tc>
           <w:tcPr>
-            <w:tcW w:w="6693" w:type="dxa"/>
-            <w:tcBorders>
-              <w:top w:val="single" w:sz="4" w:space="0" w:color="B7C4D3"/>
-              <w:left w:val="single" w:sz="4" w:space="0" w:color="B7C4D3"/>
-              <w:bottom w:val="single" w:sz="4" w:space="0" w:color="B7C4D3"/>
-              <w:right w:val="single" w:sz="4" w:space="0" w:color="B7C4D3"/>
-            </w:tcBorders>
-            <w:shd w:val="clear" w:color="auto" w:fill="F5F8FB"/>
+            <w:tcW w:w="6503" w:type="dxa"/>
+            <w:tcBorders>
+              <w:top w:val="single" w:sz="4" w:space="0" w:color="B7C4D3"/>
+              <w:left w:val="single" w:sz="4" w:space="0" w:color="B7C4D3"/>
+              <w:bottom w:val="single" w:sz="4" w:space="0" w:color="B7C4D3"/>
+              <w:right w:val="single" w:sz="4" w:space="0" w:color="B7C4D3"/>
+            </w:tcBorders>
+            <w:shd w:val="clear" w:color="auto" w:fill="FFFFFF"/>
             <w:tcMar>
               <w:top w:w="50" w:type="dxa"/>
               <w:left w:w="90" w:type="dxa"/>
@@ -4809,7 +4897,7 @@
       <w:pPr>
         <w:pStyle w:val="Heading1"/>
       </w:pPr>
-      <w:bookmarkStart w:id="4" w:name="_Toc243648896"/>
+      <w:bookmarkStart w:id="4" w:name="_Toc243649754"/>
       <w:r>
         <w:t>5. Technology stack</w:t>
       </w:r>
@@ -6274,7 +6362,7 @@
       <w:pPr>
         <w:pStyle w:val="Heading1"/>
       </w:pPr>
-      <w:bookmarkStart w:id="5" w:name="_Toc243648897"/>
+      <w:bookmarkStart w:id="5" w:name="_Toc243649755"/>
       <w:r>
         <w:t>6. Data sources</w:t>
       </w:r>
@@ -7627,7 +7715,7 @@
       <w:pPr>
         <w:pStyle w:val="Heading1"/>
       </w:pPr>
-      <w:bookmarkStart w:id="6" w:name="_Toc243648898"/>
+      <w:bookmarkStart w:id="6" w:name="_Toc243649756"/>
       <w:r>
         <w:t>7. Fact, evidence and envelope model</w:t>
       </w:r>
@@ -8186,7 +8274,7 @@
       <w:pPr>
         <w:pStyle w:val="Heading1"/>
       </w:pPr>
-      <w:bookmarkStart w:id="7" w:name="_Toc243648899"/>
+      <w:bookmarkStart w:id="7" w:name="_Toc243649757"/>
       <w:r>
         <w:t>8. Identity verification</w:t>
       </w:r>
@@ -9118,7 +9206,7 @@
       <w:pPr>
         <w:pStyle w:val="Heading1"/>
       </w:pPr>
-      <w:bookmarkStart w:id="8" w:name="_Toc243648900"/>
+      <w:bookmarkStart w:id="8" w:name="_Toc243649758"/>
       <w:r>
         <w:t>9. Other components</w:t>
       </w:r>
@@ -9567,7 +9655,7 @@
       <w:pPr>
         <w:pStyle w:val="Heading1"/>
       </w:pPr>
-      <w:bookmarkStart w:id="9" w:name="_Toc243648901"/>
+      <w:bookmarkStart w:id="9" w:name="_Toc243649759"/>
       <w:r>
         <w:t>10. Security</w:t>
       </w:r>
@@ -10460,7 +10548,7 @@
       <w:pPr>
         <w:pStyle w:val="Heading1"/>
       </w:pPr>
-      <w:bookmarkStart w:id="10" w:name="_Toc243648902"/>
+      <w:bookmarkStart w:id="10" w:name="_Toc243649760"/>
       <w:r>
         <w:t>11. Privacy and data protection</w:t>
       </w:r>
@@ -11024,7 +11112,7 @@
       <w:pPr>
         <w:pStyle w:val="Heading1"/>
       </w:pPr>
-      <w:bookmarkStart w:id="11" w:name="_Toc243648903"/>
+      <w:bookmarkStart w:id="11" w:name="_Toc243649761"/>
       <w:r>
         <w:t>12. Testing methodology</w:t>
       </w:r>
@@ -13219,7 +13307,7 @@
       <w:pPr>
         <w:pStyle w:val="Heading1"/>
       </w:pPr>
-      <w:bookmarkStart w:id="12" w:name="_Toc243648904"/>
+      <w:bookmarkStart w:id="12" w:name="_Toc243649762"/>
       <w:r>
         <w:t>13. Results at the frozen commit</w:t>
       </w:r>
@@ -17157,7 +17245,7 @@
       <w:pPr>
         <w:pStyle w:val="Heading1"/>
       </w:pPr>
-      <w:bookmarkStart w:id="13" w:name="_Toc243648905"/>
+      <w:bookmarkStart w:id="13" w:name="_Toc243649763"/>
       <w:r>
         <w:t>14. Defects found and fixed</w:t>
       </w:r>
@@ -18798,7 +18886,7 @@
       <w:pPr>
         <w:pStyle w:val="Heading1"/>
       </w:pPr>
-      <w:bookmarkStart w:id="14" w:name="_Toc243648906"/>
+      <w:bookmarkStart w:id="14" w:name="_Toc243649764"/>
       <w:r>
         <w:t>15. Limitations and future work</w:t>
       </w:r>
@@ -18920,7 +19008,7 @@
       <w:pPr>
         <w:pStyle w:val="Heading1"/>
       </w:pPr>
-      <w:bookmarkStart w:id="15" w:name="_Toc243648907"/>
+      <w:bookmarkStart w:id="15" w:name="_Toc243649765"/>
       <w:r>
         <w:t>16. Reproduction and submission</w:t>
       </w:r>
@@ -18931,7 +19019,19 @@
         <w:spacing w:after="120" w:line="276" w:lineRule="auto"/>
       </w:pPr>
       <w:r>
-        <w:t>Install and run (Linux/macOS):</w:t>
+        <w:t xml:space="preserve">Version 2 changes are documented before/after, with the old and new code and verification steps, in </w:t>
+      </w:r>
+      <w:r>
+        <w:rPr>
+          <w:rFonts w:ascii="Consolas" w:eastAsia="Consolas" w:hAnsi="Consolas" w:cs="Consolas"/>
+          <w:color w:val="333333"/>
+          <w:sz w:val="18"/>
+          <w:szCs w:val="18"/>
+        </w:rPr>
+        <w:t>CHANGES_V2.md</w:t>
+      </w:r>
+      <w:r>
+        <w:t>. To check them:</w:t>
       </w:r>
     </w:p>
     <w:p>
@@ -18945,7 +19045,7 @@
           <w:sz w:val="18"/>
           <w:szCs w:val="18"/>
         </w:rPr>
-        <w:t>python -m venv .venv &amp;&amp; .venv/bin/pip install -r requirements.txt</w:t>
+        <w:t>python tools/verify_v2_fixes.py</w:t>
       </w:r>
     </w:p>
     <w:p>
@@ -18959,7 +19059,7 @@
           <w:sz w:val="18"/>
           <w:szCs w:val="18"/>
         </w:rPr>
-        <w:t>.venv/bin/python run.py --input companies.jsonl --output out</w:t>
+        <w:t>python tools/verify_v2_fixes.py --dataset profiles/profiles.jsonl.gz</w:t>
       </w:r>
     </w:p>
     <w:p>
@@ -18972,7 +19072,15 @@
         <w:spacing w:after="120" w:line="276" w:lineRule="auto"/>
       </w:pPr>
       <w:r>
-        <w:t>Windows:</w:t>
+        <w:t>Expected: 17/17 audit cases pass, and 0 audit problems in the version 2 dataset (the version 1 dataset shows 57).</w:t>
+      </w:r>
+    </w:p>
+    <w:p>
+      <w:pPr>
+        <w:spacing w:after="120" w:line="276" w:lineRule="auto"/>
+      </w:pPr>
+      <w:r>
+        <w:t>Install and run (Linux/macOS):</w:t>
       </w:r>
     </w:p>
     <w:p>
@@ -18986,7 +19094,7 @@
           <w:sz w:val="18"/>
           <w:szCs w:val="18"/>
         </w:rPr>
-        <w:t>python -m venv .venv</w:t>
+        <w:t>python -m venv .venv &amp;&amp; .venv/bin/pip install -r requirements.txt</w:t>
       </w:r>
     </w:p>
     <w:p>
@@ -19000,21 +19108,7 @@
           <w:sz w:val="18"/>
           <w:szCs w:val="18"/>
         </w:rPr>
-        <w:t>.venv\Scripts\python.exe -m pip install -r requirements.txt</w:t>
-      </w:r>
-    </w:p>
-    <w:p>
-      <w:pPr>
-        <w:shd w:val="clear" w:color="auto" w:fill="F2F2F2"/>
-        <w:ind w:left="200"/>
-      </w:pPr>
-      <w:r>
-        <w:rPr>
-          <w:rFonts w:ascii="Consolas" w:eastAsia="Consolas" w:hAnsi="Consolas" w:cs="Consolas"/>
-          <w:sz w:val="18"/>
-          <w:szCs w:val="18"/>
-        </w:rPr>
-        <w:t>.venv\Scripts\python.exe run.py --input companies.jsonl --output out</w:t>
+        <w:t>.venv/bin/python run.py --input companies.jsonl --output out</w:t>
       </w:r>
     </w:p>
     <w:p>
@@ -19027,7 +19121,7 @@
         <w:spacing w:after="120" w:line="276" w:lineRule="auto"/>
       </w:pPr>
       <w:r>
-        <w:t>Checking a run's output against the contract (the verifier is included in the repository):</w:t>
+        <w:t>Windows:</w:t>
       </w:r>
     </w:p>
     <w:p>
@@ -19041,7 +19135,35 @@
           <w:sz w:val="18"/>
           <w:szCs w:val="18"/>
         </w:rPr>
-        <w:t>python tools/verify_run.py --input companies.jsonl --output out</w:t>
+        <w:t>python -m venv .venv</w:t>
+      </w:r>
+    </w:p>
+    <w:p>
+      <w:pPr>
+        <w:shd w:val="clear" w:color="auto" w:fill="F2F2F2"/>
+        <w:ind w:left="200"/>
+      </w:pPr>
+      <w:r>
+        <w:rPr>
+          <w:rFonts w:ascii="Consolas" w:eastAsia="Consolas" w:hAnsi="Consolas" w:cs="Consolas"/>
+          <w:sz w:val="18"/>
+          <w:szCs w:val="18"/>
+        </w:rPr>
+        <w:t>.venv\Scripts\python.exe -m pip install -r requirements.txt</w:t>
+      </w:r>
+    </w:p>
+    <w:p>
+      <w:pPr>
+        <w:shd w:val="clear" w:color="auto" w:fill="F2F2F2"/>
+        <w:ind w:left="200"/>
+      </w:pPr>
+      <w:r>
+        <w:rPr>
+          <w:rFonts w:ascii="Consolas" w:eastAsia="Consolas" w:hAnsi="Consolas" w:cs="Consolas"/>
+          <w:sz w:val="18"/>
+          <w:szCs w:val="18"/>
+        </w:rPr>
+        <w:t>.venv\Scripts\python.exe run.py --input companies.jsonl --output out</w:t>
       </w:r>
     </w:p>
     <w:p>
@@ -19054,7 +19176,7 @@
         <w:spacing w:after="120" w:line="276" w:lineRule="auto"/>
       </w:pPr>
       <w:r>
-        <w:t>Offline tests (included in the repository):</w:t>
+        <w:t>Checking a run's output against the contract (the verifier is included in the repository):</w:t>
       </w:r>
     </w:p>
     <w:p>
@@ -19068,7 +19190,7 @@
           <w:sz w:val="18"/>
           <w:szCs w:val="18"/>
         </w:rPr>
-        <w:t>python tests/test_agent.py</w:t>
+        <w:t>python tools/verify_run.py --input companies.jsonl --output out</w:t>
       </w:r>
     </w:p>
     <w:p>
@@ -19081,6 +19203,33 @@
         <w:spacing w:after="120" w:line="276" w:lineRule="auto"/>
       </w:pPr>
       <w:r>
+        <w:t>Offline tests (included in the repository):</w:t>
+      </w:r>
+    </w:p>
+    <w:p>
+      <w:pPr>
+        <w:shd w:val="clear" w:color="auto" w:fill="F2F2F2"/>
+        <w:ind w:left="200"/>
+      </w:pPr>
+      <w:r>
+        <w:rPr>
+          <w:rFonts w:ascii="Consolas" w:eastAsia="Consolas" w:hAnsi="Consolas" w:cs="Consolas"/>
+          <w:sz w:val="18"/>
+          <w:szCs w:val="18"/>
+        </w:rPr>
+        <w:t>python tests/test_agent.py</w:t>
+      </w:r>
+    </w:p>
+    <w:p>
+      <w:pPr>
+        <w:spacing w:after="120"/>
+      </w:pPr>
+    </w:p>
+    <w:p>
+      <w:pPr>
+        <w:spacing w:after="120" w:line="276" w:lineRule="auto"/>
+      </w:pPr>
+      <w:r>
         <w:t xml:space="preserve">The 13-run test harness was used for validation and is kept outside the submitted repository; its results are reported in sections 12 and 13 and in </w:t>
       </w:r>
       <w:r>
@@ -19127,7 +19276,7 @@
       <w:pPr>
         <w:pStyle w:val="Heading1"/>
       </w:pPr>
-      <w:bookmarkStart w:id="16" w:name="_Toc243648908"/>
+      <w:bookmarkStart w:id="16" w:name="_Toc243649766"/>
       <w:r>
         <w:t>Appendix A: Offline test inventory</w:t>
       </w:r>
@@ -20376,64 +20525,68 @@
 <file path=word/numbering.xml><?xml version="1.0" encoding="utf-8"?>
 <w:numbering xmlns:wpc="http://schemas.microsoft.com/office/word/2010/wordprocessingCanvas" xmlns:cx="http://schemas.microsoft.com/office/drawing/2014/chartex" xmlns:cx1="http://schemas.microsoft.com/office/drawing/2015/9/8/chartex" xmlns:cx2="http://schemas.microsoft.com/office/drawing/2015/10/21/chartex" xmlns:cx3="http://schemas.microsoft.com/office/drawing/2016/5/9/chartex" xmlns:cx4="http://schemas.microsoft.com/office/drawing/2016/5/10/chartex" xmlns:cx5="http://schemas.microsoft.com/office/drawing/2016/5/11/chartex" xmlns:cx6="http://schemas.microsoft.com/office/drawing/2016/5/12/chartex" xmlns:cx7="http://schemas.microsoft.com/office/drawing/2016/5/13/chartex" xmlns:cx8="http://schemas.microsoft.com/office/drawing/2016/5/14/chartex" xmlns:mc="http://schemas.openxmlformats.org/markup-compatibility/2006" xmlns:aink="http://schemas.microsoft.com/office/drawing/2016/ink" xmlns:am3d="http://schemas.microsoft.com/office/drawing/2017/model3d" xmlns:o="urn:schemas-microsoft-com:office:office" xmlns:oel="http://schemas.microsoft.com/office/2019/extlst" xmlns:r="http://schemas.openxmlformats.org/officeDocument/2006/relationships" xmlns:m="http://schemas.openxmlformats.org/officeDocument/2006/math" xmlns:v="urn:schemas-microsoft-com:vml" xmlns:wp14="http://schemas.microsoft.com/office/word/2010/wordprocessingDrawing" xmlns:wp="http://schemas.openxmlformats.org/drawingml/2006/wordprocessingDrawing" xmlns:w10="urn:schemas-microsoft-com:office:word" xmlns:w="http://schemas.openxmlformats.org/wordprocessingml/2006/main" xmlns:w14="http://schemas.microsoft.com/office/word/2010/wordml" xmlns:w15="http://schemas.microsoft.com/office/word/2012/wordml" xmlns:w16cex="http://schemas.microsoft.com/office/word/2018/wordml/cex" xmlns:w16cid="http://schemas.microsoft.com/office/word/2016/wordml/cid" xmlns:w16="http://schemas.microsoft.com/office/word/2018/wordml" xmlns:w16du="http://schemas.microsoft.com/office/word/2023/wordml/word16du" xmlns:w16sdtdh="http://schemas.microsoft.com/office/word/2020/wordml/sdtdatahash" xmlns:w16sdtfl="http://schemas.microsoft.com/office/word/2024/wordml/sdtformatlock" xmlns:w16se="http://schemas.microsoft.com/office/word/2015/wordml/symex" xmlns:wpg="http://schemas.microsoft.com/office/word/2010/wordprocessingGroup" xmlns:wpi="http://schemas.microsoft.com/office/word/2010/wordprocessingInk" xmlns:wne="http://schemas.microsoft.com/office/word/2006/wordml" xmlns:wps="http://schemas.microsoft.com/office/word/2010/wordprocessingShape" mc:Ignorable="w14 w15 w16se w16cid w16 w16cex w16sdtdh w16sdtfl w16du wp14">
   <w:abstractNum w:abstractNumId="0" w15:restartNumberingAfterBreak="0">
-    <w:nsid w:val="01A66F7C"/>
+    <w:nsid w:val="258A4FE8"/>
     <w:multiLevelType w:val="hybridMultilevel"/>
-    <w:tmpl w:val="86887DB4"/>
-    <w:lvl w:ilvl="0" w:tplc="F600016C">
+    <w:tmpl w:val="82F468D4"/>
+    <w:lvl w:ilvl="0" w:tplc="E83CD946">
       <w:start w:val="1"/>
-      <w:numFmt w:val="decimal"/>
-      <w:lvlText w:val="%1."/>
+      <w:numFmt w:val="bullet"/>
+      <w:lvlText w:val="•"/>
       <w:lvlJc w:val="left"/>
       <w:pPr>
-        <w:ind w:left="540" w:hanging="360"/>
+        <w:ind w:left="540" w:hanging="270"/>
       </w:pPr>
     </w:lvl>
-    <w:lvl w:ilvl="1" w:tplc="DC78647C">
+    <w:lvl w:ilvl="1" w:tplc="ECE846F0">
+      <w:start w:val="1"/>
+      <w:numFmt w:val="bullet"/>
+      <w:lvlText w:val="–"/>
+      <w:lvlJc w:val="left"/>
+      <w:pPr>
+        <w:ind w:left="1080" w:hanging="270"/>
+      </w:pPr>
+    </w:lvl>
+    <w:lvl w:ilvl="2" w:tplc="FCFA9E82">
       <w:numFmt w:val="decimal"/>
       <w:lvlText w:val=""/>
       <w:lvlJc w:val="left"/>
     </w:lvl>
-    <w:lvl w:ilvl="2" w:tplc="5DC00872">
+    <w:lvl w:ilvl="3" w:tplc="62ACDDA6">
       <w:numFmt w:val="decimal"/>
       <w:lvlText w:val=""/>
       <w:lvlJc w:val="left"/>
     </w:lvl>
-    <w:lvl w:ilvl="3" w:tplc="5568F2FE">
+    <w:lvl w:ilvl="4" w:tplc="D3A8547E">
       <w:numFmt w:val="decimal"/>
       <w:lvlText w:val=""/>
       <w:lvlJc w:val="left"/>
     </w:lvl>
-    <w:lvl w:ilvl="4" w:tplc="89FAA308">
+    <w:lvl w:ilvl="5" w:tplc="DF624E06">
       <w:numFmt w:val="decimal"/>
       <w:lvlText w:val=""/>
       <w:lvlJc w:val="left"/>
     </w:lvl>
-    <w:lvl w:ilvl="5" w:tplc="0520F7AA">
+    <w:lvl w:ilvl="6" w:tplc="B6046C9A">
       <w:numFmt w:val="decimal"/>
       <w:lvlText w:val=""/>
       <w:lvlJc w:val="left"/>
     </w:lvl>
-    <w:lvl w:ilvl="6" w:tplc="E58E3C5E">
+    <w:lvl w:ilvl="7" w:tplc="C93459B4">
       <w:numFmt w:val="decimal"/>
       <w:lvlText w:val=""/>
       <w:lvlJc w:val="left"/>
     </w:lvl>
-    <w:lvl w:ilvl="7" w:tplc="5C1880C6">
-      <w:numFmt w:val="decimal"/>
-      <w:lvlText w:val=""/>
-      <w:lvlJc w:val="left"/>
-    </w:lvl>
-    <w:lvl w:ilvl="8" w:tplc="9B404D58">
+    <w:lvl w:ilvl="8" w:tplc="EA0EAA6E">
       <w:numFmt w:val="decimal"/>
       <w:lvlText w:val=""/>
       <w:lvlJc w:val="left"/>
     </w:lvl>
   </w:abstractNum>
   <w:abstractNum w:abstractNumId="1" w15:restartNumberingAfterBreak="0">
-    <w:nsid w:val="14650DC3"/>
+    <w:nsid w:val="37EC2564"/>
     <w:multiLevelType w:val="hybridMultilevel"/>
-    <w:tmpl w:val="9A762028"/>
-    <w:lvl w:ilvl="0" w:tplc="DEA64A94" w:tentative="1">
+    <w:tmpl w:val="B9D48588"/>
+    <w:lvl w:ilvl="0" w:tplc="1EAC0612" w:tentative="1">
       <w:start w:val="1"/>
       <w:numFmt w:val="bullet"/>
       <w:lvlText w:val="●"/>
@@ -20442,7 +20595,7 @@
         <w:ind w:left="720" w:hanging="360"/>
       </w:pPr>
     </w:lvl>
-    <w:lvl w:ilvl="1" w:tplc="678494A2" w:tentative="1">
+    <w:lvl w:ilvl="1" w:tplc="6284C308" w:tentative="1">
       <w:start w:val="1"/>
       <w:numFmt w:val="bullet"/>
       <w:lvlText w:val="○"/>
@@ -20451,7 +20604,7 @@
         <w:ind w:left="1440" w:hanging="360"/>
       </w:pPr>
     </w:lvl>
-    <w:lvl w:ilvl="2" w:tplc="A26ED46A" w:tentative="1">
+    <w:lvl w:ilvl="2" w:tplc="8EFCE418" w:tentative="1">
       <w:start w:val="1"/>
       <w:numFmt w:val="bullet"/>
       <w:lvlText w:val="■"/>
@@ -20460,7 +20613,7 @@
         <w:ind w:left="2160" w:hanging="360"/>
       </w:pPr>
     </w:lvl>
-    <w:lvl w:ilvl="3" w:tplc="68AE77A4" w:tentative="1">
+    <w:lvl w:ilvl="3" w:tplc="02D4FBAA" w:tentative="1">
       <w:start w:val="1"/>
       <w:numFmt w:val="bullet"/>
       <w:lvlText w:val="●"/>
@@ -20469,7 +20622,7 @@
         <w:ind w:left="2880" w:hanging="360"/>
       </w:pPr>
     </w:lvl>
-    <w:lvl w:ilvl="4" w:tplc="67FCAB02" w:tentative="1">
+    <w:lvl w:ilvl="4" w:tplc="5D02750C" w:tentative="1">
       <w:start w:val="1"/>
       <w:numFmt w:val="bullet"/>
       <w:lvlText w:val="○"/>
@@ -20478,7 +20631,7 @@
         <w:ind w:left="3600" w:hanging="360"/>
       </w:pPr>
     </w:lvl>
-    <w:lvl w:ilvl="5" w:tplc="20AE2840" w:tentative="1">
+    <w:lvl w:ilvl="5" w:tplc="E03AA14A" w:tentative="1">
       <w:start w:val="1"/>
       <w:numFmt w:val="bullet"/>
       <w:lvlText w:val="■"/>
@@ -20487,7 +20640,7 @@
         <w:ind w:left="4320" w:hanging="360"/>
       </w:pPr>
     </w:lvl>
-    <w:lvl w:ilvl="6" w:tplc="8BE6711E" w:tentative="1">
+    <w:lvl w:ilvl="6" w:tplc="02EC858E" w:tentative="1">
       <w:start w:val="1"/>
       <w:numFmt w:val="bullet"/>
       <w:lvlText w:val="●"/>
@@ -20496,7 +20649,7 @@
         <w:ind w:left="5040" w:hanging="360"/>
       </w:pPr>
     </w:lvl>
-    <w:lvl w:ilvl="7" w:tplc="2F321E4C" w:tentative="1">
+    <w:lvl w:ilvl="7" w:tplc="F94C937A" w:tentative="1">
       <w:start w:val="1"/>
       <w:numFmt w:val="bullet"/>
       <w:lvlText w:val="●"/>
@@ -20505,7 +20658,7 @@
         <w:ind w:left="5760" w:hanging="360"/>
       </w:pPr>
     </w:lvl>
-    <w:lvl w:ilvl="8" w:tplc="9FD06BD8" w:tentative="1">
+    <w:lvl w:ilvl="8" w:tplc="393C1BC8" w:tentative="1">
       <w:start w:val="1"/>
       <w:numFmt w:val="bullet"/>
       <w:lvlText w:val="●"/>
@@ -20516,89 +20669,85 @@
     </w:lvl>
   </w:abstractNum>
   <w:abstractNum w:abstractNumId="2" w15:restartNumberingAfterBreak="0">
-    <w:nsid w:val="29AF58D1"/>
+    <w:nsid w:val="5B4540EB"/>
     <w:multiLevelType w:val="hybridMultilevel"/>
-    <w:tmpl w:val="353E0E78"/>
-    <w:lvl w:ilvl="0" w:tplc="845658D0">
+    <w:tmpl w:val="88546038"/>
+    <w:lvl w:ilvl="0" w:tplc="B866A8CC">
       <w:start w:val="1"/>
-      <w:numFmt w:val="bullet"/>
-      <w:lvlText w:val="•"/>
+      <w:numFmt w:val="decimal"/>
+      <w:lvlText w:val="%1."/>
       <w:lvlJc w:val="left"/>
       <w:pPr>
-        <w:ind w:left="540" w:hanging="270"/>
+        <w:ind w:left="540" w:hanging="360"/>
       </w:pPr>
     </w:lvl>
-    <w:lvl w:ilvl="1" w:tplc="7F36BF9C">
-      <w:start w:val="1"/>
-      <w:numFmt w:val="bullet"/>
-      <w:lvlText w:val="–"/>
-      <w:lvlJc w:val="left"/>
-      <w:pPr>
-        <w:ind w:left="1080" w:hanging="270"/>
-      </w:pPr>
-    </w:lvl>
-    <w:lvl w:ilvl="2" w:tplc="5630D05C">
+    <w:lvl w:ilvl="1" w:tplc="3A56742E">
       <w:numFmt w:val="decimal"/>
       <w:lvlText w:val=""/>
       <w:lvlJc w:val="left"/>
     </w:lvl>
-    <w:lvl w:ilvl="3" w:tplc="E3FA8FE8">
+    <w:lvl w:ilvl="2" w:tplc="694E7148">
       <w:numFmt w:val="decimal"/>
       <w:lvlText w:val=""/>
       <w:lvlJc w:val="left"/>
     </w:lvl>
-    <w:lvl w:ilvl="4" w:tplc="47782368">
+    <w:lvl w:ilvl="3" w:tplc="510480BA">
       <w:numFmt w:val="decimal"/>
       <w:lvlText w:val=""/>
       <w:lvlJc w:val="left"/>
     </w:lvl>
-    <w:lvl w:ilvl="5" w:tplc="BF7C800E">
+    <w:lvl w:ilvl="4" w:tplc="BDB43C62">
       <w:numFmt w:val="decimal"/>
       <w:lvlText w:val=""/>
       <w:lvlJc w:val="left"/>
     </w:lvl>
-    <w:lvl w:ilvl="6" w:tplc="4050A1D0">
+    <w:lvl w:ilvl="5" w:tplc="074C4A02">
       <w:numFmt w:val="decimal"/>
       <w:lvlText w:val=""/>
       <w:lvlJc w:val="left"/>
     </w:lvl>
-    <w:lvl w:ilvl="7" w:tplc="36FCB130">
+    <w:lvl w:ilvl="6" w:tplc="C62E8718">
       <w:numFmt w:val="decimal"/>
       <w:lvlText w:val=""/>
       <w:lvlJc w:val="left"/>
     </w:lvl>
-    <w:lvl w:ilvl="8" w:tplc="20CEC9EE">
+    <w:lvl w:ilvl="7" w:tplc="44CA8358">
+      <w:numFmt w:val="decimal"/>
+      <w:lvlText w:val=""/>
+      <w:lvlJc w:val="left"/>
+    </w:lvl>
+    <w:lvl w:ilvl="8" w:tplc="685AC6CC">
       <w:numFmt w:val="decimal"/>
       <w:lvlText w:val=""/>
       <w:lvlJc w:val="left"/>
     </w:lvl>
   </w:abstractNum>
-  <w:num w:numId="1" w16cid:durableId="1933784089">
+  <w:num w:numId="1" w16cid:durableId="943733111">
     <w:abstractNumId w:val="1"/>
     <w:lvlOverride w:ilvl="0">
       <w:startOverride w:val="1"/>
     </w:lvlOverride>
   </w:num>
-  <w:num w:numId="2" w16cid:durableId="1928416968">
+  <w:num w:numId="2" w16cid:durableId="2005359414">
+    <w:abstractNumId w:val="0"/>
+    <w:lvlOverride w:ilvl="0">
+      <w:startOverride w:val="1"/>
+    </w:lvlOverride>
+  </w:num>
+  <w:num w:numId="3" w16cid:durableId="864055928">
     <w:abstractNumId w:val="2"/>
     <w:lvlOverride w:ilvl="0">
       <w:startOverride w:val="1"/>
     </w:lvlOverride>
   </w:num>
-  <w:num w:numId="3" w16cid:durableId="325786302">
-    <w:abstractNumId w:val="0"/>
+  <w:num w:numId="4" w16cid:durableId="1290210884">
+    <w:abstractNumId w:val="2"/>
     <w:lvlOverride w:ilvl="0">
       <w:startOverride w:val="1"/>
     </w:lvlOverride>
   </w:num>
-  <w:num w:numId="4" w16cid:durableId="1173641225">
-    <w:abstractNumId w:val="0"/>
-    <w:lvlOverride w:ilvl="0">
-      <w:startOverride w:val="1"/>
-    </w:lvlOverride>
-  </w:num>
-  <w:num w:numId="5" w16cid:durableId="567881197">
-    <w:abstractNumId w:val="0"/>
+  <w:num w:numId="5" w16cid:durableId="1787311935">
+    <w:abstractNumId w:val="2"/>
     <w:lvlOverride w:ilvl="0">
       <w:startOverride w:val="1"/>
     </w:lvlOverride>
@@ -21227,7 +21376,7 @@
     <w:autoRedefine/>
     <w:uiPriority w:val="39"/>
     <w:unhideWhenUsed/>
-    <w:rsid w:val="002B55BD"/>
+    <w:rsid w:val="00A25812"/>
     <w:pPr>
       <w:spacing w:after="100"/>
     </w:pPr>

</xml_diff>

<commit_message>
Version 2.1 verification at 1f2ad26: CHANGES_V2.md (both rounds), regenerated test report, all docs, dataset and smoke artifacts
</commit_message>
<xml_diff>
--- a/docs/IMPLEMENTATION_REPORT.docx
+++ b/docs/IMPLEMENTATION_REPORT.docx
@@ -174,14 +174,14 @@
                 <w:sz w:val="15"/>
                 <w:szCs w:val="15"/>
               </w:rPr>
-              <w:t>a96e0f1d38e1db2c2323be8494de1f790ac855ab</w:t>
-            </w:r>
-            <w:r>
-              <w:rPr>
-                <w:sz w:val="17"/>
-                <w:szCs w:val="17"/>
-              </w:rPr>
-              <w:t xml:space="preserve"> (version 2, after Builderr's audit of version 1; all results in this report were produced at this commit)</w:t>
+              <w:t>1f2ad26cfdbbd270c252cc4fc15f01c3154cb0eb</w:t>
+            </w:r>
+            <w:r>
+              <w:rPr>
+                <w:sz w:val="17"/>
+                <w:szCs w:val="17"/>
+              </w:rPr>
+              <w:t xml:space="preserve"> (version 2.1, after Builderr's audit of version 1 and a second review; all results in this report were produced at this commit)</w:t>
             </w:r>
           </w:p>
         </w:tc>
@@ -303,7 +303,7 @@
                 <w:sz w:val="17"/>
                 <w:szCs w:val="17"/>
               </w:rPr>
-              <w:t>about 2,030 lines of agent code, 480 lines of tooling and a 660-line offline test suite in the repository; an 82-line run harness was used for validation</w:t>
+              <w:t>about 2,100 lines of agent code, 500 lines of tooling and a 750-line offline test suite in the repository; an 82-line run harness was used for validation</w:t>
             </w:r>
           </w:p>
         </w:tc>
@@ -398,7 +398,7 @@
     <w:sdt>
       <w:sdtPr>
         <w:alias w:val="Contents"/>
-        <w:id w:val="-1700917551"/>
+        <w:id w:val="-1486469943"/>
       </w:sdtPr>
       <w:sdtEndPr/>
       <w:sdtContent>
@@ -421,7 +421,7 @@
           <w:r>
             <w:fldChar w:fldCharType="separate"/>
           </w:r>
-          <w:hyperlink w:anchor="_Toc243649750" w:history="1">
+          <w:hyperlink w:anchor="_Toc243655302" w:history="1">
             <w:r>
               <w:rPr>
                 <w:rStyle w:val="Hyperlink"/>
@@ -445,7 +445,7 @@
               <w:rPr>
                 <w:noProof/>
               </w:rPr>
-              <w:instrText xml:space="preserve"> PAGEREF _Toc243649750 \h </w:instrText>
+              <w:instrText xml:space="preserve"> PAGEREF _Toc243655302 \h </w:instrText>
             </w:r>
             <w:r>
               <w:rPr>
@@ -482,7 +482,7 @@
               <w:noProof/>
             </w:rPr>
           </w:pPr>
-          <w:hyperlink w:anchor="_Toc243649751" w:history="1">
+          <w:hyperlink w:anchor="_Toc243655303" w:history="1">
             <w:r>
               <w:rPr>
                 <w:rStyle w:val="Hyperlink"/>
@@ -506,7 +506,7 @@
               <w:rPr>
                 <w:noProof/>
               </w:rPr>
-              <w:instrText xml:space="preserve"> PAGEREF _Toc243649751 \h </w:instrText>
+              <w:instrText xml:space="preserve"> PAGEREF _Toc243655303 \h </w:instrText>
             </w:r>
             <w:r>
               <w:rPr>
@@ -543,7 +543,7 @@
               <w:noProof/>
             </w:rPr>
           </w:pPr>
-          <w:hyperlink w:anchor="_Toc243649752" w:history="1">
+          <w:hyperlink w:anchor="_Toc243655304" w:history="1">
             <w:r>
               <w:rPr>
                 <w:rStyle w:val="Hyperlink"/>
@@ -567,7 +567,7 @@
               <w:rPr>
                 <w:noProof/>
               </w:rPr>
-              <w:instrText xml:space="preserve"> PAGEREF _Toc243649752 \h </w:instrText>
+              <w:instrText xml:space="preserve"> PAGEREF _Toc243655304 \h </w:instrText>
             </w:r>
             <w:r>
               <w:rPr>
@@ -604,7 +604,7 @@
               <w:noProof/>
             </w:rPr>
           </w:pPr>
-          <w:hyperlink w:anchor="_Toc243649753" w:history="1">
+          <w:hyperlink w:anchor="_Toc243655305" w:history="1">
             <w:r>
               <w:rPr>
                 <w:rStyle w:val="Hyperlink"/>
@@ -628,7 +628,7 @@
               <w:rPr>
                 <w:noProof/>
               </w:rPr>
-              <w:instrText xml:space="preserve"> PAGEREF _Toc243649753 \h </w:instrText>
+              <w:instrText xml:space="preserve"> PAGEREF _Toc243655305 \h </w:instrText>
             </w:r>
             <w:r>
               <w:rPr>
@@ -665,7 +665,7 @@
               <w:noProof/>
             </w:rPr>
           </w:pPr>
-          <w:hyperlink w:anchor="_Toc243649754" w:history="1">
+          <w:hyperlink w:anchor="_Toc243655306" w:history="1">
             <w:r>
               <w:rPr>
                 <w:rStyle w:val="Hyperlink"/>
@@ -689,7 +689,7 @@
               <w:rPr>
                 <w:noProof/>
               </w:rPr>
-              <w:instrText xml:space="preserve"> PAGEREF _Toc243649754 \h </w:instrText>
+              <w:instrText xml:space="preserve"> PAGEREF _Toc243655306 \h </w:instrText>
             </w:r>
             <w:r>
               <w:rPr>
@@ -726,7 +726,7 @@
               <w:noProof/>
             </w:rPr>
           </w:pPr>
-          <w:hyperlink w:anchor="_Toc243649755" w:history="1">
+          <w:hyperlink w:anchor="_Toc243655307" w:history="1">
             <w:r>
               <w:rPr>
                 <w:rStyle w:val="Hyperlink"/>
@@ -750,7 +750,7 @@
               <w:rPr>
                 <w:noProof/>
               </w:rPr>
-              <w:instrText xml:space="preserve"> PAGEREF _Toc243649755 \h </w:instrText>
+              <w:instrText xml:space="preserve"> PAGEREF _Toc243655307 \h </w:instrText>
             </w:r>
             <w:r>
               <w:rPr>
@@ -787,7 +787,7 @@
               <w:noProof/>
             </w:rPr>
           </w:pPr>
-          <w:hyperlink w:anchor="_Toc243649756" w:history="1">
+          <w:hyperlink w:anchor="_Toc243655308" w:history="1">
             <w:r>
               <w:rPr>
                 <w:rStyle w:val="Hyperlink"/>
@@ -811,7 +811,7 @@
               <w:rPr>
                 <w:noProof/>
               </w:rPr>
-              <w:instrText xml:space="preserve"> PAGEREF _Toc243649756 \h </w:instrText>
+              <w:instrText xml:space="preserve"> PAGEREF _Toc243655308 \h </w:instrText>
             </w:r>
             <w:r>
               <w:rPr>
@@ -848,7 +848,7 @@
               <w:noProof/>
             </w:rPr>
           </w:pPr>
-          <w:hyperlink w:anchor="_Toc243649757" w:history="1">
+          <w:hyperlink w:anchor="_Toc243655309" w:history="1">
             <w:r>
               <w:rPr>
                 <w:rStyle w:val="Hyperlink"/>
@@ -872,7 +872,7 @@
               <w:rPr>
                 <w:noProof/>
               </w:rPr>
-              <w:instrText xml:space="preserve"> PAGEREF _Toc243649757 \h </w:instrText>
+              <w:instrText xml:space="preserve"> PAGEREF _Toc243655309 \h </w:instrText>
             </w:r>
             <w:r>
               <w:rPr>
@@ -909,7 +909,7 @@
               <w:noProof/>
             </w:rPr>
           </w:pPr>
-          <w:hyperlink w:anchor="_Toc243649758" w:history="1">
+          <w:hyperlink w:anchor="_Toc243655310" w:history="1">
             <w:r>
               <w:rPr>
                 <w:rStyle w:val="Hyperlink"/>
@@ -933,7 +933,7 @@
               <w:rPr>
                 <w:noProof/>
               </w:rPr>
-              <w:instrText xml:space="preserve"> PAGEREF _Toc243649758 \h </w:instrText>
+              <w:instrText xml:space="preserve"> PAGEREF _Toc243655310 \h </w:instrText>
             </w:r>
             <w:r>
               <w:rPr>
@@ -970,7 +970,7 @@
               <w:noProof/>
             </w:rPr>
           </w:pPr>
-          <w:hyperlink w:anchor="_Toc243649759" w:history="1">
+          <w:hyperlink w:anchor="_Toc243655311" w:history="1">
             <w:r>
               <w:rPr>
                 <w:rStyle w:val="Hyperlink"/>
@@ -994,7 +994,7 @@
               <w:rPr>
                 <w:noProof/>
               </w:rPr>
-              <w:instrText xml:space="preserve"> PAGEREF _Toc243649759 \h </w:instrText>
+              <w:instrText xml:space="preserve"> PAGEREF _Toc243655311 \h </w:instrText>
             </w:r>
             <w:r>
               <w:rPr>
@@ -1011,7 +1011,7 @@
               <w:rPr>
                 <w:noProof/>
               </w:rPr>
-              <w:t>8</w:t>
+              <w:t>9</w:t>
             </w:r>
             <w:r>
               <w:rPr>
@@ -1031,7 +1031,7 @@
               <w:noProof/>
             </w:rPr>
           </w:pPr>
-          <w:hyperlink w:anchor="_Toc243649760" w:history="1">
+          <w:hyperlink w:anchor="_Toc243655312" w:history="1">
             <w:r>
               <w:rPr>
                 <w:rStyle w:val="Hyperlink"/>
@@ -1055,7 +1055,7 @@
               <w:rPr>
                 <w:noProof/>
               </w:rPr>
-              <w:instrText xml:space="preserve"> PAGEREF _Toc243649760 \h </w:instrText>
+              <w:instrText xml:space="preserve"> PAGEREF _Toc243655312 \h </w:instrText>
             </w:r>
             <w:r>
               <w:rPr>
@@ -1092,7 +1092,7 @@
               <w:noProof/>
             </w:rPr>
           </w:pPr>
-          <w:hyperlink w:anchor="_Toc243649761" w:history="1">
+          <w:hyperlink w:anchor="_Toc243655313" w:history="1">
             <w:r>
               <w:rPr>
                 <w:rStyle w:val="Hyperlink"/>
@@ -1116,7 +1116,7 @@
               <w:rPr>
                 <w:noProof/>
               </w:rPr>
-              <w:instrText xml:space="preserve"> PAGEREF _Toc243649761 \h </w:instrText>
+              <w:instrText xml:space="preserve"> PAGEREF _Toc243655313 \h </w:instrText>
             </w:r>
             <w:r>
               <w:rPr>
@@ -1153,7 +1153,7 @@
               <w:noProof/>
             </w:rPr>
           </w:pPr>
-          <w:hyperlink w:anchor="_Toc243649762" w:history="1">
+          <w:hyperlink w:anchor="_Toc243655314" w:history="1">
             <w:r>
               <w:rPr>
                 <w:rStyle w:val="Hyperlink"/>
@@ -1177,7 +1177,7 @@
               <w:rPr>
                 <w:noProof/>
               </w:rPr>
-              <w:instrText xml:space="preserve"> PAGEREF _Toc243649762 \h </w:instrText>
+              <w:instrText xml:space="preserve"> PAGEREF _Toc243655314 \h </w:instrText>
             </w:r>
             <w:r>
               <w:rPr>
@@ -1194,7 +1194,7 @@
               <w:rPr>
                 <w:noProof/>
               </w:rPr>
-              <w:t>10</w:t>
+              <w:t>11</w:t>
             </w:r>
             <w:r>
               <w:rPr>
@@ -1214,7 +1214,7 @@
               <w:noProof/>
             </w:rPr>
           </w:pPr>
-          <w:hyperlink w:anchor="_Toc243649763" w:history="1">
+          <w:hyperlink w:anchor="_Toc243655315" w:history="1">
             <w:r>
               <w:rPr>
                 <w:rStyle w:val="Hyperlink"/>
@@ -1238,7 +1238,7 @@
               <w:rPr>
                 <w:noProof/>
               </w:rPr>
-              <w:instrText xml:space="preserve"> PAGEREF _Toc243649763 \h </w:instrText>
+              <w:instrText xml:space="preserve"> PAGEREF _Toc243655315 \h </w:instrText>
             </w:r>
             <w:r>
               <w:rPr>
@@ -1275,7 +1275,7 @@
               <w:noProof/>
             </w:rPr>
           </w:pPr>
-          <w:hyperlink w:anchor="_Toc243649764" w:history="1">
+          <w:hyperlink w:anchor="_Toc243655316" w:history="1">
             <w:r>
               <w:rPr>
                 <w:rStyle w:val="Hyperlink"/>
@@ -1299,7 +1299,7 @@
               <w:rPr>
                 <w:noProof/>
               </w:rPr>
-              <w:instrText xml:space="preserve"> PAGEREF _Toc243649764 \h </w:instrText>
+              <w:instrText xml:space="preserve"> PAGEREF _Toc243655316 \h </w:instrText>
             </w:r>
             <w:r>
               <w:rPr>
@@ -1336,7 +1336,7 @@
               <w:noProof/>
             </w:rPr>
           </w:pPr>
-          <w:hyperlink w:anchor="_Toc243649765" w:history="1">
+          <w:hyperlink w:anchor="_Toc243655317" w:history="1">
             <w:r>
               <w:rPr>
                 <w:rStyle w:val="Hyperlink"/>
@@ -1360,7 +1360,7 @@
               <w:rPr>
                 <w:noProof/>
               </w:rPr>
-              <w:instrText xml:space="preserve"> PAGEREF _Toc243649765 \h </w:instrText>
+              <w:instrText xml:space="preserve"> PAGEREF _Toc243655317 \h </w:instrText>
             </w:r>
             <w:r>
               <w:rPr>
@@ -1377,7 +1377,7 @@
               <w:rPr>
                 <w:noProof/>
               </w:rPr>
-              <w:t>12</w:t>
+              <w:t>13</w:t>
             </w:r>
             <w:r>
               <w:rPr>
@@ -1397,7 +1397,7 @@
               <w:noProof/>
             </w:rPr>
           </w:pPr>
-          <w:hyperlink w:anchor="_Toc243649766" w:history="1">
+          <w:hyperlink w:anchor="_Toc243655318" w:history="1">
             <w:r>
               <w:rPr>
                 <w:rStyle w:val="Hyperlink"/>
@@ -1421,7 +1421,7 @@
               <w:rPr>
                 <w:noProof/>
               </w:rPr>
-              <w:instrText xml:space="preserve"> PAGEREF _Toc243649766 \h </w:instrText>
+              <w:instrText xml:space="preserve"> PAGEREF _Toc243655318 \h </w:instrText>
             </w:r>
             <w:r>
               <w:rPr>
@@ -1464,7 +1464,7 @@
       <w:pPr>
         <w:pStyle w:val="Heading1"/>
       </w:pPr>
-      <w:bookmarkStart w:id="0" w:name="_Toc243649750"/>
+      <w:bookmarkStart w:id="0" w:name="_Toc243655302"/>
       <w:r>
         <w:t>1. Executive summary</w:t>
       </w:r>
@@ -1634,7 +1634,7 @@
         <w:spacing w:after="60" w:line="264" w:lineRule="auto"/>
       </w:pPr>
       <w:r>
-        <w:t>137 published websites, all audited by hand: zero wrong-company publications.</w:t>
+        <w:t>136 published websites and 124 social accounts, all audited by hand: zero wrong-company publications.</w:t>
       </w:r>
     </w:p>
     <w:p>
@@ -1673,7 +1673,7 @@
         <w:spacing w:after="60" w:line="264" w:lineRule="auto"/>
       </w:pPr>
       <w:r>
-        <w:t>47 offline regression tests pass, including the network-security boundary cases and the cases from Builderr's audit.</w:t>
+        <w:t>51 offline regression tests pass, including the network-security boundary cases and the cases from Builderr's audit and the second review.</w:t>
       </w:r>
     </w:p>
     <w:p>
@@ -1686,14 +1686,14 @@
         <w:spacing w:after="60" w:line="264" w:lineRule="auto"/>
       </w:pPr>
       <w:r>
-        <w:t>A deduplicated dataset of 1,000 company profiles (46,848 claims) is built from the verified runs.</w:t>
+        <w:t>A deduplicated dataset of 1,000 company profiles (46,808 claims) is built from the verified runs.</w:t>
       </w:r>
     </w:p>
     <w:p>
       <w:pPr>
         <w:pStyle w:val="Heading1"/>
       </w:pPr>
-      <w:bookmarkStart w:id="1" w:name="_Toc243649751"/>
+      <w:bookmarkStart w:id="1" w:name="_Toc243655303"/>
       <w:r>
         <w:t>2. The challenge and its requirements</w:t>
       </w:r>
@@ -2733,7 +2733,7 @@
       <w:pPr>
         <w:pStyle w:val="Heading1"/>
       </w:pPr>
-      <w:bookmarkStart w:id="2" w:name="_Toc243649752"/>
+      <w:bookmarkStart w:id="2" w:name="_Toc243655304"/>
       <w:r>
         <w:t>3. Methodology</w:t>
       </w:r>
@@ -2883,7 +2883,7 @@
       <w:pPr>
         <w:pStyle w:val="Heading1"/>
       </w:pPr>
-      <w:bookmarkStart w:id="3" w:name="_Toc243649753"/>
+      <w:bookmarkStart w:id="3" w:name="_Toc243655305"/>
       <w:r>
         <w:t>4. Architecture</w:t>
       </w:r>
@@ -4239,7 +4239,7 @@
                 <w:sz w:val="17"/>
                 <w:szCs w:val="17"/>
               </w:rPr>
-              <w:t>639</w:t>
+              <w:t>711</w:t>
             </w:r>
           </w:p>
         </w:tc>
@@ -4679,7 +4679,7 @@
                 <w:sz w:val="17"/>
                 <w:szCs w:val="17"/>
               </w:rPr>
-              <w:t>140</w:t>
+              <w:t>162</w:t>
             </w:r>
           </w:p>
         </w:tc>
@@ -4855,7 +4855,7 @@
                 <w:sz w:val="17"/>
                 <w:szCs w:val="17"/>
               </w:rPr>
-              <w:t>662</w:t>
+              <w:t>749</w:t>
             </w:r>
           </w:p>
         </w:tc>
@@ -4882,7 +4882,7 @@
                 <w:sz w:val="17"/>
                 <w:szCs w:val="17"/>
               </w:rPr>
-              <w:t>47 offline regression tests</w:t>
+              <w:t>51 offline regression tests</w:t>
             </w:r>
           </w:p>
         </w:tc>
@@ -4897,7 +4897,7 @@
       <w:pPr>
         <w:pStyle w:val="Heading1"/>
       </w:pPr>
-      <w:bookmarkStart w:id="4" w:name="_Toc243649754"/>
+      <w:bookmarkStart w:id="4" w:name="_Toc243655306"/>
       <w:r>
         <w:t>5. Technology stack</w:t>
       </w:r>
@@ -6362,7 +6362,7 @@
       <w:pPr>
         <w:pStyle w:val="Heading1"/>
       </w:pPr>
-      <w:bookmarkStart w:id="5" w:name="_Toc243649755"/>
+      <w:bookmarkStart w:id="5" w:name="_Toc243655307"/>
       <w:r>
         <w:t>6. Data sources</w:t>
       </w:r>
@@ -7715,7 +7715,7 @@
       <w:pPr>
         <w:pStyle w:val="Heading1"/>
       </w:pPr>
-      <w:bookmarkStart w:id="6" w:name="_Toc243649756"/>
+      <w:bookmarkStart w:id="6" w:name="_Toc243655308"/>
       <w:r>
         <w:t>7. Fact, evidence and envelope model</w:t>
       </w:r>
@@ -8274,7 +8274,7 @@
       <w:pPr>
         <w:pStyle w:val="Heading1"/>
       </w:pPr>
-      <w:bookmarkStart w:id="7" w:name="_Toc243649757"/>
+      <w:bookmarkStart w:id="7" w:name="_Toc243655309"/>
       <w:r>
         <w:t>8. Identity verification</w:t>
       </w:r>
@@ -8634,7 +8634,43 @@
         <w:spacing w:after="60" w:line="264" w:lineRule="auto"/>
       </w:pPr>
       <w:r>
-        <w:t>Social profiles are published only when linked from the verified site and the handle contains the company's distinctive name; platform paths and opaque channel IDs are rejected.</w:t>
+        <w:t>Social profiles are published only when linked from the verified site and the handle is the company's name: every distinctive word must be in it and anything left over may only be a harmless affix (</w:t>
+      </w:r>
+      <w:r>
+        <w:rPr>
+          <w:rFonts w:ascii="Consolas" w:eastAsia="Consolas" w:hAnsi="Consolas" w:cs="Consolas"/>
+          <w:color w:val="333333"/>
+          <w:sz w:val="18"/>
+          <w:szCs w:val="18"/>
+        </w:rPr>
+        <w:t>as</w:t>
+      </w:r>
+      <w:r>
+        <w:t xml:space="preserve">, </w:t>
+      </w:r>
+      <w:r>
+        <w:rPr>
+          <w:rFonts w:ascii="Consolas" w:eastAsia="Consolas" w:hAnsi="Consolas" w:cs="Consolas"/>
+          <w:color w:val="333333"/>
+          <w:sz w:val="18"/>
+          <w:szCs w:val="18"/>
+        </w:rPr>
+        <w:t>no</w:t>
+      </w:r>
+      <w:r>
+        <w:t xml:space="preserve">, </w:t>
+      </w:r>
+      <w:r>
+        <w:rPr>
+          <w:rFonts w:ascii="Consolas" w:eastAsia="Consolas" w:hAnsi="Consolas" w:cs="Consolas"/>
+          <w:color w:val="333333"/>
+          <w:sz w:val="18"/>
+          <w:szCs w:val="18"/>
+        </w:rPr>
+        <w:t>norge</w:t>
+      </w:r>
+      <w:r>
+        <w:t>), another legal-name word or a page ID, so sister, parent, subsidiary, group and other-company accounts that share a word are rejected; platform paths and opaque channel IDs are rejected.</w:t>
       </w:r>
     </w:p>
     <w:p>
@@ -9206,7 +9242,7 @@
       <w:pPr>
         <w:pStyle w:val="Heading1"/>
       </w:pPr>
-      <w:bookmarkStart w:id="8" w:name="_Toc243649758"/>
+      <w:bookmarkStart w:id="8" w:name="_Toc243655310"/>
       <w:r>
         <w:t>9. Other components</w:t>
       </w:r>
@@ -9340,7 +9376,7 @@
         <w:spacing w:after="60" w:line="264" w:lineRule="auto"/>
       </w:pPr>
       <w:r>
-        <w:t>linked social profiles whose handle names the company;</w:t>
+        <w:t>linked social profiles whose handle is the company's name (see section 8);</w:t>
       </w:r>
     </w:p>
     <w:p>
@@ -9378,7 +9414,19 @@
         <w:spacing w:after="60" w:line="264" w:lineRule="auto"/>
       </w:pPr>
       <w:r>
-        <w:t xml:space="preserve">dated news posts from JSON-LD articles and </w:t>
+        <w:t xml:space="preserve">dated news posts: the JSON-LD article node's own </w:t>
+      </w:r>
+      <w:r>
+        <w:rPr>
+          <w:rFonts w:ascii="Consolas" w:eastAsia="Consolas" w:hAnsi="Consolas" w:cs="Consolas"/>
+          <w:color w:val="333333"/>
+          <w:sz w:val="18"/>
+          <w:szCs w:val="18"/>
+        </w:rPr>
+        <w:t>datePublished</w:t>
+      </w:r>
+      <w:r>
+        <w:t xml:space="preserve">, or a </w:t>
       </w:r>
       <w:r>
         <w:rPr>
@@ -9390,7 +9438,19 @@
         <w:t>&lt;time&gt;</w:t>
       </w:r>
       <w:r>
-        <w:t xml:space="preserve"> elements: the URL must look like a post (date path or news/blog/press section); contact, product and shop pages, menu labels and demo posts are rejected, and "modified"/"updated" dates are never used as publish dates;</w:t>
+        <w:t xml:space="preserve"> on the news page only when its container holds exactly one date and links to exactly one article; dates must be plausible and never "modified"/"updated". Contact, product and shop pages, menu labels and demo posts are rejected. A generic </w:t>
+      </w:r>
+      <w:r>
+        <w:rPr>
+          <w:rFonts w:ascii="Consolas" w:eastAsia="Consolas" w:hAnsi="Consolas" w:cs="Consolas"/>
+          <w:color w:val="333333"/>
+          <w:sz w:val="18"/>
+          <w:szCs w:val="18"/>
+        </w:rPr>
+        <w:t>Article</w:t>
+      </w:r>
+      <w:r>
+        <w:t xml:space="preserve"> needs a post-like URL; explicit news types and structured list entries may use any URL;</w:t>
       </w:r>
     </w:p>
     <w:p>
@@ -9403,7 +9463,7 @@
         <w:spacing w:after="60" w:line="264" w:lineRule="auto"/>
       </w:pPr>
       <w:r>
-        <w:t>current (unexpired) JobPosting markup that names this company as employer. Careers landing pages are not published.</w:t>
+        <w:t>current (unexpired) JobPosting markup whose employer carries this org number or the exact legal name including the legal form (a similar name, another legal form or another org number is rejected). Careers landing pages are not published.</w:t>
       </w:r>
     </w:p>
     <w:p>
@@ -9655,7 +9715,7 @@
       <w:pPr>
         <w:pStyle w:val="Heading1"/>
       </w:pPr>
-      <w:bookmarkStart w:id="9" w:name="_Toc243649759"/>
+      <w:bookmarkStart w:id="9" w:name="_Toc243655311"/>
       <w:r>
         <w:t>10. Security</w:t>
       </w:r>
@@ -10548,7 +10608,7 @@
       <w:pPr>
         <w:pStyle w:val="Heading1"/>
       </w:pPr>
-      <w:bookmarkStart w:id="10" w:name="_Toc243649760"/>
+      <w:bookmarkStart w:id="10" w:name="_Toc243655312"/>
       <w:r>
         <w:t>11. Privacy and data protection</w:t>
       </w:r>
@@ -11112,7 +11172,7 @@
       <w:pPr>
         <w:pStyle w:val="Heading1"/>
       </w:pPr>
-      <w:bookmarkStart w:id="11" w:name="_Toc243649761"/>
+      <w:bookmarkStart w:id="11" w:name="_Toc243655313"/>
       <w:r>
         <w:t>12. Testing methodology</w:t>
       </w:r>
@@ -11135,10 +11195,10 @@
           <w:b/>
           <w:bCs/>
         </w:rPr>
-        <w:t>1. Offline regression tests (47).</w:t>
-      </w:r>
-      <w:r>
-        <w:t xml:space="preserve"> These cover the identity gate (19), discovery and extraction (10), network security (9), budgets and states (4), refresh (3), and input and data rules (2), as listed in Appendix A. Network tests use stand-ins for DNS and HTTP, so they run anywhere without network access. The test that guards credential stripping was mutation-checked: disabling the protection makes it fail.</w:t>
+        <w:t>1. Offline regression tests (51).</w:t>
+      </w:r>
+      <w:r>
+        <w:t xml:space="preserve"> These cover the identity gate (19), discovery and extraction (14), network security (9), budgets and states (4), refresh (3), and input and data rules (2), as listed in Appendix A. Network tests use stand-ins for DNS and HTTP, so they run anywhere without network access. The test that guards credential stripping was mutation-checked: disabling the protection makes it fail.</w:t>
       </w:r>
     </w:p>
     <w:p>
@@ -13307,7 +13367,7 @@
       <w:pPr>
         <w:pStyle w:val="Heading1"/>
       </w:pPr>
-      <w:bookmarkStart w:id="12" w:name="_Toc243649762"/>
+      <w:bookmarkStart w:id="12" w:name="_Toc243655314"/>
       <w:r>
         <w:t>13. Results at the frozen commit</w:t>
       </w:r>
@@ -13664,7 +13724,7 @@
                 <w:sz w:val="17"/>
                 <w:szCs w:val="17"/>
               </w:rPr>
-              <w:t>4,376</w:t>
+              <w:t>4,372</w:t>
             </w:r>
           </w:p>
         </w:tc>
@@ -13772,7 +13832,7 @@
                 <w:sz w:val="17"/>
                 <w:szCs w:val="17"/>
               </w:rPr>
-              <w:t>470 s</w:t>
+              <w:t>479 s</w:t>
             </w:r>
           </w:p>
         </w:tc>
@@ -13885,7 +13945,7 @@
                 <w:sz w:val="17"/>
                 <w:szCs w:val="17"/>
               </w:rPr>
-              <w:t>4,563</w:t>
+              <w:t>4,562</w:t>
             </w:r>
           </w:p>
         </w:tc>
@@ -13993,7 +14053,7 @@
                 <w:sz w:val="17"/>
                 <w:szCs w:val="17"/>
               </w:rPr>
-              <w:t>407 s</w:t>
+              <w:t>412 s</w:t>
             </w:r>
           </w:p>
         </w:tc>
@@ -14106,7 +14166,7 @@
                 <w:sz w:val="17"/>
                 <w:szCs w:val="17"/>
               </w:rPr>
-              <w:t>4,416</w:t>
+              <w:t>4,410</w:t>
             </w:r>
           </w:p>
         </w:tc>
@@ -14187,7 +14247,7 @@
                 <w:sz w:val="17"/>
                 <w:szCs w:val="17"/>
               </w:rPr>
-              <w:t>867</w:t>
+              <w:t>862</w:t>
             </w:r>
           </w:p>
         </w:tc>
@@ -14214,7 +14274,7 @@
                 <w:sz w:val="17"/>
                 <w:szCs w:val="17"/>
               </w:rPr>
-              <w:t>429 s</w:t>
+              <w:t>444 s</w:t>
             </w:r>
           </w:p>
         </w:tc>
@@ -14327,7 +14387,7 @@
                 <w:sz w:val="17"/>
                 <w:szCs w:val="17"/>
               </w:rPr>
-              <w:t>4,541</w:t>
+              <w:t>4,539</w:t>
             </w:r>
           </w:p>
         </w:tc>
@@ -14408,7 +14468,7 @@
                 <w:sz w:val="17"/>
                 <w:szCs w:val="17"/>
               </w:rPr>
-              <w:t>815</w:t>
+              <w:t>812</w:t>
             </w:r>
           </w:p>
         </w:tc>
@@ -14435,7 +14495,7 @@
                 <w:sz w:val="17"/>
                 <w:szCs w:val="17"/>
               </w:rPr>
-              <w:t>405 s</w:t>
+              <w:t>420 s</w:t>
             </w:r>
           </w:p>
         </w:tc>
@@ -14548,7 +14608,7 @@
                 <w:sz w:val="17"/>
                 <w:szCs w:val="17"/>
               </w:rPr>
-              <w:t>4,500</w:t>
+              <w:t>4,496</w:t>
             </w:r>
           </w:p>
         </w:tc>
@@ -14602,7 +14662,7 @@
                 <w:sz w:val="17"/>
                 <w:szCs w:val="17"/>
               </w:rPr>
-              <w:t>1</w:t>
+              <w:t>2</w:t>
             </w:r>
           </w:p>
         </w:tc>
@@ -14629,7 +14689,7 @@
                 <w:sz w:val="17"/>
                 <w:szCs w:val="17"/>
               </w:rPr>
-              <w:t>883</w:t>
+              <w:t>881</w:t>
             </w:r>
           </w:p>
         </w:tc>
@@ -14656,7 +14716,7 @@
                 <w:sz w:val="17"/>
                 <w:szCs w:val="17"/>
               </w:rPr>
-              <w:t>413 s</w:t>
+              <w:t>419 s</w:t>
             </w:r>
           </w:p>
         </w:tc>
@@ -14769,7 +14829,7 @@
                 <w:sz w:val="17"/>
                 <w:szCs w:val="17"/>
               </w:rPr>
-              <w:t>5,512</w:t>
+              <w:t>5,505</w:t>
             </w:r>
           </w:p>
         </w:tc>
@@ -14796,7 +14856,7 @@
                 <w:sz w:val="17"/>
                 <w:szCs w:val="17"/>
               </w:rPr>
-              <w:t>32</w:t>
+              <w:t>31</w:t>
             </w:r>
           </w:p>
         </w:tc>
@@ -14850,7 +14910,7 @@
                 <w:sz w:val="17"/>
                 <w:szCs w:val="17"/>
               </w:rPr>
-              <w:t>925</w:t>
+              <w:t>922</w:t>
             </w:r>
           </w:p>
         </w:tc>
@@ -14877,7 +14937,7 @@
                 <w:sz w:val="17"/>
                 <w:szCs w:val="17"/>
               </w:rPr>
-              <w:t>508 s</w:t>
+              <w:t>519 s</w:t>
             </w:r>
           </w:p>
         </w:tc>
@@ -14990,7 +15050,7 @@
                 <w:sz w:val="17"/>
                 <w:szCs w:val="17"/>
               </w:rPr>
-              <w:t>5,505</w:t>
+              <w:t>5,494</w:t>
             </w:r>
           </w:p>
         </w:tc>
@@ -15098,7 +15158,7 @@
                 <w:sz w:val="17"/>
                 <w:szCs w:val="17"/>
               </w:rPr>
-              <w:t>422 s</w:t>
+              <w:t>418 s</w:t>
             </w:r>
           </w:p>
         </w:tc>
@@ -15319,7 +15379,7 @@
                 <w:sz w:val="17"/>
                 <w:szCs w:val="17"/>
               </w:rPr>
-              <w:t>40 s</w:t>
+              <w:t>42 s</w:t>
             </w:r>
           </w:p>
         </w:tc>
@@ -15540,7 +15600,7 @@
                 <w:sz w:val="17"/>
                 <w:szCs w:val="17"/>
               </w:rPr>
-              <w:t>135 s</w:t>
+              <w:t>136 s</w:t>
             </w:r>
           </w:p>
         </w:tc>
@@ -15653,7 +15713,7 @@
                 <w:sz w:val="17"/>
                 <w:szCs w:val="17"/>
               </w:rPr>
-              <w:t>4,376</w:t>
+              <w:t>4,372</w:t>
             </w:r>
           </w:p>
         </w:tc>
@@ -15734,7 +15794,7 @@
                 <w:sz w:val="17"/>
                 <w:szCs w:val="17"/>
               </w:rPr>
-              <w:t>831</w:t>
+              <w:t>829</w:t>
             </w:r>
           </w:p>
         </w:tc>
@@ -15761,7 +15821,7 @@
                 <w:sz w:val="17"/>
                 <w:szCs w:val="17"/>
               </w:rPr>
-              <w:t>463 s</w:t>
+              <w:t>484 s</w:t>
             </w:r>
           </w:p>
         </w:tc>
@@ -15955,7 +16015,7 @@
                 <w:sz w:val="17"/>
                 <w:szCs w:val="17"/>
               </w:rPr>
-              <w:t>885</w:t>
+              <w:t>878</w:t>
             </w:r>
           </w:p>
         </w:tc>
@@ -15982,7 +16042,7 @@
                 <w:sz w:val="17"/>
                 <w:szCs w:val="17"/>
               </w:rPr>
-              <w:t>426 s</w:t>
+              <w:t>421 s</w:t>
             </w:r>
           </w:p>
         </w:tc>
@@ -16095,7 +16155,7 @@
                 <w:sz w:val="17"/>
                 <w:szCs w:val="17"/>
               </w:rPr>
-              <w:t>4,583</w:t>
+              <w:t>4,581</w:t>
             </w:r>
           </w:p>
         </w:tc>
@@ -16176,7 +16236,7 @@
                 <w:sz w:val="17"/>
                 <w:szCs w:val="17"/>
               </w:rPr>
-              <w:t>899</w:t>
+              <w:t>891</w:t>
             </w:r>
           </w:p>
         </w:tc>
@@ -16203,7 +16263,7 @@
                 <w:sz w:val="17"/>
                 <w:szCs w:val="17"/>
               </w:rPr>
-              <w:t>457 s</w:t>
+              <w:t>452 s</w:t>
             </w:r>
           </w:p>
         </w:tc>
@@ -16316,7 +16376,7 @@
                 <w:sz w:val="17"/>
                 <w:szCs w:val="17"/>
               </w:rPr>
-              <w:t>4,401</w:t>
+              <w:t>4,398</w:t>
             </w:r>
           </w:p>
         </w:tc>
@@ -16397,7 +16457,7 @@
                 <w:sz w:val="17"/>
                 <w:szCs w:val="17"/>
               </w:rPr>
-              <w:t>819</w:t>
+              <w:t>816</w:t>
             </w:r>
           </w:p>
         </w:tc>
@@ -16424,7 +16484,7 @@
                 <w:sz w:val="17"/>
                 <w:szCs w:val="17"/>
               </w:rPr>
-              <w:t>441 s</w:t>
+              <w:t>448 s</w:t>
             </w:r>
           </w:p>
         </w:tc>
@@ -17033,7 +17093,7 @@
                 <w:sz w:val="17"/>
                 <w:szCs w:val="17"/>
               </w:rPr>
-              <w:t>3–6</w:t>
+              <w:t>2–4</w:t>
             </w:r>
           </w:p>
         </w:tc>
@@ -17108,7 +17168,7 @@
         <w:spacing w:after="120" w:line="276" w:lineRule="auto"/>
       </w:pPr>
       <w:r>
-        <w:t>On employer-heavy and website-heavy batches, website coverage rises to 32–40 per 100.</w:t>
+        <w:t>On employer-heavy and website-heavy batches, website coverage rises to 31–40 per 100.</w:t>
       </w:r>
     </w:p>
     <w:p>
@@ -17123,7 +17183,7 @@
         <w:t>Source yield</w:t>
       </w:r>
       <w:r>
-        <w:t xml:space="preserve"> (smoke run): Brønnøysund 501 requests → 4,339 claims; company websites 237 requests → 37 claims; NAV feed 94 requests → 0 claims in that batch.</w:t>
+        <w:t xml:space="preserve"> (smoke run): Brønnøysund 501 requests → 4,339 claims; company websites 237 requests → 33 claims; NAV feed 94 requests → 0 claims in that batch.</w:t>
       </w:r>
     </w:p>
     <w:p>
@@ -17138,7 +17198,7 @@
         <w:t>Identity audit:</w:t>
       </w:r>
       <w:r>
-        <w:t xml:space="preserve"> 137 unique websites were published across the suite:</w:t>
+        <w:t xml:space="preserve"> 136 unique websites were published across the suite:</w:t>
       </w:r>
     </w:p>
     <w:p>
@@ -17151,7 +17211,7 @@
         <w:spacing w:after="60" w:line="264" w:lineRule="auto"/>
       </w:pPr>
       <w:r>
-        <w:t>30 with the organisation number on sites the company declared to an official source;</w:t>
+        <w:t>31 with the organisation number on sites the company declared to an official source;</w:t>
       </w:r>
     </w:p>
     <w:p>
@@ -17177,7 +17237,7 @@
         <w:spacing w:after="60" w:line="264" w:lineRule="auto"/>
       </w:pPr>
       <w:r>
-        <w:t>56 with the exact legal name plus the registry's own phone or address;</w:t>
+        <w:t>54 with the exact legal name plus the registry's own phone or address;</w:t>
       </w:r>
     </w:p>
     <w:p>
@@ -17211,6 +17271,50 @@
         <w:spacing w:after="120" w:line="276" w:lineRule="auto"/>
       </w:pPr>
       <w:r>
+        <w:t xml:space="preserve">All 124 published social accounts were also checked by hand: each is the company's exact name, optionally with </w:t>
+      </w:r>
+      <w:r>
+        <w:rPr>
+          <w:rFonts w:ascii="Consolas" w:eastAsia="Consolas" w:hAnsi="Consolas" w:cs="Consolas"/>
+          <w:color w:val="333333"/>
+          <w:sz w:val="18"/>
+          <w:szCs w:val="18"/>
+        </w:rPr>
+        <w:t>as</w:t>
+      </w:r>
+      <w:r>
+        <w:t xml:space="preserve">, </w:t>
+      </w:r>
+      <w:r>
+        <w:rPr>
+          <w:rFonts w:ascii="Consolas" w:eastAsia="Consolas" w:hAnsi="Consolas" w:cs="Consolas"/>
+          <w:color w:val="333333"/>
+          <w:sz w:val="18"/>
+          <w:szCs w:val="18"/>
+        </w:rPr>
+        <w:t>no</w:t>
+      </w:r>
+      <w:r>
+        <w:t xml:space="preserve">, </w:t>
+      </w:r>
+      <w:r>
+        <w:rPr>
+          <w:rFonts w:ascii="Consolas" w:eastAsia="Consolas" w:hAnsi="Consolas" w:cs="Consolas"/>
+          <w:color w:val="333333"/>
+          <w:sz w:val="18"/>
+          <w:szCs w:val="18"/>
+        </w:rPr>
+        <w:t>norge</w:t>
+      </w:r>
+      <w:r>
+        <w:t>, a country word or a page number.</w:t>
+      </w:r>
+    </w:p>
+    <w:p>
+      <w:pPr>
+        <w:spacing w:after="120" w:line="276" w:lineRule="auto"/>
+      </w:pPr>
+      <w:r>
         <w:t>None is a wrong-company match.</w:t>
       </w:r>
     </w:p>
@@ -17238,14 +17342,14 @@
         <w:t>profiles/profiles.jsonl.gz</w:t>
       </w:r>
       <w:r>
-        <w:t xml:space="preserve"> holds 1,000 unique companies (46,848 claims and as many evidence records), merged only from runs that passed verification. The manifest records the commit and the content SHA-256. The agent never reads this dataset when researching a batch.</w:t>
+        <w:t xml:space="preserve"> holds 1,000 unique companies (46,808 claims and as many evidence records), merged only from runs that passed verification. The manifest records the commit and the content SHA-256. The agent never reads this dataset when researching a batch.</w:t>
       </w:r>
     </w:p>
     <w:p>
       <w:pPr>
         <w:pStyle w:val="Heading1"/>
       </w:pPr>
-      <w:bookmarkStart w:id="13" w:name="_Toc243649763"/>
+      <w:bookmarkStart w:id="13" w:name="_Toc243655315"/>
       <w:r>
         <w:t>14. Defects found and fixed</w:t>
       </w:r>
@@ -17267,9 +17371,9 @@
       </w:tblPr>
       <w:tblGrid>
         <w:gridCol w:w="570"/>
-        <w:gridCol w:w="5194"/>
-        <w:gridCol w:w="1860"/>
-        <w:gridCol w:w="2014"/>
+        <w:gridCol w:w="5448"/>
+        <w:gridCol w:w="1786"/>
+        <w:gridCol w:w="1834"/>
       </w:tblGrid>
       <w:tr>
         <w:trPr>
@@ -17308,7 +17412,7 @@
         </w:tc>
         <w:tc>
           <w:tcPr>
-            <w:tcW w:w="5194" w:type="dxa"/>
+            <w:tcW w:w="5448" w:type="dxa"/>
             <w:tcBorders>
               <w:top w:val="single" w:sz="4" w:space="0" w:color="B7C4D3"/>
               <w:left w:val="single" w:sz="4" w:space="0" w:color="B7C4D3"/>
@@ -17338,7 +17442,7 @@
         </w:tc>
         <w:tc>
           <w:tcPr>
-            <w:tcW w:w="1860" w:type="dxa"/>
+            <w:tcW w:w="1786" w:type="dxa"/>
             <w:tcBorders>
               <w:top w:val="single" w:sz="4" w:space="0" w:color="B7C4D3"/>
               <w:left w:val="single" w:sz="4" w:space="0" w:color="B7C4D3"/>
@@ -17368,7 +17472,7 @@
         </w:tc>
         <w:tc>
           <w:tcPr>
-            <w:tcW w:w="2014" w:type="dxa"/>
+            <w:tcW w:w="1834" w:type="dxa"/>
             <w:tcBorders>
               <w:top w:val="single" w:sz="4" w:space="0" w:color="B7C4D3"/>
               <w:left w:val="single" w:sz="4" w:space="0" w:color="B7C4D3"/>
@@ -17430,7 +17534,7 @@
         </w:tc>
         <w:tc>
           <w:tcPr>
-            <w:tcW w:w="5194" w:type="dxa"/>
+            <w:tcW w:w="5448" w:type="dxa"/>
             <w:tcBorders>
               <w:top w:val="single" w:sz="4" w:space="0" w:color="B7C4D3"/>
               <w:left w:val="single" w:sz="4" w:space="0" w:color="B7C4D3"/>
@@ -17457,7 +17561,7 @@
         </w:tc>
         <w:tc>
           <w:tcPr>
-            <w:tcW w:w="1860" w:type="dxa"/>
+            <w:tcW w:w="1786" w:type="dxa"/>
             <w:tcBorders>
               <w:top w:val="single" w:sz="4" w:space="0" w:color="B7C4D3"/>
               <w:left w:val="single" w:sz="4" w:space="0" w:color="B7C4D3"/>
@@ -17484,7 +17588,7 @@
         </w:tc>
         <w:tc>
           <w:tcPr>
-            <w:tcW w:w="2014" w:type="dxa"/>
+            <w:tcW w:w="1834" w:type="dxa"/>
             <w:tcBorders>
               <w:top w:val="single" w:sz="4" w:space="0" w:color="B7C4D3"/>
               <w:left w:val="single" w:sz="4" w:space="0" w:color="B7C4D3"/>
@@ -17543,7 +17647,7 @@
         </w:tc>
         <w:tc>
           <w:tcPr>
-            <w:tcW w:w="5194" w:type="dxa"/>
+            <w:tcW w:w="5448" w:type="dxa"/>
             <w:tcBorders>
               <w:top w:val="single" w:sz="4" w:space="0" w:color="B7C4D3"/>
               <w:left w:val="single" w:sz="4" w:space="0" w:color="B7C4D3"/>
@@ -17570,7 +17674,7 @@
         </w:tc>
         <w:tc>
           <w:tcPr>
-            <w:tcW w:w="1860" w:type="dxa"/>
+            <w:tcW w:w="1786" w:type="dxa"/>
             <w:tcBorders>
               <w:top w:val="single" w:sz="4" w:space="0" w:color="B7C4D3"/>
               <w:left w:val="single" w:sz="4" w:space="0" w:color="B7C4D3"/>
@@ -17597,7 +17701,7 @@
         </w:tc>
         <w:tc>
           <w:tcPr>
-            <w:tcW w:w="2014" w:type="dxa"/>
+            <w:tcW w:w="1834" w:type="dxa"/>
             <w:tcBorders>
               <w:top w:val="single" w:sz="4" w:space="0" w:color="B7C4D3"/>
               <w:left w:val="single" w:sz="4" w:space="0" w:color="B7C4D3"/>
@@ -17656,7 +17760,7 @@
         </w:tc>
         <w:tc>
           <w:tcPr>
-            <w:tcW w:w="5194" w:type="dxa"/>
+            <w:tcW w:w="5448" w:type="dxa"/>
             <w:tcBorders>
               <w:top w:val="single" w:sz="4" w:space="0" w:color="B7C4D3"/>
               <w:left w:val="single" w:sz="4" w:space="0" w:color="B7C4D3"/>
@@ -17683,7 +17787,7 @@
         </w:tc>
         <w:tc>
           <w:tcPr>
-            <w:tcW w:w="1860" w:type="dxa"/>
+            <w:tcW w:w="1786" w:type="dxa"/>
             <w:tcBorders>
               <w:top w:val="single" w:sz="4" w:space="0" w:color="B7C4D3"/>
               <w:left w:val="single" w:sz="4" w:space="0" w:color="B7C4D3"/>
@@ -17710,7 +17814,7 @@
         </w:tc>
         <w:tc>
           <w:tcPr>
-            <w:tcW w:w="2014" w:type="dxa"/>
+            <w:tcW w:w="1834" w:type="dxa"/>
             <w:tcBorders>
               <w:top w:val="single" w:sz="4" w:space="0" w:color="B7C4D3"/>
               <w:left w:val="single" w:sz="4" w:space="0" w:color="B7C4D3"/>
@@ -17769,7 +17873,7 @@
         </w:tc>
         <w:tc>
           <w:tcPr>
-            <w:tcW w:w="5194" w:type="dxa"/>
+            <w:tcW w:w="5448" w:type="dxa"/>
             <w:tcBorders>
               <w:top w:val="single" w:sz="4" w:space="0" w:color="B7C4D3"/>
               <w:left w:val="single" w:sz="4" w:space="0" w:color="B7C4D3"/>
@@ -17796,7 +17900,7 @@
         </w:tc>
         <w:tc>
           <w:tcPr>
-            <w:tcW w:w="1860" w:type="dxa"/>
+            <w:tcW w:w="1786" w:type="dxa"/>
             <w:tcBorders>
               <w:top w:val="single" w:sz="4" w:space="0" w:color="B7C4D3"/>
               <w:left w:val="single" w:sz="4" w:space="0" w:color="B7C4D3"/>
@@ -17823,7 +17927,7 @@
         </w:tc>
         <w:tc>
           <w:tcPr>
-            <w:tcW w:w="2014" w:type="dxa"/>
+            <w:tcW w:w="1834" w:type="dxa"/>
             <w:tcBorders>
               <w:top w:val="single" w:sz="4" w:space="0" w:color="B7C4D3"/>
               <w:left w:val="single" w:sz="4" w:space="0" w:color="B7C4D3"/>
@@ -17882,7 +17986,7 @@
         </w:tc>
         <w:tc>
           <w:tcPr>
-            <w:tcW w:w="5194" w:type="dxa"/>
+            <w:tcW w:w="5448" w:type="dxa"/>
             <w:tcBorders>
               <w:top w:val="single" w:sz="4" w:space="0" w:color="B7C4D3"/>
               <w:left w:val="single" w:sz="4" w:space="0" w:color="B7C4D3"/>
@@ -17909,7 +18013,7 @@
         </w:tc>
         <w:tc>
           <w:tcPr>
-            <w:tcW w:w="1860" w:type="dxa"/>
+            <w:tcW w:w="1786" w:type="dxa"/>
             <w:tcBorders>
               <w:top w:val="single" w:sz="4" w:space="0" w:color="B7C4D3"/>
               <w:left w:val="single" w:sz="4" w:space="0" w:color="B7C4D3"/>
@@ -17936,7 +18040,7 @@
         </w:tc>
         <w:tc>
           <w:tcPr>
-            <w:tcW w:w="2014" w:type="dxa"/>
+            <w:tcW w:w="1834" w:type="dxa"/>
             <w:tcBorders>
               <w:top w:val="single" w:sz="4" w:space="0" w:color="B7C4D3"/>
               <w:left w:val="single" w:sz="4" w:space="0" w:color="B7C4D3"/>
@@ -17995,7 +18099,7 @@
         </w:tc>
         <w:tc>
           <w:tcPr>
-            <w:tcW w:w="5194" w:type="dxa"/>
+            <w:tcW w:w="5448" w:type="dxa"/>
             <w:tcBorders>
               <w:top w:val="single" w:sz="4" w:space="0" w:color="B7C4D3"/>
               <w:left w:val="single" w:sz="4" w:space="0" w:color="B7C4D3"/>
@@ -18022,7 +18126,7 @@
         </w:tc>
         <w:tc>
           <w:tcPr>
-            <w:tcW w:w="1860" w:type="dxa"/>
+            <w:tcW w:w="1786" w:type="dxa"/>
             <w:tcBorders>
               <w:top w:val="single" w:sz="4" w:space="0" w:color="B7C4D3"/>
               <w:left w:val="single" w:sz="4" w:space="0" w:color="B7C4D3"/>
@@ -18049,7 +18153,7 @@
         </w:tc>
         <w:tc>
           <w:tcPr>
-            <w:tcW w:w="2014" w:type="dxa"/>
+            <w:tcW w:w="1834" w:type="dxa"/>
             <w:tcBorders>
               <w:top w:val="single" w:sz="4" w:space="0" w:color="B7C4D3"/>
               <w:left w:val="single" w:sz="4" w:space="0" w:color="B7C4D3"/>
@@ -18108,7 +18212,7 @@
         </w:tc>
         <w:tc>
           <w:tcPr>
-            <w:tcW w:w="5194" w:type="dxa"/>
+            <w:tcW w:w="5448" w:type="dxa"/>
             <w:tcBorders>
               <w:top w:val="single" w:sz="4" w:space="0" w:color="B7C4D3"/>
               <w:left w:val="single" w:sz="4" w:space="0" w:color="B7C4D3"/>
@@ -18135,7 +18239,7 @@
         </w:tc>
         <w:tc>
           <w:tcPr>
-            <w:tcW w:w="1860" w:type="dxa"/>
+            <w:tcW w:w="1786" w:type="dxa"/>
             <w:tcBorders>
               <w:top w:val="single" w:sz="4" w:space="0" w:color="B7C4D3"/>
               <w:left w:val="single" w:sz="4" w:space="0" w:color="B7C4D3"/>
@@ -18162,7 +18266,7 @@
         </w:tc>
         <w:tc>
           <w:tcPr>
-            <w:tcW w:w="2014" w:type="dxa"/>
+            <w:tcW w:w="1834" w:type="dxa"/>
             <w:tcBorders>
               <w:top w:val="single" w:sz="4" w:space="0" w:color="B7C4D3"/>
               <w:left w:val="single" w:sz="4" w:space="0" w:color="B7C4D3"/>
@@ -18221,7 +18325,7 @@
         </w:tc>
         <w:tc>
           <w:tcPr>
-            <w:tcW w:w="5194" w:type="dxa"/>
+            <w:tcW w:w="5448" w:type="dxa"/>
             <w:tcBorders>
               <w:top w:val="single" w:sz="4" w:space="0" w:color="B7C4D3"/>
               <w:left w:val="single" w:sz="4" w:space="0" w:color="B7C4D3"/>
@@ -18248,7 +18352,7 @@
         </w:tc>
         <w:tc>
           <w:tcPr>
-            <w:tcW w:w="1860" w:type="dxa"/>
+            <w:tcW w:w="1786" w:type="dxa"/>
             <w:tcBorders>
               <w:top w:val="single" w:sz="4" w:space="0" w:color="B7C4D3"/>
               <w:left w:val="single" w:sz="4" w:space="0" w:color="B7C4D3"/>
@@ -18275,7 +18379,7 @@
         </w:tc>
         <w:tc>
           <w:tcPr>
-            <w:tcW w:w="2014" w:type="dxa"/>
+            <w:tcW w:w="1834" w:type="dxa"/>
             <w:tcBorders>
               <w:top w:val="single" w:sz="4" w:space="0" w:color="B7C4D3"/>
               <w:left w:val="single" w:sz="4" w:space="0" w:color="B7C4D3"/>
@@ -18334,7 +18438,7 @@
         </w:tc>
         <w:tc>
           <w:tcPr>
-            <w:tcW w:w="5194" w:type="dxa"/>
+            <w:tcW w:w="5448" w:type="dxa"/>
             <w:tcBorders>
               <w:top w:val="single" w:sz="4" w:space="0" w:color="B7C4D3"/>
               <w:left w:val="single" w:sz="4" w:space="0" w:color="B7C4D3"/>
@@ -18361,7 +18465,7 @@
         </w:tc>
         <w:tc>
           <w:tcPr>
-            <w:tcW w:w="1860" w:type="dxa"/>
+            <w:tcW w:w="1786" w:type="dxa"/>
             <w:tcBorders>
               <w:top w:val="single" w:sz="4" w:space="0" w:color="B7C4D3"/>
               <w:left w:val="single" w:sz="4" w:space="0" w:color="B7C4D3"/>
@@ -18388,7 +18492,7 @@
         </w:tc>
         <w:tc>
           <w:tcPr>
-            <w:tcW w:w="2014" w:type="dxa"/>
+            <w:tcW w:w="1834" w:type="dxa"/>
             <w:tcBorders>
               <w:top w:val="single" w:sz="4" w:space="0" w:color="B7C4D3"/>
               <w:left w:val="single" w:sz="4" w:space="0" w:color="B7C4D3"/>
@@ -18447,7 +18551,7 @@
         </w:tc>
         <w:tc>
           <w:tcPr>
-            <w:tcW w:w="5194" w:type="dxa"/>
+            <w:tcW w:w="5448" w:type="dxa"/>
             <w:tcBorders>
               <w:top w:val="single" w:sz="4" w:space="0" w:color="B7C4D3"/>
               <w:left w:val="single" w:sz="4" w:space="0" w:color="B7C4D3"/>
@@ -18474,7 +18578,7 @@
         </w:tc>
         <w:tc>
           <w:tcPr>
-            <w:tcW w:w="1860" w:type="dxa"/>
+            <w:tcW w:w="1786" w:type="dxa"/>
             <w:tcBorders>
               <w:top w:val="single" w:sz="4" w:space="0" w:color="B7C4D3"/>
               <w:left w:val="single" w:sz="4" w:space="0" w:color="B7C4D3"/>
@@ -18501,7 +18605,7 @@
         </w:tc>
         <w:tc>
           <w:tcPr>
-            <w:tcW w:w="2014" w:type="dxa"/>
+            <w:tcW w:w="1834" w:type="dxa"/>
             <w:tcBorders>
               <w:top w:val="single" w:sz="4" w:space="0" w:color="B7C4D3"/>
               <w:left w:val="single" w:sz="4" w:space="0" w:color="B7C4D3"/>
@@ -18560,7 +18664,7 @@
         </w:tc>
         <w:tc>
           <w:tcPr>
-            <w:tcW w:w="5194" w:type="dxa"/>
+            <w:tcW w:w="5448" w:type="dxa"/>
             <w:tcBorders>
               <w:top w:val="single" w:sz="4" w:space="0" w:color="B7C4D3"/>
               <w:left w:val="single" w:sz="4" w:space="0" w:color="B7C4D3"/>
@@ -18587,7 +18691,7 @@
         </w:tc>
         <w:tc>
           <w:tcPr>
-            <w:tcW w:w="1860" w:type="dxa"/>
+            <w:tcW w:w="1786" w:type="dxa"/>
             <w:tcBorders>
               <w:top w:val="single" w:sz="4" w:space="0" w:color="B7C4D3"/>
               <w:left w:val="single" w:sz="4" w:space="0" w:color="B7C4D3"/>
@@ -18614,7 +18718,7 @@
         </w:tc>
         <w:tc>
           <w:tcPr>
-            <w:tcW w:w="2014" w:type="dxa"/>
+            <w:tcW w:w="1834" w:type="dxa"/>
             <w:tcBorders>
               <w:top w:val="single" w:sz="4" w:space="0" w:color="B7C4D3"/>
               <w:left w:val="single" w:sz="4" w:space="0" w:color="B7C4D3"/>
@@ -18673,7 +18777,7 @@
         </w:tc>
         <w:tc>
           <w:tcPr>
-            <w:tcW w:w="5194" w:type="dxa"/>
+            <w:tcW w:w="5448" w:type="dxa"/>
             <w:tcBorders>
               <w:top w:val="single" w:sz="4" w:space="0" w:color="B7C4D3"/>
               <w:left w:val="single" w:sz="4" w:space="0" w:color="B7C4D3"/>
@@ -18700,7 +18804,7 @@
         </w:tc>
         <w:tc>
           <w:tcPr>
-            <w:tcW w:w="1860" w:type="dxa"/>
+            <w:tcW w:w="1786" w:type="dxa"/>
             <w:tcBorders>
               <w:top w:val="single" w:sz="4" w:space="0" w:color="B7C4D3"/>
               <w:left w:val="single" w:sz="4" w:space="0" w:color="B7C4D3"/>
@@ -18727,7 +18831,7 @@
         </w:tc>
         <w:tc>
           <w:tcPr>
-            <w:tcW w:w="2014" w:type="dxa"/>
+            <w:tcW w:w="1834" w:type="dxa"/>
             <w:tcBorders>
               <w:top w:val="single" w:sz="4" w:space="0" w:color="B7C4D3"/>
               <w:left w:val="single" w:sz="4" w:space="0" w:color="B7C4D3"/>
@@ -18786,7 +18890,7 @@
         </w:tc>
         <w:tc>
           <w:tcPr>
-            <w:tcW w:w="5194" w:type="dxa"/>
+            <w:tcW w:w="5448" w:type="dxa"/>
             <w:tcBorders>
               <w:top w:val="single" w:sz="4" w:space="0" w:color="B7C4D3"/>
               <w:left w:val="single" w:sz="4" w:space="0" w:color="B7C4D3"/>
@@ -18813,7 +18917,7 @@
         </w:tc>
         <w:tc>
           <w:tcPr>
-            <w:tcW w:w="1860" w:type="dxa"/>
+            <w:tcW w:w="1786" w:type="dxa"/>
             <w:tcBorders>
               <w:top w:val="single" w:sz="4" w:space="0" w:color="B7C4D3"/>
               <w:left w:val="single" w:sz="4" w:space="0" w:color="B7C4D3"/>
@@ -18840,7 +18944,7 @@
         </w:tc>
         <w:tc>
           <w:tcPr>
-            <w:tcW w:w="2014" w:type="dxa"/>
+            <w:tcW w:w="1834" w:type="dxa"/>
             <w:tcBorders>
               <w:top w:val="single" w:sz="4" w:space="0" w:color="B7C4D3"/>
               <w:left w:val="single" w:sz="4" w:space="0" w:color="B7C4D3"/>
@@ -18864,6 +18968,121 @@
                 <w:szCs w:val="17"/>
               </w:rPr>
               <w:t>Builderr audit of version 1</w:t>
+            </w:r>
+          </w:p>
+        </w:tc>
+      </w:tr>
+      <w:tr>
+        <w:trPr>
+          <w:cantSplit/>
+        </w:trPr>
+        <w:tc>
+          <w:tcPr>
+            <w:tcW w:w="570" w:type="dxa"/>
+            <w:tcBorders>
+              <w:top w:val="single" w:sz="4" w:space="0" w:color="B7C4D3"/>
+              <w:left w:val="single" w:sz="4" w:space="0" w:color="B7C4D3"/>
+              <w:bottom w:val="single" w:sz="4" w:space="0" w:color="B7C4D3"/>
+              <w:right w:val="single" w:sz="4" w:space="0" w:color="B7C4D3"/>
+            </w:tcBorders>
+            <w:shd w:val="clear" w:color="auto" w:fill="F5F8FB"/>
+            <w:tcMar>
+              <w:top w:w="50" w:type="dxa"/>
+              <w:left w:w="90" w:type="dxa"/>
+              <w:bottom w:w="50" w:type="dxa"/>
+              <w:right w:w="90" w:type="dxa"/>
+            </w:tcMar>
+          </w:tcPr>
+          <w:p>
+            <w:r>
+              <w:rPr>
+                <w:sz w:val="17"/>
+                <w:szCs w:val="17"/>
+              </w:rPr>
+              <w:t>19</w:t>
+            </w:r>
+          </w:p>
+        </w:tc>
+        <w:tc>
+          <w:tcPr>
+            <w:tcW w:w="5448" w:type="dxa"/>
+            <w:tcBorders>
+              <w:top w:val="single" w:sz="4" w:space="0" w:color="B7C4D3"/>
+              <w:left w:val="single" w:sz="4" w:space="0" w:color="B7C4D3"/>
+              <w:bottom w:val="single" w:sz="4" w:space="0" w:color="B7C4D3"/>
+              <w:right w:val="single" w:sz="4" w:space="0" w:color="B7C4D3"/>
+            </w:tcBorders>
+            <w:shd w:val="clear" w:color="auto" w:fill="F5F8FB"/>
+            <w:tcMar>
+              <w:top w:w="50" w:type="dxa"/>
+              <w:left w:w="90" w:type="dxa"/>
+              <w:bottom w:w="50" w:type="dxa"/>
+              <w:right w:w="90" w:type="dxa"/>
+            </w:tcMar>
+          </w:tcPr>
+          <w:p>
+            <w:r>
+              <w:rPr>
+                <w:sz w:val="17"/>
+                <w:szCs w:val="17"/>
+              </w:rPr>
+              <w:t>social handles shared by sister/parent/subsidiary/group accounts; a date shared by several articles pinned to the first; similar employer names accepted for website jobs</w:t>
+            </w:r>
+          </w:p>
+        </w:tc>
+        <w:tc>
+          <w:tcPr>
+            <w:tcW w:w="1786" w:type="dxa"/>
+            <w:tcBorders>
+              <w:top w:val="single" w:sz="4" w:space="0" w:color="B7C4D3"/>
+              <w:left w:val="single" w:sz="4" w:space="0" w:color="B7C4D3"/>
+              <w:bottom w:val="single" w:sz="4" w:space="0" w:color="B7C4D3"/>
+              <w:right w:val="single" w:sz="4" w:space="0" w:color="B7C4D3"/>
+            </w:tcBorders>
+            <w:shd w:val="clear" w:color="auto" w:fill="F5F8FB"/>
+            <w:tcMar>
+              <w:top w:w="50" w:type="dxa"/>
+              <w:left w:w="90" w:type="dxa"/>
+              <w:bottom w:w="50" w:type="dxa"/>
+              <w:right w:w="90" w:type="dxa"/>
+            </w:tcMar>
+          </w:tcPr>
+          <w:p>
+            <w:r>
+              <w:rPr>
+                <w:sz w:val="17"/>
+                <w:szCs w:val="17"/>
+              </w:rPr>
+              <w:t>wrong company (facts)</w:t>
+            </w:r>
+          </w:p>
+        </w:tc>
+        <w:tc>
+          <w:tcPr>
+            <w:tcW w:w="1834" w:type="dxa"/>
+            <w:tcBorders>
+              <w:top w:val="single" w:sz="4" w:space="0" w:color="B7C4D3"/>
+              <w:left w:val="single" w:sz="4" w:space="0" w:color="B7C4D3"/>
+              <w:bottom w:val="single" w:sz="4" w:space="0" w:color="B7C4D3"/>
+              <w:right w:val="single" w:sz="4" w:space="0" w:color="B7C4D3"/>
+            </w:tcBorders>
+            <w:shd w:val="clear" w:color="auto" w:fill="F5F8FB"/>
+            <w:tcMar>
+              <w:top w:w="50" w:type="dxa"/>
+              <w:left w:w="90" w:type="dxa"/>
+              <w:bottom w:w="50" w:type="dxa"/>
+              <w:right w:w="90" w:type="dxa"/>
+            </w:tcMar>
+          </w:tcPr>
+          <w:p>
+            <w:r>
+              <w:rPr>
+                <w:b/>
+                <w:bCs/>
+                <w:sz w:val="17"/>
+                <w:szCs w:val="17"/>
+              </w:rPr>
+              <w:t>second review of version 2.0</w:t>
             </w:r>
           </w:p>
         </w:tc>
@@ -18886,7 +19105,7 @@
       <w:pPr>
         <w:pStyle w:val="Heading1"/>
       </w:pPr>
-      <w:bookmarkStart w:id="14" w:name="_Toc243649764"/>
+      <w:bookmarkStart w:id="14" w:name="_Toc243655316"/>
       <w:r>
         <w:t>15. Limitations and future work</w:t>
       </w:r>
@@ -19008,7 +19227,7 @@
       <w:pPr>
         <w:pStyle w:val="Heading1"/>
       </w:pPr>
-      <w:bookmarkStart w:id="15" w:name="_Toc243649765"/>
+      <w:bookmarkStart w:id="15" w:name="_Toc243655317"/>
       <w:r>
         <w:t>16. Reproduction and submission</w:t>
       </w:r>
@@ -19072,7 +19291,7 @@
         <w:spacing w:after="120" w:line="276" w:lineRule="auto"/>
       </w:pPr>
       <w:r>
-        <w:t>Expected: 17/17 audit cases pass, and 0 audit problems in the version 2 dataset (the version 1 dataset shows 57).</w:t>
+        <w:t>Expected: 27/27 audit cases pass, and 0 audit problems in the current dataset (version 1's dataset shows 89 and version 2.0's 38 under the current rules).</w:t>
       </w:r>
     </w:p>
     <w:p>
@@ -19266,7 +19485,7 @@
           <w:sz w:val="18"/>
           <w:szCs w:val="18"/>
         </w:rPr>
-        <w:t>a96e0f1</w:t>
+        <w:t>1f2ad26</w:t>
       </w:r>
       <w:r>
         <w:t>; later commits change documentation and data only.</w:t>
@@ -19276,7 +19495,7 @@
       <w:pPr>
         <w:pStyle w:val="Heading1"/>
       </w:pPr>
-      <w:bookmarkStart w:id="16" w:name="_Toc243649766"/>
+      <w:bookmarkStart w:id="16" w:name="_Toc243655318"/>
       <w:r>
         <w:t>Appendix A: Offline test inventory</w:t>
       </w:r>
@@ -19936,6 +20155,70 @@
                 <w:szCs w:val="15"/>
               </w:rPr>
               <w:t>test_job_posting_must_name_this_company_and_careers_pages_are_not_jobs</w:t>
+            </w:r>
+            <w:r>
+              <w:rPr>
+                <w:sz w:val="17"/>
+                <w:szCs w:val="17"/>
+              </w:rPr>
+              <w:t xml:space="preserve">, </w:t>
+            </w:r>
+            <w:r>
+              <w:rPr>
+                <w:rFonts w:ascii="Consolas" w:eastAsia="Consolas" w:hAnsi="Consolas" w:cs="Consolas"/>
+                <w:color w:val="333333"/>
+                <w:sz w:val="15"/>
+                <w:szCs w:val="15"/>
+              </w:rPr>
+              <w:t>test_website_job_needs_exact_employer_not_a_similar_name</w:t>
+            </w:r>
+            <w:r>
+              <w:rPr>
+                <w:sz w:val="17"/>
+                <w:szCs w:val="17"/>
+              </w:rPr>
+              <w:t xml:space="preserve">, </w:t>
+            </w:r>
+            <w:r>
+              <w:rPr>
+                <w:rFonts w:ascii="Consolas" w:eastAsia="Consolas" w:hAnsi="Consolas" w:cs="Consolas"/>
+                <w:color w:val="333333"/>
+                <w:sz w:val="15"/>
+                <w:szCs w:val="15"/>
+              </w:rPr>
+              <w:t>test_nav_job_with_similar_employer_name_is_not_published</w:t>
+            </w:r>
+            <w:r>
+              <w:rPr>
+                <w:sz w:val="17"/>
+                <w:szCs w:val="17"/>
+              </w:rPr>
+              <w:t xml:space="preserve">, </w:t>
+            </w:r>
+            <w:r>
+              <w:rPr>
+                <w:rFonts w:ascii="Consolas" w:eastAsia="Consolas" w:hAnsi="Consolas" w:cs="Consolas"/>
+                <w:color w:val="333333"/>
+                <w:sz w:val="15"/>
+                <w:szCs w:val="15"/>
+              </w:rPr>
+              <w:t>test_news_date_must_belong_to_one_article</w:t>
+            </w:r>
+            <w:r>
+              <w:rPr>
+                <w:sz w:val="17"/>
+                <w:szCs w:val="17"/>
+              </w:rPr>
+              <w:t xml:space="preserve">, </w:t>
+            </w:r>
+            <w:r>
+              <w:rPr>
+                <w:rFonts w:ascii="Consolas" w:eastAsia="Consolas" w:hAnsi="Consolas" w:cs="Consolas"/>
+                <w:color w:val="333333"/>
+                <w:sz w:val="15"/>
+                <w:szCs w:val="15"/>
+              </w:rPr>
+              <w:t>test_explicit_news_types_accept_unusual_urls_but_generic_articles_do_not</w:t>
             </w:r>
           </w:p>
         </w:tc>
@@ -20525,10 +20808,10 @@
 <file path=word/numbering.xml><?xml version="1.0" encoding="utf-8"?>
 <w:numbering xmlns:wpc="http://schemas.microsoft.com/office/word/2010/wordprocessingCanvas" xmlns:cx="http://schemas.microsoft.com/office/drawing/2014/chartex" xmlns:cx1="http://schemas.microsoft.com/office/drawing/2015/9/8/chartex" xmlns:cx2="http://schemas.microsoft.com/office/drawing/2015/10/21/chartex" xmlns:cx3="http://schemas.microsoft.com/office/drawing/2016/5/9/chartex" xmlns:cx4="http://schemas.microsoft.com/office/drawing/2016/5/10/chartex" xmlns:cx5="http://schemas.microsoft.com/office/drawing/2016/5/11/chartex" xmlns:cx6="http://schemas.microsoft.com/office/drawing/2016/5/12/chartex" xmlns:cx7="http://schemas.microsoft.com/office/drawing/2016/5/13/chartex" xmlns:cx8="http://schemas.microsoft.com/office/drawing/2016/5/14/chartex" xmlns:mc="http://schemas.openxmlformats.org/markup-compatibility/2006" xmlns:aink="http://schemas.microsoft.com/office/drawing/2016/ink" xmlns:am3d="http://schemas.microsoft.com/office/drawing/2017/model3d" xmlns:o="urn:schemas-microsoft-com:office:office" xmlns:oel="http://schemas.microsoft.com/office/2019/extlst" xmlns:r="http://schemas.openxmlformats.org/officeDocument/2006/relationships" xmlns:m="http://schemas.openxmlformats.org/officeDocument/2006/math" xmlns:v="urn:schemas-microsoft-com:vml" xmlns:wp14="http://schemas.microsoft.com/office/word/2010/wordprocessingDrawing" xmlns:wp="http://schemas.openxmlformats.org/drawingml/2006/wordprocessingDrawing" xmlns:w10="urn:schemas-microsoft-com:office:word" xmlns:w="http://schemas.openxmlformats.org/wordprocessingml/2006/main" xmlns:w14="http://schemas.microsoft.com/office/word/2010/wordml" xmlns:w15="http://schemas.microsoft.com/office/word/2012/wordml" xmlns:w16cex="http://schemas.microsoft.com/office/word/2018/wordml/cex" xmlns:w16cid="http://schemas.microsoft.com/office/word/2016/wordml/cid" xmlns:w16="http://schemas.microsoft.com/office/word/2018/wordml" xmlns:w16du="http://schemas.microsoft.com/office/word/2023/wordml/word16du" xmlns:w16sdtdh="http://schemas.microsoft.com/office/word/2020/wordml/sdtdatahash" xmlns:w16sdtfl="http://schemas.microsoft.com/office/word/2024/wordml/sdtformatlock" xmlns:w16se="http://schemas.microsoft.com/office/word/2015/wordml/symex" xmlns:wpg="http://schemas.microsoft.com/office/word/2010/wordprocessingGroup" xmlns:wpi="http://schemas.microsoft.com/office/word/2010/wordprocessingInk" xmlns:wne="http://schemas.microsoft.com/office/word/2006/wordml" xmlns:wps="http://schemas.microsoft.com/office/word/2010/wordprocessingShape" mc:Ignorable="w14 w15 w16se w16cid w16 w16cex w16sdtdh w16sdtfl w16du wp14">
   <w:abstractNum w:abstractNumId="0" w15:restartNumberingAfterBreak="0">
-    <w:nsid w:val="258A4FE8"/>
+    <w:nsid w:val="1A945492"/>
     <w:multiLevelType w:val="hybridMultilevel"/>
-    <w:tmpl w:val="82F468D4"/>
-    <w:lvl w:ilvl="0" w:tplc="E83CD946">
+    <w:tmpl w:val="46DCCEB4"/>
+    <w:lvl w:ilvl="0" w:tplc="838AD134">
       <w:start w:val="1"/>
       <w:numFmt w:val="bullet"/>
       <w:lvlText w:val="•"/>
@@ -20537,7 +20820,7 @@
         <w:ind w:left="540" w:hanging="270"/>
       </w:pPr>
     </w:lvl>
-    <w:lvl w:ilvl="1" w:tplc="ECE846F0">
+    <w:lvl w:ilvl="1" w:tplc="5ECC2F40">
       <w:start w:val="1"/>
       <w:numFmt w:val="bullet"/>
       <w:lvlText w:val="–"/>
@@ -20546,47 +20829,101 @@
         <w:ind w:left="1080" w:hanging="270"/>
       </w:pPr>
     </w:lvl>
-    <w:lvl w:ilvl="2" w:tplc="FCFA9E82">
+    <w:lvl w:ilvl="2" w:tplc="F3C8F38A">
       <w:numFmt w:val="decimal"/>
       <w:lvlText w:val=""/>
       <w:lvlJc w:val="left"/>
     </w:lvl>
-    <w:lvl w:ilvl="3" w:tplc="62ACDDA6">
+    <w:lvl w:ilvl="3" w:tplc="B02C1BEE">
       <w:numFmt w:val="decimal"/>
       <w:lvlText w:val=""/>
       <w:lvlJc w:val="left"/>
     </w:lvl>
-    <w:lvl w:ilvl="4" w:tplc="D3A8547E">
+    <w:lvl w:ilvl="4" w:tplc="F9A4C80A">
       <w:numFmt w:val="decimal"/>
       <w:lvlText w:val=""/>
       <w:lvlJc w:val="left"/>
     </w:lvl>
-    <w:lvl w:ilvl="5" w:tplc="DF624E06">
+    <w:lvl w:ilvl="5" w:tplc="E4C4D2DA">
       <w:numFmt w:val="decimal"/>
       <w:lvlText w:val=""/>
       <w:lvlJc w:val="left"/>
     </w:lvl>
-    <w:lvl w:ilvl="6" w:tplc="B6046C9A">
+    <w:lvl w:ilvl="6" w:tplc="6F384E58">
       <w:numFmt w:val="decimal"/>
       <w:lvlText w:val=""/>
       <w:lvlJc w:val="left"/>
     </w:lvl>
-    <w:lvl w:ilvl="7" w:tplc="C93459B4">
+    <w:lvl w:ilvl="7" w:tplc="12BE4DB2">
       <w:numFmt w:val="decimal"/>
       <w:lvlText w:val=""/>
       <w:lvlJc w:val="left"/>
     </w:lvl>
-    <w:lvl w:ilvl="8" w:tplc="EA0EAA6E">
+    <w:lvl w:ilvl="8" w:tplc="38709890">
       <w:numFmt w:val="decimal"/>
       <w:lvlText w:val=""/>
       <w:lvlJc w:val="left"/>
     </w:lvl>
   </w:abstractNum>
   <w:abstractNum w:abstractNumId="1" w15:restartNumberingAfterBreak="0">
-    <w:nsid w:val="37EC2564"/>
+    <w:nsid w:val="310C4823"/>
     <w:multiLevelType w:val="hybridMultilevel"/>
-    <w:tmpl w:val="B9D48588"/>
-    <w:lvl w:ilvl="0" w:tplc="1EAC0612" w:tentative="1">
+    <w:tmpl w:val="5FEEC40E"/>
+    <w:lvl w:ilvl="0" w:tplc="072ED5CA">
+      <w:start w:val="1"/>
+      <w:numFmt w:val="decimal"/>
+      <w:lvlText w:val="%1."/>
+      <w:lvlJc w:val="left"/>
+      <w:pPr>
+        <w:ind w:left="540" w:hanging="360"/>
+      </w:pPr>
+    </w:lvl>
+    <w:lvl w:ilvl="1" w:tplc="39E69660">
+      <w:numFmt w:val="decimal"/>
+      <w:lvlText w:val=""/>
+      <w:lvlJc w:val="left"/>
+    </w:lvl>
+    <w:lvl w:ilvl="2" w:tplc="581A64C6">
+      <w:numFmt w:val="decimal"/>
+      <w:lvlText w:val=""/>
+      <w:lvlJc w:val="left"/>
+    </w:lvl>
+    <w:lvl w:ilvl="3" w:tplc="5D6EDF08">
+      <w:numFmt w:val="decimal"/>
+      <w:lvlText w:val=""/>
+      <w:lvlJc w:val="left"/>
+    </w:lvl>
+    <w:lvl w:ilvl="4" w:tplc="E27EAD7C">
+      <w:numFmt w:val="decimal"/>
+      <w:lvlText w:val=""/>
+      <w:lvlJc w:val="left"/>
+    </w:lvl>
+    <w:lvl w:ilvl="5" w:tplc="1834D05A">
+      <w:numFmt w:val="decimal"/>
+      <w:lvlText w:val=""/>
+      <w:lvlJc w:val="left"/>
+    </w:lvl>
+    <w:lvl w:ilvl="6" w:tplc="89E6DF00">
+      <w:numFmt w:val="decimal"/>
+      <w:lvlText w:val=""/>
+      <w:lvlJc w:val="left"/>
+    </w:lvl>
+    <w:lvl w:ilvl="7" w:tplc="90B88566">
+      <w:numFmt w:val="decimal"/>
+      <w:lvlText w:val=""/>
+      <w:lvlJc w:val="left"/>
+    </w:lvl>
+    <w:lvl w:ilvl="8" w:tplc="274C08A6">
+      <w:numFmt w:val="decimal"/>
+      <w:lvlText w:val=""/>
+      <w:lvlJc w:val="left"/>
+    </w:lvl>
+  </w:abstractNum>
+  <w:abstractNum w:abstractNumId="2" w15:restartNumberingAfterBreak="0">
+    <w:nsid w:val="3D8429E1"/>
+    <w:multiLevelType w:val="hybridMultilevel"/>
+    <w:tmpl w:val="41EC58AE"/>
+    <w:lvl w:ilvl="0" w:tplc="86B8AE96" w:tentative="1">
       <w:start w:val="1"/>
       <w:numFmt w:val="bullet"/>
       <w:lvlText w:val="●"/>
@@ -20595,7 +20932,7 @@
         <w:ind w:left="720" w:hanging="360"/>
       </w:pPr>
     </w:lvl>
-    <w:lvl w:ilvl="1" w:tplc="6284C308" w:tentative="1">
+    <w:lvl w:ilvl="1" w:tplc="5930E29C" w:tentative="1">
       <w:start w:val="1"/>
       <w:numFmt w:val="bullet"/>
       <w:lvlText w:val="○"/>
@@ -20604,7 +20941,7 @@
         <w:ind w:left="1440" w:hanging="360"/>
       </w:pPr>
     </w:lvl>
-    <w:lvl w:ilvl="2" w:tplc="8EFCE418" w:tentative="1">
+    <w:lvl w:ilvl="2" w:tplc="2278DAB4" w:tentative="1">
       <w:start w:val="1"/>
       <w:numFmt w:val="bullet"/>
       <w:lvlText w:val="■"/>
@@ -20613,7 +20950,7 @@
         <w:ind w:left="2160" w:hanging="360"/>
       </w:pPr>
     </w:lvl>
-    <w:lvl w:ilvl="3" w:tplc="02D4FBAA" w:tentative="1">
+    <w:lvl w:ilvl="3" w:tplc="EBA0DD12" w:tentative="1">
       <w:start w:val="1"/>
       <w:numFmt w:val="bullet"/>
       <w:lvlText w:val="●"/>
@@ -20622,7 +20959,7 @@
         <w:ind w:left="2880" w:hanging="360"/>
       </w:pPr>
     </w:lvl>
-    <w:lvl w:ilvl="4" w:tplc="5D02750C" w:tentative="1">
+    <w:lvl w:ilvl="4" w:tplc="B14C2D9A" w:tentative="1">
       <w:start w:val="1"/>
       <w:numFmt w:val="bullet"/>
       <w:lvlText w:val="○"/>
@@ -20631,7 +20968,7 @@
         <w:ind w:left="3600" w:hanging="360"/>
       </w:pPr>
     </w:lvl>
-    <w:lvl w:ilvl="5" w:tplc="E03AA14A" w:tentative="1">
+    <w:lvl w:ilvl="5" w:tplc="DCF42FB0" w:tentative="1">
       <w:start w:val="1"/>
       <w:numFmt w:val="bullet"/>
       <w:lvlText w:val="■"/>
@@ -20640,7 +20977,7 @@
         <w:ind w:left="4320" w:hanging="360"/>
       </w:pPr>
     </w:lvl>
-    <w:lvl w:ilvl="6" w:tplc="02EC858E" w:tentative="1">
+    <w:lvl w:ilvl="6" w:tplc="C3E0E4C4" w:tentative="1">
       <w:start w:val="1"/>
       <w:numFmt w:val="bullet"/>
       <w:lvlText w:val="●"/>
@@ -20649,7 +20986,7 @@
         <w:ind w:left="5040" w:hanging="360"/>
       </w:pPr>
     </w:lvl>
-    <w:lvl w:ilvl="7" w:tplc="F94C937A" w:tentative="1">
+    <w:lvl w:ilvl="7" w:tplc="DB6E9890" w:tentative="1">
       <w:start w:val="1"/>
       <w:numFmt w:val="bullet"/>
       <w:lvlText w:val="●"/>
@@ -20658,7 +20995,7 @@
         <w:ind w:left="5760" w:hanging="360"/>
       </w:pPr>
     </w:lvl>
-    <w:lvl w:ilvl="8" w:tplc="393C1BC8" w:tentative="1">
+    <w:lvl w:ilvl="8" w:tplc="668A28F2" w:tentative="1">
       <w:start w:val="1"/>
       <w:numFmt w:val="bullet"/>
       <w:lvlText w:val="●"/>
@@ -20668,86 +21005,32 @@
       </w:pPr>
     </w:lvl>
   </w:abstractNum>
-  <w:abstractNum w:abstractNumId="2" w15:restartNumberingAfterBreak="0">
-    <w:nsid w:val="5B4540EB"/>
-    <w:multiLevelType w:val="hybridMultilevel"/>
-    <w:tmpl w:val="88546038"/>
-    <w:lvl w:ilvl="0" w:tplc="B866A8CC">
-      <w:start w:val="1"/>
-      <w:numFmt w:val="decimal"/>
-      <w:lvlText w:val="%1."/>
-      <w:lvlJc w:val="left"/>
-      <w:pPr>
-        <w:ind w:left="540" w:hanging="360"/>
-      </w:pPr>
-    </w:lvl>
-    <w:lvl w:ilvl="1" w:tplc="3A56742E">
-      <w:numFmt w:val="decimal"/>
-      <w:lvlText w:val=""/>
-      <w:lvlJc w:val="left"/>
-    </w:lvl>
-    <w:lvl w:ilvl="2" w:tplc="694E7148">
-      <w:numFmt w:val="decimal"/>
-      <w:lvlText w:val=""/>
-      <w:lvlJc w:val="left"/>
-    </w:lvl>
-    <w:lvl w:ilvl="3" w:tplc="510480BA">
-      <w:numFmt w:val="decimal"/>
-      <w:lvlText w:val=""/>
-      <w:lvlJc w:val="left"/>
-    </w:lvl>
-    <w:lvl w:ilvl="4" w:tplc="BDB43C62">
-      <w:numFmt w:val="decimal"/>
-      <w:lvlText w:val=""/>
-      <w:lvlJc w:val="left"/>
-    </w:lvl>
-    <w:lvl w:ilvl="5" w:tplc="074C4A02">
-      <w:numFmt w:val="decimal"/>
-      <w:lvlText w:val=""/>
-      <w:lvlJc w:val="left"/>
-    </w:lvl>
-    <w:lvl w:ilvl="6" w:tplc="C62E8718">
-      <w:numFmt w:val="decimal"/>
-      <w:lvlText w:val=""/>
-      <w:lvlJc w:val="left"/>
-    </w:lvl>
-    <w:lvl w:ilvl="7" w:tplc="44CA8358">
-      <w:numFmt w:val="decimal"/>
-      <w:lvlText w:val=""/>
-      <w:lvlJc w:val="left"/>
-    </w:lvl>
-    <w:lvl w:ilvl="8" w:tplc="685AC6CC">
-      <w:numFmt w:val="decimal"/>
-      <w:lvlText w:val=""/>
-      <w:lvlJc w:val="left"/>
-    </w:lvl>
-  </w:abstractNum>
-  <w:num w:numId="1" w16cid:durableId="943733111">
+  <w:num w:numId="1" w16cid:durableId="624508839">
+    <w:abstractNumId w:val="2"/>
+    <w:lvlOverride w:ilvl="0">
+      <w:startOverride w:val="1"/>
+    </w:lvlOverride>
+  </w:num>
+  <w:num w:numId="2" w16cid:durableId="1936597033">
+    <w:abstractNumId w:val="0"/>
+    <w:lvlOverride w:ilvl="0">
+      <w:startOverride w:val="1"/>
+    </w:lvlOverride>
+  </w:num>
+  <w:num w:numId="3" w16cid:durableId="1546135084">
     <w:abstractNumId w:val="1"/>
     <w:lvlOverride w:ilvl="0">
       <w:startOverride w:val="1"/>
     </w:lvlOverride>
   </w:num>
-  <w:num w:numId="2" w16cid:durableId="2005359414">
-    <w:abstractNumId w:val="0"/>
+  <w:num w:numId="4" w16cid:durableId="728070094">
+    <w:abstractNumId w:val="1"/>
     <w:lvlOverride w:ilvl="0">
       <w:startOverride w:val="1"/>
     </w:lvlOverride>
   </w:num>
-  <w:num w:numId="3" w16cid:durableId="864055928">
-    <w:abstractNumId w:val="2"/>
-    <w:lvlOverride w:ilvl="0">
-      <w:startOverride w:val="1"/>
-    </w:lvlOverride>
-  </w:num>
-  <w:num w:numId="4" w16cid:durableId="1290210884">
-    <w:abstractNumId w:val="2"/>
-    <w:lvlOverride w:ilvl="0">
-      <w:startOverride w:val="1"/>
-    </w:lvlOverride>
-  </w:num>
-  <w:num w:numId="5" w16cid:durableId="1787311935">
-    <w:abstractNumId w:val="2"/>
+  <w:num w:numId="5" w16cid:durableId="429162395">
+    <w:abstractNumId w:val="1"/>
     <w:lvlOverride w:ilvl="0">
       <w:startOverride w:val="1"/>
     </w:lvlOverride>
@@ -21376,7 +21659,7 @@
     <w:autoRedefine/>
     <w:uiPriority w:val="39"/>
     <w:unhideWhenUsed/>
-    <w:rsid w:val="00A25812"/>
+    <w:rsid w:val="00163639"/>
     <w:pPr>
       <w:spacing w:after="100"/>
     </w:pPr>

</xml_diff>

<commit_message>
Version 2.2 verification at 70cfcf0: CHANGES_V2.md Part 3 (parent root domains, attributable social accounts), regenerated test report, all docs, dataset and smoke artifacts
</commit_message>
<xml_diff>
--- a/docs/IMPLEMENTATION_REPORT.docx
+++ b/docs/IMPLEMENTATION_REPORT.docx
@@ -174,14 +174,14 @@
                 <w:sz w:val="15"/>
                 <w:szCs w:val="15"/>
               </w:rPr>
-              <w:t>1f2ad26cfdbbd270c252cc4fc15f01c3154cb0eb</w:t>
-            </w:r>
-            <w:r>
-              <w:rPr>
-                <w:sz w:val="17"/>
-                <w:szCs w:val="17"/>
-              </w:rPr>
-              <w:t xml:space="preserve"> (version 2.1, after Builderr's audit of version 1 and a second review; all results in this report were produced at this commit)</w:t>
+              <w:t>70cfcf091640d4742684a036f988d08624d1d69d</w:t>
+            </w:r>
+            <w:r>
+              <w:rPr>
+                <w:sz w:val="17"/>
+                <w:szCs w:val="17"/>
+              </w:rPr>
+              <w:t xml:space="preserve"> (version 2.2, after Builderr's audit of version 1, a second review and the residual-risk review; all results in this report were produced at this commit)</w:t>
             </w:r>
           </w:p>
         </w:tc>
@@ -303,7 +303,7 @@
                 <w:sz w:val="17"/>
                 <w:szCs w:val="17"/>
               </w:rPr>
-              <w:t>about 2,100 lines of agent code, 500 lines of tooling and a 750-line offline test suite in the repository; an 82-line run harness was used for validation</w:t>
+              <w:t>about 2,100 lines of agent code, 500 lines of tooling and an 840-line offline test suite in the repository; an 82-line run harness was used for validation</w:t>
             </w:r>
           </w:p>
         </w:tc>
@@ -398,7 +398,7 @@
     <w:sdt>
       <w:sdtPr>
         <w:alias w:val="Contents"/>
-        <w:id w:val="-1486469943"/>
+        <w:id w:val="-665630791"/>
       </w:sdtPr>
       <w:sdtEndPr/>
       <w:sdtContent>
@@ -421,7 +421,7 @@
           <w:r>
             <w:fldChar w:fldCharType="separate"/>
           </w:r>
-          <w:hyperlink w:anchor="_Toc243655302" w:history="1">
+          <w:hyperlink w:anchor="_Toc243660982" w:history="1">
             <w:r>
               <w:rPr>
                 <w:rStyle w:val="Hyperlink"/>
@@ -445,7 +445,7 @@
               <w:rPr>
                 <w:noProof/>
               </w:rPr>
-              <w:instrText xml:space="preserve"> PAGEREF _Toc243655302 \h </w:instrText>
+              <w:instrText xml:space="preserve"> PAGEREF _Toc243660982 \h </w:instrText>
             </w:r>
             <w:r>
               <w:rPr>
@@ -482,7 +482,7 @@
               <w:noProof/>
             </w:rPr>
           </w:pPr>
-          <w:hyperlink w:anchor="_Toc243655303" w:history="1">
+          <w:hyperlink w:anchor="_Toc243660983" w:history="1">
             <w:r>
               <w:rPr>
                 <w:rStyle w:val="Hyperlink"/>
@@ -506,7 +506,7 @@
               <w:rPr>
                 <w:noProof/>
               </w:rPr>
-              <w:instrText xml:space="preserve"> PAGEREF _Toc243655303 \h </w:instrText>
+              <w:instrText xml:space="preserve"> PAGEREF _Toc243660983 \h </w:instrText>
             </w:r>
             <w:r>
               <w:rPr>
@@ -543,7 +543,7 @@
               <w:noProof/>
             </w:rPr>
           </w:pPr>
-          <w:hyperlink w:anchor="_Toc243655304" w:history="1">
+          <w:hyperlink w:anchor="_Toc243660984" w:history="1">
             <w:r>
               <w:rPr>
                 <w:rStyle w:val="Hyperlink"/>
@@ -567,7 +567,7 @@
               <w:rPr>
                 <w:noProof/>
               </w:rPr>
-              <w:instrText xml:space="preserve"> PAGEREF _Toc243655304 \h </w:instrText>
+              <w:instrText xml:space="preserve"> PAGEREF _Toc243660984 \h </w:instrText>
             </w:r>
             <w:r>
               <w:rPr>
@@ -604,7 +604,7 @@
               <w:noProof/>
             </w:rPr>
           </w:pPr>
-          <w:hyperlink w:anchor="_Toc243655305" w:history="1">
+          <w:hyperlink w:anchor="_Toc243660985" w:history="1">
             <w:r>
               <w:rPr>
                 <w:rStyle w:val="Hyperlink"/>
@@ -628,7 +628,7 @@
               <w:rPr>
                 <w:noProof/>
               </w:rPr>
-              <w:instrText xml:space="preserve"> PAGEREF _Toc243655305 \h </w:instrText>
+              <w:instrText xml:space="preserve"> PAGEREF _Toc243660985 \h </w:instrText>
             </w:r>
             <w:r>
               <w:rPr>
@@ -665,7 +665,7 @@
               <w:noProof/>
             </w:rPr>
           </w:pPr>
-          <w:hyperlink w:anchor="_Toc243655306" w:history="1">
+          <w:hyperlink w:anchor="_Toc243660986" w:history="1">
             <w:r>
               <w:rPr>
                 <w:rStyle w:val="Hyperlink"/>
@@ -689,7 +689,7 @@
               <w:rPr>
                 <w:noProof/>
               </w:rPr>
-              <w:instrText xml:space="preserve"> PAGEREF _Toc243655306 \h </w:instrText>
+              <w:instrText xml:space="preserve"> PAGEREF _Toc243660986 \h </w:instrText>
             </w:r>
             <w:r>
               <w:rPr>
@@ -726,7 +726,7 @@
               <w:noProof/>
             </w:rPr>
           </w:pPr>
-          <w:hyperlink w:anchor="_Toc243655307" w:history="1">
+          <w:hyperlink w:anchor="_Toc243660987" w:history="1">
             <w:r>
               <w:rPr>
                 <w:rStyle w:val="Hyperlink"/>
@@ -750,7 +750,7 @@
               <w:rPr>
                 <w:noProof/>
               </w:rPr>
-              <w:instrText xml:space="preserve"> PAGEREF _Toc243655307 \h </w:instrText>
+              <w:instrText xml:space="preserve"> PAGEREF _Toc243660987 \h </w:instrText>
             </w:r>
             <w:r>
               <w:rPr>
@@ -787,7 +787,7 @@
               <w:noProof/>
             </w:rPr>
           </w:pPr>
-          <w:hyperlink w:anchor="_Toc243655308" w:history="1">
+          <w:hyperlink w:anchor="_Toc243660988" w:history="1">
             <w:r>
               <w:rPr>
                 <w:rStyle w:val="Hyperlink"/>
@@ -811,7 +811,7 @@
               <w:rPr>
                 <w:noProof/>
               </w:rPr>
-              <w:instrText xml:space="preserve"> PAGEREF _Toc243655308 \h </w:instrText>
+              <w:instrText xml:space="preserve"> PAGEREF _Toc243660988 \h </w:instrText>
             </w:r>
             <w:r>
               <w:rPr>
@@ -848,7 +848,7 @@
               <w:noProof/>
             </w:rPr>
           </w:pPr>
-          <w:hyperlink w:anchor="_Toc243655309" w:history="1">
+          <w:hyperlink w:anchor="_Toc243660989" w:history="1">
             <w:r>
               <w:rPr>
                 <w:rStyle w:val="Hyperlink"/>
@@ -872,7 +872,7 @@
               <w:rPr>
                 <w:noProof/>
               </w:rPr>
-              <w:instrText xml:space="preserve"> PAGEREF _Toc243655309 \h </w:instrText>
+              <w:instrText xml:space="preserve"> PAGEREF _Toc243660989 \h </w:instrText>
             </w:r>
             <w:r>
               <w:rPr>
@@ -909,7 +909,7 @@
               <w:noProof/>
             </w:rPr>
           </w:pPr>
-          <w:hyperlink w:anchor="_Toc243655310" w:history="1">
+          <w:hyperlink w:anchor="_Toc243660990" w:history="1">
             <w:r>
               <w:rPr>
                 <w:rStyle w:val="Hyperlink"/>
@@ -933,7 +933,7 @@
               <w:rPr>
                 <w:noProof/>
               </w:rPr>
-              <w:instrText xml:space="preserve"> PAGEREF _Toc243655310 \h </w:instrText>
+              <w:instrText xml:space="preserve"> PAGEREF _Toc243660990 \h </w:instrText>
             </w:r>
             <w:r>
               <w:rPr>
@@ -970,7 +970,7 @@
               <w:noProof/>
             </w:rPr>
           </w:pPr>
-          <w:hyperlink w:anchor="_Toc243655311" w:history="1">
+          <w:hyperlink w:anchor="_Toc243660991" w:history="1">
             <w:r>
               <w:rPr>
                 <w:rStyle w:val="Hyperlink"/>
@@ -994,7 +994,7 @@
               <w:rPr>
                 <w:noProof/>
               </w:rPr>
-              <w:instrText xml:space="preserve"> PAGEREF _Toc243655311 \h </w:instrText>
+              <w:instrText xml:space="preserve"> PAGEREF _Toc243660991 \h </w:instrText>
             </w:r>
             <w:r>
               <w:rPr>
@@ -1031,7 +1031,7 @@
               <w:noProof/>
             </w:rPr>
           </w:pPr>
-          <w:hyperlink w:anchor="_Toc243655312" w:history="1">
+          <w:hyperlink w:anchor="_Toc243660992" w:history="1">
             <w:r>
               <w:rPr>
                 <w:rStyle w:val="Hyperlink"/>
@@ -1055,7 +1055,7 @@
               <w:rPr>
                 <w:noProof/>
               </w:rPr>
-              <w:instrText xml:space="preserve"> PAGEREF _Toc243655312 \h </w:instrText>
+              <w:instrText xml:space="preserve"> PAGEREF _Toc243660992 \h </w:instrText>
             </w:r>
             <w:r>
               <w:rPr>
@@ -1092,7 +1092,7 @@
               <w:noProof/>
             </w:rPr>
           </w:pPr>
-          <w:hyperlink w:anchor="_Toc243655313" w:history="1">
+          <w:hyperlink w:anchor="_Toc243660993" w:history="1">
             <w:r>
               <w:rPr>
                 <w:rStyle w:val="Hyperlink"/>
@@ -1116,7 +1116,7 @@
               <w:rPr>
                 <w:noProof/>
               </w:rPr>
-              <w:instrText xml:space="preserve"> PAGEREF _Toc243655313 \h </w:instrText>
+              <w:instrText xml:space="preserve"> PAGEREF _Toc243660993 \h </w:instrText>
             </w:r>
             <w:r>
               <w:rPr>
@@ -1133,7 +1133,7 @@
               <w:rPr>
                 <w:noProof/>
               </w:rPr>
-              <w:t>9</w:t>
+              <w:t>10</w:t>
             </w:r>
             <w:r>
               <w:rPr>
@@ -1153,7 +1153,7 @@
               <w:noProof/>
             </w:rPr>
           </w:pPr>
-          <w:hyperlink w:anchor="_Toc243655314" w:history="1">
+          <w:hyperlink w:anchor="_Toc243660994" w:history="1">
             <w:r>
               <w:rPr>
                 <w:rStyle w:val="Hyperlink"/>
@@ -1177,7 +1177,7 @@
               <w:rPr>
                 <w:noProof/>
               </w:rPr>
-              <w:instrText xml:space="preserve"> PAGEREF _Toc243655314 \h </w:instrText>
+              <w:instrText xml:space="preserve"> PAGEREF _Toc243660994 \h </w:instrText>
             </w:r>
             <w:r>
               <w:rPr>
@@ -1214,7 +1214,7 @@
               <w:noProof/>
             </w:rPr>
           </w:pPr>
-          <w:hyperlink w:anchor="_Toc243655315" w:history="1">
+          <w:hyperlink w:anchor="_Toc243660995" w:history="1">
             <w:r>
               <w:rPr>
                 <w:rStyle w:val="Hyperlink"/>
@@ -1238,7 +1238,7 @@
               <w:rPr>
                 <w:noProof/>
               </w:rPr>
-              <w:instrText xml:space="preserve"> PAGEREF _Toc243655315 \h </w:instrText>
+              <w:instrText xml:space="preserve"> PAGEREF _Toc243660995 \h </w:instrText>
             </w:r>
             <w:r>
               <w:rPr>
@@ -1275,7 +1275,7 @@
               <w:noProof/>
             </w:rPr>
           </w:pPr>
-          <w:hyperlink w:anchor="_Toc243655316" w:history="1">
+          <w:hyperlink w:anchor="_Toc243660996" w:history="1">
             <w:r>
               <w:rPr>
                 <w:rStyle w:val="Hyperlink"/>
@@ -1299,7 +1299,7 @@
               <w:rPr>
                 <w:noProof/>
               </w:rPr>
-              <w:instrText xml:space="preserve"> PAGEREF _Toc243655316 \h </w:instrText>
+              <w:instrText xml:space="preserve"> PAGEREF _Toc243660996 \h </w:instrText>
             </w:r>
             <w:r>
               <w:rPr>
@@ -1336,7 +1336,7 @@
               <w:noProof/>
             </w:rPr>
           </w:pPr>
-          <w:hyperlink w:anchor="_Toc243655317" w:history="1">
+          <w:hyperlink w:anchor="_Toc243660997" w:history="1">
             <w:r>
               <w:rPr>
                 <w:rStyle w:val="Hyperlink"/>
@@ -1360,7 +1360,7 @@
               <w:rPr>
                 <w:noProof/>
               </w:rPr>
-              <w:instrText xml:space="preserve"> PAGEREF _Toc243655317 \h </w:instrText>
+              <w:instrText xml:space="preserve"> PAGEREF _Toc243660997 \h </w:instrText>
             </w:r>
             <w:r>
               <w:rPr>
@@ -1397,7 +1397,7 @@
               <w:noProof/>
             </w:rPr>
           </w:pPr>
-          <w:hyperlink w:anchor="_Toc243655318" w:history="1">
+          <w:hyperlink w:anchor="_Toc243660998" w:history="1">
             <w:r>
               <w:rPr>
                 <w:rStyle w:val="Hyperlink"/>
@@ -1421,7 +1421,7 @@
               <w:rPr>
                 <w:noProof/>
               </w:rPr>
-              <w:instrText xml:space="preserve"> PAGEREF _Toc243655318 \h </w:instrText>
+              <w:instrText xml:space="preserve"> PAGEREF _Toc243660998 \h </w:instrText>
             </w:r>
             <w:r>
               <w:rPr>
@@ -1464,7 +1464,7 @@
       <w:pPr>
         <w:pStyle w:val="Heading1"/>
       </w:pPr>
-      <w:bookmarkStart w:id="0" w:name="_Toc243655302"/>
+      <w:bookmarkStart w:id="0" w:name="_Toc243660982"/>
       <w:r>
         <w:t>1. Executive summary</w:t>
       </w:r>
@@ -1634,7 +1634,7 @@
         <w:spacing w:after="60" w:line="264" w:lineRule="auto"/>
       </w:pPr>
       <w:r>
-        <w:t>136 published websites and 124 social accounts, all audited by hand: zero wrong-company publications.</w:t>
+        <w:t>137 published websites and 113 social accounts, all audited by hand: zero wrong-company publications.</w:t>
       </w:r>
     </w:p>
     <w:p>
@@ -1673,7 +1673,7 @@
         <w:spacing w:after="60" w:line="264" w:lineRule="auto"/>
       </w:pPr>
       <w:r>
-        <w:t>51 offline regression tests pass, including the network-security boundary cases and the cases from Builderr's audit and the second review.</w:t>
+        <w:t>56 offline regression tests pass, including the network-security boundary cases and the cases from Builderr's audit and both reviews.</w:t>
       </w:r>
     </w:p>
     <w:p>
@@ -1686,14 +1686,14 @@
         <w:spacing w:after="60" w:line="264" w:lineRule="auto"/>
       </w:pPr>
       <w:r>
-        <w:t>A deduplicated dataset of 1,000 company profiles (46,808 claims) is built from the verified runs.</w:t>
+        <w:t>A deduplicated dataset of 1,000 company profiles (46,780 claims) is built from the verified runs.</w:t>
       </w:r>
     </w:p>
     <w:p>
       <w:pPr>
         <w:pStyle w:val="Heading1"/>
       </w:pPr>
-      <w:bookmarkStart w:id="1" w:name="_Toc243655303"/>
+      <w:bookmarkStart w:id="1" w:name="_Toc243660983"/>
       <w:r>
         <w:t>2. The challenge and its requirements</w:t>
       </w:r>
@@ -2733,7 +2733,7 @@
       <w:pPr>
         <w:pStyle w:val="Heading1"/>
       </w:pPr>
-      <w:bookmarkStart w:id="2" w:name="_Toc243655304"/>
+      <w:bookmarkStart w:id="2" w:name="_Toc243660984"/>
       <w:r>
         <w:t>3. Methodology</w:t>
       </w:r>
@@ -2883,7 +2883,7 @@
       <w:pPr>
         <w:pStyle w:val="Heading1"/>
       </w:pPr>
-      <w:bookmarkStart w:id="3" w:name="_Toc243655305"/>
+      <w:bookmarkStart w:id="3" w:name="_Toc243660985"/>
       <w:r>
         <w:t>4. Architecture</w:t>
       </w:r>
@@ -4239,7 +4239,7 @@
                 <w:sz w:val="17"/>
                 <w:szCs w:val="17"/>
               </w:rPr>
-              <w:t>711</w:t>
+              <w:t>786</w:t>
             </w:r>
           </w:p>
         </w:tc>
@@ -4503,7 +4503,7 @@
                 <w:sz w:val="17"/>
                 <w:szCs w:val="17"/>
               </w:rPr>
-              <w:t>195</w:t>
+              <w:t>201</w:t>
             </w:r>
           </w:p>
         </w:tc>
@@ -4679,7 +4679,7 @@
                 <w:sz w:val="17"/>
                 <w:szCs w:val="17"/>
               </w:rPr>
-              <w:t>162</w:t>
+              <w:t>179</w:t>
             </w:r>
           </w:p>
         </w:tc>
@@ -4855,7 +4855,7 @@
                 <w:sz w:val="17"/>
                 <w:szCs w:val="17"/>
               </w:rPr>
-              <w:t>749</w:t>
+              <w:t>835</w:t>
             </w:r>
           </w:p>
         </w:tc>
@@ -4882,7 +4882,7 @@
                 <w:sz w:val="17"/>
                 <w:szCs w:val="17"/>
               </w:rPr>
-              <w:t>51 offline regression tests</w:t>
+              <w:t>56 offline regression tests</w:t>
             </w:r>
           </w:p>
         </w:tc>
@@ -4897,7 +4897,7 @@
       <w:pPr>
         <w:pStyle w:val="Heading1"/>
       </w:pPr>
-      <w:bookmarkStart w:id="4" w:name="_Toc243655306"/>
+      <w:bookmarkStart w:id="4" w:name="_Toc243660986"/>
       <w:r>
         <w:t>5. Technology stack</w:t>
       </w:r>
@@ -6362,7 +6362,7 @@
       <w:pPr>
         <w:pStyle w:val="Heading1"/>
       </w:pPr>
-      <w:bookmarkStart w:id="5" w:name="_Toc243655307"/>
+      <w:bookmarkStart w:id="5" w:name="_Toc243660987"/>
       <w:r>
         <w:t>6. Data sources</w:t>
       </w:r>
@@ -7715,7 +7715,7 @@
       <w:pPr>
         <w:pStyle w:val="Heading1"/>
       </w:pPr>
-      <w:bookmarkStart w:id="6" w:name="_Toc243655308"/>
+      <w:bookmarkStart w:id="6" w:name="_Toc243660988"/>
       <w:r>
         <w:t>7. Fact, evidence and envelope model</w:t>
       </w:r>
@@ -8274,7 +8274,7 @@
       <w:pPr>
         <w:pStyle w:val="Heading1"/>
       </w:pPr>
-      <w:bookmarkStart w:id="7" w:name="_Toc243655309"/>
+      <w:bookmarkStart w:id="7" w:name="_Toc243660989"/>
       <w:r>
         <w:t>8. Identity verification</w:t>
       </w:r>
@@ -8670,7 +8670,19 @@
         <w:t>norge</w:t>
       </w:r>
       <w:r>
-        <w:t>), another legal-name word or a page ID, so sister, parent, subsidiary, group and other-company accounts that share a word are rejected; platform paths and opaque channel IDs are rejected.</w:t>
+        <w:t xml:space="preserve">), another legal-name word or a page ID, so sister, parent, subsidiary, group and other-company accounts that share a word are rejected; platform paths and opaque channel IDs are rejected. The company must also present the account as its own: site chrome, its contact or about page, repeated on two or more of its pages, or the </w:t>
+      </w:r>
+      <w:r>
+        <w:rPr>
+          <w:rFonts w:ascii="Consolas" w:eastAsia="Consolas" w:hAnsi="Consolas" w:cs="Consolas"/>
+          <w:color w:val="333333"/>
+          <w:sz w:val="18"/>
+          <w:szCs w:val="18"/>
+        </w:rPr>
+        <w:t>sameAs</w:t>
+      </w:r>
+      <w:r>
+        <w:t xml:space="preserve"> of its own structured-data record. A link inside an article or another organisation's markup is withheld.</w:t>
       </w:r>
     </w:p>
     <w:p>
@@ -8696,6 +8708,19 @@
       </w:r>
       <w:r>
         <w:t>), the URL is published but no social accounts, news or jobs are taken from that domain.</w:t>
+      </w:r>
+    </w:p>
+    <w:p>
+      <w:pPr>
+        <w:pStyle w:val="ListParagraph"/>
+        <w:numPr>
+          <w:ilvl w:val="0"/>
+          <w:numId w:val="2"/>
+        </w:numPr>
+        <w:spacing w:after="60" w:line="264" w:lineRule="auto"/>
+      </w:pPr>
+      <w:r>
+        <w:t>A subsidiary can be declared with its parent's root domain, where no path shows the difference. Site content (description, brand, social accounts, contacts, news, jobs) is taken only when the site is shown to be the company's own: the domain matches the company name, the org number or exact legal name is in the site's own footer/address block with no other organisation's number, or the site's structured data is this company. Otherwise only the URL is published, with the reason.</w:t>
       </w:r>
     </w:p>
     <w:p>
@@ -9242,7 +9267,7 @@
       <w:pPr>
         <w:pStyle w:val="Heading1"/>
       </w:pPr>
-      <w:bookmarkStart w:id="8" w:name="_Toc243655310"/>
+      <w:bookmarkStart w:id="8" w:name="_Toc243660990"/>
       <w:r>
         <w:t>9. Other components</w:t>
       </w:r>
@@ -9715,7 +9740,7 @@
       <w:pPr>
         <w:pStyle w:val="Heading1"/>
       </w:pPr>
-      <w:bookmarkStart w:id="9" w:name="_Toc243655311"/>
+      <w:bookmarkStart w:id="9" w:name="_Toc243660991"/>
       <w:r>
         <w:t>10. Security</w:t>
       </w:r>
@@ -10608,7 +10633,7 @@
       <w:pPr>
         <w:pStyle w:val="Heading1"/>
       </w:pPr>
-      <w:bookmarkStart w:id="10" w:name="_Toc243655312"/>
+      <w:bookmarkStart w:id="10" w:name="_Toc243660992"/>
       <w:r>
         <w:t>11. Privacy and data protection</w:t>
       </w:r>
@@ -11172,7 +11197,7 @@
       <w:pPr>
         <w:pStyle w:val="Heading1"/>
       </w:pPr>
-      <w:bookmarkStart w:id="11" w:name="_Toc243655313"/>
+      <w:bookmarkStart w:id="11" w:name="_Toc243660993"/>
       <w:r>
         <w:t>12. Testing methodology</w:t>
       </w:r>
@@ -11195,10 +11220,10 @@
           <w:b/>
           <w:bCs/>
         </w:rPr>
-        <w:t>1. Offline regression tests (51).</w:t>
-      </w:r>
-      <w:r>
-        <w:t xml:space="preserve"> These cover the identity gate (19), discovery and extraction (14), network security (9), budgets and states (4), refresh (3), and input and data rules (2), as listed in Appendix A. Network tests use stand-ins for DNS and HTTP, so they run anywhere without network access. The test that guards credential stripping was mutation-checked: disabling the protection makes it fail.</w:t>
+        <w:t>1. Offline regression tests (56).</w:t>
+      </w:r>
+      <w:r>
+        <w:t xml:space="preserve"> These cover the identity gate (19), discovery and extraction (19), network security (9), budgets and states (4), refresh (3), and input and data rules (2), as listed in Appendix A. Network tests use stand-ins for DNS and HTTP, so they run anywhere without network access. The test that guards credential stripping was mutation-checked: disabling the protection makes it fail.</w:t>
       </w:r>
     </w:p>
     <w:p>
@@ -12456,7 +12481,7 @@
                 <w:sz w:val="17"/>
                 <w:szCs w:val="17"/>
               </w:rPr>
-              <w:t>social handles name the company; news items are dated posts; no careers landing pages; NAV jobs link to a single ad</w:t>
+              <w:t>social handles name the company; news items are dated posts; no careers landing pages; NAV jobs link to a single ad; no claim from a site not shown to be the company's own</w:t>
             </w:r>
           </w:p>
         </w:tc>
@@ -13367,7 +13392,7 @@
       <w:pPr>
         <w:pStyle w:val="Heading1"/>
       </w:pPr>
-      <w:bookmarkStart w:id="12" w:name="_Toc243655314"/>
+      <w:bookmarkStart w:id="12" w:name="_Toc243660994"/>
       <w:r>
         <w:t>13. Results at the frozen commit</w:t>
       </w:r>
@@ -13724,7 +13749,7 @@
                 <w:sz w:val="17"/>
                 <w:szCs w:val="17"/>
               </w:rPr>
-              <w:t>4,372</w:t>
+              <w:t>4,367</w:t>
             </w:r>
           </w:p>
         </w:tc>
@@ -13805,7 +13830,7 @@
                 <w:sz w:val="17"/>
                 <w:szCs w:val="17"/>
               </w:rPr>
-              <w:t>832</w:t>
+              <w:t>827</w:t>
             </w:r>
           </w:p>
         </w:tc>
@@ -13832,7 +13857,7 @@
                 <w:sz w:val="17"/>
                 <w:szCs w:val="17"/>
               </w:rPr>
-              <w:t>479 s</w:t>
+              <w:t>473 s</w:t>
             </w:r>
           </w:p>
         </w:tc>
@@ -13945,7 +13970,7 @@
                 <w:sz w:val="17"/>
                 <w:szCs w:val="17"/>
               </w:rPr>
-              <w:t>4,562</w:t>
+              <w:t>4,561</w:t>
             </w:r>
           </w:p>
         </w:tc>
@@ -14026,7 +14051,7 @@
                 <w:sz w:val="17"/>
                 <w:szCs w:val="17"/>
               </w:rPr>
-              <w:t>892</w:t>
+              <w:t>890</w:t>
             </w:r>
           </w:p>
         </w:tc>
@@ -14053,7 +14078,7 @@
                 <w:sz w:val="17"/>
                 <w:szCs w:val="17"/>
               </w:rPr>
-              <w:t>412 s</w:t>
+              <w:t>417 s</w:t>
             </w:r>
           </w:p>
         </w:tc>
@@ -14495,7 +14520,7 @@
                 <w:sz w:val="17"/>
                 <w:szCs w:val="17"/>
               </w:rPr>
-              <w:t>420 s</w:t>
+              <w:t>414 s</w:t>
             </w:r>
           </w:p>
         </w:tc>
@@ -14608,7 +14633,7 @@
                 <w:sz w:val="17"/>
                 <w:szCs w:val="17"/>
               </w:rPr>
-              <w:t>4,496</w:t>
+              <w:t>4,490</w:t>
             </w:r>
           </w:p>
         </w:tc>
@@ -14689,7 +14714,7 @@
                 <w:sz w:val="17"/>
                 <w:szCs w:val="17"/>
               </w:rPr>
-              <w:t>881</w:t>
+              <w:t>883</w:t>
             </w:r>
           </w:p>
         </w:tc>
@@ -14716,7 +14741,7 @@
                 <w:sz w:val="17"/>
                 <w:szCs w:val="17"/>
               </w:rPr>
-              <w:t>419 s</w:t>
+              <w:t>410 s</w:t>
             </w:r>
           </w:p>
         </w:tc>
@@ -14829,7 +14854,7 @@
                 <w:sz w:val="17"/>
                 <w:szCs w:val="17"/>
               </w:rPr>
-              <w:t>5,505</w:t>
+              <w:t>5,498</w:t>
             </w:r>
           </w:p>
         </w:tc>
@@ -14856,7 +14881,7 @@
                 <w:sz w:val="17"/>
                 <w:szCs w:val="17"/>
               </w:rPr>
-              <w:t>31</w:t>
+              <w:t>32</w:t>
             </w:r>
           </w:p>
         </w:tc>
@@ -14910,7 +14935,7 @@
                 <w:sz w:val="17"/>
                 <w:szCs w:val="17"/>
               </w:rPr>
-              <w:t>922</w:t>
+              <w:t>917</w:t>
             </w:r>
           </w:p>
         </w:tc>
@@ -14937,7 +14962,7 @@
                 <w:sz w:val="17"/>
                 <w:szCs w:val="17"/>
               </w:rPr>
-              <w:t>519 s</w:t>
+              <w:t>516 s</w:t>
             </w:r>
           </w:p>
         </w:tc>
@@ -15050,7 +15075,7 @@
                 <w:sz w:val="17"/>
                 <w:szCs w:val="17"/>
               </w:rPr>
-              <w:t>5,494</w:t>
+              <w:t>5,487</w:t>
             </w:r>
           </w:p>
         </w:tc>
@@ -15131,7 +15156,7 @@
                 <w:sz w:val="17"/>
                 <w:szCs w:val="17"/>
               </w:rPr>
-              <w:t>1,045</w:t>
+              <w:t>1,046</w:t>
             </w:r>
           </w:p>
         </w:tc>
@@ -15158,7 +15183,7 @@
                 <w:sz w:val="17"/>
                 <w:szCs w:val="17"/>
               </w:rPr>
-              <w:t>418 s</w:t>
+              <w:t>428 s</w:t>
             </w:r>
           </w:p>
         </w:tc>
@@ -15379,7 +15404,7 @@
                 <w:sz w:val="17"/>
                 <w:szCs w:val="17"/>
               </w:rPr>
-              <w:t>42 s</w:t>
+              <w:t>41 s</w:t>
             </w:r>
           </w:p>
         </w:tc>
@@ -15573,7 +15598,7 @@
                 <w:sz w:val="17"/>
                 <w:szCs w:val="17"/>
               </w:rPr>
-              <w:t>523</w:t>
+              <w:t>525</w:t>
             </w:r>
           </w:p>
         </w:tc>
@@ -15713,7 +15738,7 @@
                 <w:sz w:val="17"/>
                 <w:szCs w:val="17"/>
               </w:rPr>
-              <w:t>4,372</w:t>
+              <w:t>4,367</w:t>
             </w:r>
           </w:p>
         </w:tc>
@@ -15821,7 +15846,7 @@
                 <w:sz w:val="17"/>
                 <w:szCs w:val="17"/>
               </w:rPr>
-              <w:t>484 s</w:t>
+              <w:t>477 s</w:t>
             </w:r>
           </w:p>
         </w:tc>
@@ -16015,7 +16040,7 @@
                 <w:sz w:val="17"/>
                 <w:szCs w:val="17"/>
               </w:rPr>
-              <w:t>878</w:t>
+              <w:t>877</w:t>
             </w:r>
           </w:p>
         </w:tc>
@@ -16042,7 +16067,7 @@
                 <w:sz w:val="17"/>
                 <w:szCs w:val="17"/>
               </w:rPr>
-              <w:t>421 s</w:t>
+              <w:t>424 s</w:t>
             </w:r>
           </w:p>
         </w:tc>
@@ -16236,7 +16261,7 @@
                 <w:sz w:val="17"/>
                 <w:szCs w:val="17"/>
               </w:rPr>
-              <w:t>891</w:t>
+              <w:t>895</w:t>
             </w:r>
           </w:p>
         </w:tc>
@@ -16263,7 +16288,7 @@
                 <w:sz w:val="17"/>
                 <w:szCs w:val="17"/>
               </w:rPr>
-              <w:t>452 s</w:t>
+              <w:t>472 s</w:t>
             </w:r>
           </w:p>
         </w:tc>
@@ -16376,7 +16401,7 @@
                 <w:sz w:val="17"/>
                 <w:szCs w:val="17"/>
               </w:rPr>
-              <w:t>4,398</w:t>
+              <w:t>4,396</w:t>
             </w:r>
           </w:p>
         </w:tc>
@@ -16457,7 +16482,7 @@
                 <w:sz w:val="17"/>
                 <w:szCs w:val="17"/>
               </w:rPr>
-              <w:t>816</w:t>
+              <w:t>815</w:t>
             </w:r>
           </w:p>
         </w:tc>
@@ -16484,7 +16509,7 @@
                 <w:sz w:val="17"/>
                 <w:szCs w:val="17"/>
               </w:rPr>
-              <w:t>448 s</w:t>
+              <w:t>456 s</w:t>
             </w:r>
           </w:p>
         </w:tc>
@@ -17183,7 +17208,7 @@
         <w:t>Source yield</w:t>
       </w:r>
       <w:r>
-        <w:t xml:space="preserve"> (smoke run): Brønnøysund 501 requests → 4,339 claims; company websites 237 requests → 33 claims; NAV feed 94 requests → 0 claims in that batch.</w:t>
+        <w:t xml:space="preserve"> (smoke run): Brønnøysund 501 requests → 4,339 claims; company websites 233 requests → 28 claims; NAV feed 93 requests → 0 claims in that batch.</w:t>
       </w:r>
     </w:p>
     <w:p>
@@ -17198,7 +17223,7 @@
         <w:t>Identity audit:</w:t>
       </w:r>
       <w:r>
-        <w:t xml:space="preserve"> 136 unique websites were published across the suite:</w:t>
+        <w:t xml:space="preserve"> 137 unique websites were published across the suite:</w:t>
       </w:r>
     </w:p>
     <w:p>
@@ -17237,7 +17262,7 @@
         <w:spacing w:after="60" w:line="264" w:lineRule="auto"/>
       </w:pPr>
       <w:r>
-        <w:t>54 with the exact legal name plus the registry's own phone or address;</w:t>
+        <w:t>55 with the exact legal name plus the registry's own phone or address;</w:t>
       </w:r>
     </w:p>
     <w:p>
@@ -17271,7 +17296,19 @@
         <w:spacing w:after="120" w:line="276" w:lineRule="auto"/>
       </w:pPr>
       <w:r>
-        <w:t xml:space="preserve">All 124 published social accounts were also checked by hand: each is the company's exact name, optionally with </w:t>
+        <w:t xml:space="preserve">Site ownership: 129 are shown to be the company's own site; 8 are published as URL only (one, </w:t>
+      </w:r>
+      <w:r>
+        <w:rPr>
+          <w:rFonts w:ascii="Consolas" w:eastAsia="Consolas" w:hAnsi="Consolas" w:cs="Consolas"/>
+          <w:color w:val="333333"/>
+          <w:sz w:val="18"/>
+          <w:szCs w:val="18"/>
+        </w:rPr>
+        <w:t>vif-fotball.no</w:t>
+      </w:r>
+      <w:r>
+        <w:t xml:space="preserve">, is shared by two registry entities). All 113 published social accounts were also checked by hand: each is the company's exact name, optionally with </w:t>
       </w:r>
       <w:r>
         <w:rPr>
@@ -17307,7 +17344,7 @@
         <w:t>norge</w:t>
       </w:r>
       <w:r>
-        <w:t>, a country word or a page number.</w:t>
+        <w:t>, a country word or a page number, and each is presented by the company itself.</w:t>
       </w:r>
     </w:p>
     <w:p>
@@ -17342,14 +17379,14 @@
         <w:t>profiles/profiles.jsonl.gz</w:t>
       </w:r>
       <w:r>
-        <w:t xml:space="preserve"> holds 1,000 unique companies (46,808 claims and as many evidence records), merged only from runs that passed verification. The manifest records the commit and the content SHA-256. The agent never reads this dataset when researching a batch.</w:t>
+        <w:t xml:space="preserve"> holds 1,000 unique companies (46,780 claims and as many evidence records), merged only from runs that passed verification. The manifest records the commit and the content SHA-256. The agent never reads this dataset when researching a batch.</w:t>
       </w:r>
     </w:p>
     <w:p>
       <w:pPr>
         <w:pStyle w:val="Heading1"/>
       </w:pPr>
-      <w:bookmarkStart w:id="13" w:name="_Toc243655315"/>
+      <w:bookmarkStart w:id="13" w:name="_Toc243660995"/>
       <w:r>
         <w:t>14. Defects found and fixed</w:t>
       </w:r>
@@ -17371,9 +17408,9 @@
       </w:tblPr>
       <w:tblGrid>
         <w:gridCol w:w="570"/>
-        <w:gridCol w:w="5448"/>
-        <w:gridCol w:w="1786"/>
-        <w:gridCol w:w="1834"/>
+        <w:gridCol w:w="5135"/>
+        <w:gridCol w:w="1739"/>
+        <w:gridCol w:w="2194"/>
       </w:tblGrid>
       <w:tr>
         <w:trPr>
@@ -17412,7 +17449,7 @@
         </w:tc>
         <w:tc>
           <w:tcPr>
-            <w:tcW w:w="5448" w:type="dxa"/>
+            <w:tcW w:w="5135" w:type="dxa"/>
             <w:tcBorders>
               <w:top w:val="single" w:sz="4" w:space="0" w:color="B7C4D3"/>
               <w:left w:val="single" w:sz="4" w:space="0" w:color="B7C4D3"/>
@@ -17442,7 +17479,7 @@
         </w:tc>
         <w:tc>
           <w:tcPr>
-            <w:tcW w:w="1786" w:type="dxa"/>
+            <w:tcW w:w="1739" w:type="dxa"/>
             <w:tcBorders>
               <w:top w:val="single" w:sz="4" w:space="0" w:color="B7C4D3"/>
               <w:left w:val="single" w:sz="4" w:space="0" w:color="B7C4D3"/>
@@ -17472,7 +17509,7 @@
         </w:tc>
         <w:tc>
           <w:tcPr>
-            <w:tcW w:w="1834" w:type="dxa"/>
+            <w:tcW w:w="2194" w:type="dxa"/>
             <w:tcBorders>
               <w:top w:val="single" w:sz="4" w:space="0" w:color="B7C4D3"/>
               <w:left w:val="single" w:sz="4" w:space="0" w:color="B7C4D3"/>
@@ -17534,7 +17571,7 @@
         </w:tc>
         <w:tc>
           <w:tcPr>
-            <w:tcW w:w="5448" w:type="dxa"/>
+            <w:tcW w:w="5135" w:type="dxa"/>
             <w:tcBorders>
               <w:top w:val="single" w:sz="4" w:space="0" w:color="B7C4D3"/>
               <w:left w:val="single" w:sz="4" w:space="0" w:color="B7C4D3"/>
@@ -17561,7 +17598,7 @@
         </w:tc>
         <w:tc>
           <w:tcPr>
-            <w:tcW w:w="1786" w:type="dxa"/>
+            <w:tcW w:w="1739" w:type="dxa"/>
             <w:tcBorders>
               <w:top w:val="single" w:sz="4" w:space="0" w:color="B7C4D3"/>
               <w:left w:val="single" w:sz="4" w:space="0" w:color="B7C4D3"/>
@@ -17588,7 +17625,7 @@
         </w:tc>
         <w:tc>
           <w:tcPr>
-            <w:tcW w:w="1834" w:type="dxa"/>
+            <w:tcW w:w="2194" w:type="dxa"/>
             <w:tcBorders>
               <w:top w:val="single" w:sz="4" w:space="0" w:color="B7C4D3"/>
               <w:left w:val="single" w:sz="4" w:space="0" w:color="B7C4D3"/>
@@ -17647,7 +17684,7 @@
         </w:tc>
         <w:tc>
           <w:tcPr>
-            <w:tcW w:w="5448" w:type="dxa"/>
+            <w:tcW w:w="5135" w:type="dxa"/>
             <w:tcBorders>
               <w:top w:val="single" w:sz="4" w:space="0" w:color="B7C4D3"/>
               <w:left w:val="single" w:sz="4" w:space="0" w:color="B7C4D3"/>
@@ -17674,7 +17711,7 @@
         </w:tc>
         <w:tc>
           <w:tcPr>
-            <w:tcW w:w="1786" w:type="dxa"/>
+            <w:tcW w:w="1739" w:type="dxa"/>
             <w:tcBorders>
               <w:top w:val="single" w:sz="4" w:space="0" w:color="B7C4D3"/>
               <w:left w:val="single" w:sz="4" w:space="0" w:color="B7C4D3"/>
@@ -17701,7 +17738,7 @@
         </w:tc>
         <w:tc>
           <w:tcPr>
-            <w:tcW w:w="1834" w:type="dxa"/>
+            <w:tcW w:w="2194" w:type="dxa"/>
             <w:tcBorders>
               <w:top w:val="single" w:sz="4" w:space="0" w:color="B7C4D3"/>
               <w:left w:val="single" w:sz="4" w:space="0" w:color="B7C4D3"/>
@@ -17760,7 +17797,7 @@
         </w:tc>
         <w:tc>
           <w:tcPr>
-            <w:tcW w:w="5448" w:type="dxa"/>
+            <w:tcW w:w="5135" w:type="dxa"/>
             <w:tcBorders>
               <w:top w:val="single" w:sz="4" w:space="0" w:color="B7C4D3"/>
               <w:left w:val="single" w:sz="4" w:space="0" w:color="B7C4D3"/>
@@ -17787,7 +17824,7 @@
         </w:tc>
         <w:tc>
           <w:tcPr>
-            <w:tcW w:w="1786" w:type="dxa"/>
+            <w:tcW w:w="1739" w:type="dxa"/>
             <w:tcBorders>
               <w:top w:val="single" w:sz="4" w:space="0" w:color="B7C4D3"/>
               <w:left w:val="single" w:sz="4" w:space="0" w:color="B7C4D3"/>
@@ -17814,7 +17851,7 @@
         </w:tc>
         <w:tc>
           <w:tcPr>
-            <w:tcW w:w="1834" w:type="dxa"/>
+            <w:tcW w:w="2194" w:type="dxa"/>
             <w:tcBorders>
               <w:top w:val="single" w:sz="4" w:space="0" w:color="B7C4D3"/>
               <w:left w:val="single" w:sz="4" w:space="0" w:color="B7C4D3"/>
@@ -17873,7 +17910,7 @@
         </w:tc>
         <w:tc>
           <w:tcPr>
-            <w:tcW w:w="5448" w:type="dxa"/>
+            <w:tcW w:w="5135" w:type="dxa"/>
             <w:tcBorders>
               <w:top w:val="single" w:sz="4" w:space="0" w:color="B7C4D3"/>
               <w:left w:val="single" w:sz="4" w:space="0" w:color="B7C4D3"/>
@@ -17900,7 +17937,7 @@
         </w:tc>
         <w:tc>
           <w:tcPr>
-            <w:tcW w:w="1786" w:type="dxa"/>
+            <w:tcW w:w="1739" w:type="dxa"/>
             <w:tcBorders>
               <w:top w:val="single" w:sz="4" w:space="0" w:color="B7C4D3"/>
               <w:left w:val="single" w:sz="4" w:space="0" w:color="B7C4D3"/>
@@ -17927,7 +17964,7 @@
         </w:tc>
         <w:tc>
           <w:tcPr>
-            <w:tcW w:w="1834" w:type="dxa"/>
+            <w:tcW w:w="2194" w:type="dxa"/>
             <w:tcBorders>
               <w:top w:val="single" w:sz="4" w:space="0" w:color="B7C4D3"/>
               <w:left w:val="single" w:sz="4" w:space="0" w:color="B7C4D3"/>
@@ -17986,7 +18023,7 @@
         </w:tc>
         <w:tc>
           <w:tcPr>
-            <w:tcW w:w="5448" w:type="dxa"/>
+            <w:tcW w:w="5135" w:type="dxa"/>
             <w:tcBorders>
               <w:top w:val="single" w:sz="4" w:space="0" w:color="B7C4D3"/>
               <w:left w:val="single" w:sz="4" w:space="0" w:color="B7C4D3"/>
@@ -18013,7 +18050,7 @@
         </w:tc>
         <w:tc>
           <w:tcPr>
-            <w:tcW w:w="1786" w:type="dxa"/>
+            <w:tcW w:w="1739" w:type="dxa"/>
             <w:tcBorders>
               <w:top w:val="single" w:sz="4" w:space="0" w:color="B7C4D3"/>
               <w:left w:val="single" w:sz="4" w:space="0" w:color="B7C4D3"/>
@@ -18040,7 +18077,7 @@
         </w:tc>
         <w:tc>
           <w:tcPr>
-            <w:tcW w:w="1834" w:type="dxa"/>
+            <w:tcW w:w="2194" w:type="dxa"/>
             <w:tcBorders>
               <w:top w:val="single" w:sz="4" w:space="0" w:color="B7C4D3"/>
               <w:left w:val="single" w:sz="4" w:space="0" w:color="B7C4D3"/>
@@ -18099,7 +18136,7 @@
         </w:tc>
         <w:tc>
           <w:tcPr>
-            <w:tcW w:w="5448" w:type="dxa"/>
+            <w:tcW w:w="5135" w:type="dxa"/>
             <w:tcBorders>
               <w:top w:val="single" w:sz="4" w:space="0" w:color="B7C4D3"/>
               <w:left w:val="single" w:sz="4" w:space="0" w:color="B7C4D3"/>
@@ -18126,7 +18163,7 @@
         </w:tc>
         <w:tc>
           <w:tcPr>
-            <w:tcW w:w="1786" w:type="dxa"/>
+            <w:tcW w:w="1739" w:type="dxa"/>
             <w:tcBorders>
               <w:top w:val="single" w:sz="4" w:space="0" w:color="B7C4D3"/>
               <w:left w:val="single" w:sz="4" w:space="0" w:color="B7C4D3"/>
@@ -18153,7 +18190,7 @@
         </w:tc>
         <w:tc>
           <w:tcPr>
-            <w:tcW w:w="1834" w:type="dxa"/>
+            <w:tcW w:w="2194" w:type="dxa"/>
             <w:tcBorders>
               <w:top w:val="single" w:sz="4" w:space="0" w:color="B7C4D3"/>
               <w:left w:val="single" w:sz="4" w:space="0" w:color="B7C4D3"/>
@@ -18212,7 +18249,7 @@
         </w:tc>
         <w:tc>
           <w:tcPr>
-            <w:tcW w:w="5448" w:type="dxa"/>
+            <w:tcW w:w="5135" w:type="dxa"/>
             <w:tcBorders>
               <w:top w:val="single" w:sz="4" w:space="0" w:color="B7C4D3"/>
               <w:left w:val="single" w:sz="4" w:space="0" w:color="B7C4D3"/>
@@ -18239,7 +18276,7 @@
         </w:tc>
         <w:tc>
           <w:tcPr>
-            <w:tcW w:w="1786" w:type="dxa"/>
+            <w:tcW w:w="1739" w:type="dxa"/>
             <w:tcBorders>
               <w:top w:val="single" w:sz="4" w:space="0" w:color="B7C4D3"/>
               <w:left w:val="single" w:sz="4" w:space="0" w:color="B7C4D3"/>
@@ -18266,7 +18303,7 @@
         </w:tc>
         <w:tc>
           <w:tcPr>
-            <w:tcW w:w="1834" w:type="dxa"/>
+            <w:tcW w:w="2194" w:type="dxa"/>
             <w:tcBorders>
               <w:top w:val="single" w:sz="4" w:space="0" w:color="B7C4D3"/>
               <w:left w:val="single" w:sz="4" w:space="0" w:color="B7C4D3"/>
@@ -18325,7 +18362,7 @@
         </w:tc>
         <w:tc>
           <w:tcPr>
-            <w:tcW w:w="5448" w:type="dxa"/>
+            <w:tcW w:w="5135" w:type="dxa"/>
             <w:tcBorders>
               <w:top w:val="single" w:sz="4" w:space="0" w:color="B7C4D3"/>
               <w:left w:val="single" w:sz="4" w:space="0" w:color="B7C4D3"/>
@@ -18352,7 +18389,7 @@
         </w:tc>
         <w:tc>
           <w:tcPr>
-            <w:tcW w:w="1786" w:type="dxa"/>
+            <w:tcW w:w="1739" w:type="dxa"/>
             <w:tcBorders>
               <w:top w:val="single" w:sz="4" w:space="0" w:color="B7C4D3"/>
               <w:left w:val="single" w:sz="4" w:space="0" w:color="B7C4D3"/>
@@ -18379,7 +18416,7 @@
         </w:tc>
         <w:tc>
           <w:tcPr>
-            <w:tcW w:w="1834" w:type="dxa"/>
+            <w:tcW w:w="2194" w:type="dxa"/>
             <w:tcBorders>
               <w:top w:val="single" w:sz="4" w:space="0" w:color="B7C4D3"/>
               <w:left w:val="single" w:sz="4" w:space="0" w:color="B7C4D3"/>
@@ -18438,7 +18475,7 @@
         </w:tc>
         <w:tc>
           <w:tcPr>
-            <w:tcW w:w="5448" w:type="dxa"/>
+            <w:tcW w:w="5135" w:type="dxa"/>
             <w:tcBorders>
               <w:top w:val="single" w:sz="4" w:space="0" w:color="B7C4D3"/>
               <w:left w:val="single" w:sz="4" w:space="0" w:color="B7C4D3"/>
@@ -18465,7 +18502,7 @@
         </w:tc>
         <w:tc>
           <w:tcPr>
-            <w:tcW w:w="1786" w:type="dxa"/>
+            <w:tcW w:w="1739" w:type="dxa"/>
             <w:tcBorders>
               <w:top w:val="single" w:sz="4" w:space="0" w:color="B7C4D3"/>
               <w:left w:val="single" w:sz="4" w:space="0" w:color="B7C4D3"/>
@@ -18492,7 +18529,7 @@
         </w:tc>
         <w:tc>
           <w:tcPr>
-            <w:tcW w:w="1834" w:type="dxa"/>
+            <w:tcW w:w="2194" w:type="dxa"/>
             <w:tcBorders>
               <w:top w:val="single" w:sz="4" w:space="0" w:color="B7C4D3"/>
               <w:left w:val="single" w:sz="4" w:space="0" w:color="B7C4D3"/>
@@ -18551,7 +18588,7 @@
         </w:tc>
         <w:tc>
           <w:tcPr>
-            <w:tcW w:w="5448" w:type="dxa"/>
+            <w:tcW w:w="5135" w:type="dxa"/>
             <w:tcBorders>
               <w:top w:val="single" w:sz="4" w:space="0" w:color="B7C4D3"/>
               <w:left w:val="single" w:sz="4" w:space="0" w:color="B7C4D3"/>
@@ -18578,7 +18615,7 @@
         </w:tc>
         <w:tc>
           <w:tcPr>
-            <w:tcW w:w="1786" w:type="dxa"/>
+            <w:tcW w:w="1739" w:type="dxa"/>
             <w:tcBorders>
               <w:top w:val="single" w:sz="4" w:space="0" w:color="B7C4D3"/>
               <w:left w:val="single" w:sz="4" w:space="0" w:color="B7C4D3"/>
@@ -18605,7 +18642,7 @@
         </w:tc>
         <w:tc>
           <w:tcPr>
-            <w:tcW w:w="1834" w:type="dxa"/>
+            <w:tcW w:w="2194" w:type="dxa"/>
             <w:tcBorders>
               <w:top w:val="single" w:sz="4" w:space="0" w:color="B7C4D3"/>
               <w:left w:val="single" w:sz="4" w:space="0" w:color="B7C4D3"/>
@@ -18664,7 +18701,7 @@
         </w:tc>
         <w:tc>
           <w:tcPr>
-            <w:tcW w:w="5448" w:type="dxa"/>
+            <w:tcW w:w="5135" w:type="dxa"/>
             <w:tcBorders>
               <w:top w:val="single" w:sz="4" w:space="0" w:color="B7C4D3"/>
               <w:left w:val="single" w:sz="4" w:space="0" w:color="B7C4D3"/>
@@ -18691,7 +18728,7 @@
         </w:tc>
         <w:tc>
           <w:tcPr>
-            <w:tcW w:w="1786" w:type="dxa"/>
+            <w:tcW w:w="1739" w:type="dxa"/>
             <w:tcBorders>
               <w:top w:val="single" w:sz="4" w:space="0" w:color="B7C4D3"/>
               <w:left w:val="single" w:sz="4" w:space="0" w:color="B7C4D3"/>
@@ -18718,7 +18755,7 @@
         </w:tc>
         <w:tc>
           <w:tcPr>
-            <w:tcW w:w="1834" w:type="dxa"/>
+            <w:tcW w:w="2194" w:type="dxa"/>
             <w:tcBorders>
               <w:top w:val="single" w:sz="4" w:space="0" w:color="B7C4D3"/>
               <w:left w:val="single" w:sz="4" w:space="0" w:color="B7C4D3"/>
@@ -18777,7 +18814,7 @@
         </w:tc>
         <w:tc>
           <w:tcPr>
-            <w:tcW w:w="5448" w:type="dxa"/>
+            <w:tcW w:w="5135" w:type="dxa"/>
             <w:tcBorders>
               <w:top w:val="single" w:sz="4" w:space="0" w:color="B7C4D3"/>
               <w:left w:val="single" w:sz="4" w:space="0" w:color="B7C4D3"/>
@@ -18804,7 +18841,7 @@
         </w:tc>
         <w:tc>
           <w:tcPr>
-            <w:tcW w:w="1786" w:type="dxa"/>
+            <w:tcW w:w="1739" w:type="dxa"/>
             <w:tcBorders>
               <w:top w:val="single" w:sz="4" w:space="0" w:color="B7C4D3"/>
               <w:left w:val="single" w:sz="4" w:space="0" w:color="B7C4D3"/>
@@ -18831,7 +18868,7 @@
         </w:tc>
         <w:tc>
           <w:tcPr>
-            <w:tcW w:w="1834" w:type="dxa"/>
+            <w:tcW w:w="2194" w:type="dxa"/>
             <w:tcBorders>
               <w:top w:val="single" w:sz="4" w:space="0" w:color="B7C4D3"/>
               <w:left w:val="single" w:sz="4" w:space="0" w:color="B7C4D3"/>
@@ -18890,7 +18927,7 @@
         </w:tc>
         <w:tc>
           <w:tcPr>
-            <w:tcW w:w="5448" w:type="dxa"/>
+            <w:tcW w:w="5135" w:type="dxa"/>
             <w:tcBorders>
               <w:top w:val="single" w:sz="4" w:space="0" w:color="B7C4D3"/>
               <w:left w:val="single" w:sz="4" w:space="0" w:color="B7C4D3"/>
@@ -18917,7 +18954,7 @@
         </w:tc>
         <w:tc>
           <w:tcPr>
-            <w:tcW w:w="1786" w:type="dxa"/>
+            <w:tcW w:w="1739" w:type="dxa"/>
             <w:tcBorders>
               <w:top w:val="single" w:sz="4" w:space="0" w:color="B7C4D3"/>
               <w:left w:val="single" w:sz="4" w:space="0" w:color="B7C4D3"/>
@@ -18944,7 +18981,7 @@
         </w:tc>
         <w:tc>
           <w:tcPr>
-            <w:tcW w:w="1834" w:type="dxa"/>
+            <w:tcW w:w="2194" w:type="dxa"/>
             <w:tcBorders>
               <w:top w:val="single" w:sz="4" w:space="0" w:color="B7C4D3"/>
               <w:left w:val="single" w:sz="4" w:space="0" w:color="B7C4D3"/>
@@ -19005,7 +19042,7 @@
         </w:tc>
         <w:tc>
           <w:tcPr>
-            <w:tcW w:w="5448" w:type="dxa"/>
+            <w:tcW w:w="5135" w:type="dxa"/>
             <w:tcBorders>
               <w:top w:val="single" w:sz="4" w:space="0" w:color="B7C4D3"/>
               <w:left w:val="single" w:sz="4" w:space="0" w:color="B7C4D3"/>
@@ -19032,7 +19069,7 @@
         </w:tc>
         <w:tc>
           <w:tcPr>
-            <w:tcW w:w="1786" w:type="dxa"/>
+            <w:tcW w:w="1739" w:type="dxa"/>
             <w:tcBorders>
               <w:top w:val="single" w:sz="4" w:space="0" w:color="B7C4D3"/>
               <w:left w:val="single" w:sz="4" w:space="0" w:color="B7C4D3"/>
@@ -19059,7 +19096,7 @@
         </w:tc>
         <w:tc>
           <w:tcPr>
-            <w:tcW w:w="1834" w:type="dxa"/>
+            <w:tcW w:w="2194" w:type="dxa"/>
             <w:tcBorders>
               <w:top w:val="single" w:sz="4" w:space="0" w:color="B7C4D3"/>
               <w:left w:val="single" w:sz="4" w:space="0" w:color="B7C4D3"/>
@@ -19083,6 +19120,121 @@
                 <w:szCs w:val="17"/>
               </w:rPr>
               <w:t>second review of version 2.0</w:t>
+            </w:r>
+          </w:p>
+        </w:tc>
+      </w:tr>
+      <w:tr>
+        <w:trPr>
+          <w:cantSplit/>
+        </w:trPr>
+        <w:tc>
+          <w:tcPr>
+            <w:tcW w:w="570" w:type="dxa"/>
+            <w:tcBorders>
+              <w:top w:val="single" w:sz="4" w:space="0" w:color="B7C4D3"/>
+              <w:left w:val="single" w:sz="4" w:space="0" w:color="B7C4D3"/>
+              <w:bottom w:val="single" w:sz="4" w:space="0" w:color="B7C4D3"/>
+              <w:right w:val="single" w:sz="4" w:space="0" w:color="B7C4D3"/>
+            </w:tcBorders>
+            <w:shd w:val="clear" w:color="auto" w:fill="FFFFFF"/>
+            <w:tcMar>
+              <w:top w:w="50" w:type="dxa"/>
+              <w:left w:w="90" w:type="dxa"/>
+              <w:bottom w:w="50" w:type="dxa"/>
+              <w:right w:w="90" w:type="dxa"/>
+            </w:tcMar>
+          </w:tcPr>
+          <w:p>
+            <w:r>
+              <w:rPr>
+                <w:sz w:val="17"/>
+                <w:szCs w:val="17"/>
+              </w:rPr>
+              <w:t>20</w:t>
+            </w:r>
+          </w:p>
+        </w:tc>
+        <w:tc>
+          <w:tcPr>
+            <w:tcW w:w="5135" w:type="dxa"/>
+            <w:tcBorders>
+              <w:top w:val="single" w:sz="4" w:space="0" w:color="B7C4D3"/>
+              <w:left w:val="single" w:sz="4" w:space="0" w:color="B7C4D3"/>
+              <w:bottom w:val="single" w:sz="4" w:space="0" w:color="B7C4D3"/>
+              <w:right w:val="single" w:sz="4" w:space="0" w:color="B7C4D3"/>
+            </w:tcBorders>
+            <w:shd w:val="clear" w:color="auto" w:fill="FFFFFF"/>
+            <w:tcMar>
+              <w:top w:w="50" w:type="dxa"/>
+              <w:left w:w="90" w:type="dxa"/>
+              <w:bottom w:w="50" w:type="dxa"/>
+              <w:right w:w="90" w:type="dxa"/>
+            </w:tcMar>
+          </w:tcPr>
+          <w:p>
+            <w:r>
+              <w:rPr>
+                <w:sz w:val="17"/>
+                <w:szCs w:val="17"/>
+              </w:rPr>
+              <w:t>a subsidiary declared with its parent's root domain got the parent's site content; full-name social links in article text or another organisation's structured data were published</w:t>
+            </w:r>
+          </w:p>
+        </w:tc>
+        <w:tc>
+          <w:tcPr>
+            <w:tcW w:w="1739" w:type="dxa"/>
+            <w:tcBorders>
+              <w:top w:val="single" w:sz="4" w:space="0" w:color="B7C4D3"/>
+              <w:left w:val="single" w:sz="4" w:space="0" w:color="B7C4D3"/>
+              <w:bottom w:val="single" w:sz="4" w:space="0" w:color="B7C4D3"/>
+              <w:right w:val="single" w:sz="4" w:space="0" w:color="B7C4D3"/>
+            </w:tcBorders>
+            <w:shd w:val="clear" w:color="auto" w:fill="FFFFFF"/>
+            <w:tcMar>
+              <w:top w:w="50" w:type="dxa"/>
+              <w:left w:w="90" w:type="dxa"/>
+              <w:bottom w:w="50" w:type="dxa"/>
+              <w:right w:w="90" w:type="dxa"/>
+            </w:tcMar>
+          </w:tcPr>
+          <w:p>
+            <w:r>
+              <w:rPr>
+                <w:sz w:val="17"/>
+                <w:szCs w:val="17"/>
+              </w:rPr>
+              <w:t>wrong company (facts)</w:t>
+            </w:r>
+          </w:p>
+        </w:tc>
+        <w:tc>
+          <w:tcPr>
+            <w:tcW w:w="2194" w:type="dxa"/>
+            <w:tcBorders>
+              <w:top w:val="single" w:sz="4" w:space="0" w:color="B7C4D3"/>
+              <w:left w:val="single" w:sz="4" w:space="0" w:color="B7C4D3"/>
+              <w:bottom w:val="single" w:sz="4" w:space="0" w:color="B7C4D3"/>
+              <w:right w:val="single" w:sz="4" w:space="0" w:color="B7C4D3"/>
+            </w:tcBorders>
+            <w:shd w:val="clear" w:color="auto" w:fill="FFFFFF"/>
+            <w:tcMar>
+              <w:top w:w="50" w:type="dxa"/>
+              <w:left w:w="90" w:type="dxa"/>
+              <w:bottom w:w="50" w:type="dxa"/>
+              <w:right w:w="90" w:type="dxa"/>
+            </w:tcMar>
+          </w:tcPr>
+          <w:p>
+            <w:r>
+              <w:rPr>
+                <w:b/>
+                <w:bCs/>
+                <w:sz w:val="17"/>
+                <w:szCs w:val="17"/>
+              </w:rPr>
+              <w:t>residual-risk review of version 2.1</w:t>
             </w:r>
           </w:p>
         </w:tc>
@@ -19105,7 +19257,7 @@
       <w:pPr>
         <w:pStyle w:val="Heading1"/>
       </w:pPr>
-      <w:bookmarkStart w:id="14" w:name="_Toc243655316"/>
+      <w:bookmarkStart w:id="14" w:name="_Toc243660996"/>
       <w:r>
         <w:t>15. Limitations and future work</w:t>
       </w:r>
@@ -19125,10 +19277,10 @@
           <w:b/>
           <w:bCs/>
         </w:rPr>
-        <w:t>Website coverage (5–11 % on random batches)</w:t>
-      </w:r>
-      <w:r>
-        <w:t xml:space="preserve"> is the price of publishing only proven matches. Most unpublished candidates are brand names, sites without an org number in an identity block, or redirecting domains. The optional search connector is the next lever, but it needs a key the evaluator can reproduce and an A/B test before use.</w:t>
+        <w:t>Site facts are withheld for 8 of 137 published websites</w:t>
+      </w:r>
+      <w:r>
+        <w:t xml:space="preserve"> whose footer shows neither the org number nor the exact legal name. One is a genuinely shared club site; most of the others are probably the company's own. Withholding is the safer error.</w:t>
       </w:r>
     </w:p>
     <w:p>
@@ -19145,10 +19297,10 @@
           <w:b/>
           <w:bCs/>
         </w:rPr>
-        <w:t>Job coverage is low (0–2 per 100).</w:t>
-      </w:r>
-      <w:r>
-        <w:t xml:space="preserve"> Most random companies have no NAV ad in a 45-day window, and only about 1,250 of 5,600 employer names carry a legal suffix. The matcher is precise (orgnr-verified) and works on hiring companies.</w:t>
+        <w:t>Website coverage (5–11 % on random batches)</w:t>
+      </w:r>
+      <w:r>
+        <w:t xml:space="preserve"> is the price of publishing only proven matches. Most unpublished candidates are brand names, sites without an org number in an identity block, or redirecting domains. The optional search connector is the next lever, but it needs a key the evaluator can reproduce and an A/B test before use.</w:t>
       </w:r>
     </w:p>
     <w:p>
@@ -19165,10 +19317,10 @@
           <w:b/>
           <w:bCs/>
         </w:rPr>
-        <w:t>The accounts API is a preview service</w:t>
-      </w:r>
-      <w:r>
-        <w:t xml:space="preserve"> without service guarantees. Outages are reported honestly, but a fallback such as filed PDF copies is not implemented.</w:t>
+        <w:t>Job coverage is low (0–2 per 100).</w:t>
+      </w:r>
+      <w:r>
+        <w:t xml:space="preserve"> Most random companies have no NAV ad in a 45-day window, and only about 1,250 of 5,600 employer names carry a legal suffix. The matcher is precise (orgnr-verified) and works on hiring companies.</w:t>
       </w:r>
     </w:p>
     <w:p>
@@ -19185,22 +19337,10 @@
           <w:b/>
           <w:bCs/>
         </w:rPr>
-        <w:t>One batch of 1,000 companies under a 2,000-request cap</w:t>
-      </w:r>
-      <w:r>
-        <w:t xml:space="preserve"> would exhaust the budget at about 8.7 requests per company. The agent still returns every envelope with the registry baseline and marks later sources </w:t>
-      </w:r>
-      <w:r>
-        <w:rPr>
-          <w:rFonts w:ascii="Consolas" w:eastAsia="Consolas" w:hAnsi="Consolas" w:cs="Consolas"/>
-          <w:color w:val="333333"/>
-          <w:sz w:val="18"/>
-          <w:szCs w:val="18"/>
-        </w:rPr>
-        <w:t>blocked</w:t>
-      </w:r>
-      <w:r>
-        <w:t>, as the budget stress run demonstrates.</w:t>
+        <w:t>The accounts API is a preview service</w:t>
+      </w:r>
+      <w:r>
+        <w:t xml:space="preserve"> without service guarantees. Outages are reported honestly, but a fallback such as filed PDF copies is not implemented.</w:t>
       </w:r>
     </w:p>
     <w:p>
@@ -19217,6 +19357,38 @@
           <w:b/>
           <w:bCs/>
         </w:rPr>
+        <w:t>One batch of 1,000 companies under a 2,000-request cap</w:t>
+      </w:r>
+      <w:r>
+        <w:t xml:space="preserve"> would exhaust the budget at about 8.7 requests per company. The agent still returns every envelope with the registry baseline and marks later sources </w:t>
+      </w:r>
+      <w:r>
+        <w:rPr>
+          <w:rFonts w:ascii="Consolas" w:eastAsia="Consolas" w:hAnsi="Consolas" w:cs="Consolas"/>
+          <w:color w:val="333333"/>
+          <w:sz w:val="18"/>
+          <w:szCs w:val="18"/>
+        </w:rPr>
+        <w:t>blocked</w:t>
+      </w:r>
+      <w:r>
+        <w:t>, as the budget stress run demonstrates.</w:t>
+      </w:r>
+    </w:p>
+    <w:p>
+      <w:pPr>
+        <w:pStyle w:val="ListParagraph"/>
+        <w:numPr>
+          <w:ilvl w:val="0"/>
+          <w:numId w:val="2"/>
+        </w:numPr>
+        <w:spacing w:after="60" w:line="264" w:lineRule="auto"/>
+      </w:pPr>
+      <w:r>
+        <w:rPr>
+          <w:b/>
+          <w:bCs/>
+        </w:rPr>
         <w:t>Network-security tests use stand-ins</w:t>
       </w:r>
       <w:r>
@@ -19227,7 +19399,7 @@
       <w:pPr>
         <w:pStyle w:val="Heading1"/>
       </w:pPr>
-      <w:bookmarkStart w:id="15" w:name="_Toc243655317"/>
+      <w:bookmarkStart w:id="15" w:name="_Toc243660997"/>
       <w:r>
         <w:t>16. Reproduction and submission</w:t>
       </w:r>
@@ -19291,7 +19463,7 @@
         <w:spacing w:after="120" w:line="276" w:lineRule="auto"/>
       </w:pPr>
       <w:r>
-        <w:t>Expected: 27/27 audit cases pass, and 0 audit problems in the current dataset (version 1's dataset shows 89 and version 2.0's 38 under the current rules).</w:t>
+        <w:t>Expected: 29/29 audit cases pass, and 0 audit problems in the current dataset (version 1's dataset shows 89 and version 2.0's 38 under the current rules).</w:t>
       </w:r>
     </w:p>
     <w:p>
@@ -19485,7 +19657,7 @@
           <w:sz w:val="18"/>
           <w:szCs w:val="18"/>
         </w:rPr>
-        <w:t>1f2ad26</w:t>
+        <w:t>70cfcf0</w:t>
       </w:r>
       <w:r>
         <w:t>; later commits change documentation and data only.</w:t>
@@ -19495,7 +19667,7 @@
       <w:pPr>
         <w:pStyle w:val="Heading1"/>
       </w:pPr>
-      <w:bookmarkStart w:id="16" w:name="_Toc243655318"/>
+      <w:bookmarkStart w:id="16" w:name="_Toc243660998"/>
       <w:r>
         <w:t>Appendix A: Offline test inventory</w:t>
       </w:r>
@@ -20219,6 +20391,86 @@
                 <w:szCs w:val="15"/>
               </w:rPr>
               <w:t>test_explicit_news_types_accept_unusual_urls_but_generic_articles_do_not</w:t>
+            </w:r>
+            <w:r>
+              <w:rPr>
+                <w:sz w:val="17"/>
+                <w:szCs w:val="17"/>
+              </w:rPr>
+              <w:t xml:space="preserve">, </w:t>
+            </w:r>
+            <w:r>
+              <w:rPr>
+                <w:rFonts w:ascii="Consolas" w:eastAsia="Consolas" w:hAnsi="Consolas" w:cs="Consolas"/>
+                <w:color w:val="333333"/>
+                <w:sz w:val="15"/>
+                <w:szCs w:val="15"/>
+              </w:rPr>
+              <w:t>test_subsidiary_declared_with_parent_root_domain_gets_no_parent_facts</w:t>
+            </w:r>
+            <w:r>
+              <w:rPr>
+                <w:sz w:val="17"/>
+                <w:szCs w:val="17"/>
+              </w:rPr>
+              <w:t xml:space="preserve">, </w:t>
+            </w:r>
+            <w:r>
+              <w:rPr>
+                <w:rFonts w:ascii="Consolas" w:eastAsia="Consolas" w:hAnsi="Consolas" w:cs="Consolas"/>
+                <w:color w:val="333333"/>
+                <w:sz w:val="15"/>
+                <w:szCs w:val="15"/>
+              </w:rPr>
+              <w:t>test_subsidiarys_own_root_site_keeps_its_facts</w:t>
+            </w:r>
+            <w:r>
+              <w:rPr>
+                <w:sz w:val="17"/>
+                <w:szCs w:val="17"/>
+              </w:rPr>
+              <w:t xml:space="preserve">, </w:t>
+            </w:r>
+            <w:r>
+              <w:rPr>
+                <w:rFonts w:ascii="Consolas" w:eastAsia="Consolas" w:hAnsi="Consolas" w:cs="Consolas"/>
+                <w:color w:val="333333"/>
+                <w:sz w:val="15"/>
+                <w:szCs w:val="15"/>
+              </w:rPr>
+              <w:t>test_footer_listing_several_companies_does_not_prove_site_owner</w:t>
+            </w:r>
+            <w:r>
+              <w:rPr>
+                <w:sz w:val="17"/>
+                <w:szCs w:val="17"/>
+              </w:rPr>
+              <w:t xml:space="preserve">, </w:t>
+            </w:r>
+            <w:r>
+              <w:rPr>
+                <w:rFonts w:ascii="Consolas" w:eastAsia="Consolas" w:hAnsi="Consolas" w:cs="Consolas"/>
+                <w:color w:val="333333"/>
+                <w:sz w:val="15"/>
+                <w:szCs w:val="15"/>
+              </w:rPr>
+              <w:t>test_social_account_must_be_attributable_not_just_name_matching</w:t>
+            </w:r>
+            <w:r>
+              <w:rPr>
+                <w:sz w:val="17"/>
+                <w:szCs w:val="17"/>
+              </w:rPr>
+              <w:t xml:space="preserve">, </w:t>
+            </w:r>
+            <w:r>
+              <w:rPr>
+                <w:rFonts w:ascii="Consolas" w:eastAsia="Consolas" w:hAnsi="Consolas" w:cs="Consolas"/>
+                <w:color w:val="333333"/>
+                <w:sz w:val="15"/>
+                <w:szCs w:val="15"/>
+              </w:rPr>
+              <w:t>test_social_link_repeated_across_site_pages_counts_as_site_chrome</w:t>
             </w:r>
           </w:p>
         </w:tc>
@@ -20808,10 +21060,10 @@
 <file path=word/numbering.xml><?xml version="1.0" encoding="utf-8"?>
 <w:numbering xmlns:wpc="http://schemas.microsoft.com/office/word/2010/wordprocessingCanvas" xmlns:cx="http://schemas.microsoft.com/office/drawing/2014/chartex" xmlns:cx1="http://schemas.microsoft.com/office/drawing/2015/9/8/chartex" xmlns:cx2="http://schemas.microsoft.com/office/drawing/2015/10/21/chartex" xmlns:cx3="http://schemas.microsoft.com/office/drawing/2016/5/9/chartex" xmlns:cx4="http://schemas.microsoft.com/office/drawing/2016/5/10/chartex" xmlns:cx5="http://schemas.microsoft.com/office/drawing/2016/5/11/chartex" xmlns:cx6="http://schemas.microsoft.com/office/drawing/2016/5/12/chartex" xmlns:cx7="http://schemas.microsoft.com/office/drawing/2016/5/13/chartex" xmlns:cx8="http://schemas.microsoft.com/office/drawing/2016/5/14/chartex" xmlns:mc="http://schemas.openxmlformats.org/markup-compatibility/2006" xmlns:aink="http://schemas.microsoft.com/office/drawing/2016/ink" xmlns:am3d="http://schemas.microsoft.com/office/drawing/2017/model3d" xmlns:o="urn:schemas-microsoft-com:office:office" xmlns:oel="http://schemas.microsoft.com/office/2019/extlst" xmlns:r="http://schemas.openxmlformats.org/officeDocument/2006/relationships" xmlns:m="http://schemas.openxmlformats.org/officeDocument/2006/math" xmlns:v="urn:schemas-microsoft-com:vml" xmlns:wp14="http://schemas.microsoft.com/office/word/2010/wordprocessingDrawing" xmlns:wp="http://schemas.openxmlformats.org/drawingml/2006/wordprocessingDrawing" xmlns:w10="urn:schemas-microsoft-com:office:word" xmlns:w="http://schemas.openxmlformats.org/wordprocessingml/2006/main" xmlns:w14="http://schemas.microsoft.com/office/word/2010/wordml" xmlns:w15="http://schemas.microsoft.com/office/word/2012/wordml" xmlns:w16cex="http://schemas.microsoft.com/office/word/2018/wordml/cex" xmlns:w16cid="http://schemas.microsoft.com/office/word/2016/wordml/cid" xmlns:w16="http://schemas.microsoft.com/office/word/2018/wordml" xmlns:w16du="http://schemas.microsoft.com/office/word/2023/wordml/word16du" xmlns:w16sdtdh="http://schemas.microsoft.com/office/word/2020/wordml/sdtdatahash" xmlns:w16sdtfl="http://schemas.microsoft.com/office/word/2024/wordml/sdtformatlock" xmlns:w16se="http://schemas.microsoft.com/office/word/2015/wordml/symex" xmlns:wpg="http://schemas.microsoft.com/office/word/2010/wordprocessingGroup" xmlns:wpi="http://schemas.microsoft.com/office/word/2010/wordprocessingInk" xmlns:wne="http://schemas.microsoft.com/office/word/2006/wordml" xmlns:wps="http://schemas.microsoft.com/office/word/2010/wordprocessingShape" mc:Ignorable="w14 w15 w16se w16cid w16 w16cex w16sdtdh w16sdtfl w16du wp14">
   <w:abstractNum w:abstractNumId="0" w15:restartNumberingAfterBreak="0">
-    <w:nsid w:val="1A945492"/>
+    <w:nsid w:val="018E4038"/>
     <w:multiLevelType w:val="hybridMultilevel"/>
-    <w:tmpl w:val="46DCCEB4"/>
-    <w:lvl w:ilvl="0" w:tplc="838AD134">
+    <w:tmpl w:val="C352CBB6"/>
+    <w:lvl w:ilvl="0" w:tplc="A2B0A7D4">
       <w:start w:val="1"/>
       <w:numFmt w:val="bullet"/>
       <w:lvlText w:val="•"/>
@@ -20820,7 +21072,7 @@
         <w:ind w:left="540" w:hanging="270"/>
       </w:pPr>
     </w:lvl>
-    <w:lvl w:ilvl="1" w:tplc="5ECC2F40">
+    <w:lvl w:ilvl="1" w:tplc="FE662874">
       <w:start w:val="1"/>
       <w:numFmt w:val="bullet"/>
       <w:lvlText w:val="–"/>
@@ -20829,47 +21081,47 @@
         <w:ind w:left="1080" w:hanging="270"/>
       </w:pPr>
     </w:lvl>
-    <w:lvl w:ilvl="2" w:tplc="F3C8F38A">
+    <w:lvl w:ilvl="2" w:tplc="33F6C248">
       <w:numFmt w:val="decimal"/>
       <w:lvlText w:val=""/>
       <w:lvlJc w:val="left"/>
     </w:lvl>
-    <w:lvl w:ilvl="3" w:tplc="B02C1BEE">
+    <w:lvl w:ilvl="3" w:tplc="F18C14D2">
       <w:numFmt w:val="decimal"/>
       <w:lvlText w:val=""/>
       <w:lvlJc w:val="left"/>
     </w:lvl>
-    <w:lvl w:ilvl="4" w:tplc="F9A4C80A">
+    <w:lvl w:ilvl="4" w:tplc="13DEA472">
       <w:numFmt w:val="decimal"/>
       <w:lvlText w:val=""/>
       <w:lvlJc w:val="left"/>
     </w:lvl>
-    <w:lvl w:ilvl="5" w:tplc="E4C4D2DA">
+    <w:lvl w:ilvl="5" w:tplc="16F2AB54">
       <w:numFmt w:val="decimal"/>
       <w:lvlText w:val=""/>
       <w:lvlJc w:val="left"/>
     </w:lvl>
-    <w:lvl w:ilvl="6" w:tplc="6F384E58">
+    <w:lvl w:ilvl="6" w:tplc="26D2BB32">
       <w:numFmt w:val="decimal"/>
       <w:lvlText w:val=""/>
       <w:lvlJc w:val="left"/>
     </w:lvl>
-    <w:lvl w:ilvl="7" w:tplc="12BE4DB2">
+    <w:lvl w:ilvl="7" w:tplc="1E96A4F6">
       <w:numFmt w:val="decimal"/>
       <w:lvlText w:val=""/>
       <w:lvlJc w:val="left"/>
     </w:lvl>
-    <w:lvl w:ilvl="8" w:tplc="38709890">
+    <w:lvl w:ilvl="8" w:tplc="03CC1D00">
       <w:numFmt w:val="decimal"/>
       <w:lvlText w:val=""/>
       <w:lvlJc w:val="left"/>
     </w:lvl>
   </w:abstractNum>
   <w:abstractNum w:abstractNumId="1" w15:restartNumberingAfterBreak="0">
-    <w:nsid w:val="310C4823"/>
+    <w:nsid w:val="275C2FB7"/>
     <w:multiLevelType w:val="hybridMultilevel"/>
-    <w:tmpl w:val="5FEEC40E"/>
-    <w:lvl w:ilvl="0" w:tplc="072ED5CA">
+    <w:tmpl w:val="5CF24404"/>
+    <w:lvl w:ilvl="0" w:tplc="99F62000">
       <w:start w:val="1"/>
       <w:numFmt w:val="decimal"/>
       <w:lvlText w:val="%1."/>
@@ -20878,52 +21130,52 @@
         <w:ind w:left="540" w:hanging="360"/>
       </w:pPr>
     </w:lvl>
-    <w:lvl w:ilvl="1" w:tplc="39E69660">
+    <w:lvl w:ilvl="1" w:tplc="FDF07EE0">
       <w:numFmt w:val="decimal"/>
       <w:lvlText w:val=""/>
       <w:lvlJc w:val="left"/>
     </w:lvl>
-    <w:lvl w:ilvl="2" w:tplc="581A64C6">
+    <w:lvl w:ilvl="2" w:tplc="D3480898">
       <w:numFmt w:val="decimal"/>
       <w:lvlText w:val=""/>
       <w:lvlJc w:val="left"/>
     </w:lvl>
-    <w:lvl w:ilvl="3" w:tplc="5D6EDF08">
+    <w:lvl w:ilvl="3" w:tplc="1792B99E">
       <w:numFmt w:val="decimal"/>
       <w:lvlText w:val=""/>
       <w:lvlJc w:val="left"/>
     </w:lvl>
-    <w:lvl w:ilvl="4" w:tplc="E27EAD7C">
+    <w:lvl w:ilvl="4" w:tplc="70F4B93E">
       <w:numFmt w:val="decimal"/>
       <w:lvlText w:val=""/>
       <w:lvlJc w:val="left"/>
     </w:lvl>
-    <w:lvl w:ilvl="5" w:tplc="1834D05A">
+    <w:lvl w:ilvl="5" w:tplc="FA80AAEC">
       <w:numFmt w:val="decimal"/>
       <w:lvlText w:val=""/>
       <w:lvlJc w:val="left"/>
     </w:lvl>
-    <w:lvl w:ilvl="6" w:tplc="89E6DF00">
+    <w:lvl w:ilvl="6" w:tplc="98B0FF1C">
       <w:numFmt w:val="decimal"/>
       <w:lvlText w:val=""/>
       <w:lvlJc w:val="left"/>
     </w:lvl>
-    <w:lvl w:ilvl="7" w:tplc="90B88566">
+    <w:lvl w:ilvl="7" w:tplc="64CC7BE6">
       <w:numFmt w:val="decimal"/>
       <w:lvlText w:val=""/>
       <w:lvlJc w:val="left"/>
     </w:lvl>
-    <w:lvl w:ilvl="8" w:tplc="274C08A6">
+    <w:lvl w:ilvl="8" w:tplc="ABB008FE">
       <w:numFmt w:val="decimal"/>
       <w:lvlText w:val=""/>
       <w:lvlJc w:val="left"/>
     </w:lvl>
   </w:abstractNum>
   <w:abstractNum w:abstractNumId="2" w15:restartNumberingAfterBreak="0">
-    <w:nsid w:val="3D8429E1"/>
+    <w:nsid w:val="644D2310"/>
     <w:multiLevelType w:val="hybridMultilevel"/>
-    <w:tmpl w:val="41EC58AE"/>
-    <w:lvl w:ilvl="0" w:tplc="86B8AE96" w:tentative="1">
+    <w:tmpl w:val="BDE6D57E"/>
+    <w:lvl w:ilvl="0" w:tplc="C61250CA" w:tentative="1">
       <w:start w:val="1"/>
       <w:numFmt w:val="bullet"/>
       <w:lvlText w:val="●"/>
@@ -20932,7 +21184,7 @@
         <w:ind w:left="720" w:hanging="360"/>
       </w:pPr>
     </w:lvl>
-    <w:lvl w:ilvl="1" w:tplc="5930E29C" w:tentative="1">
+    <w:lvl w:ilvl="1" w:tplc="E606280A" w:tentative="1">
       <w:start w:val="1"/>
       <w:numFmt w:val="bullet"/>
       <w:lvlText w:val="○"/>
@@ -20941,7 +21193,7 @@
         <w:ind w:left="1440" w:hanging="360"/>
       </w:pPr>
     </w:lvl>
-    <w:lvl w:ilvl="2" w:tplc="2278DAB4" w:tentative="1">
+    <w:lvl w:ilvl="2" w:tplc="7EE0B7C0" w:tentative="1">
       <w:start w:val="1"/>
       <w:numFmt w:val="bullet"/>
       <w:lvlText w:val="■"/>
@@ -20950,7 +21202,7 @@
         <w:ind w:left="2160" w:hanging="360"/>
       </w:pPr>
     </w:lvl>
-    <w:lvl w:ilvl="3" w:tplc="EBA0DD12" w:tentative="1">
+    <w:lvl w:ilvl="3" w:tplc="EEBE92D6" w:tentative="1">
       <w:start w:val="1"/>
       <w:numFmt w:val="bullet"/>
       <w:lvlText w:val="●"/>
@@ -20959,7 +21211,7 @@
         <w:ind w:left="2880" w:hanging="360"/>
       </w:pPr>
     </w:lvl>
-    <w:lvl w:ilvl="4" w:tplc="B14C2D9A" w:tentative="1">
+    <w:lvl w:ilvl="4" w:tplc="A02420D0" w:tentative="1">
       <w:start w:val="1"/>
       <w:numFmt w:val="bullet"/>
       <w:lvlText w:val="○"/>
@@ -20968,7 +21220,7 @@
         <w:ind w:left="3600" w:hanging="360"/>
       </w:pPr>
     </w:lvl>
-    <w:lvl w:ilvl="5" w:tplc="DCF42FB0" w:tentative="1">
+    <w:lvl w:ilvl="5" w:tplc="46D252C8" w:tentative="1">
       <w:start w:val="1"/>
       <w:numFmt w:val="bullet"/>
       <w:lvlText w:val="■"/>
@@ -20977,7 +21229,7 @@
         <w:ind w:left="4320" w:hanging="360"/>
       </w:pPr>
     </w:lvl>
-    <w:lvl w:ilvl="6" w:tplc="C3E0E4C4" w:tentative="1">
+    <w:lvl w:ilvl="6" w:tplc="4F58721A" w:tentative="1">
       <w:start w:val="1"/>
       <w:numFmt w:val="bullet"/>
       <w:lvlText w:val="●"/>
@@ -20986,7 +21238,7 @@
         <w:ind w:left="5040" w:hanging="360"/>
       </w:pPr>
     </w:lvl>
-    <w:lvl w:ilvl="7" w:tplc="DB6E9890" w:tentative="1">
+    <w:lvl w:ilvl="7" w:tplc="F13E76EA" w:tentative="1">
       <w:start w:val="1"/>
       <w:numFmt w:val="bullet"/>
       <w:lvlText w:val="●"/>
@@ -20995,7 +21247,7 @@
         <w:ind w:left="5760" w:hanging="360"/>
       </w:pPr>
     </w:lvl>
-    <w:lvl w:ilvl="8" w:tplc="668A28F2" w:tentative="1">
+    <w:lvl w:ilvl="8" w:tplc="7D3E246A" w:tentative="1">
       <w:start w:val="1"/>
       <w:numFmt w:val="bullet"/>
       <w:lvlText w:val="●"/>
@@ -21005,31 +21257,31 @@
       </w:pPr>
     </w:lvl>
   </w:abstractNum>
-  <w:num w:numId="1" w16cid:durableId="624508839">
+  <w:num w:numId="1" w16cid:durableId="1837722118">
     <w:abstractNumId w:val="2"/>
     <w:lvlOverride w:ilvl="0">
       <w:startOverride w:val="1"/>
     </w:lvlOverride>
   </w:num>
-  <w:num w:numId="2" w16cid:durableId="1936597033">
+  <w:num w:numId="2" w16cid:durableId="1823962356">
     <w:abstractNumId w:val="0"/>
     <w:lvlOverride w:ilvl="0">
       <w:startOverride w:val="1"/>
     </w:lvlOverride>
   </w:num>
-  <w:num w:numId="3" w16cid:durableId="1546135084">
+  <w:num w:numId="3" w16cid:durableId="1202674025">
     <w:abstractNumId w:val="1"/>
     <w:lvlOverride w:ilvl="0">
       <w:startOverride w:val="1"/>
     </w:lvlOverride>
   </w:num>
-  <w:num w:numId="4" w16cid:durableId="728070094">
+  <w:num w:numId="4" w16cid:durableId="779644195">
     <w:abstractNumId w:val="1"/>
     <w:lvlOverride w:ilvl="0">
       <w:startOverride w:val="1"/>
     </w:lvlOverride>
   </w:num>
-  <w:num w:numId="5" w16cid:durableId="429162395">
+  <w:num w:numId="5" w16cid:durableId="455293518">
     <w:abstractNumId w:val="1"/>
     <w:lvlOverride w:ilvl="0">
       <w:startOverride w:val="1"/>
@@ -21659,7 +21911,7 @@
     <w:autoRedefine/>
     <w:uiPriority w:val="39"/>
     <w:unhideWhenUsed/>
-    <w:rsid w:val="00163639"/>
+    <w:rsid w:val="00DE60AA"/>
     <w:pPr>
       <w:spacing w:after="100"/>
     </w:pPr>

</xml_diff>